<commit_message>
MTM PRD: thirteen sections — workflows, business rules, NFRs; "Out of this edition" and the local-build line removed
Co-Authored-By: Claude Fable 5.1 <noreply@anthropic.com>
</commit_message>
<xml_diff>
--- a/public/docs/bsc-plm-prd-mtm-v1.0.docx
+++ b/public/docs/bsc-plm-prd-mtm-v1.0.docx
@@ -30,7 +30,7 @@
     </w:p>
     <w:p>
       <w:r>
-        <w:t>This is the requirements document for the MTM edition of BSC PLM: the version of the tool that covers Bombay Shirt Company's made-to-measure business end to end and nothing else. It is what the MTM prototype (VITE_EDITION=mtm, http://localhost:5176) shows, written down screen by screen so the delivery team can build from it. The workflows run in the order a shirt happens: the customer's order at the store, the day's production and the factory floor, then the cloth behind it — the fabric master, purchase orders, sourcing, the design loop and the swatch desk. The full prototype remains the reference for the ready-to-wear work; everything that is RTW-only is out of this document and comes in a later phase.</w:t>
+        <w:t>This is the requirements document for the MTM edition of BSC PLM: the version of the tool that covers Bombay Shirt Company's made-to-measure business end to end and nothing else. It is what the MTM prototype shows, written down screen by screen so the delivery team can build from it. The workflows run in the order a shirt happens: the customer's order at the store, the day's production and the factory floor, then the cloth behind it — the fabric master, purchase orders, sourcing, the design loop and the swatch desk. The full prototype remains the reference for the ready-to-wear work; everything that is RTW-only is out of this document and comes in a later phase.</w:t>
       </w:r>
     </w:p>
     <w:p>
@@ -47,17 +47,6 @@
       </w:r>
       <w:r>
         <w:t>The customer's order first: the store's MTM work (bills, fit profiles, trial and express, sheet corrections, returns, credit, refunds); MTM daily production (queue, plan, floor, changed sheets, extra fabric, ship-by moves), the factory merchandiser's MTM floor and the Factories screen. Then the cloth: the MTM fabric master as Enigma's fabric DB (fabric info, attributes, inventory, transactions, reservations); purchase orders, raised by Enigma or by hand, and the receiving line; the core weekly stock review; the sourcing desk and the vendor master; the MTM fabric requirement from ask to live online (five states); the swatch desk up to the handover to Yusuf; and the conversation and files on every record; and the cross-cutting bell and names rule.</w:t>
-      </w:r>
-    </w:p>
-    <w:p>
-      <w:r>
-        <w:rPr>
-          <w:b/>
-        </w:rPr>
-        <w:t xml:space="preserve">Out of this edition. </w:t>
-      </w:r>
-      <w:r>
-        <w:t>Everything RTW: style requests, planning review, launches, the production tracker and TNA, stock health, OTIF. "Several options at once" requests are retired: design raises each option as its own MTM fabric ask. FOB is retired: BSC buys the cloth. The warehouse portal (vehicle round, RTW lots, STOs, books, hemming round trip, GRN register) is held for a later phase; in this edition fabric receiving happens on the purchase order's receiving line and the swatch desk stops at the handover. Bespoke's daily mill list and parcel inward return with the warehouse portal; the store-side gate on sold-out bespoke cloth stays.</w:t>
       </w:r>
     </w:p>
     <w:p>
@@ -5325,7 +5314,7 @@
         <w:t xml:space="preserve">Alerts. </w:t>
       </w:r>
       <w:r>
-        <w:t>Design: a vendor added and waiting for Push PO (urgent at 5 days of hold left); fabric in with no design yet; a design not pushed to Enigma. Sourcing: a requirement with no vendor; an extension asked. Every line in the bell names the workflow and the state (see section 12).</w:t>
+        <w:t>Design: a vendor added and waiting for Push PO (urgent at 5 days of hold left); fabric in with no design yet; a design not pushed to Enigma. Sourcing: a requirement with no vendor; an extension asked.</w:t>
       </w:r>
     </w:p>
     <w:p>
@@ -6132,890 +6121,7 @@
         <w:pStyle w:val="Heading2"/>
       </w:pPr>
       <w:r>
-        <w:t>12. Cross-cutting behaviour</w:t>
-      </w:r>
-    </w:p>
-    <w:p>
-      <w:r>
-        <w:rPr>
-          <w:b/>
-        </w:rPr>
-        <w:t xml:space="preserve">The bell · Waiting on you. </w:t>
-      </w:r>
-      <w:r>
-        <w:t>One bell per person showing their team's items, grouped by the job in plain words ("Give a new cut ratio", "Raise the purchase order", "Add a vendor") with a count and how many are urgent. Each line names the record, the workflow it belongs to (MTM fabric ask, Swatch desk, Store floor, MTM production, Fabric master…), where the record stands now ("2 of 5 · Vendor added"), why it is on the list, and an Open button to where the job is done. Lines are recomputed from the records on every change and disappear the moment the record moves. Messages (mentions) are the second tab.</w:t>
-      </w:r>
-    </w:p>
-    <w:p>
-      <w:r>
-        <w:rPr>
-          <w:b/>
-        </w:rPr>
-        <w:t xml:space="preserve">Sidebar. </w:t>
-      </w:r>
-      <w:r>
-        <w:t>Teams are pills with a role-coloured dot and a count; a pill opens to its screens on a rail. The team you are in is marked. Saved views keep a screen with its filters by name.</w:t>
-      </w:r>
-    </w:p>
-    <w:p>
-      <w:r>
-        <w:rPr>
-          <w:b/>
-        </w:rPr>
-        <w:t xml:space="preserve">Records. </w:t>
-      </w:r>
-      <w:r>
-        <w:t>A fabric is a page with a facts strip and tabs; a mill, a requirement and an order open as drawers whose sections open scrolled to their heading. Every record carries files and a conversation with mentions (workflow 8); nothing is emailed, the record is the thread.</w:t>
-      </w:r>
-    </w:p>
-    <w:p>
-      <w:r>
-        <w:rPr>
-          <w:b/>
-        </w:rPr>
-        <w:t xml:space="preserve">Names. </w:t>
-      </w:r>
-      <w:r>
-        <w:t>A fabric, a design and a launch each carry a working name, a final name and a history of every earlier name with who, when and why. The code is the identity; analytics key on the code and show the current name.</w:t>
-      </w:r>
-    </w:p>
-    <w:p>
-      <w:r>
-        <w:rPr>
-          <w:b/>
-        </w:rPr>
-        <w:t xml:space="preserve">Who acts next. </w:t>
-      </w:r>
-      <w:r>
-        <w:t>Every record header carries one state. A button appears only for the role that owns the step; others see whose move it is. Fields that can be edited look editable: dashed tiles, a pencil on hover, a chip that says so.</w:t>
-      </w:r>
-    </w:p>
-    <w:p>
-      <w:r>
-        <w:rPr>
-          <w:b/>
-        </w:rPr>
-        <w:t xml:space="preserve">Colour. </w:t>
-      </w:r>
-      <w:r>
-        <w:t>One accent (green) for the thing to click: primary buttons, the active tab, the hovered row, the sidebar's current screen. Four state tones with a border so they read at a glance: green good or live, amber waiting on you, blue on its way, red a problem. The five requirement states keep one colour each everywhere they appear: grey requirement requested, amber vendor added, blue PO punched, green-tint fabric in, green live online. Team colours (plum design, ochre sourcing, teal production, green store) mark whose hand a record is in, never a state.</w:t>
-      </w:r>
-    </w:p>
-    <w:p>
-      <w:r>
-        <w:rPr>
-          <w:b/>
-        </w:rPr>
-        <w:t xml:space="preserve">Lists. </w:t>
-      </w:r>
-      <w:r>
-        <w:t>Paged at 20 to 25; filters and the open record in the URL so a view is shareable and Back works; every list exports to .xlsx; search across requirements, fabrics, mills, orders, customers.</w:t>
-      </w:r>
-    </w:p>
-    <w:p>
-      <w:r>
-        <w:rPr>
-          <w:b/>
-        </w:rPr>
-        <w:t xml:space="preserve">Undo and audit. </w:t>
-      </w:r>
-      <w:r>
-        <w:t>The last ten writes can be undone for seven seconds by the person who made them. Every write appends who, when and what; order sheets keep versions V1, V2, V3 with from and to; ship-by moves keep the original date and the reason.</w:t>
-      </w:r>
-    </w:p>
-    <w:p>
-      <w:pPr>
-        <w:pStyle w:val="Heading2"/>
-      </w:pPr>
-      <w:r>
-        <w:t>13. Data model summary</w:t>
-      </w:r>
-    </w:p>
-    <w:tbl>
-      <w:tblPr>
-        <w:tblStyle w:val="TableGrid"/>
-        <w:tblW w:type="auto" w:w="0"/>
-        <w:tblLook w:firstColumn="1" w:firstRow="1" w:lastColumn="0" w:lastRow="0" w:noHBand="0" w:noVBand="1" w:val="04A0"/>
-      </w:tblPr>
-      <w:tblGrid>
-        <w:gridCol w:w="2493"/>
-        <w:gridCol w:w="2493"/>
-        <w:gridCol w:w="2493"/>
-        <w:gridCol w:w="2493"/>
-      </w:tblGrid>
-      <w:tr>
-        <w:tc>
-          <w:tcPr>
-            <w:tcW w:type="dxa" w:w="2493"/>
-          </w:tcPr>
-          <w:p>
-            <w:r>
-              <w:rPr>
-                <w:b/>
-                <w:sz w:val="17"/>
-              </w:rPr>
-              <w:t>Record</w:t>
-            </w:r>
-          </w:p>
-        </w:tc>
-        <w:tc>
-          <w:tcPr>
-            <w:tcW w:type="dxa" w:w="2493"/>
-          </w:tcPr>
-          <w:p>
-            <w:r>
-              <w:rPr>
-                <w:b/>
-                <w:sz w:val="17"/>
-              </w:rPr>
-              <w:t>Key fields</w:t>
-            </w:r>
-          </w:p>
-        </w:tc>
-        <w:tc>
-          <w:tcPr>
-            <w:tcW w:type="dxa" w:w="2493"/>
-          </w:tcPr>
-          <w:p>
-            <w:r>
-              <w:rPr>
-                <w:b/>
-                <w:sz w:val="17"/>
-              </w:rPr>
-              <w:t>Source of the fields</w:t>
-            </w:r>
-          </w:p>
-        </w:tc>
-        <w:tc>
-          <w:tcPr>
-            <w:tcW w:type="dxa" w:w="2493"/>
-          </w:tcPr>
-          <w:p>
-            <w:r>
-              <w:rPr>
-                <w:b/>
-                <w:sz w:val="17"/>
-              </w:rPr>
-              <w:t>Owned by</w:t>
-            </w:r>
-          </w:p>
-        </w:tc>
-      </w:tr>
-      <w:tr>
-        <w:tc>
-          <w:tcPr>
-            <w:tcW w:type="dxa" w:w="2493"/>
-          </w:tcPr>
-          <w:p>
-            <w:r>
-              <w:rPr>
-                <w:sz w:val="17"/>
-              </w:rPr>
-              <w:t>Fabric</w:t>
-            </w:r>
-          </w:p>
-        </w:tc>
-        <w:tc>
-          <w:tcPr>
-            <w:tcW w:type="dxa" w:w="2493"/>
-          </w:tcPr>
-          <w:p>
-            <w:r>
-              <w:rPr>
-                <w:sz w:val="17"/>
-              </w:rPr>
-              <w:t>code, name (with nameHistory), bucket (core, non-core, bespoke), vendor, vendorCode, composition, widthIn (Panna), cpm, mrp, swatchBook, stockMetres, reservedMetres, incomingMetres, thresholdMetres, onHold, paused, supply review, coreBlock, millAvailable; category, productType; mill {country, description, currency, costPerUnit, tatHours, moq, mills}; attrs {the twenty dynamic attributes}; inventory {warehouse, thresholdMetres, maxMetres, autoReplenish, bins}; transactions</w:t>
-            </w:r>
-          </w:p>
-        </w:tc>
-        <w:tc>
-          <w:tcPr>
-            <w:tcW w:type="dxa" w:w="2493"/>
-          </w:tcPr>
-          <w:p>
-            <w:r>
-              <w:rPr>
-                <w:sz w:val="17"/>
-              </w:rPr>
-              <w:t>Enigma fabric master, inventory and logs; typed (pause, review, block, adjustments)</w:t>
-            </w:r>
-          </w:p>
-        </w:tc>
-        <w:tc>
-          <w:tcPr>
-            <w:tcW w:type="dxa" w:w="2493"/>
-          </w:tcPr>
-          <w:p>
-            <w:r>
-              <w:rPr>
-                <w:sz w:val="17"/>
-              </w:rPr>
-              <w:t>Design, sourcing</w:t>
-            </w:r>
-          </w:p>
-        </w:tc>
-      </w:tr>
-      <w:tr>
-        <w:tc>
-          <w:tcPr>
-            <w:tcW w:type="dxa" w:w="2493"/>
-          </w:tcPr>
-          <w:p>
-            <w:r>
-              <w:rPr>
-                <w:sz w:val="17"/>
-              </w:rPr>
-              <w:t>Vendor (mill)</w:t>
-            </w:r>
-          </w:p>
-        </w:tc>
-        <w:tc>
-          <w:tcPr>
-            <w:tcW w:type="dxa" w:w="2493"/>
-          </w:tcPr>
-          <w:p>
-            <w:r>
-              <w:rPr>
-                <w:sz w:val="17"/>
-              </w:rPr>
-              <w:t>id, name, kind, location, region, leadDays, moq, blockWindowDays, onTimeRate; enigma {vendorCode, vendorType, address, officePhone, officeEmail, active, categories, country, description, currency, tatHours}</w:t>
-            </w:r>
-          </w:p>
-        </w:tc>
-        <w:tc>
-          <w:tcPr>
-            <w:tcW w:type="dxa" w:w="2493"/>
-          </w:tcPr>
-          <w:p>
-            <w:r>
-              <w:rPr>
-                <w:sz w:val="17"/>
-              </w:rPr>
-              <w:t>Enigma vendors; typed</w:t>
-            </w:r>
-          </w:p>
-        </w:tc>
-        <w:tc>
-          <w:tcPr>
-            <w:tcW w:type="dxa" w:w="2493"/>
-          </w:tcPr>
-          <w:p>
-            <w:r>
-              <w:rPr>
-                <w:sz w:val="17"/>
-              </w:rPr>
-              <w:t>Sourcing</w:t>
-            </w:r>
-          </w:p>
-        </w:tc>
-      </w:tr>
-      <w:tr>
-        <w:tc>
-          <w:tcPr>
-            <w:tcW w:type="dxa" w:w="2493"/>
-          </w:tcPr>
-          <w:p>
-            <w:r>
-              <w:rPr>
-                <w:sz w:val="17"/>
-              </w:rPr>
-              <w:t>Concept (MTM fabric ask)</w:t>
-            </w:r>
-          </w:p>
-        </w:tc>
-        <w:tc>
-          <w:tcPr>
-            <w:tcW w:type="dxa" w:w="2493"/>
-          </w:tcPr>
-          <w:p>
-            <w:r>
-              <w:rPr>
-                <w:sz w:val="17"/>
-              </w:rPr>
-              <w:t>kind, name, finalName, nameHistory, brief, book, targetMonth, baseFabricId, fabricOptions (one live vendor with hold, chosenBy, rejected, extensionAsked), fabricId, fabricPo, enigma {template, consumptionBase, consumptionBuffer, configuredOn}, designs, swatch {inwardOn, handoverOn, priority, …}, online {photosOn, videoOn, postOn, liveOn}; derived mtmStage 1–5</w:t>
-            </w:r>
-          </w:p>
-        </w:tc>
-        <w:tc>
-          <w:tcPr>
-            <w:tcW w:type="dxa" w:w="2493"/>
-          </w:tcPr>
-          <w:p>
-            <w:r>
-              <w:rPr>
-                <w:sz w:val="17"/>
-              </w:rPr>
-              <w:t>Typed; PO number and fabric code from Enigma</w:t>
-            </w:r>
-          </w:p>
-        </w:tc>
-        <w:tc>
-          <w:tcPr>
-            <w:tcW w:type="dxa" w:w="2493"/>
-          </w:tcPr>
-          <w:p>
-            <w:r>
-              <w:rPr>
-                <w:sz w:val="17"/>
-              </w:rPr>
-              <w:t>Design, sourcing</w:t>
-            </w:r>
-          </w:p>
-        </w:tc>
-      </w:tr>
-      <w:tr>
-        <w:tc>
-          <w:tcPr>
-            <w:tcW w:type="dxa" w:w="2493"/>
-          </w:tcPr>
-          <w:p>
-            <w:r>
-              <w:rPr>
-                <w:sz w:val="17"/>
-              </w:rPr>
-              <w:t>ConceptDesign</w:t>
-            </w:r>
-          </w:p>
-        </w:tc>
-        <w:tc>
-          <w:tcPr>
-            <w:tcW w:type="dxa" w:w="2493"/>
-          </w:tcPr>
-          <w:p>
-            <w:r>
-              <w:rPr>
-                <w:sz w:val="17"/>
-              </w:rPr>
-              <w:t>code, name, finalName, nameHistory, productType, weightGrams, region, stockMode, status, salesChannel, media, sizeOptionName, sizes, variants {value, price, discountedPrice, sku}, description, buzzwords, enigmaOn, enigmaSyncedOn</w:t>
-            </w:r>
-          </w:p>
-        </w:tc>
-        <w:tc>
-          <w:tcPr>
-            <w:tcW w:type="dxa" w:w="2493"/>
-          </w:tcPr>
-          <w:p>
-            <w:r>
-              <w:rPr>
-                <w:sz w:val="17"/>
-              </w:rPr>
-              <w:t>Typed; pushed to Enigma</w:t>
-            </w:r>
-          </w:p>
-        </w:tc>
-        <w:tc>
-          <w:tcPr>
-            <w:tcW w:type="dxa" w:w="2493"/>
-          </w:tcPr>
-          <w:p>
-            <w:r>
-              <w:rPr>
-                <w:sz w:val="17"/>
-              </w:rPr>
-              <w:t>Design</w:t>
-            </w:r>
-          </w:p>
-        </w:tc>
-      </w:tr>
-      <w:tr>
-        <w:tc>
-          <w:tcPr>
-            <w:tcW w:type="dxa" w:w="2493"/>
-          </w:tcPr>
-          <w:p>
-            <w:r>
-              <w:rPr>
-                <w:sz w:val="17"/>
-              </w:rPr>
-              <w:t>Fabric PO</w:t>
-            </w:r>
-          </w:p>
-        </w:tc>
-        <w:tc>
-          <w:tcPr>
-            <w:tcW w:type="dxa" w:w="2493"/>
-          </w:tcPr>
-          <w:p>
-            <w:r>
-              <w:rPr>
-                <w:sz w:val="17"/>
-              </w:rPr>
-              <w:t>poNo, fabricId, vendorId, metres, raisedOn, source (auto | manual), expectedOn, vendorConfirmedOn, remark, receivedMetres, receipts, closedOn, closedShort</w:t>
-            </w:r>
-          </w:p>
-        </w:tc>
-        <w:tc>
-          <w:tcPr>
-            <w:tcW w:type="dxa" w:w="2493"/>
-          </w:tcPr>
-          <w:p>
-            <w:r>
-              <w:rPr>
-                <w:sz w:val="17"/>
-              </w:rPr>
-              <w:t>Enigma PO or minted; typed confirmation; receiving updates</w:t>
-            </w:r>
-          </w:p>
-        </w:tc>
-        <w:tc>
-          <w:tcPr>
-            <w:tcW w:type="dxa" w:w="2493"/>
-          </w:tcPr>
-          <w:p>
-            <w:r>
-              <w:rPr>
-                <w:sz w:val="17"/>
-              </w:rPr>
-              <w:t>Sourcing</w:t>
-            </w:r>
-          </w:p>
-        </w:tc>
-      </w:tr>
-      <w:tr>
-        <w:tc>
-          <w:tcPr>
-            <w:tcW w:type="dxa" w:w="2493"/>
-          </w:tcPr>
-          <w:p>
-            <w:r>
-              <w:rPr>
-                <w:sz w:val="17"/>
-              </w:rPr>
-              <w:t>Customer order (MTM piece)</w:t>
-            </w:r>
-          </w:p>
-        </w:tc>
-        <w:tc>
-          <w:tcPr>
-            <w:tcW w:type="dxa" w:w="2493"/>
-          </w:tcPr>
-          <w:p>
-            <w:r>
-              <w:rPr>
-                <w:sz w:val="17"/>
-              </w:rPr>
-              <w:t>orderNo, billNo, customer, fabricId, designId, fit, fitProfile, measuredBy, trial, express, factoryComment, logisticComment, qty, punchedOn, promisedOn with revisions, tag, planId, factoryId, consumptionM, scans, spec, measurements, pattern, revisions (each a version)</w:t>
-            </w:r>
-          </w:p>
-        </w:tc>
-        <w:tc>
-          <w:tcPr>
-            <w:tcW w:type="dxa" w:w="2493"/>
-          </w:tcPr>
-          <w:p>
-            <w:r>
-              <w:rPr>
-                <w:sz w:val="17"/>
-              </w:rPr>
-              <w:t>Enigma order sheet; typed at the store; scans</w:t>
-            </w:r>
-          </w:p>
-        </w:tc>
-        <w:tc>
-          <w:tcPr>
-            <w:tcW w:type="dxa" w:w="2493"/>
-          </w:tcPr>
-          <w:p>
-            <w:r>
-              <w:rPr>
-                <w:sz w:val="17"/>
-              </w:rPr>
-              <w:t>Store, production, factory</w:t>
-            </w:r>
-          </w:p>
-        </w:tc>
-      </w:tr>
-      <w:tr>
-        <w:tc>
-          <w:tcPr>
-            <w:tcW w:type="dxa" w:w="2493"/>
-          </w:tcPr>
-          <w:p>
-            <w:r>
-              <w:rPr>
-                <w:sz w:val="17"/>
-              </w:rPr>
-              <w:t>Production plan</w:t>
-            </w:r>
-          </w:p>
-        </w:tc>
-        <w:tc>
-          <w:tcPr>
-            <w:tcW w:type="dxa" w:w="2493"/>
-          </w:tcPr>
-          <w:p>
-            <w:r>
-              <w:rPr>
-                <w:sz w:val="17"/>
-              </w:rPr>
-              <w:t>planNo, factory, orders, forcedOver</w:t>
-            </w:r>
-          </w:p>
-        </w:tc>
-        <w:tc>
-          <w:tcPr>
-            <w:tcW w:type="dxa" w:w="2493"/>
-          </w:tcPr>
-          <w:p>
-            <w:r>
-              <w:rPr>
-                <w:sz w:val="17"/>
-              </w:rPr>
-              <w:t>Computed proposal, confirmed</w:t>
-            </w:r>
-          </w:p>
-        </w:tc>
-        <w:tc>
-          <w:tcPr>
-            <w:tcW w:type="dxa" w:w="2493"/>
-          </w:tcPr>
-          <w:p>
-            <w:r>
-              <w:rPr>
-                <w:sz w:val="17"/>
-              </w:rPr>
-              <w:t>Production</w:t>
-            </w:r>
-          </w:p>
-        </w:tc>
-      </w:tr>
-      <w:tr>
-        <w:tc>
-          <w:tcPr>
-            <w:tcW w:type="dxa" w:w="2493"/>
-          </w:tcPr>
-          <w:p>
-            <w:r>
-              <w:rPr>
-                <w:sz w:val="17"/>
-              </w:rPr>
-              <w:t>Extra fabric request</w:t>
-            </w:r>
-          </w:p>
-        </w:tc>
-        <w:tc>
-          <w:tcPr>
-            <w:tcW w:type="dxa" w:w="2493"/>
-          </w:tcPr>
-          <w:p>
-            <w:r>
-              <w:rPr>
-                <w:sz w:val="17"/>
-              </w:rPr>
-              <w:t>order, cloth, panel, metres, reason, status</w:t>
-            </w:r>
-          </w:p>
-        </w:tc>
-        <w:tc>
-          <w:tcPr>
-            <w:tcW w:type="dxa" w:w="2493"/>
-          </w:tcPr>
-          <w:p>
-            <w:r>
-              <w:rPr>
-                <w:sz w:val="17"/>
-              </w:rPr>
-              <w:t>Typed</w:t>
-            </w:r>
-          </w:p>
-        </w:tc>
-        <w:tc>
-          <w:tcPr>
-            <w:tcW w:type="dxa" w:w="2493"/>
-          </w:tcPr>
-          <w:p>
-            <w:r>
-              <w:rPr>
-                <w:sz w:val="17"/>
-              </w:rPr>
-              <w:t>Factory, production</w:t>
-            </w:r>
-          </w:p>
-        </w:tc>
-      </w:tr>
-      <w:tr>
-        <w:tc>
-          <w:tcPr>
-            <w:tcW w:type="dxa" w:w="2493"/>
-          </w:tcPr>
-          <w:p>
-            <w:r>
-              <w:rPr>
-                <w:sz w:val="17"/>
-              </w:rPr>
-              <w:t>Return case · credit entry</w:t>
-            </w:r>
-          </w:p>
-        </w:tc>
-        <w:tc>
-          <w:tcPr>
-            <w:tcW w:type="dxa" w:w="2493"/>
-          </w:tcPr>
-          <w:p>
-            <w:r>
-              <w:rPr>
-                <w:sz w:val="17"/>
-              </w:rPr>
-              <w:t>caseNo, piece, reason, wants, ladder attempts, refund or credit note; credit amount, note number, valid one year</w:t>
-            </w:r>
-          </w:p>
-        </w:tc>
-        <w:tc>
-          <w:tcPr>
-            <w:tcW w:type="dxa" w:w="2493"/>
-          </w:tcPr>
-          <w:p>
-            <w:r>
-              <w:rPr>
-                <w:sz w:val="17"/>
-              </w:rPr>
-              <w:t>Typed</w:t>
-            </w:r>
-          </w:p>
-        </w:tc>
-        <w:tc>
-          <w:tcPr>
-            <w:tcW w:type="dxa" w:w="2493"/>
-          </w:tcPr>
-          <w:p>
-            <w:r>
-              <w:rPr>
-                <w:sz w:val="17"/>
-              </w:rPr>
-              <w:t>Store, finance</w:t>
-            </w:r>
-          </w:p>
-        </w:tc>
-      </w:tr>
-      <w:tr>
-        <w:tc>
-          <w:tcPr>
-            <w:tcW w:type="dxa" w:w="2493"/>
-          </w:tcPr>
-          <w:p>
-            <w:r>
-              <w:rPr>
-                <w:sz w:val="17"/>
-              </w:rPr>
-              <w:t>GRN</w:t>
-            </w:r>
-          </w:p>
-        </w:tc>
-        <w:tc>
-          <w:tcPr>
-            <w:tcW w:type="dxa" w:w="2493"/>
-          </w:tcPr>
-          <w:p>
-            <w:r>
-              <w:rPr>
-                <w:sz w:val="17"/>
-              </w:rPr>
-              <w:t>number, kind, against PO, quantity, rejected, who counted</w:t>
-            </w:r>
-          </w:p>
-        </w:tc>
-        <w:tc>
-          <w:tcPr>
-            <w:tcW w:type="dxa" w:w="2493"/>
-          </w:tcPr>
-          <w:p>
-            <w:r>
-              <w:rPr>
-                <w:sz w:val="17"/>
-              </w:rPr>
-              <w:t>Receiving line</w:t>
-            </w:r>
-          </w:p>
-        </w:tc>
-        <w:tc>
-          <w:tcPr>
-            <w:tcW w:type="dxa" w:w="2493"/>
-          </w:tcPr>
-          <w:p>
-            <w:r>
-              <w:rPr>
-                <w:sz w:val="17"/>
-              </w:rPr>
-              <w:t>Warehouse (recorded)</w:t>
-            </w:r>
-          </w:p>
-        </w:tc>
-      </w:tr>
-      <w:tr>
-        <w:tc>
-          <w:tcPr>
-            <w:tcW w:type="dxa" w:w="2493"/>
-          </w:tcPr>
-          <w:p>
-            <w:r>
-              <w:rPr>
-                <w:sz w:val="17"/>
-              </w:rPr>
-              <w:t>Trims item</w:t>
-            </w:r>
-          </w:p>
-        </w:tc>
-        <w:tc>
-          <w:tcPr>
-            <w:tcW w:type="dxa" w:w="2493"/>
-          </w:tcPr>
-          <w:p>
-            <w:r>
-              <w:rPr>
-                <w:sz w:val="17"/>
-              </w:rPr>
-              <w:t>item, stock, threshold, incoming, cost</w:t>
-            </w:r>
-          </w:p>
-        </w:tc>
-        <w:tc>
-          <w:tcPr>
-            <w:tcW w:type="dxa" w:w="2493"/>
-          </w:tcPr>
-          <w:p>
-            <w:r>
-              <w:rPr>
-                <w:sz w:val="17"/>
-              </w:rPr>
-              <w:t>Trims Working sheet; receipts</w:t>
-            </w:r>
-          </w:p>
-        </w:tc>
-        <w:tc>
-          <w:tcPr>
-            <w:tcW w:type="dxa" w:w="2493"/>
-          </w:tcPr>
-          <w:p>
-            <w:r>
-              <w:rPr>
-                <w:sz w:val="17"/>
-              </w:rPr>
-              <w:t>Sourcing</w:t>
-            </w:r>
-          </w:p>
-        </w:tc>
-      </w:tr>
-      <w:tr>
-        <w:tc>
-          <w:tcPr>
-            <w:tcW w:type="dxa" w:w="2493"/>
-          </w:tcPr>
-          <w:p>
-            <w:r>
-              <w:rPr>
-                <w:sz w:val="17"/>
-              </w:rPr>
-              <w:t>Thread and comment</w:t>
-            </w:r>
-          </w:p>
-        </w:tc>
-        <w:tc>
-          <w:tcPr>
-            <w:tcW w:type="dxa" w:w="2493"/>
-          </w:tcPr>
-          <w:p>
-            <w:r>
-              <w:rPr>
-                <w:sz w:val="17"/>
-              </w:rPr>
-              <w:t>kind (order, fabric, concept, customer, vendor, return), subjectId; comment {at, who, role, text, step, mentions (person or role ids), resolved [{by, at}]}</w:t>
-            </w:r>
-          </w:p>
-        </w:tc>
-        <w:tc>
-          <w:tcPr>
-            <w:tcW w:type="dxa" w:w="2493"/>
-          </w:tcPr>
-          <w:p>
-            <w:r>
-              <w:rPr>
-                <w:sz w:val="17"/>
-              </w:rPr>
-              <w:t>Typed; system posts</w:t>
-            </w:r>
-          </w:p>
-        </w:tc>
-        <w:tc>
-          <w:tcPr>
-            <w:tcW w:type="dxa" w:w="2493"/>
-          </w:tcPr>
-          <w:p>
-            <w:r>
-              <w:rPr>
-                <w:sz w:val="17"/>
-              </w:rPr>
-              <w:t>Everyone who can open the record</w:t>
-            </w:r>
-          </w:p>
-        </w:tc>
-      </w:tr>
-      <w:tr>
-        <w:tc>
-          <w:tcPr>
-            <w:tcW w:type="dxa" w:w="2493"/>
-          </w:tcPr>
-          <w:p>
-            <w:r>
-              <w:rPr>
-                <w:sz w:val="17"/>
-              </w:rPr>
-              <w:t>Attachment</w:t>
-            </w:r>
-          </w:p>
-        </w:tc>
-        <w:tc>
-          <w:tcPr>
-            <w:tcW w:type="dxa" w:w="2493"/>
-          </w:tcPr>
-          <w:p>
-            <w:r>
-              <w:rPr>
-                <w:sz w:val="17"/>
-              </w:rPr>
-              <w:t>record kind and id, label (per record kind), step, file, who, when</w:t>
-            </w:r>
-          </w:p>
-        </w:tc>
-        <w:tc>
-          <w:tcPr>
-            <w:tcW w:type="dxa" w:w="2493"/>
-          </w:tcPr>
-          <w:p>
-            <w:r>
-              <w:rPr>
-                <w:sz w:val="17"/>
-              </w:rPr>
-              <w:t>Uploaded</w:t>
-            </w:r>
-          </w:p>
-        </w:tc>
-        <w:tc>
-          <w:tcPr>
-            <w:tcW w:type="dxa" w:w="2493"/>
-          </w:tcPr>
-          <w:p>
-            <w:r>
-              <w:rPr>
-                <w:sz w:val="17"/>
-              </w:rPr>
-              <w:t>Everyone who can open the record</w:t>
-            </w:r>
-          </w:p>
-        </w:tc>
-      </w:tr>
-    </w:tbl>
-    <w:p/>
-    <w:p>
-      <w:r>
-        <w:t>Identifiers minted by BSC PLM until Enigma supplies them: fabric codes for new cloth, product codes for designs, fabric PO numbers, bill and order numbers, plan numbers, GRN numbers, case numbers, credit note numbers. Each is replaced by Enigma's own where write-back is granted.</w:t>
-      </w:r>
-    </w:p>
-    <w:p>
-      <w:pPr>
-        <w:pStyle w:val="Heading2"/>
-      </w:pPr>
-      <w:r>
-        <w:t>14. Business rules and validations</w:t>
+        <w:t>12. Business rules and validations</w:t>
       </w:r>
     </w:p>
     <w:tbl>
@@ -7457,7 +6563,7 @@
         <w:pStyle w:val="Heading2"/>
       </w:pPr>
       <w:r>
-        <w:t>15. Non-functional requirements and the Enigma contract</w:t>
+        <w:t>13. Non-functional requirements and the Enigma contract</w:t>
       </w:r>
     </w:p>
     <w:tbl>
@@ -7523,7 +6629,7 @@
               <w:rPr>
                 <w:sz w:val="17"/>
               </w:rPr>
-              <w:t>A separate application beside Enigma. Reads over Enigma's API; its own database for every record in section 13; write-back behind per-module flags in the last phase. No build inside Enigma's codebase. One codebase builds both editions; the MTM edition is a build flag that hides the RTW screens and the warehouse portal.</w:t>
+              <w:t>A separate application beside Enigma. Reads over Enigma's API; its own database for every record it keeps; write-back behind per-module flags in the last phase. No build inside Enigma's codebase. One codebase builds both editions; the MTM edition is a build flag that hides the RTW screens and the warehouse portal.</w:t>
             </w:r>
           </w:p>
         </w:tc>
@@ -7894,385 +7000,6 @@
       </w:tr>
     </w:tbl>
     <w:p/>
-    <w:p>
-      <w:pPr>
-        <w:pStyle w:val="Heading2"/>
-      </w:pPr>
-      <w:r>
-        <w:t>16. Build order and acceptance</w:t>
-      </w:r>
-    </w:p>
-    <w:p>
-      <w:r>
-        <w:t>Five phases, one team at a time, each closed before the next opens. The order below follows the one BSC set for the full tool; it is BSC's to confirm for this edition. Before phase 1: Enigma read access confirmed for the fabric master, inventory, logs, POs, orders, vendors and designs; the one-time import of open items from the sheets.</w:t>
-      </w:r>
-    </w:p>
-    <w:tbl>
-      <w:tblPr>
-        <w:tblStyle w:val="TableGrid"/>
-        <w:tblW w:type="auto" w:w="0"/>
-        <w:tblLook w:firstColumn="1" w:firstRow="1" w:lastColumn="0" w:lastRow="0" w:noHBand="0" w:noVBand="1" w:val="04A0"/>
-      </w:tblPr>
-      <w:tblGrid>
-        <w:gridCol w:w="3324"/>
-        <w:gridCol w:w="3324"/>
-        <w:gridCol w:w="3324"/>
-      </w:tblGrid>
-      <w:tr>
-        <w:tc>
-          <w:tcPr>
-            <w:tcW w:type="dxa" w:w="3324"/>
-          </w:tcPr>
-          <w:p>
-            <w:r>
-              <w:rPr>
-                <w:b/>
-                <w:sz w:val="17"/>
-              </w:rPr>
-              <w:t>Phase</w:t>
-            </w:r>
-          </w:p>
-        </w:tc>
-        <w:tc>
-          <w:tcPr>
-            <w:tcW w:type="dxa" w:w="3324"/>
-          </w:tcPr>
-          <w:p>
-            <w:r>
-              <w:rPr>
-                <w:b/>
-                <w:sz w:val="17"/>
-              </w:rPr>
-              <w:t>Scope (workflows)</w:t>
-            </w:r>
-          </w:p>
-        </w:tc>
-        <w:tc>
-          <w:tcPr>
-            <w:tcW w:type="dxa" w:w="3324"/>
-          </w:tcPr>
-          <w:p>
-            <w:r>
-              <w:rPr>
-                <w:b/>
-                <w:sz w:val="17"/>
-              </w:rPr>
-              <w:t>Done when</w:t>
-            </w:r>
-          </w:p>
-        </w:tc>
-      </w:tr>
-      <w:tr>
-        <w:tc>
-          <w:tcPr>
-            <w:tcW w:type="dxa" w:w="3324"/>
-          </w:tcPr>
-          <w:p>
-            <w:r>
-              <w:rPr>
-                <w:sz w:val="17"/>
-              </w:rPr>
-              <w:t>1. MTM production and the floor</w:t>
-            </w:r>
-          </w:p>
-        </w:tc>
-        <w:tc>
-          <w:tcPr>
-            <w:tcW w:type="dxa" w:w="3324"/>
-          </w:tcPr>
-          <w:p>
-            <w:r>
-              <w:rPr>
-                <w:sz w:val="17"/>
-              </w:rPr>
-              <w:t>Workflow 2: queue, proposal, plans, scans, changed sheets with versions, extra fabric, ship-by moves, the Factories screen; workflow 8 on the customer order (the conversation that replaces the WhatsApp thread).</w:t>
-            </w:r>
-          </w:p>
-        </w:tc>
-        <w:tc>
-          <w:tcPr>
-            <w:tcW w:type="dxa" w:w="3324"/>
-          </w:tcPr>
-          <w:p>
-            <w:r>
-              <w:rPr>
-                <w:sz w:val="17"/>
-              </w:rPr>
-              <w:t>A planner and every MTM factory's merchandiser work from these screens for real orders; the WhatsApp thread for allocation and extra cloth is no longer the record.</w:t>
-            </w:r>
-          </w:p>
-        </w:tc>
-      </w:tr>
-      <w:tr>
-        <w:tc>
-          <w:tcPr>
-            <w:tcW w:type="dxa" w:w="3324"/>
-          </w:tcPr>
-          <w:p>
-            <w:r>
-              <w:rPr>
-                <w:sz w:val="17"/>
-              </w:rPr>
-              <w:t>2. The store floor</w:t>
-            </w:r>
-          </w:p>
-        </w:tc>
-        <w:tc>
-          <w:tcPr>
-            <w:tcW w:type="dxa" w:w="3324"/>
-          </w:tcPr>
-          <w:p>
-            <w:r>
-              <w:rPr>
-                <w:sz w:val="17"/>
-              </w:rPr>
-              <w:t>Workflow 1: bills with fit profiles, trial and express, comments, sheet corrections as versions, cases, the ladder, credit notes, refund approval. Bespoke fabrics gated on the mill's last report.</w:t>
-            </w:r>
-          </w:p>
-        </w:tc>
-        <w:tc>
-          <w:tcPr>
-            <w:tcW w:type="dxa" w:w="3324"/>
-          </w:tcPr>
-          <w:p>
-            <w:r>
-              <w:rPr>
-                <w:sz w:val="17"/>
-              </w:rPr>
-              <w:t>A handful of pilot stores run returns and alterations here instead of Slack; store credit has one ledger.</w:t>
-            </w:r>
-          </w:p>
-        </w:tc>
-      </w:tr>
-      <w:tr>
-        <w:tc>
-          <w:tcPr>
-            <w:tcW w:type="dxa" w:w="3324"/>
-          </w:tcPr>
-          <w:p>
-            <w:r>
-              <w:rPr>
-                <w:sz w:val="17"/>
-              </w:rPr>
-              <w:t>3. The fabric, from requirement to live online</w:t>
-            </w:r>
-          </w:p>
-        </w:tc>
-        <w:tc>
-          <w:tcPr>
-            <w:tcW w:type="dxa" w:w="3324"/>
-          </w:tcPr>
-          <w:p>
-            <w:r>
-              <w:rPr>
-                <w:sz w:val="17"/>
-              </w:rPr>
-              <w:t>Workflows 3 to 7: the five-state record, the sourcing desk, the vendor card and Push PO, the receiving line, designs with variants pushed to Enigma, names, go live online; the fabric master as Enigma's fabric DB; the mills as Enigma's vendor master; purchase orders auto and by hand; the weekly core review; the swatch desk to the handover (workflow 7).</w:t>
-            </w:r>
-          </w:p>
-        </w:tc>
-        <w:tc>
-          <w:tcPr>
-            <w:tcW w:type="dxa" w:w="3324"/>
-          </w:tcPr>
-          <w:p>
-            <w:r>
-              <w:rPr>
-                <w:sz w:val="17"/>
-              </w:rPr>
-              <w:t>Ten fabrics run from raised to live online without the swatch tracker sheet or a hand-typed Enigma datasheet; the international-fabric spreadsheet is retired.</w:t>
-            </w:r>
-          </w:p>
-        </w:tc>
-      </w:tr>
-      <w:tr>
-        <w:tc>
-          <w:tcPr>
-            <w:tcW w:type="dxa" w:w="3324"/>
-          </w:tcPr>
-          <w:p>
-            <w:r>
-              <w:rPr>
-                <w:sz w:val="17"/>
-              </w:rPr>
-              <w:t>4. The warehouse portal</w:t>
-            </w:r>
-          </w:p>
-        </w:tc>
-        <w:tc>
-          <w:tcPr>
-            <w:tcW w:type="dxa" w:w="3324"/>
-          </w:tcPr>
-          <w:p>
-            <w:r>
-              <w:rPr>
-                <w:sz w:val="17"/>
-              </w:rPr>
-              <w:t>Vehicle round, fabric rolls on the portal, bespoke mill list and parcels, GRN register, bundles out, extra fabric out, the rest of the swatch desk (cut, sticker, dispatch, photos, stores told), books and fit samples.</w:t>
-            </w:r>
-          </w:p>
-        </w:tc>
-        <w:tc>
-          <w:tcPr>
-            <w:tcW w:type="dxa" w:w="3324"/>
-          </w:tcPr>
-          <w:p>
-            <w:r>
-              <w:rPr>
-                <w:sz w:val="17"/>
-              </w:rPr>
-              <w:t>A fabric receipt updates saleable stock everywhere within the day; every receipt has a GRN.</w:t>
-            </w:r>
-          </w:p>
-        </w:tc>
-      </w:tr>
-      <w:tr>
-        <w:tc>
-          <w:tcPr>
-            <w:tcW w:type="dxa" w:w="3324"/>
-          </w:tcPr>
-          <w:p>
-            <w:r>
-              <w:rPr>
-                <w:sz w:val="17"/>
-              </w:rPr>
-              <w:t>5. Writing into Enigma, and the edges</w:t>
-            </w:r>
-          </w:p>
-        </w:tc>
-        <w:tc>
-          <w:tcPr>
-            <w:tcW w:type="dxa" w:w="3324"/>
-          </w:tcPr>
-          <w:p>
-            <w:r>
-              <w:rPr>
-                <w:sz w:val="17"/>
-              </w:rPr>
-              <w:t>Write-back where agreed (fabric and inventory edits, POs and receiving, vendors, designs, on-hold, order sheets); narrow layouts; every rule marked later; stickers and barcodes; the daily closing report.</w:t>
-            </w:r>
-          </w:p>
-        </w:tc>
-        <w:tc>
-          <w:tcPr>
-            <w:tcW w:type="dxa" w:w="3324"/>
-          </w:tcPr>
-          <w:p>
-            <w:r>
-              <w:rPr>
-                <w:sz w:val="17"/>
-              </w:rPr>
-              <w:t>Each write-back verified against Enigma for a week; the later list empty or re-planned.</w:t>
-            </w:r>
-          </w:p>
-        </w:tc>
-      </w:tr>
-    </w:tbl>
-    <w:p/>
-    <w:p>
-      <w:pPr>
-        <w:pStyle w:val="Heading2"/>
-      </w:pPr>
-      <w:r>
-        <w:t>17. Open questions and assumptions</w:t>
-      </w:r>
-    </w:p>
-    <w:p>
-      <w:pPr>
-        <w:pStyle w:val="ListBullet"/>
-      </w:pPr>
-      <w:r>
-        <w:t>Enigma write access per module: fabric info and attributes, inventory and adjustments, fabric PO and Update Receiving Status, vendors, designs and variants, on-hold, order sheet. Decides how much stays "recorded".</w:t>
-      </w:r>
-    </w:p>
-    <w:p>
-      <w:pPr>
-        <w:pStyle w:val="ListBullet"/>
-      </w:pPr>
-      <w:r>
-        <w:t>A change filter or feed on the fabric read; a date or code range on the transaction log.</w:t>
-      </w:r>
-    </w:p>
-    <w:p>
-      <w:pPr>
-        <w:pStyle w:val="ListBullet"/>
-      </w:pPr>
-      <w:r>
-        <w:t>Whether Enigma's auto-PO threshold and Is Auto Replenishment are one flag or two, and whether BSC PLM may edit the threshold.</w:t>
-      </w:r>
-    </w:p>
-    <w:p>
-      <w:pPr>
-        <w:pStyle w:val="ListBullet"/>
-      </w:pPr>
-      <w:r>
-        <w:t>Whether the warehouse books rolls on the PO line in BSC PLM in phase 3, or in Enigma with the number copied, until the portal arrives in phase 4.</w:t>
-      </w:r>
-    </w:p>
-    <w:p>
-      <w:pPr>
-        <w:pStyle w:val="ListBullet"/>
-      </w:pPr>
-      <w:r>
-        <w:t>The variant option set Enigma accepts (free text, or a fixed Size list) and whether a discounted price per variant is a field or a rule.</w:t>
-      </w:r>
-    </w:p>
-    <w:p>
-      <w:pPr>
-        <w:pStyle w:val="ListBullet"/>
-      </w:pPr>
-      <w:r>
-        <w:t>Who owns Big-Checked and composition family in Enigma today (fabric attribute or product flag) — this document puts them on the fabric.</w:t>
-      </w:r>
-    </w:p>
-    <w:p>
-      <w:pPr>
-        <w:pStyle w:val="ListBullet"/>
-      </w:pPr>
-      <w:r>
-        <w:t>Whether a required reason on Reject and a later-than-before check on Extend should block.</w:t>
-      </w:r>
-    </w:p>
-    <w:p>
-      <w:pPr>
-        <w:pStyle w:val="ListBullet"/>
-      </w:pPr>
-      <w:r>
-        <w:t>Bespoke: the promised date against the MTM default, and where the daily mill list lives until the warehouse portal (phase 4).</w:t>
-      </w:r>
-    </w:p>
-    <w:p>
-      <w:pPr>
-        <w:pStyle w:val="ListBullet"/>
-      </w:pPr>
-      <w:r>
-        <w:t>Store: where store credit lives today (Shopify gift card, Enigma, nowhere); store-only fabrics that never go online.</w:t>
-      </w:r>
-    </w:p>
-    <w:p>
-      <w:pPr>
-        <w:pStyle w:val="ListBullet"/>
-      </w:pPr>
-      <w:r>
-        <w:t>Production: cap extra-fabric metres at the panel allowance; the freeze window length (2 hours placed).</w:t>
-      </w:r>
-    </w:p>
-    <w:p>
-      <w:r>
-        <w:t>Assumed until confirmed: metres per shirt 2.15; the reorder point and MOQ rule as section 7; the fit-sample set; the trim master costs; the vendor hold windows per mill.</w:t>
-      </w:r>
-    </w:p>
-    <w:p>
-      <w:r>
-        <w:rPr>
-          <w:b/>
-        </w:rPr>
-        <w:t xml:space="preserve">Deliberately out of scope. </w:t>
-      </w:r>
-      <w:r>
-        <w:t>Everything ready-to-wear; several-options requests; FOB; costing, margin, working capital; customer marketing; store checklists; the MTM visualiser; escalations as a workflow.</w:t>
-      </w:r>
-    </w:p>
     <w:sectPr>
       <w:pgSz w:w="12240" w:h="15840"/>
       <w:pgMar w:top="1134" w:right="1134" w:bottom="1134" w:left="1134" w:header="720" w:footer="720" w:gutter="0"/>

</xml_diff>

<commit_message>
Production review 21 Oct: order sheet locked once production starts (logistics remark only, repunch for measurements); bespoke extra fabric routed to Shravani for a PO; washed fabric books usable metres; PRD updated, alteration/hemming extra fabric noted as pending
Co-Authored-By: Claude Opus 5.5 <noreply@anthropic.com>
</commit_message>
<xml_diff>
--- a/public/docs/bsc-plm-prd-mtm-v1.0.docx
+++ b/public/docs/bsc-plm-prd-mtm-v1.0.docx
@@ -1360,7 +1360,7 @@
                 <w:color w:val="1A1A1A"/>
                 <w:sz w:val="17"/>
               </w:rPr>
-              <w:t>Fabric Name, Inventory Type, Category, Product Type, Fabric Code, On Hold; Vendor Information (Vendor Name, Vendor Code for fabric, Mill Country, Mill Description, Currency, Cost per Unit, TAT in hours, MOQ, Mills); the Dynamic Attributes for shirts (Panna, Big-Checked, Thread Count, Fabric Ply, Wrinkle Resistance, Stretch, Consumed_In, Construction, Composition family, Washed Fabric, Washcare Description, Weight Class, Weave Description, Pattern, Fabric Color, Contrast Fabric, Fabric Piping, Is_Cutroll, Is_uniform, Weave, Composition); fabric image</w:t>
+              <w:t>Fabric Name, Inventory Type, Category, Product Type, Fabric Code, On Hold; Vendor Information (Vendor Name, Vendor Code for fabric, Mill Country, Mill Description, Currency, Cost per Unit, TAT in hours, MOQ, Mills); the Dynamic Attributes for shirts (Panna, Big-Checked, Thread Count, Fabric Ply, Wrinkle Resistance, Stretch, Consumed_In, Construction, Composition family, Washed Fabric, Wash shrinkage %, Washcare Description, Weight Class, Weave Description, Pattern, Fabric Color, Contrast Fabric, Fabric Piping, Is_Cutroll, Is_uniform, Weave, Composition); fabric image</w:t>
             </w:r>
           </w:p>
         </w:tc>
@@ -3553,7 +3553,7 @@
                 <w:color w:val="1A1A1A"/>
                 <w:sz w:val="17"/>
               </w:rPr>
-              <w:t>1. The sheet is Enigma's layout: measurements, pattern details, options. Every field that can be corrected is a dashed tile with a pencil on hover and a chip "click any field to correct it".</w:t>
+              <w:t>1. The sheet is Enigma's layout: measurements, pattern details, options, headed Order sheet · V1 · as punched, then V2 · changed once.</w:t>
             </w:r>
           </w:p>
           <w:p>
@@ -3566,57 +3566,33 @@
                 <w:color w:val="1A1A1A"/>
                 <w:sz w:val="17"/>
               </w:rPr>
-              <w:t>2. The associate clicks the field, types the correction and why, and saves. The sheet heading reads Order sheet · V1 · as punched, then V2 · changed once, V3 · changed 2 times; the change log shows the version each change produced.</w:t>
-            </w:r>
-          </w:p>
-        </w:tc>
-        <w:tc>
-          <w:tcPr>
-            <w:tcW w:type="dxa" w:w="1624"/>
-            <w:tcBorders>
-              <w:bottom w:val="single" w:sz="4" w:color="E5E5E5"/>
-              <w:top w:val="nil"/>
-              <w:left w:val="nil"/>
-              <w:right w:val="nil"/>
-            </w:tcBorders>
-          </w:tcPr>
-          <w:p>
-            <w:pPr>
-              <w:spacing w:before="0" w:after="40"/>
-            </w:pPr>
-            <w:r/>
+              <w:t>2. Before production starts (the piece is still an order or in PP) every field that can be corrected is a dashed tile with a pencil on hover. The associate clicks the field, types the correction and why, and saves.</w:t>
+            </w:r>
+          </w:p>
+          <w:p>
+            <w:pPr>
+              <w:spacing w:before="0" w:after="40"/>
+            </w:pPr>
             <w:r>
               <w:rPr>
                 <w:rFonts w:ascii="Inter Tight" w:hAnsi="Inter Tight" w:cs="Inter Tight" w:eastAsia="Inter Tight"/>
                 <w:color w:val="1A1A1A"/>
                 <w:sz w:val="17"/>
               </w:rPr>
-              <w:t>typed</w:t>
-            </w:r>
-          </w:p>
-        </w:tc>
-        <w:tc>
-          <w:tcPr>
-            <w:tcW w:type="dxa" w:w="1624"/>
-            <w:tcBorders>
-              <w:bottom w:val="single" w:sz="4" w:color="E5E5E5"/>
-              <w:top w:val="nil"/>
-              <w:left w:val="nil"/>
-              <w:right w:val="nil"/>
-            </w:tcBorders>
-          </w:tcPr>
-          <w:p>
-            <w:pPr>
-              <w:spacing w:before="0" w:after="40"/>
-            </w:pPr>
-            <w:r/>
+              <w:t>3. Once production starts (the piece is on a plan) measurements and styling are locked and there are no free-form change remarks. Only a logistics remark can change: ship to the store or to the customer's home, hold for collection.</w:t>
+            </w:r>
+          </w:p>
+          <w:p>
+            <w:pPr>
+              <w:spacing w:before="0" w:after="40"/>
+            </w:pPr>
             <w:r>
               <w:rPr>
                 <w:rFonts w:ascii="Inter Tight" w:hAnsi="Inter Tight" w:cs="Inter Tight" w:eastAsia="Inter Tight"/>
                 <w:color w:val="1A1A1A"/>
                 <w:sz w:val="17"/>
               </w:rPr>
-              <w:t>anything until the piece is allocated; remarks only after; nothing once made</w:t>
+              <w:t>4. If the measurements must change after that, the associate clicks Repunch with new measurements: the piece is cancelled and a new order (same customer, fabric and sheet, number suffixed -R) is punched for them to correct.</w:t>
             </w:r>
           </w:p>
         </w:tc>
@@ -3641,7 +3617,57 @@
                 <w:color w:val="1A1A1A"/>
                 <w:sz w:val="17"/>
               </w:rPr>
-              <w:t>production sees it on Changed sheets; the factory sees the amended version flagged for reprint, and the warning says which version the factory holds</w:t>
+              <w:t>typed</w:t>
+            </w:r>
+          </w:p>
+        </w:tc>
+        <w:tc>
+          <w:tcPr>
+            <w:tcW w:type="dxa" w:w="1624"/>
+            <w:tcBorders>
+              <w:bottom w:val="single" w:sz="4" w:color="E5E5E5"/>
+              <w:top w:val="nil"/>
+              <w:left w:val="nil"/>
+              <w:right w:val="nil"/>
+            </w:tcBorders>
+          </w:tcPr>
+          <w:p>
+            <w:pPr>
+              <w:spacing w:before="0" w:after="40"/>
+            </w:pPr>
+            <w:r/>
+            <w:r>
+              <w:rPr>
+                <w:rFonts w:ascii="Inter Tight" w:hAnsi="Inter Tight" w:cs="Inter Tight" w:eastAsia="Inter Tight"/>
+                <w:color w:val="1A1A1A"/>
+                <w:sz w:val="17"/>
+              </w:rPr>
+              <w:t>edit only before production starts; logistics remark only after; nothing once made</w:t>
+            </w:r>
+          </w:p>
+        </w:tc>
+        <w:tc>
+          <w:tcPr>
+            <w:tcW w:type="dxa" w:w="1624"/>
+            <w:tcBorders>
+              <w:bottom w:val="single" w:sz="4" w:color="E5E5E5"/>
+              <w:top w:val="nil"/>
+              <w:left w:val="nil"/>
+              <w:right w:val="nil"/>
+            </w:tcBorders>
+          </w:tcPr>
+          <w:p>
+            <w:pPr>
+              <w:spacing w:before="0" w:after="40"/>
+            </w:pPr>
+            <w:r/>
+            <w:r>
+              <w:rPr>
+                <w:rFonts w:ascii="Inter Tight" w:hAnsi="Inter Tight" w:cs="Inter Tight" w:eastAsia="Inter Tight"/>
+                <w:color w:val="1A1A1A"/>
+                <w:sz w:val="17"/>
+              </w:rPr>
+              <w:t>a correction before production lands on the record as the next version; a repunch cancels the old piece (its cloth released if not cut, spent if cut) and puts the new one in the queue</w:t>
             </w:r>
           </w:p>
         </w:tc>
@@ -5250,7 +5276,7 @@
                 <w:color w:val="1A1A1A"/>
                 <w:sz w:val="17"/>
               </w:rPr>
-              <w:t>A sheet changes after planning · store, production, factory</w:t>
+              <w:t>A change after production starts · store, production, factory</w:t>
             </w:r>
           </w:p>
         </w:tc>
@@ -5275,7 +5301,7 @@
                 <w:color w:val="1A1A1A"/>
                 <w:sz w:val="17"/>
               </w:rPr>
-              <w:t>1. The store's correction becomes Amend, re-issue to factory once planned. Changed sheets shows the amendment with the changed fields; Acknowledged, plan on this (not yet allocated), Told factory (already at a factory), or Pull back to PP on a fabric change.</w:t>
+              <w:t>1. Once a piece is on a plan no measurement or styling change reaches the factory. The reason: remarks arriving at arbitrary points get missed and leave the factory accountable for a change it could not make.</w:t>
             </w:r>
           </w:p>
           <w:p>
@@ -5288,57 +5314,33 @@
                 <w:color w:val="1A1A1A"/>
                 <w:sz w:val="17"/>
               </w:rPr>
-              <w:t>2. The factory portal lists it under Changed after it reached us with the version; the merchandiser reprints and clicks Acknowledged. Acknowledged is pressed after acting on the change, not on reading it.</w:t>
-            </w:r>
-          </w:p>
-        </w:tc>
-        <w:tc>
-          <w:tcPr>
-            <w:tcW w:type="dxa" w:w="1624"/>
-            <w:tcBorders>
-              <w:bottom w:val="single" w:sz="4" w:color="E5E5E5"/>
-              <w:top w:val="nil"/>
-              <w:left w:val="nil"/>
-              <w:right w:val="nil"/>
-            </w:tcBorders>
-          </w:tcPr>
-          <w:p>
-            <w:pPr>
-              <w:spacing w:before="0" w:after="40"/>
-            </w:pPr>
-            <w:r/>
+              <w:t>2. A logistics remark (where it ships) shows on the order and the shipping team reads it; nothing is re-issued to the factory.</w:t>
+            </w:r>
+          </w:p>
+          <w:p>
+            <w:pPr>
+              <w:spacing w:before="0" w:after="40"/>
+            </w:pPr>
             <w:r>
               <w:rPr>
                 <w:rFonts w:ascii="Inter Tight" w:hAnsi="Inter Tight" w:cs="Inter Tight" w:eastAsia="Inter Tight"/>
                 <w:color w:val="1A1A1A"/>
                 <w:sz w:val="17"/>
               </w:rPr>
-              <w:t>typed</w:t>
-            </w:r>
-          </w:p>
-        </w:tc>
-        <w:tc>
-          <w:tcPr>
-            <w:tcW w:type="dxa" w:w="1624"/>
-            <w:tcBorders>
-              <w:bottom w:val="single" w:sz="4" w:color="E5E5E5"/>
-              <w:top w:val="nil"/>
-              <w:left w:val="nil"/>
-              <w:right w:val="nil"/>
-            </w:tcBorders>
-          </w:tcPr>
-          <w:p>
-            <w:pPr>
-              <w:spacing w:before="0" w:after="40"/>
-            </w:pPr>
-            <w:r/>
+              <w:t>3. A measurement change is a repunch by the store (1.4). If the piece is planned but the cloth is not yet cut, production can pull it back to PP instead.</w:t>
+            </w:r>
+          </w:p>
+          <w:p>
+            <w:pPr>
+              <w:spacing w:before="0" w:after="40"/>
+            </w:pPr>
             <w:r>
               <w:rPr>
                 <w:rFonts w:ascii="Inter Tight" w:hAnsi="Inter Tight" w:cs="Inter Tight" w:eastAsia="Inter Tight"/>
                 <w:color w:val="1A1A1A"/>
                 <w:sz w:val="17"/>
               </w:rPr>
-              <w:t>store freely until allocation, remarks after, nothing once made; production freely until planning; amendments flagged for reprint in transit or in factory</w:t>
+              <w:t>4. Changes made before planning appear on Changed sheets; production clicks Acknowledged once it has acted on them.</w:t>
             </w:r>
           </w:p>
         </w:tc>
@@ -5363,7 +5365,57 @@
                 <w:color w:val="1A1A1A"/>
                 <w:sz w:val="17"/>
               </w:rPr>
-              <w:t>a numbered version with who, from, to, reprint flag, when production and the factory acknowledged it</w:t>
+              <w:t>typed</w:t>
+            </w:r>
+          </w:p>
+        </w:tc>
+        <w:tc>
+          <w:tcPr>
+            <w:tcW w:type="dxa" w:w="1624"/>
+            <w:tcBorders>
+              <w:bottom w:val="single" w:sz="4" w:color="E5E5E5"/>
+              <w:top w:val="nil"/>
+              <w:left w:val="nil"/>
+              <w:right w:val="nil"/>
+            </w:tcBorders>
+          </w:tcPr>
+          <w:p>
+            <w:pPr>
+              <w:spacing w:before="0" w:after="40"/>
+            </w:pPr>
+            <w:r/>
+            <w:r>
+              <w:rPr>
+                <w:rFonts w:ascii="Inter Tight" w:hAnsi="Inter Tight" w:cs="Inter Tight" w:eastAsia="Inter Tight"/>
+                <w:color w:val="1A1A1A"/>
+                <w:sz w:val="17"/>
+              </w:rPr>
+              <w:t>whether the cloth is cut is today a manual check with the factory; how that becomes a system rule is still to settle with Parag</w:t>
+            </w:r>
+          </w:p>
+        </w:tc>
+        <w:tc>
+          <w:tcPr>
+            <w:tcW w:type="dxa" w:w="1624"/>
+            <w:tcBorders>
+              <w:bottom w:val="single" w:sz="4" w:color="E5E5E5"/>
+              <w:top w:val="nil"/>
+              <w:left w:val="nil"/>
+              <w:right w:val="nil"/>
+            </w:tcBorders>
+          </w:tcPr>
+          <w:p>
+            <w:pPr>
+              <w:spacing w:before="0" w:after="40"/>
+            </w:pPr>
+            <w:r/>
+            <w:r>
+              <w:rPr>
+                <w:rFonts w:ascii="Inter Tight" w:hAnsi="Inter Tight" w:cs="Inter Tight" w:eastAsia="Inter Tight"/>
+                <w:color w:val="1A1A1A"/>
+                <w:sz w:val="17"/>
+              </w:rPr>
+              <w:t>the factory never receives a changed sheet mid-production</w:t>
             </w:r>
           </w:p>
         </w:tc>
@@ -5567,7 +5619,7 @@
                 <w:color w:val="1A1A1A"/>
                 <w:sz w:val="17"/>
               </w:rPr>
-              <w:t>Extra fabric · factory, production</w:t>
+              <w:t>Extra fabric · factory, production, Shravani</w:t>
             </w:r>
           </w:p>
         </w:tc>
@@ -5592,7 +5644,7 @@
                 <w:color w:val="1A1A1A"/>
                 <w:sz w:val="17"/>
               </w:rPr>
-              <w:t>1. The merchandiser asks for extra cloth: cloth, panel (front 0.8 m, both fronts 0.9, sleeve 0.8, both sleeves 0.9, collar 0.3, cuff 0.3), metres, reason (factory error or PP error), note.</w:t>
+              <w:t>1. The merchandiser clicks Ask for extra cloth on a piece: cloth, panel (front 0.8 m, both fronts 0.9, sleeve 0.8, both sleeves 0.9, collar 0.3, cuff 0.3), metres, reason (factory error or PP error), note.</w:t>
             </w:r>
           </w:p>
           <w:p>
@@ -5605,32 +5657,20 @@
                 <w:color w:val="1A1A1A"/>
                 <w:sz w:val="17"/>
               </w:rPr>
-              <w:t>2. Production sees the shelf before and after; Approve or Decline with a note.</w:t>
-            </w:r>
-          </w:p>
-        </w:tc>
-        <w:tc>
-          <w:tcPr>
-            <w:tcW w:type="dxa" w:w="1624"/>
-            <w:tcBorders>
-              <w:bottom w:val="single" w:sz="4" w:color="E5E5E5"/>
-              <w:top w:val="nil"/>
-              <w:left w:val="nil"/>
-              <w:right w:val="nil"/>
-            </w:tcBorders>
-          </w:tcPr>
-          <w:p>
-            <w:pPr>
-              <w:spacing w:before="0" w:after="40"/>
-            </w:pPr>
-            <w:r/>
+              <w:t>2. Production (Swati) sees each ask with the shelf before and after. If the cloth is on the shelf: Approve or Decline with a note; approval deducts the metres.</w:t>
+            </w:r>
+          </w:p>
+          <w:p>
+            <w:pPr>
+              <w:spacing w:before="0" w:after="40"/>
+            </w:pPr>
             <w:r>
               <w:rPr>
                 <w:rFonts w:ascii="Inter Tight" w:hAnsi="Inter Tight" w:cs="Inter Tight" w:eastAsia="Inter Tight"/>
                 <w:color w:val="1A1A1A"/>
                 <w:sz w:val="17"/>
               </w:rPr>
-              <w:t>typed</w:t>
+              <w:t>3. If the cloth is bespoke, or the shelf does not cover it, even a small shortfall needs a PO with the mill. Production clicks Send to Shravani for a PO; the ask reads "with Shravani · PO". Shravani raises the PO with the mill (PO raised with the mill), and when the cloth is in (Cloth in · back to approval) the ask returns to production to approve as usual.</w:t>
             </w:r>
           </w:p>
         </w:tc>
@@ -5655,7 +5695,7 @@
                 <w:color w:val="1A1A1A"/>
                 <w:sz w:val="17"/>
               </w:rPr>
-              <w:t>the order needs a fabric and a factory; later capped at the panel allowance</w:t>
+              <w:t>typed; PO number from the mill PO</w:t>
             </w:r>
           </w:p>
         </w:tc>
@@ -5680,6 +5720,31 @@
                 <w:color w:val="1A1A1A"/>
                 <w:sz w:val="17"/>
               </w:rPr>
+              <w:t>the order needs a fabric and a factory; later capped at the panel allowance; the bespoke routing is proposed, not final</w:t>
+            </w:r>
+          </w:p>
+        </w:tc>
+        <w:tc>
+          <w:tcPr>
+            <w:tcW w:type="dxa" w:w="1624"/>
+            <w:tcBorders>
+              <w:bottom w:val="single" w:sz="4" w:color="E5E5E5"/>
+              <w:top w:val="nil"/>
+              <w:left w:val="nil"/>
+              <w:right w:val="nil"/>
+            </w:tcBorders>
+          </w:tcPr>
+          <w:p>
+            <w:pPr>
+              <w:spacing w:before="0" w:after="40"/>
+            </w:pPr>
+            <w:r/>
+            <w:r>
+              <w:rPr>
+                <w:rFonts w:ascii="Inter Tight" w:hAnsi="Inter Tight" w:cs="Inter Tight" w:eastAsia="Inter Tight"/>
+                <w:color w:val="1A1A1A"/>
+                <w:sz w:val="17"/>
+              </w:rPr>
               <w:t>approval deducts the metres at once; factory errors count on the vendor, PP errors on the consumption rule</w:t>
             </w:r>
           </w:p>
@@ -5839,6 +5904,25 @@
       </w:tr>
     </w:tbl>
     <w:p/>
+    <w:p>
+      <w:r>
+        <w:rPr>
+          <w:rFonts w:ascii="Inter Tight" w:hAnsi="Inter Tight" w:cs="Inter Tight" w:eastAsia="Inter Tight"/>
+          <w:b/>
+          <w:color w:val="0A0A0A"/>
+          <w:sz w:val="20"/>
+        </w:rPr>
+        <w:t xml:space="preserve">Alteration and hemming unit. </w:t>
+      </w:r>
+      <w:r>
+        <w:rPr>
+          <w:rFonts w:ascii="Inter Tight" w:hAnsi="Inter Tight" w:cs="Inter Tight" w:eastAsia="Inter Tight"/>
+          <w:color w:val="1A1A1A"/>
+          <w:sz w:val="20"/>
+        </w:rPr>
+        <w:t>Extra fabric for the alteration and hemming unit is to be logged in the same way, for example cloth for a part replacement, or collars and cuffs sent to a store to attach (CCP alterations). The unit is a requester of cloth, not only a destination for orders. The exact request, approval and stock steps are still to be agreed with Parag before this is built.</w:t>
+      </w:r>
+    </w:p>
     <w:p>
       <w:r>
         <w:rPr>
@@ -9147,32 +9231,20 @@
                 <w:color w:val="1A1A1A"/>
                 <w:sz w:val="17"/>
               </w:rPr>
-              <w:t>4. The same line is on Purchase orders (workflow 4).</w:t>
-            </w:r>
-          </w:p>
-        </w:tc>
-        <w:tc>
-          <w:tcPr>
-            <w:tcW w:type="dxa" w:w="1624"/>
-            <w:tcBorders>
-              <w:bottom w:val="single" w:sz="4" w:color="E5E5E5"/>
-              <w:top w:val="nil"/>
-              <w:left w:val="nil"/>
-              <w:right w:val="nil"/>
-            </w:tcBorders>
-          </w:tcPr>
-          <w:p>
-            <w:pPr>
-              <w:spacing w:before="0" w:after="40"/>
-            </w:pPr>
-            <w:r/>
+              <w:t>4. Washed fabric: the GRN records the metres received, and the shelf books the usable metres after washing (100 m received at 5% shrinkage books 95 m). The difference is a WASH line in the fabric's transactions.</w:t>
+            </w:r>
+          </w:p>
+          <w:p>
+            <w:pPr>
+              <w:spacing w:before="0" w:after="40"/>
+            </w:pPr>
             <w:r>
               <w:rPr>
                 <w:rFonts w:ascii="Inter Tight" w:hAnsi="Inter Tight" w:cs="Inter Tight" w:eastAsia="Inter Tight"/>
                 <w:color w:val="1A1A1A"/>
                 <w:sz w:val="17"/>
               </w:rPr>
-              <w:t>PO from 6.3; metres counted</w:t>
+              <w:t>5. The same line is on Purchase orders (workflow 4).</w:t>
             </w:r>
           </w:p>
         </w:tc>
@@ -9197,7 +9269,7 @@
                 <w:color w:val="1A1A1A"/>
                 <w:sz w:val="17"/>
               </w:rPr>
-              <w:t>metres received never above pending</w:t>
+              <w:t>PO from 6.3; metres counted; wash shrinkage from the fabric's attributes</w:t>
             </w:r>
           </w:p>
         </w:tc>
@@ -9222,7 +9294,32 @@
                 <w:color w:val="1A1A1A"/>
                 <w:sz w:val="17"/>
               </w:rPr>
-              <w:t>the shelf goes up and incoming down on every update; when the line is received or closed the record moves to state 4 · Fabric in</w:t>
+              <w:t>metres received never above pending; shrinkage applies only to fabrics marked Washed Fabric</w:t>
+            </w:r>
+          </w:p>
+        </w:tc>
+        <w:tc>
+          <w:tcPr>
+            <w:tcW w:type="dxa" w:w="1624"/>
+            <w:tcBorders>
+              <w:bottom w:val="single" w:sz="4" w:color="E5E5E5"/>
+              <w:top w:val="nil"/>
+              <w:left w:val="nil"/>
+              <w:right w:val="nil"/>
+            </w:tcBorders>
+          </w:tcPr>
+          <w:p>
+            <w:pPr>
+              <w:spacing w:before="0" w:after="40"/>
+            </w:pPr>
+            <w:r/>
+            <w:r>
+              <w:rPr>
+                <w:rFonts w:ascii="Inter Tight" w:hAnsi="Inter Tight" w:cs="Inter Tight" w:eastAsia="Inter Tight"/>
+                <w:color w:val="1A1A1A"/>
+                <w:sz w:val="17"/>
+              </w:rPr>
+              <w:t>the shelf goes up by the usable metres and incoming down by what arrived; when the line is received or closed the record moves to state 4 · Fabric in</w:t>
             </w:r>
           </w:p>
         </w:tc>
@@ -11963,7 +12060,7 @@
                 <w:color w:val="5C6066"/>
                 <w:sz w:val="15"/>
               </w:rPr>
-              <w:t>MTM production</w:t>
+              <w:t>Extra fabric</w:t>
             </w:r>
           </w:p>
         </w:tc>
@@ -11988,7 +12085,7 @@
                 <w:color w:val="1A1A1A"/>
                 <w:sz w:val="17"/>
               </w:rPr>
-              <w:t>A piece joins the queue after the freeze window. A plan over headroom is refused unless forced, and forcing is recorded with the name. Urgent sets ship-by to punch + 2 days. Scan-out deducts metres from stock and reserved. A bespoke piece is never planned before its parcel is in. A ship-by move needs a reason.</w:t>
+              <w:t>Approval from the shelf deducts the metres at once. Bespoke cloth, or a shortfall the shelf cannot cover, goes to Shravani for a PO with the mill and returns to production to approve when the cloth is in (proposed, not final). Extra fabric for the alteration and hemming unit (part replacement; collar or cuff sent to a store to attach) is to be logged too; its request, approval and stock steps are still to settle with Parag.</w:t>
             </w:r>
           </w:p>
         </w:tc>
@@ -12015,7 +12112,7 @@
                 <w:color w:val="5C6066"/>
                 <w:sz w:val="15"/>
               </w:rPr>
-              <w:t>Sheet changes</w:t>
+              <w:t>Washed fabric</w:t>
             </w:r>
           </w:p>
         </w:tc>
@@ -12040,7 +12137,111 @@
                 <w:color w:val="1A1A1A"/>
                 <w:sz w:val="17"/>
               </w:rPr>
-              <w:t>Store: freely until allocation, remarks only after, nothing once made. Production: freely until planning; amendments flagged for reprint in transit or in factory. Each change makes the next version (V2, V3); the factory's held version is shown until re-issued.</w:t>
+              <w:t>Only fabrics marked Washed Fabric shrink. Stock books the usable metres after washing (received × (1 − shrinkage)); the GRN keeps the metres received. Who records the wash and the resulting metres is still to settle with Parag.</w:t>
+            </w:r>
+          </w:p>
+        </w:tc>
+      </w:tr>
+      <w:tr>
+        <w:tc>
+          <w:tcPr>
+            <w:tcW w:type="dxa" w:w="4873"/>
+            <w:tcBorders>
+              <w:bottom w:val="single" w:sz="4" w:color="E5E5E5"/>
+              <w:top w:val="nil"/>
+              <w:left w:val="nil"/>
+              <w:right w:val="nil"/>
+            </w:tcBorders>
+          </w:tcPr>
+          <w:p>
+            <w:pPr>
+              <w:spacing w:before="0" w:after="40"/>
+            </w:pPr>
+            <w:r/>
+            <w:r>
+              <w:rPr>
+                <w:rFonts w:ascii="JetBrains Mono" w:hAnsi="JetBrains Mono" w:cs="JetBrains Mono" w:eastAsia="JetBrains Mono"/>
+                <w:color w:val="5C6066"/>
+                <w:sz w:val="15"/>
+              </w:rPr>
+              <w:t>MTM production</w:t>
+            </w:r>
+          </w:p>
+        </w:tc>
+        <w:tc>
+          <w:tcPr>
+            <w:tcW w:type="dxa" w:w="4873"/>
+            <w:tcBorders>
+              <w:bottom w:val="single" w:sz="4" w:color="E5E5E5"/>
+              <w:top w:val="nil"/>
+              <w:left w:val="nil"/>
+              <w:right w:val="nil"/>
+            </w:tcBorders>
+          </w:tcPr>
+          <w:p>
+            <w:pPr>
+              <w:spacing w:before="0" w:after="40"/>
+            </w:pPr>
+            <w:r/>
+            <w:r>
+              <w:rPr>
+                <w:rFonts w:ascii="Inter Tight" w:hAnsi="Inter Tight" w:cs="Inter Tight" w:eastAsia="Inter Tight"/>
+                <w:color w:val="1A1A1A"/>
+                <w:sz w:val="17"/>
+              </w:rPr>
+              <w:t>A piece joins the queue after the freeze window. A plan over headroom is refused unless forced, and forcing is recorded with the name. Urgent sets ship-by to punch + 2 days. Scan-out deducts metres from stock and reserved. A bespoke piece is never planned before its parcel is in. A ship-by move needs a reason.</w:t>
+            </w:r>
+          </w:p>
+        </w:tc>
+      </w:tr>
+      <w:tr>
+        <w:tc>
+          <w:tcPr>
+            <w:tcW w:type="dxa" w:w="4873"/>
+            <w:tcBorders>
+              <w:bottom w:val="single" w:sz="4" w:color="E5E5E5"/>
+              <w:top w:val="nil"/>
+              <w:left w:val="nil"/>
+              <w:right w:val="nil"/>
+            </w:tcBorders>
+          </w:tcPr>
+          <w:p>
+            <w:pPr>
+              <w:spacing w:before="0" w:after="40"/>
+            </w:pPr>
+            <w:r/>
+            <w:r>
+              <w:rPr>
+                <w:rFonts w:ascii="JetBrains Mono" w:hAnsi="JetBrains Mono" w:cs="JetBrains Mono" w:eastAsia="JetBrains Mono"/>
+                <w:color w:val="5C6066"/>
+                <w:sz w:val="15"/>
+              </w:rPr>
+              <w:t>Sheet changes</w:t>
+            </w:r>
+          </w:p>
+        </w:tc>
+        <w:tc>
+          <w:tcPr>
+            <w:tcW w:type="dxa" w:w="4873"/>
+            <w:tcBorders>
+              <w:bottom w:val="single" w:sz="4" w:color="E5E5E5"/>
+              <w:top w:val="nil"/>
+              <w:left w:val="nil"/>
+              <w:right w:val="nil"/>
+            </w:tcBorders>
+          </w:tcPr>
+          <w:p>
+            <w:pPr>
+              <w:spacing w:before="0" w:after="40"/>
+            </w:pPr>
+            <w:r/>
+            <w:r>
+              <w:rPr>
+                <w:rFonts w:ascii="Inter Tight" w:hAnsi="Inter Tight" w:cs="Inter Tight" w:eastAsia="Inter Tight"/>
+                <w:color w:val="1A1A1A"/>
+                <w:sz w:val="17"/>
+              </w:rPr>
+              <w:t>Before production starts (order or PP) the store and production can correct the sheet; each correction is the next version (V2, V3). Once the piece is on a plan, measurements and styling are locked and there are no free-form change remarks; only a logistics remark (where it ships) can change. A measurement change after that is a repunch: the piece is cancelled and a new order punched. Whether the cloth is cut is a manual check with the factory until a rule is agreed.</w:t>
             </w:r>
           </w:p>
         </w:tc>

</xml_diff>

<commit_message>
MTM PRD: fix the 6.4 back-reference, drop the RTW-only BOM mention, cancellation now includes repunch
Co-Authored-By: Claude Opus 5.5 <noreply@anthropic.com>
</commit_message>
<xml_diff>
--- a/public/docs/bsc-plm-prd-mtm-v1.0.docx
+++ b/public/docs/bsc-plm-prd-mtm-v1.0.docx
@@ -4071,7 +4071,7 @@
           <w:color w:val="1A1A1A"/>
           <w:sz w:val="20"/>
         </w:rPr>
-        <w:t>Order (punched at the store) → PP (waiting for a factory; frozen 2 hours for store-side changes) → PP · planned (on a plan; job card printed; fabric cut) → In production (scanned out of the unit) → In factory (scanned in; aging after 5 days) → Out factory (QC passed) → RTS (back at the unit) → Fitting / shipping → Delivered. Cancelled can happen before cutting.</w:t>
+        <w:t>Order (punched at the store) → PP (waiting for a factory; frozen 2 hours for store-side changes) → PP · planned (on a plan; job card printed; fabric cut) → In production (scanned out of the unit) → In factory (scanned in; aging after 5 days) → Out factory (QC passed) → RTS (back at the unit) → Fitting / shipping → Delivered. Cancelled happens before cutting, or when the store repunches the piece.</w:t>
       </w:r>
     </w:p>
     <w:tbl>
@@ -7219,7 +7219,7 @@
                 <w:color w:val="1A1A1A"/>
                 <w:sz w:val="17"/>
               </w:rPr>
-              <w:t>1. The trims master with stock, threshold, incoming and cost; a BOM line on a requirement reads from it.</w:t>
+              <w:t>1. The trims master with stock, threshold, incoming and cost.</w:t>
             </w:r>
           </w:p>
         </w:tc>
@@ -9115,7 +9115,7 @@
                 <w:color w:val="1A1A1A"/>
                 <w:sz w:val="17"/>
               </w:rPr>
-              <w:t>back to 1.3</w:t>
+              <w:t>back to 6.3</w:t>
             </w:r>
           </w:p>
         </w:tc>

</xml_diff>

<commit_message>
Requirement record: Designs & stickers is its own always-open section, so design codes can be added at any stage and the stickers are easy to find
Co-Authored-By: Claude Opus 5.5 <noreply@anthropic.com>
</commit_message>
<xml_diff>
--- a/public/docs/bsc-plm-prd-mtm-v1.0.docx
+++ b/public/docs/bsc-plm-prd-mtm-v1.0.docx
@@ -9371,7 +9371,7 @@
                 <w:color w:val="1A1A1A"/>
                 <w:sz w:val="17"/>
               </w:rPr>
-              <w:t>Designs on the fabric · design</w:t>
+              <w:t>Designs and stickers · design</w:t>
             </w:r>
           </w:p>
         </w:tc>
@@ -9396,7 +9396,7 @@
                 <w:color w:val="1A1A1A"/>
                 <w:sz w:val="17"/>
               </w:rPr>
-              <w:t>1. In section 3 · Fabric in the designer clicks + Add a design and fills Enigma's Product Info: SKU, Product Type, Weight, Region, Stock Mode, Primary Fabric (this cloth), Status, Sales Channel, Media.</w:t>
+              <w:t>1. Design codes can be added at any stage, not only once the cloth is in. In Designs &amp; stickers, a section of its own on the record, the designer clicks + Add a design and fills Enigma's Product Info: SKU, Product Type, Weight, Region, Stock Mode, Primary Fabric (this cloth), Status, Sales Channel, Media.</w:t>
             </w:r>
           </w:p>
           <w:p>
@@ -9436,6 +9436,19 @@
                 <w:sz w:val="17"/>
               </w:rPr>
               <w:t>4. Save mints a product code (BOM-SHI-FM/CS-nnnn). Push to Enigma on the row sends it; the row then reads "in Enigma · synced &lt;date&gt;".</w:t>
+            </w:r>
+          </w:p>
+          <w:p>
+            <w:pPr>
+              <w:spacing w:before="0" w:after="40"/>
+            </w:pPr>
+            <w:r>
+              <w:rPr>
+                <w:rFonts w:ascii="Inter Tight" w:hAnsi="Inter Tight" w:cs="Inter Tight" w:eastAsia="Inter Tight"/>
+                <w:color w:val="1A1A1A"/>
+                <w:sz w:val="17"/>
+              </w:rPr>
+              <w:t>5. The stickers sit under the designs: one label per design with the fabric code, design name and product code, swatch book and MRP, printed as a 3 × 7 sheet or one page per design.</w:t>
             </w:r>
           </w:p>
         </w:tc>

</xml_diff>

<commit_message>
Remove repunch from the prototype and the hosted PRD: after production starts only a logistics remark changes; a measurement change is handled manually
Co-Authored-By: Claude Opus 5.5 <noreply@anthropic.com>
</commit_message>
<xml_diff>
--- a/public/docs/bsc-plm-prd-mtm-v1.0.docx
+++ b/public/docs/bsc-plm-prd-mtm-v1.0.docx
@@ -3553,7 +3553,7 @@
                 <w:color w:val="1A1A1A"/>
                 <w:sz w:val="17"/>
               </w:rPr>
-              <w:t>1. The sheet is Enigma's layout: measurements, pattern details, options, headed Order sheet · V1 · as punched, then V2 · changed once.</w:t>
+              <w:t>1. The sheet is Enigma's layout: measurements, pattern details, options. Every field that can be corrected is a dashed tile with a pencil on hover and a chip "click any field to correct it".</w:t>
             </w:r>
           </w:p>
           <w:p>
@@ -3566,7 +3566,7 @@
                 <w:color w:val="1A1A1A"/>
                 <w:sz w:val="17"/>
               </w:rPr>
-              <w:t>2. Before production starts (the piece is still an order or in PP) every field that can be corrected is a dashed tile with a pencil on hover. The associate clicks the field, types the correction and why, and saves.</w:t>
+              <w:t>2. The associate clicks the field, types the correction and why, and saves. The sheet heading reads Order sheet · V1 · as punched, then V2 · changed once, V3 · changed 2 times; the change log shows the version each change produced.</w:t>
             </w:r>
           </w:p>
           <w:p>
@@ -3579,20 +3579,32 @@
                 <w:color w:val="1A1A1A"/>
                 <w:sz w:val="17"/>
               </w:rPr>
-              <w:t>3. Once production starts (the piece is on a plan) measurements and styling are locked and there are no free-form change remarks. Only a logistics remark can change: ship to the store or to the customer's home, hold for collection.</w:t>
-            </w:r>
-          </w:p>
-          <w:p>
-            <w:pPr>
-              <w:spacing w:before="0" w:after="40"/>
-            </w:pPr>
+              <w:t>3. Once production starts (the piece is on a plan) measurements and styling are locked and there are no free-form change remarks. Only a logistics remark can change.</w:t>
+            </w:r>
+          </w:p>
+        </w:tc>
+        <w:tc>
+          <w:tcPr>
+            <w:tcW w:type="dxa" w:w="1624"/>
+            <w:tcBorders>
+              <w:bottom w:val="single" w:sz="4" w:color="E5E5E5"/>
+              <w:top w:val="nil"/>
+              <w:left w:val="nil"/>
+              <w:right w:val="nil"/>
+            </w:tcBorders>
+          </w:tcPr>
+          <w:p>
+            <w:pPr>
+              <w:spacing w:before="0" w:after="40"/>
+            </w:pPr>
+            <w:r/>
             <w:r>
               <w:rPr>
                 <w:rFonts w:ascii="Inter Tight" w:hAnsi="Inter Tight" w:cs="Inter Tight" w:eastAsia="Inter Tight"/>
                 <w:color w:val="1A1A1A"/>
                 <w:sz w:val="17"/>
               </w:rPr>
-              <w:t>4. If the measurements must change after that, the associate clicks Repunch with new measurements: the piece is cancelled and a new order (same customer, fabric and sheet, number suffixed -R) is punched for them to correct.</w:t>
+              <w:t>typed</w:t>
             </w:r>
           </w:p>
         </w:tc>
@@ -3617,7 +3629,7 @@
                 <w:color w:val="1A1A1A"/>
                 <w:sz w:val="17"/>
               </w:rPr>
-              <w:t>typed</w:t>
+              <w:t>edit only before production starts; logistics remark only after; nothing once made</w:t>
             </w:r>
           </w:p>
         </w:tc>
@@ -3642,32 +3654,7 @@
                 <w:color w:val="1A1A1A"/>
                 <w:sz w:val="17"/>
               </w:rPr>
-              <w:t>edit only before production starts; logistics remark only after; nothing once made</w:t>
-            </w:r>
-          </w:p>
-        </w:tc>
-        <w:tc>
-          <w:tcPr>
-            <w:tcW w:type="dxa" w:w="1624"/>
-            <w:tcBorders>
-              <w:bottom w:val="single" w:sz="4" w:color="E5E5E5"/>
-              <w:top w:val="nil"/>
-              <w:left w:val="nil"/>
-              <w:right w:val="nil"/>
-            </w:tcBorders>
-          </w:tcPr>
-          <w:p>
-            <w:pPr>
-              <w:spacing w:before="0" w:after="40"/>
-            </w:pPr>
-            <w:r/>
-            <w:r>
-              <w:rPr>
-                <w:rFonts w:ascii="Inter Tight" w:hAnsi="Inter Tight" w:cs="Inter Tight" w:eastAsia="Inter Tight"/>
-                <w:color w:val="1A1A1A"/>
-                <w:sz w:val="17"/>
-              </w:rPr>
-              <w:t>a correction before production lands on the record as the next version; a repunch cancels the old piece (its cloth released if not cut, spent if cut) and puts the new one in the queue</w:t>
+              <w:t>production sees a correction on Changed sheets as the next version; after production starts only a logistics remark changes on the order</w:t>
             </w:r>
           </w:p>
         </w:tc>
@@ -4071,7 +4058,7 @@
           <w:color w:val="1A1A1A"/>
           <w:sz w:val="20"/>
         </w:rPr>
-        <w:t>Order (punched at the store) → PP (waiting for a factory; frozen 2 hours for store-side changes) → PP · planned (on a plan; job card printed; fabric cut) → In production (scanned out of the unit) → In factory (scanned in; aging after 5 days) → Out factory (QC passed) → RTS (back at the unit) → Fitting / shipping → Delivered. Cancelled happens before cutting, or when the store repunches the piece.</w:t>
+        <w:t>Order (punched at the store) → PP (waiting for a factory; frozen 2 hours for store-side changes) → PP · planned (on a plan; job card printed; fabric cut) → In production (scanned out of the unit) → In factory (scanned in; aging after 5 days) → Out factory (QC passed) → RTS (back at the unit) → Fitting / shipping → Delivered. Cancelled can happen before cutting.</w:t>
       </w:r>
     </w:p>
     <w:tbl>
@@ -5301,7 +5288,7 @@
                 <w:color w:val="1A1A1A"/>
                 <w:sz w:val="17"/>
               </w:rPr>
-              <w:t>1. Once a piece is on a plan no measurement or styling change reaches the factory. The reason: remarks arriving at arbitrary points get missed and leave the factory accountable for a change it could not make.</w:t>
+              <w:t>1. Once a piece is on a plan no measurement or styling change reaches the factory; remarks arriving at arbitrary points get missed and leave the factory accountable for a change it could not make.</w:t>
             </w:r>
           </w:p>
           <w:p>
@@ -5314,7 +5301,7 @@
                 <w:color w:val="1A1A1A"/>
                 <w:sz w:val="17"/>
               </w:rPr>
-              <w:t>2. A logistics remark (where it ships) shows on the order and the shipping team reads it; nothing is re-issued to the factory.</w:t>
+              <w:t>2. A logistics remark shows on the order for the shipping team; nothing is re-issued to the factory.</w:t>
             </w:r>
           </w:p>
           <w:p>
@@ -5327,20 +5314,32 @@
                 <w:color w:val="1A1A1A"/>
                 <w:sz w:val="17"/>
               </w:rPr>
-              <w:t>3. A measurement change is a repunch by the store (1.4). If the piece is planned but the cloth is not yet cut, production can pull it back to PP instead.</w:t>
-            </w:r>
-          </w:p>
-          <w:p>
-            <w:pPr>
-              <w:spacing w:before="0" w:after="40"/>
-            </w:pPr>
+              <w:t>3. Changes made before planning appear on Changed sheets; production clicks Acknowledged once it has acted on them.</w:t>
+            </w:r>
+          </w:p>
+        </w:tc>
+        <w:tc>
+          <w:tcPr>
+            <w:tcW w:type="dxa" w:w="1624"/>
+            <w:tcBorders>
+              <w:bottom w:val="single" w:sz="4" w:color="E5E5E5"/>
+              <w:top w:val="nil"/>
+              <w:left w:val="nil"/>
+              <w:right w:val="nil"/>
+            </w:tcBorders>
+          </w:tcPr>
+          <w:p>
+            <w:pPr>
+              <w:spacing w:before="0" w:after="40"/>
+            </w:pPr>
+            <w:r/>
             <w:r>
               <w:rPr>
                 <w:rFonts w:ascii="Inter Tight" w:hAnsi="Inter Tight" w:cs="Inter Tight" w:eastAsia="Inter Tight"/>
                 <w:color w:val="1A1A1A"/>
                 <w:sz w:val="17"/>
               </w:rPr>
-              <w:t>4. Changes made before planning appear on Changed sheets; production clicks Acknowledged once it has acted on them.</w:t>
+              <w:t>typed</w:t>
             </w:r>
           </w:p>
         </w:tc>
@@ -5365,32 +5364,7 @@
                 <w:color w:val="1A1A1A"/>
                 <w:sz w:val="17"/>
               </w:rPr>
-              <w:t>typed</w:t>
-            </w:r>
-          </w:p>
-        </w:tc>
-        <w:tc>
-          <w:tcPr>
-            <w:tcW w:type="dxa" w:w="1624"/>
-            <w:tcBorders>
-              <w:bottom w:val="single" w:sz="4" w:color="E5E5E5"/>
-              <w:top w:val="nil"/>
-              <w:left w:val="nil"/>
-              <w:right w:val="nil"/>
-            </w:tcBorders>
-          </w:tcPr>
-          <w:p>
-            <w:pPr>
-              <w:spacing w:before="0" w:after="40"/>
-            </w:pPr>
-            <w:r/>
-            <w:r>
-              <w:rPr>
-                <w:rFonts w:ascii="Inter Tight" w:hAnsi="Inter Tight" w:cs="Inter Tight" w:eastAsia="Inter Tight"/>
-                <w:color w:val="1A1A1A"/>
-                <w:sz w:val="17"/>
-              </w:rPr>
-              <w:t>whether the cloth is cut is today a manual check with the factory; how that becomes a system rule is still to settle with Parag</w:t>
+              <w:t>store and production edit freely until the piece is on a plan; logistics remark only after; nothing once made</w:t>
             </w:r>
           </w:p>
         </w:tc>
@@ -12254,7 +12228,7 @@
                 <w:color w:val="1A1A1A"/>
                 <w:sz w:val="17"/>
               </w:rPr>
-              <w:t>Before production starts (order or PP) the store and production can correct the sheet; each correction is the next version (V2, V3). Once the piece is on a plan, measurements and styling are locked and there are no free-form change remarks; only a logistics remark (where it ships) can change. A measurement change after that is a repunch: the piece is cancelled and a new order punched. Whether the cloth is cut is a manual check with the factory until a rule is agreed.</w:t>
+              <w:t>Before production starts (order or PP) the store and production can correct the sheet; each correction is the next version (V2, V3). Once the piece is on a plan, measurements and styling are locked and there are no free-form change remarks; only a logistics remark can change.</w:t>
             </w:r>
           </w:p>
         </w:tc>

</xml_diff>

<commit_message>
MTM PRD: one sticker per design, add form closed by default, designs at any stage
Co-Authored-By: Claude Opus 5.5 <noreply@anthropic.com>
</commit_message>
<xml_diff>
--- a/public/docs/bsc-plm-prd-mtm-v1.0.docx
+++ b/public/docs/bsc-plm-prd-mtm-v1.0.docx
@@ -8221,7 +8221,7 @@
           <w:color w:val="1A1A1A"/>
           <w:sz w:val="20"/>
         </w:rPr>
-        <w:t>One new made-to-measure fabric, shade or construction variant runs on one record. The record is always in exactly one of five states, and the list shows that state in one column: 1 Requirement requested (sourcing has to add a vendor) · 2 Vendor added (design has to punch the PO) · 3 PO punched (the cloth is on its way) · 4 Fabric in (design adds the designs and configures Enigma) · 5 Live online. The record opens on four sections in that order; there is no section for "PO punched" because it is a state, not work.</w:t>
+        <w:t>One new made-to-measure fabric, shade or construction variant runs on one record. The record is always in exactly one of five states, and the list shows that state in one column: 1 Requirement requested (sourcing has to add a vendor) · 2 Vendor added (design has to punch the PO) · 3 PO punched (the cloth is on its way) · 4 Fabric in (design configures Enigma; design codes can be added at any stage) · 5 Live online. The record opens on four sections in that order; there is no section for "PO punched" because it is a state, not work.</w:t>
       </w:r>
     </w:p>
     <w:p>
@@ -9422,7 +9422,7 @@
                 <w:color w:val="1A1A1A"/>
                 <w:sz w:val="17"/>
               </w:rPr>
-              <w:t>5. The stickers sit under the designs: one label per design with the fabric code, design name and product code, swatch book and MRP, printed as a 3 × 7 sheet or one page per design.</w:t>
+              <w:t>5. The stickers sit under the designs: one label per design with the fabric code, design name and product code, swatch book and MRP, printed as a 3 × 7 sheet or one page per design. One sticker per design; there is no per-store copy count. The add form stays closed until + Add a design is clicked.</w:t>
             </w:r>
           </w:p>
         </w:tc>

</xml_diff>

<commit_message>
Washed on the requirement form; shrinkage % entered on the receiving line once a cut is washed; PRDs updated
Co-Authored-By: Claude Opus 5.5 <noreply@anthropic.com>
</commit_message>
<xml_diff>
--- a/public/docs/bsc-plm-prd-mtm-v1.0.docx
+++ b/public/docs/bsc-plm-prd-mtm-v1.0.docx
@@ -8493,7 +8493,7 @@
                 <w:color w:val="1A1A1A"/>
                 <w:sz w:val="17"/>
               </w:rPr>
-              <w:t>2. They type a working name, why BSC needs it, the swatch book it belongs in, the month wanted, and attach a sketch, swatch photo or pattern file. Samples are optional and sit in a fold.</w:t>
+              <w:t>2. They type a working name, why BSC needs it, the swatch book it belongs in, the month wanted, and attach a sketch, swatch photo or pattern file. Samples are optional and sit in a fold. They also mark whether the fabric will be washed; the shrinkage is only known once the cloth arrives.</w:t>
             </w:r>
           </w:p>
           <w:p>
@@ -9205,7 +9205,7 @@
                 <w:color w:val="1A1A1A"/>
                 <w:sz w:val="17"/>
               </w:rPr>
-              <w:t>4. Washed fabric: the GRN records the metres received, and the shelf books the usable metres after washing (100 m received at 5% shrinkage books 95 m). The difference is a WASH line in the fabric's transactions.</w:t>
+              <w:t>4. Washed fabric: when the cloth arrives a cut is washed and the receiver enters the shrinkage % on the receiving line. The GRN records the metres received, and the shelf books the usable metres (100 m received at 5% shrinkage books 95 m). The difference is a WASH line in the fabric's transactions.</w:t>
             </w:r>
           </w:p>
           <w:p>
@@ -9243,7 +9243,7 @@
                 <w:color w:val="1A1A1A"/>
                 <w:sz w:val="17"/>
               </w:rPr>
-              <w:t>PO from 6.3; metres counted; wash shrinkage from the fabric's attributes</w:t>
+              <w:t>PO from 6.3; metres counted; washed from the requirement; shrinkage % entered at receiving</w:t>
             </w:r>
           </w:p>
         </w:tc>
@@ -9268,7 +9268,7 @@
                 <w:color w:val="1A1A1A"/>
                 <w:sz w:val="17"/>
               </w:rPr>
-              <w:t>metres received never above pending; shrinkage applies only to fabrics marked Washed Fabric</w:t>
+              <w:t>metres received never above pending; shrinkage applies only to fabric marked washed on the requirement, and is required before metres are booked</w:t>
             </w:r>
           </w:p>
         </w:tc>
@@ -12124,7 +12124,7 @@
                 <w:color w:val="1A1A1A"/>
                 <w:sz w:val="17"/>
               </w:rPr>
-              <w:t>Only fabrics marked Washed Fabric shrink. Stock books the usable metres after washing (received × (1 − shrinkage)); the GRN keeps the metres received. Who records the wash and the resulting metres is still to settle with Parag.</w:t>
+              <w:t>Whether a fabric is washed is set on the requirement when design raises it; its shrinkage % is entered at receiving, once a cut has been washed. Only washed fabric shrinks: stock books the usable metres after washing (received × (1 − shrinkage)); the GRN keeps the metres received.</w:t>
             </w:r>
           </w:p>
         </w:tc>

</xml_diff>

<commit_message>
MTM PRD: regenerate with the samples checklist and the RetailOS note
Co-Authored-By: Claude Opus 5.5 <noreply@anthropic.com>
</commit_message>
<xml_diff>
--- a/public/docs/bsc-plm-prd-mtm-v1.0.docx
+++ b/public/docs/bsc-plm-prd-mtm-v1.0.docx
@@ -193,7 +193,7 @@
           <w:color w:val="1A1A1A"/>
           <w:sz w:val="20"/>
         </w:rPr>
-        <w:t>Six roles in this edition, one login per team; colleagues in a team appear by name on what they wrote. Each role lands on the first screen it works in. The sidebar lists teams as pills; a team opens to its screens.</w:t>
+        <w:t>Six roles in this edition, five of them with screens in BSC PLM (store managers stay in RetailOS), one login per team; colleagues in a team appear by name on what they wrote. Each role lands on the first screen it works in. The sidebar lists teams as pills; a team opens to its screens.</w:t>
       </w:r>
     </w:p>
     <w:tbl>
@@ -915,7 +915,7 @@
                 <w:color w:val="1A1A1A"/>
                 <w:sz w:val="17"/>
               </w:rPr>
-              <w:t>Bills, customer profiles, order-sheet corrections, returns and credit notes, refund requests</w:t>
+              <w:t>No screen in BSC PLM. Bills, customer profiles, order-sheet corrections, returns and credit notes and refund requests stay in RetailOS, which gains anything additional; the prototype shows these for demonstration only</w:t>
             </w:r>
           </w:p>
         </w:tc>
@@ -2792,7 +2792,7 @@
           <w:color w:val="1A1A1A"/>
           <w:sz w:val="20"/>
         </w:rPr>
-        <w:t>The MTM side of the store page: customers, orders, what I can sell, returns and alterations. Anyone not from that store can read it but not act.</w:t>
+        <w:t>The MTM side of the store page: customers, orders, what I can sell, returns and alterations. Anyone not from that store can read it but not act. Store managers will not have a screen in BSC PLM. They already work in RetailOS, and anything additional they need is added to RetailOS itself. The flows below are written down so RetailOS and BSC PLM agree on what passes between them; the store screens in the prototype are there only to demonstrate those flows end to end.</w:t>
       </w:r>
     </w:p>
     <w:tbl>
@@ -8493,7 +8493,7 @@
                 <w:color w:val="1A1A1A"/>
                 <w:sz w:val="17"/>
               </w:rPr>
-              <w:t>2. They type a working name, why BSC needs it, the swatch book it belongs in, the month wanted, and attach a sketch, swatch photo or pattern file. Samples are optional and sit in a fold. They also mark whether the fabric will be washed; the shrinkage is only known once the cloth arrives.</w:t>
+              <w:t>2. They type a working name, why BSC needs it, the swatch book it belongs in, the month wanted, and attach a sketch, swatch photo or pattern file. Samples are an optional checklist on the record: Sample &amp; PAT file handed to a factory, PP sample approved, Shipment sample approved, Approval posted to every department. Each row is ticked with one click and an optional remark; sending a sample back needs the remark. Remarks land in the record's conversation under their step. They also mark whether the fabric will be washed; the shrinkage is only known once the cloth arrives.</w:t>
             </w:r>
           </w:p>
           <w:p>

</xml_diff>

<commit_message>
MTM: pre-confirmed orders, CAD/cutting/fusing/compiling desks, contrast fabric, extra fabric via Shravani; PRD updated
Co-Authored-By: Claude Opus 5.5 <noreply@anthropic.com>
</commit_message>
<xml_diff>
--- a/public/docs/bsc-plm-prd-mtm-v1.0.docx
+++ b/public/docs/bsc-plm-prd-mtm-v1.0.docx
@@ -661,7 +661,7 @@
                 <w:color w:val="1A1A1A"/>
                 <w:sz w:val="17"/>
               </w:rPr>
-              <w:t>Allocate pieces to factories, plans, the factory floor, changed sheets, extra fabric, ship-by moves; the Factories screen inputs</w:t>
+              <w:t>Confirm pre-confirmed orders, allocate pieces to factories, plans, the pre-production overview, the factory floor, changed sheets, extra fabric, ship-by moves; the Factories screen inputs</w:t>
             </w:r>
           </w:p>
         </w:tc>
@@ -4058,7 +4058,7 @@
           <w:color w:val="1A1A1A"/>
           <w:sz w:val="20"/>
         </w:rPr>
-        <w:t>Order (punched at the store) → PP (waiting for a factory; frozen 2 hours for store-side changes) → PP · planned (on a plan; job card printed; fabric cut) → In production (scanned out of the unit) → In factory (scanned in; aging after 5 days) → Out factory (QC passed) → RTS (back at the unit) → Fitting / shipping → Delivered. Cancelled can happen before cutting.</w:t>
+        <w:t>Order (punched at the store) → PP (waiting for a factory; frozen 2 hours for store-side changes) → PP · planned (on a plan) → pre-production at the unit: CAD → Cutting → Fusing → Compiling → In production (scanned out of the unit) → In factory (scanned in; aging after 5 days) → Out factory (QC passed) → RTS (back at the unit) → Fitting / shipping → Delivered. Cancelled can happen before cutting.</w:t>
       </w:r>
     </w:p>
     <w:tbl>
@@ -4413,7 +4413,7 @@
                 <w:color w:val="5C6066"/>
                 <w:sz w:val="15"/>
               </w:rPr>
-              <w:t>2.2</w:t>
+              <w:t>2.1a</w:t>
             </w:r>
           </w:p>
         </w:tc>
@@ -4438,7 +4438,7 @@
                 <w:color w:val="1A1A1A"/>
                 <w:sz w:val="17"/>
               </w:rPr>
-              <w:t>The system proposes · system</w:t>
+              <w:t>Pre-confirmed orders · store, production</w:t>
             </w:r>
           </w:p>
         </w:tc>
@@ -4463,7 +4463,7 @@
                 <w:color w:val="1A1A1A"/>
                 <w:sz w:val="17"/>
               </w:rPr>
-              <w:t>1. One card per MTM factory: feed target, pieces on the floor and their age, in transit, headroom today, load in days, the number proposed.</w:t>
+              <w:t>1. An order taken at the store but not yet confirmed (measurement not done, on hold, payment pending) is pre-confirmed. It shows the reason and a note.</w:t>
             </w:r>
           </w:p>
           <w:p>
@@ -4476,32 +4476,20 @@
                 <w:color w:val="1A1A1A"/>
                 <w:sz w:val="17"/>
               </w:rPr>
-              <w:t>2. Corporate pieces to the corporate factory; urgent to the factory with an urgent reserve if room, else the nearest with room; the rest to the most headroom, oldest first.</w:t>
-            </w:r>
-          </w:p>
-        </w:tc>
-        <w:tc>
-          <w:tcPr>
-            <w:tcW w:type="dxa" w:w="1624"/>
-            <w:tcBorders>
-              <w:bottom w:val="single" w:sz="4" w:color="E5E5E5"/>
-              <w:top w:val="nil"/>
-              <w:left w:val="nil"/>
-              <w:right w:val="nil"/>
-            </w:tcBorders>
-          </w:tcPr>
-          <w:p>
-            <w:pPr>
-              <w:spacing w:before="0" w:after="40"/>
-            </w:pPr>
-            <w:r/>
+              <w:t>2. Allocate has two filters: Exclude pre-confirmed (the planning queue, the default) and Pre-confirmed (only these orders, each with Confirm).</w:t>
+            </w:r>
+          </w:p>
+          <w:p>
+            <w:pPr>
+              <w:spacing w:before="0" w:after="40"/>
+            </w:pPr>
             <w:r>
               <w:rPr>
                 <w:rFonts w:ascii="Inter Tight" w:hAnsi="Inter Tight" w:cs="Inter Tight" w:eastAsia="Inter Tight"/>
                 <w:color w:val="1A1A1A"/>
                 <w:sz w:val="17"/>
               </w:rPr>
-              <w:t>Factories screen inputs; day logs</w:t>
+              <w:t>3. Confirm order, with an optional remark, takes it into the planning queue.</w:t>
             </w:r>
           </w:p>
         </w:tc>
@@ -4526,7 +4514,7 @@
                 <w:color w:val="1A1A1A"/>
                 <w:sz w:val="17"/>
               </w:rPr>
-              <w:t>headroom = daily capacity − in transit − pieces beyond two days of work</w:t>
+              <w:t>the store; typed</w:t>
             </w:r>
           </w:p>
         </w:tc>
@@ -4551,7 +4539,32 @@
                 <w:color w:val="1A1A1A"/>
                 <w:sz w:val="17"/>
               </w:rPr>
-              <w:t>None</w:t>
+              <w:t>a pre-confirmed order cannot be planned to a factory</w:t>
+            </w:r>
+          </w:p>
+        </w:tc>
+        <w:tc>
+          <w:tcPr>
+            <w:tcW w:type="dxa" w:w="1624"/>
+            <w:tcBorders>
+              <w:bottom w:val="single" w:sz="4" w:color="E5E5E5"/>
+              <w:top w:val="nil"/>
+              <w:left w:val="nil"/>
+              <w:right w:val="nil"/>
+            </w:tcBorders>
+          </w:tcPr>
+          <w:p>
+            <w:pPr>
+              <w:spacing w:before="0" w:after="40"/>
+            </w:pPr>
+            <w:r/>
+            <w:r>
+              <w:rPr>
+                <w:rFonts w:ascii="Inter Tight" w:hAnsi="Inter Tight" w:cs="Inter Tight" w:eastAsia="Inter Tight"/>
+                <w:color w:val="1A1A1A"/>
+                <w:sz w:val="17"/>
+              </w:rPr>
+              <w:t>confirmed orders join the queue in punch order</w:t>
             </w:r>
           </w:p>
         </w:tc>
@@ -4578,7 +4591,7 @@
                 <w:color w:val="5C6066"/>
                 <w:sz w:val="15"/>
               </w:rPr>
-              <w:t>2.3</w:t>
+              <w:t>2.2</w:t>
             </w:r>
           </w:p>
         </w:tc>
@@ -4603,7 +4616,7 @@
                 <w:color w:val="1A1A1A"/>
                 <w:sz w:val="17"/>
               </w:rPr>
-              <w:t>The planner confirms · production</w:t>
+              <w:t>The system proposes · system</w:t>
             </w:r>
           </w:p>
         </w:tc>
@@ -4628,7 +4641,7 @@
                 <w:color w:val="1A1A1A"/>
                 <w:sz w:val="17"/>
               </w:rPr>
-              <w:t>1. Tick pieces (all, oldest 20/30/50, or the card's proposal), pick the factory; the card shows headroom after this plan and "over by N" in red.</w:t>
+              <w:t>1. One card per MTM factory: feed target, pieces on the floor and their age, in transit, headroom today, load in days, the number proposed.</w:t>
             </w:r>
           </w:p>
           <w:p>
@@ -4641,7 +4654,7 @@
                 <w:color w:val="1A1A1A"/>
                 <w:sz w:val="17"/>
               </w:rPr>
-              <w:t>2. Submit N to &lt;factory&gt;; over headroom the button reads Send anyway and records the override.</w:t>
+              <w:t>2. Corporate pieces to the corporate factory; urgent to the factory with an urgent reserve if room, else the nearest with room; the rest to the most headroom, oldest first.</w:t>
             </w:r>
           </w:p>
         </w:tc>
@@ -4666,7 +4679,7 @@
                 <w:color w:val="1A1A1A"/>
                 <w:sz w:val="17"/>
               </w:rPr>
-              <w:t>typed</w:t>
+              <w:t>Factories screen inputs; day logs</w:t>
             </w:r>
           </w:p>
         </w:tc>
@@ -4691,7 +4704,7 @@
                 <w:color w:val="1A1A1A"/>
                 <w:sz w:val="17"/>
               </w:rPr>
-              <w:t>over headroom refused unless forced; urgent sets ship-by = punch + 2 days</w:t>
+              <w:t>headroom = daily capacity − in transit − pieces beyond two days of work</w:t>
             </w:r>
           </w:p>
         </w:tc>
@@ -4716,7 +4729,7 @@
                 <w:color w:val="1A1A1A"/>
                 <w:sz w:val="17"/>
               </w:rPr>
-              <w:t>a plan number; pieces read PP · planned; the cut list fills; the factory sees "on its way"</w:t>
+              <w:t>None</w:t>
             </w:r>
           </w:p>
         </w:tc>
@@ -4743,7 +4756,7 @@
                 <w:color w:val="5C6066"/>
                 <w:sz w:val="15"/>
               </w:rPr>
-              <w:t>2.3a</w:t>
+              <w:t>2.3</w:t>
             </w:r>
           </w:p>
         </w:tc>
@@ -4768,7 +4781,7 @@
                 <w:color w:val="1A1A1A"/>
                 <w:sz w:val="17"/>
               </w:rPr>
-              <w:t>Open a plan · production</w:t>
+              <w:t>The planner confirms · production</w:t>
             </w:r>
           </w:p>
         </w:tc>
@@ -4793,7 +4806,7 @@
                 <w:color w:val="1A1A1A"/>
                 <w:sz w:val="17"/>
               </w:rPr>
-              <w:t>1. Plans lists every plan: number, factory, created, pieces, where the pieces are (a pill per stage with a count), open or closed. Clicking a row opens the plan.</w:t>
+              <w:t>1. Tick pieces (all, oldest 20/30/50, or the card's proposal), pick the factory; the card shows headroom after this plan and "over by N" in red.</w:t>
             </w:r>
           </w:p>
           <w:p>
@@ -4806,20 +4819,32 @@
                 <w:color w:val="1A1A1A"/>
                 <w:sz w:val="17"/>
               </w:rPr>
-              <w:t>2. The plan shows its facts (factory, pieces, cloth in metres, fabrics, first ship-by, urgent count; sent over capacity and by whom), a left-to-right strip of where its pieces are (planned → in production → in factory → out factory → RTS → dispatched, a count in each), the whole-plan scans that apply right now, the cut list by fabric, and every piece: order, customer and store, fabric and metres, ship-by, stage, and the dates it was sent to the factory, reached it, was ready and came back at the unit.</w:t>
-            </w:r>
-          </w:p>
-          <w:p>
-            <w:pPr>
-              <w:spacing w:before="0" w:after="40"/>
-            </w:pPr>
+              <w:t>2. Submit N to &lt;factory&gt;; over headroom the button reads Send anyway and records the override.</w:t>
+            </w:r>
+          </w:p>
+        </w:tc>
+        <w:tc>
+          <w:tcPr>
+            <w:tcW w:type="dxa" w:w="1624"/>
+            <w:tcBorders>
+              <w:bottom w:val="single" w:sz="4" w:color="E5E5E5"/>
+              <w:top w:val="nil"/>
+              <w:left w:val="nil"/>
+              <w:right w:val="nil"/>
+            </w:tcBorders>
+          </w:tcPr>
+          <w:p>
+            <w:pPr>
+              <w:spacing w:before="0" w:after="40"/>
+            </w:pPr>
+            <w:r/>
             <w:r>
               <w:rPr>
                 <w:rFonts w:ascii="Inter Tight" w:hAnsi="Inter Tight" w:cs="Inter Tight" w:eastAsia="Inter Tight"/>
                 <w:color w:val="1A1A1A"/>
                 <w:sz w:val="17"/>
               </w:rPr>
-              <w:t>3. Clicking a piece opens its order sheet with the full timeline.</w:t>
+              <w:t>typed</w:t>
             </w:r>
           </w:p>
         </w:tc>
@@ -4844,7 +4869,7 @@
                 <w:color w:val="1A1A1A"/>
                 <w:sz w:val="17"/>
               </w:rPr>
-              <w:t>the plan; scans</w:t>
+              <w:t>over headroom refused unless forced; urgent sets ship-by = punch + 2 days</w:t>
             </w:r>
           </w:p>
         </w:tc>
@@ -4869,7 +4894,34 @@
                 <w:color w:val="1A1A1A"/>
                 <w:sz w:val="17"/>
               </w:rPr>
-              <w:t>none</w:t>
+              <w:t>a plan number; pieces read PP · planned; the cut list fills; the factory sees "on its way"</w:t>
+            </w:r>
+          </w:p>
+        </w:tc>
+      </w:tr>
+      <w:tr>
+        <w:tc>
+          <w:tcPr>
+            <w:tcW w:type="dxa" w:w="1624"/>
+            <w:tcBorders>
+              <w:bottom w:val="single" w:sz="4" w:color="E5E5E5"/>
+              <w:top w:val="nil"/>
+              <w:left w:val="nil"/>
+              <w:right w:val="nil"/>
+            </w:tcBorders>
+          </w:tcPr>
+          <w:p>
+            <w:pPr>
+              <w:spacing w:before="0" w:after="40"/>
+            </w:pPr>
+            <w:r/>
+            <w:r>
+              <w:rPr>
+                <w:rFonts w:ascii="JetBrains Mono" w:hAnsi="JetBrains Mono" w:cs="JetBrains Mono" w:eastAsia="JetBrains Mono"/>
+                <w:color w:val="5C6066"/>
+                <w:sz w:val="15"/>
+              </w:rPr>
+              <w:t>2.3a</w:t>
             </w:r>
           </w:p>
         </w:tc>
@@ -4894,6 +4946,132 @@
                 <w:color w:val="1A1A1A"/>
                 <w:sz w:val="17"/>
               </w:rPr>
+              <w:t>Open a plan · production</w:t>
+            </w:r>
+          </w:p>
+        </w:tc>
+        <w:tc>
+          <w:tcPr>
+            <w:tcW w:type="dxa" w:w="1624"/>
+            <w:tcBorders>
+              <w:bottom w:val="single" w:sz="4" w:color="E5E5E5"/>
+              <w:top w:val="nil"/>
+              <w:left w:val="nil"/>
+              <w:right w:val="nil"/>
+            </w:tcBorders>
+          </w:tcPr>
+          <w:p>
+            <w:pPr>
+              <w:spacing w:before="0" w:after="40"/>
+            </w:pPr>
+            <w:r/>
+            <w:r>
+              <w:rPr>
+                <w:rFonts w:ascii="Inter Tight" w:hAnsi="Inter Tight" w:cs="Inter Tight" w:eastAsia="Inter Tight"/>
+                <w:color w:val="1A1A1A"/>
+                <w:sz w:val="17"/>
+              </w:rPr>
+              <w:t>1. Plans lists every plan: number, factory, created, pieces, where the pieces are (a pill per stage with a count), open or closed. Clicking a row opens the plan.</w:t>
+            </w:r>
+          </w:p>
+          <w:p>
+            <w:pPr>
+              <w:spacing w:before="0" w:after="40"/>
+            </w:pPr>
+            <w:r>
+              <w:rPr>
+                <w:rFonts w:ascii="Inter Tight" w:hAnsi="Inter Tight" w:cs="Inter Tight" w:eastAsia="Inter Tight"/>
+                <w:color w:val="1A1A1A"/>
+                <w:sz w:val="17"/>
+              </w:rPr>
+              <w:t>2. The plan shows its facts (factory, pieces, cloth in metres, fabrics, first ship-by, urgent count; sent over capacity and by whom), a left-to-right strip of where its pieces are (planned → in production → in factory → out factory → RTS → dispatched, a count in each), the whole-plan scans that apply right now, the cut list by fabric, and every piece: order, customer and store, fabric and metres, ship-by, stage, and the dates it was sent to the factory, reached it, was ready and came back at the unit.</w:t>
+            </w:r>
+          </w:p>
+          <w:p>
+            <w:pPr>
+              <w:spacing w:before="0" w:after="40"/>
+            </w:pPr>
+            <w:r>
+              <w:rPr>
+                <w:rFonts w:ascii="Inter Tight" w:hAnsi="Inter Tight" w:cs="Inter Tight" w:eastAsia="Inter Tight"/>
+                <w:color w:val="1A1A1A"/>
+                <w:sz w:val="17"/>
+              </w:rPr>
+              <w:t>3. Clicking a piece opens its order sheet with the full timeline.</w:t>
+            </w:r>
+          </w:p>
+        </w:tc>
+        <w:tc>
+          <w:tcPr>
+            <w:tcW w:type="dxa" w:w="1624"/>
+            <w:tcBorders>
+              <w:bottom w:val="single" w:sz="4" w:color="E5E5E5"/>
+              <w:top w:val="nil"/>
+              <w:left w:val="nil"/>
+              <w:right w:val="nil"/>
+            </w:tcBorders>
+          </w:tcPr>
+          <w:p>
+            <w:pPr>
+              <w:spacing w:before="0" w:after="40"/>
+            </w:pPr>
+            <w:r/>
+            <w:r>
+              <w:rPr>
+                <w:rFonts w:ascii="Inter Tight" w:hAnsi="Inter Tight" w:cs="Inter Tight" w:eastAsia="Inter Tight"/>
+                <w:color w:val="1A1A1A"/>
+                <w:sz w:val="17"/>
+              </w:rPr>
+              <w:t>the plan; scans</w:t>
+            </w:r>
+          </w:p>
+        </w:tc>
+        <w:tc>
+          <w:tcPr>
+            <w:tcW w:type="dxa" w:w="1624"/>
+            <w:tcBorders>
+              <w:bottom w:val="single" w:sz="4" w:color="E5E5E5"/>
+              <w:top w:val="nil"/>
+              <w:left w:val="nil"/>
+              <w:right w:val="nil"/>
+            </w:tcBorders>
+          </w:tcPr>
+          <w:p>
+            <w:pPr>
+              <w:spacing w:before="0" w:after="40"/>
+            </w:pPr>
+            <w:r/>
+            <w:r>
+              <w:rPr>
+                <w:rFonts w:ascii="Inter Tight" w:hAnsi="Inter Tight" w:cs="Inter Tight" w:eastAsia="Inter Tight"/>
+                <w:color w:val="1A1A1A"/>
+                <w:sz w:val="17"/>
+              </w:rPr>
+              <w:t>none</w:t>
+            </w:r>
+          </w:p>
+        </w:tc>
+        <w:tc>
+          <w:tcPr>
+            <w:tcW w:type="dxa" w:w="1624"/>
+            <w:tcBorders>
+              <w:bottom w:val="single" w:sz="4" w:color="E5E5E5"/>
+              <w:top w:val="nil"/>
+              <w:left w:val="nil"/>
+              <w:right w:val="nil"/>
+            </w:tcBorders>
+          </w:tcPr>
+          <w:p>
+            <w:pPr>
+              <w:spacing w:before="0" w:after="40"/>
+            </w:pPr>
+            <w:r/>
+            <w:r>
+              <w:rPr>
+                <w:rFonts w:ascii="Inter Tight" w:hAnsi="Inter Tight" w:cs="Inter Tight" w:eastAsia="Inter Tight"/>
+                <w:color w:val="1A1A1A"/>
+                <w:sz w:val="17"/>
+              </w:rPr>
               <w:t>the dates are the scans; nothing is typed</w:t>
             </w:r>
           </w:p>
@@ -4946,7 +5124,7 @@
                 <w:color w:val="1A1A1A"/>
                 <w:sz w:val="17"/>
               </w:rPr>
-              <w:t>Cut and bundle · unit</w:t>
+              <w:t>Pre-production desks · CAD, cutting, fusing, compiling teams</w:t>
             </w:r>
           </w:p>
         </w:tc>
@@ -4971,57 +5149,33 @@
                 <w:color w:val="1A1A1A"/>
                 <w:sz w:val="17"/>
               </w:rPr>
-              <w:t>1. Each plan shows a cut list by fabric and the order sheets, any changed sheet marked with its version. Print sheets, cut, Scan out all.</w:t>
-            </w:r>
-          </w:p>
-        </w:tc>
-        <w:tc>
-          <w:tcPr>
-            <w:tcW w:type="dxa" w:w="1624"/>
-            <w:tcBorders>
-              <w:bottom w:val="single" w:sz="4" w:color="E5E5E5"/>
-              <w:top w:val="nil"/>
-              <w:left w:val="nil"/>
-              <w:right w:val="nil"/>
-            </w:tcBorders>
-          </w:tcPr>
-          <w:p>
-            <w:pPr>
-              <w:spacing w:before="0" w:after="40"/>
-            </w:pPr>
-            <w:r/>
+              <w:t>1. Once a plan is submitted, every order on it passes four desks at the unit, each with its own screen: CAD (the order sheet XML from Enigma becomes a CAD file and a print), Cutting (the cloth is cut to the CAD and the print attached), Fusing (collar, cuff and placket interlining), Compiling (the bundle is checked and approved).</w:t>
+            </w:r>
+          </w:p>
+          <w:p>
+            <w:pPr>
+              <w:spacing w:before="0" w:after="40"/>
+            </w:pPr>
             <w:r>
               <w:rPr>
                 <w:rFonts w:ascii="Inter Tight" w:hAnsi="Inter Tight" w:cs="Inter Tight" w:eastAsia="Inter Tight"/>
                 <w:color w:val="1A1A1A"/>
                 <w:sz w:val="17"/>
               </w:rPr>
-              <w:t>the plan; consumption from Enigma</w:t>
-            </w:r>
-          </w:p>
-        </w:tc>
-        <w:tc>
-          <w:tcPr>
-            <w:tcW w:type="dxa" w:w="1624"/>
-            <w:tcBorders>
-              <w:bottom w:val="single" w:sz="4" w:color="E5E5E5"/>
-              <w:top w:val="nil"/>
-              <w:left w:val="nil"/>
-              <w:right w:val="nil"/>
-            </w:tcBorders>
-          </w:tcPr>
-          <w:p>
-            <w:pPr>
-              <w:spacing w:before="0" w:after="40"/>
-            </w:pPr>
-            <w:r/>
+              <w:t>2. Each desk shows Waiting for us, Taken up and Done. The team selects orders and clicks Take up, which puts the person's name on them, then Mark done with an optional remark. The next desk sees them.</w:t>
+            </w:r>
+          </w:p>
+          <w:p>
+            <w:pPr>
+              <w:spacing w:before="0" w:after="40"/>
+            </w:pPr>
             <w:r>
               <w:rPr>
                 <w:rFonts w:ascii="Inter Tight" w:hAnsi="Inter Tight" w:cs="Inter Tight" w:eastAsia="Inter Tight"/>
                 <w:color w:val="1A1A1A"/>
                 <w:sz w:val="17"/>
               </w:rPr>
-              <w:t>the plan must be submitted</w:t>
+              <w:t>3. Production's Pre-production tab counts orders at each desk (taken up or not started) and those ready to send, and shows every planned order with its four steps.</w:t>
             </w:r>
           </w:p>
         </w:tc>
@@ -5046,7 +5200,57 @@
                 <w:color w:val="1A1A1A"/>
                 <w:sz w:val="17"/>
               </w:rPr>
-              <w:t>In production; metres off stock and reserved at the scan</w:t>
+              <w:t>the plan; the order sheet XML from Enigma; typed</w:t>
+            </w:r>
+          </w:p>
+        </w:tc>
+        <w:tc>
+          <w:tcPr>
+            <w:tcW w:type="dxa" w:w="1624"/>
+            <w:tcBorders>
+              <w:bottom w:val="single" w:sz="4" w:color="E5E5E5"/>
+              <w:top w:val="nil"/>
+              <w:left w:val="nil"/>
+              <w:right w:val="nil"/>
+            </w:tcBorders>
+          </w:tcPr>
+          <w:p>
+            <w:pPr>
+              <w:spacing w:before="0" w:after="40"/>
+            </w:pPr>
+            <w:r/>
+            <w:r>
+              <w:rPr>
+                <w:rFonts w:ascii="Inter Tight" w:hAnsi="Inter Tight" w:cs="Inter Tight" w:eastAsia="Inter Tight"/>
+                <w:color w:val="1A1A1A"/>
+                <w:sz w:val="17"/>
+              </w:rPr>
+              <w:t>desks run in order; an order leaves for the factory only once compiled</w:t>
+            </w:r>
+          </w:p>
+        </w:tc>
+        <w:tc>
+          <w:tcPr>
+            <w:tcW w:type="dxa" w:w="1624"/>
+            <w:tcBorders>
+              <w:bottom w:val="single" w:sz="4" w:color="E5E5E5"/>
+              <w:top w:val="nil"/>
+              <w:left w:val="nil"/>
+              <w:right w:val="nil"/>
+            </w:tcBorders>
+          </w:tcPr>
+          <w:p>
+            <w:pPr>
+              <w:spacing w:before="0" w:after="40"/>
+            </w:pPr>
+            <w:r/>
+            <w:r>
+              <w:rPr>
+                <w:rFonts w:ascii="Inter Tight" w:hAnsi="Inter Tight" w:cs="Inter Tight" w:eastAsia="Inter Tight"/>
+                <w:color w:val="1A1A1A"/>
+                <w:sz w:val="17"/>
+              </w:rPr>
+              <w:t>who did each step and when is on the order</w:t>
             </w:r>
           </w:p>
         </w:tc>
@@ -5073,7 +5277,7 @@
                 <w:color w:val="5C6066"/>
                 <w:sz w:val="15"/>
               </w:rPr>
-              <w:t>2.5</w:t>
+              <w:t>2.4a</w:t>
             </w:r>
           </w:p>
         </w:tc>
@@ -5098,7 +5302,7 @@
                 <w:color w:val="1A1A1A"/>
                 <w:sz w:val="17"/>
               </w:rPr>
-              <w:t>The factory scans · merchandiser</w:t>
+              <w:t>Contrast fabric · compiling team</w:t>
             </w:r>
           </w:p>
         </w:tc>
@@ -5123,7 +5327,7 @@
                 <w:color w:val="1A1A1A"/>
                 <w:sz w:val="17"/>
               </w:rPr>
-              <w:t>1. My factory: on their way, on the floor, ready. Received per piece or selection; Out of the factory when done; Log the day at day end with pieces out and a note.</w:t>
+              <w:t>1. A piece can carry contrast fabric: a little of another inventory fabric for a pocket, a collar band or a cuff lining. It is listed on the order with the fabric and metres; the compiling desk can add a line.</w:t>
             </w:r>
           </w:p>
           <w:p>
@@ -5136,7 +5340,7 @@
                 <w:color w:val="1A1A1A"/>
                 <w:sz w:val="17"/>
               </w:rPr>
-              <w:t>2. Production's Factory floor tab shows the same floor per factory: order, customer, fabric and metres, tag, ship-by, stage, when the piece reached the factory (or when it was sent, while on its way), and days in factory, red past 5. Clicking a row opens the order sheet.</w:t>
+              <w:t>2. Approve &amp; mark compiled deducts the contrast metres from that fabric's physical stock, with a line in its transactions.</w:t>
             </w:r>
           </w:p>
         </w:tc>
@@ -5161,7 +5365,7 @@
                 <w:color w:val="1A1A1A"/>
                 <w:sz w:val="17"/>
               </w:rPr>
-              <w:t>scans; typed counts</w:t>
+              <w:t>the order sheet; typed at compiling</w:t>
             </w:r>
           </w:p>
         </w:tc>
@@ -5186,7 +5390,7 @@
                 <w:color w:val="1A1A1A"/>
                 <w:sz w:val="17"/>
               </w:rPr>
-              <w:t>each piece must be at the previous stage</w:t>
+              <w:t>only inventory fabric; metres per line</w:t>
             </w:r>
           </w:p>
         </w:tc>
@@ -5211,7 +5415,7 @@
                 <w:color w:val="1A1A1A"/>
                 <w:sz w:val="17"/>
               </w:rPr>
-              <w:t>the Factories screen shows the factory's count beside the scanned count, amber when they differ</w:t>
+              <w:t>physical stock falls by the contrast metres; saleable follows</w:t>
             </w:r>
           </w:p>
         </w:tc>
@@ -5238,7 +5442,7 @@
                 <w:color w:val="5C6066"/>
                 <w:sz w:val="15"/>
               </w:rPr>
-              <w:t>2.6</w:t>
+              <w:t>2.4b</w:t>
             </w:r>
           </w:p>
         </w:tc>
@@ -5263,7 +5467,7 @@
                 <w:color w:val="1A1A1A"/>
                 <w:sz w:val="17"/>
               </w:rPr>
-              <w:t>A change after production starts · store, production, factory</w:t>
+              <w:t>Scan out · unit</w:t>
             </w:r>
           </w:p>
         </w:tc>
@@ -5288,33 +5492,57 @@
                 <w:color w:val="1A1A1A"/>
                 <w:sz w:val="17"/>
               </w:rPr>
-              <w:t>1. Once a piece is on a plan no measurement or styling change reaches the factory; remarks arriving at arbitrary points get missed and leave the factory accountable for a change it could not make.</w:t>
-            </w:r>
-          </w:p>
-          <w:p>
-            <w:pPr>
-              <w:spacing w:before="0" w:after="40"/>
-            </w:pPr>
+              <w:t>1. Each plan shows a cut list by fabric and the order sheets. Scan out sends the compiled orders to the factory.</w:t>
+            </w:r>
+          </w:p>
+        </w:tc>
+        <w:tc>
+          <w:tcPr>
+            <w:tcW w:type="dxa" w:w="1624"/>
+            <w:tcBorders>
+              <w:bottom w:val="single" w:sz="4" w:color="E5E5E5"/>
+              <w:top w:val="nil"/>
+              <w:left w:val="nil"/>
+              <w:right w:val="nil"/>
+            </w:tcBorders>
+          </w:tcPr>
+          <w:p>
+            <w:pPr>
+              <w:spacing w:before="0" w:after="40"/>
+            </w:pPr>
+            <w:r/>
             <w:r>
               <w:rPr>
                 <w:rFonts w:ascii="Inter Tight" w:hAnsi="Inter Tight" w:cs="Inter Tight" w:eastAsia="Inter Tight"/>
                 <w:color w:val="1A1A1A"/>
                 <w:sz w:val="17"/>
               </w:rPr>
-              <w:t>2. A logistics remark shows on the order for the shipping team; nothing is re-issued to the factory.</w:t>
-            </w:r>
-          </w:p>
-          <w:p>
-            <w:pPr>
-              <w:spacing w:before="0" w:after="40"/>
-            </w:pPr>
+              <w:t>the plan; consumption from Enigma</w:t>
+            </w:r>
+          </w:p>
+        </w:tc>
+        <w:tc>
+          <w:tcPr>
+            <w:tcW w:type="dxa" w:w="1624"/>
+            <w:tcBorders>
+              <w:bottom w:val="single" w:sz="4" w:color="E5E5E5"/>
+              <w:top w:val="nil"/>
+              <w:left w:val="nil"/>
+              <w:right w:val="nil"/>
+            </w:tcBorders>
+          </w:tcPr>
+          <w:p>
+            <w:pPr>
+              <w:spacing w:before="0" w:after="40"/>
+            </w:pPr>
+            <w:r/>
             <w:r>
               <w:rPr>
                 <w:rFonts w:ascii="Inter Tight" w:hAnsi="Inter Tight" w:cs="Inter Tight" w:eastAsia="Inter Tight"/>
                 <w:color w:val="1A1A1A"/>
                 <w:sz w:val="17"/>
               </w:rPr>
-              <w:t>3. Changes made before planning appear on Changed sheets; production clicks Acknowledged once it has acted on them.</w:t>
+              <w:t>orders not yet compiled are held back</w:t>
             </w:r>
           </w:p>
         </w:tc>
@@ -5339,7 +5567,34 @@
                 <w:color w:val="1A1A1A"/>
                 <w:sz w:val="17"/>
               </w:rPr>
-              <w:t>typed</w:t>
+              <w:t>In production; the main fabric's metres come off physical and reserved stock at the scan</w:t>
+            </w:r>
+          </w:p>
+        </w:tc>
+      </w:tr>
+      <w:tr>
+        <w:tc>
+          <w:tcPr>
+            <w:tcW w:type="dxa" w:w="1624"/>
+            <w:tcBorders>
+              <w:bottom w:val="single" w:sz="4" w:color="E5E5E5"/>
+              <w:top w:val="nil"/>
+              <w:left w:val="nil"/>
+              <w:right w:val="nil"/>
+            </w:tcBorders>
+          </w:tcPr>
+          <w:p>
+            <w:pPr>
+              <w:spacing w:before="0" w:after="40"/>
+            </w:pPr>
+            <w:r/>
+            <w:r>
+              <w:rPr>
+                <w:rFonts w:ascii="JetBrains Mono" w:hAnsi="JetBrains Mono" w:cs="JetBrains Mono" w:eastAsia="JetBrains Mono"/>
+                <w:color w:val="5C6066"/>
+                <w:sz w:val="15"/>
+              </w:rPr>
+              <w:t>2.5</w:t>
             </w:r>
           </w:p>
         </w:tc>
@@ -5364,7 +5619,7 @@
                 <w:color w:val="1A1A1A"/>
                 <w:sz w:val="17"/>
               </w:rPr>
-              <w:t>store and production edit freely until the piece is on a plan; logistics remark only after; nothing once made</w:t>
+              <w:t>The factory scans · merchandiser</w:t>
             </w:r>
           </w:p>
         </w:tc>
@@ -5389,7 +5644,95 @@
                 <w:color w:val="1A1A1A"/>
                 <w:sz w:val="17"/>
               </w:rPr>
-              <w:t>the factory never receives a changed sheet mid-production</w:t>
+              <w:t>1. My factory: on their way, on the floor, ready. Received per piece or selection; Out of the factory when done; Log the day at day end with pieces out and a note.</w:t>
+            </w:r>
+          </w:p>
+          <w:p>
+            <w:pPr>
+              <w:spacing w:before="0" w:after="40"/>
+            </w:pPr>
+            <w:r>
+              <w:rPr>
+                <w:rFonts w:ascii="Inter Tight" w:hAnsi="Inter Tight" w:cs="Inter Tight" w:eastAsia="Inter Tight"/>
+                <w:color w:val="1A1A1A"/>
+                <w:sz w:val="17"/>
+              </w:rPr>
+              <w:t>2. Production's Factory floor tab shows the same floor per factory: order, customer, fabric and metres, tag, ship-by, stage, when the piece reached the factory (or when it was sent, while on its way), and days in factory, red past 5. Clicking a row opens the order sheet.</w:t>
+            </w:r>
+          </w:p>
+        </w:tc>
+        <w:tc>
+          <w:tcPr>
+            <w:tcW w:type="dxa" w:w="1624"/>
+            <w:tcBorders>
+              <w:bottom w:val="single" w:sz="4" w:color="E5E5E5"/>
+              <w:top w:val="nil"/>
+              <w:left w:val="nil"/>
+              <w:right w:val="nil"/>
+            </w:tcBorders>
+          </w:tcPr>
+          <w:p>
+            <w:pPr>
+              <w:spacing w:before="0" w:after="40"/>
+            </w:pPr>
+            <w:r/>
+            <w:r>
+              <w:rPr>
+                <w:rFonts w:ascii="Inter Tight" w:hAnsi="Inter Tight" w:cs="Inter Tight" w:eastAsia="Inter Tight"/>
+                <w:color w:val="1A1A1A"/>
+                <w:sz w:val="17"/>
+              </w:rPr>
+              <w:t>scans; typed counts</w:t>
+            </w:r>
+          </w:p>
+        </w:tc>
+        <w:tc>
+          <w:tcPr>
+            <w:tcW w:type="dxa" w:w="1624"/>
+            <w:tcBorders>
+              <w:bottom w:val="single" w:sz="4" w:color="E5E5E5"/>
+              <w:top w:val="nil"/>
+              <w:left w:val="nil"/>
+              <w:right w:val="nil"/>
+            </w:tcBorders>
+          </w:tcPr>
+          <w:p>
+            <w:pPr>
+              <w:spacing w:before="0" w:after="40"/>
+            </w:pPr>
+            <w:r/>
+            <w:r>
+              <w:rPr>
+                <w:rFonts w:ascii="Inter Tight" w:hAnsi="Inter Tight" w:cs="Inter Tight" w:eastAsia="Inter Tight"/>
+                <w:color w:val="1A1A1A"/>
+                <w:sz w:val="17"/>
+              </w:rPr>
+              <w:t>each piece must be at the previous stage</w:t>
+            </w:r>
+          </w:p>
+        </w:tc>
+        <w:tc>
+          <w:tcPr>
+            <w:tcW w:type="dxa" w:w="1624"/>
+            <w:tcBorders>
+              <w:bottom w:val="single" w:sz="4" w:color="E5E5E5"/>
+              <w:top w:val="nil"/>
+              <w:left w:val="nil"/>
+              <w:right w:val="nil"/>
+            </w:tcBorders>
+          </w:tcPr>
+          <w:p>
+            <w:pPr>
+              <w:spacing w:before="0" w:after="40"/>
+            </w:pPr>
+            <w:r/>
+            <w:r>
+              <w:rPr>
+                <w:rFonts w:ascii="Inter Tight" w:hAnsi="Inter Tight" w:cs="Inter Tight" w:eastAsia="Inter Tight"/>
+                <w:color w:val="1A1A1A"/>
+                <w:sz w:val="17"/>
+              </w:rPr>
+              <w:t>the Factories screen shows the factory's count beside the scanned count, amber when they differ</w:t>
             </w:r>
           </w:p>
         </w:tc>
@@ -5416,7 +5759,7 @@
                 <w:color w:val="5C6066"/>
                 <w:sz w:val="15"/>
               </w:rPr>
-              <w:t>2.7</w:t>
+              <w:t>2.6</w:t>
             </w:r>
           </w:p>
         </w:tc>
@@ -5441,7 +5784,7 @@
                 <w:color w:val="1A1A1A"/>
                 <w:sz w:val="17"/>
               </w:rPr>
-              <w:t>Move a ship-by · production</w:t>
+              <w:t>A change after production starts · store, production, factory</w:t>
             </w:r>
           </w:p>
         </w:tc>
@@ -5466,57 +5809,33 @@
                 <w:color w:val="1A1A1A"/>
                 <w:sz w:val="17"/>
               </w:rPr>
-              <w:t>1. One piece: Factory delayed, move ship-by with a date and why. A whole floor: pick the factory, days and one reason.</w:t>
-            </w:r>
-          </w:p>
-        </w:tc>
-        <w:tc>
-          <w:tcPr>
-            <w:tcW w:type="dxa" w:w="1624"/>
-            <w:tcBorders>
-              <w:bottom w:val="single" w:sz="4" w:color="E5E5E5"/>
-              <w:top w:val="nil"/>
-              <w:left w:val="nil"/>
-              <w:right w:val="nil"/>
-            </w:tcBorders>
-          </w:tcPr>
-          <w:p>
-            <w:pPr>
-              <w:spacing w:before="0" w:after="40"/>
-            </w:pPr>
-            <w:r/>
+              <w:t>1. Once a piece is on a plan no measurement or styling change reaches the factory; remarks arriving at arbitrary points get missed and leave the factory accountable for a change it could not make.</w:t>
+            </w:r>
+          </w:p>
+          <w:p>
+            <w:pPr>
+              <w:spacing w:before="0" w:after="40"/>
+            </w:pPr>
             <w:r>
               <w:rPr>
                 <w:rFonts w:ascii="Inter Tight" w:hAnsi="Inter Tight" w:cs="Inter Tight" w:eastAsia="Inter Tight"/>
                 <w:color w:val="1A1A1A"/>
                 <w:sz w:val="17"/>
               </w:rPr>
-              <w:t>typed</w:t>
-            </w:r>
-          </w:p>
-        </w:tc>
-        <w:tc>
-          <w:tcPr>
-            <w:tcW w:type="dxa" w:w="1624"/>
-            <w:tcBorders>
-              <w:bottom w:val="single" w:sz="4" w:color="E5E5E5"/>
-              <w:top w:val="nil"/>
-              <w:left w:val="nil"/>
-              <w:right w:val="nil"/>
-            </w:tcBorders>
-          </w:tcPr>
-          <w:p>
-            <w:pPr>
-              <w:spacing w:before="0" w:after="40"/>
-            </w:pPr>
-            <w:r/>
+              <w:t>2. A logistics remark shows on the order for the shipping team; nothing is re-issued to the factory.</w:t>
+            </w:r>
+          </w:p>
+          <w:p>
+            <w:pPr>
+              <w:spacing w:before="0" w:after="40"/>
+            </w:pPr>
             <w:r>
               <w:rPr>
                 <w:rFonts w:ascii="Inter Tight" w:hAnsi="Inter Tight" w:cs="Inter Tight" w:eastAsia="Inter Tight"/>
                 <w:color w:val="1A1A1A"/>
                 <w:sz w:val="17"/>
               </w:rPr>
-              <w:t>open pieces only</w:t>
+              <w:t>3. Changes made before planning appear on Changed sheets; production clicks Acknowledged once it has acted on them.</w:t>
             </w:r>
           </w:p>
         </w:tc>
@@ -5541,7 +5860,57 @@
                 <w:color w:val="1A1A1A"/>
                 <w:sz w:val="17"/>
               </w:rPr>
-              <w:t>original date kept; the store reads "moved from…, tell the customer"; the portal marks "moved"</w:t>
+              <w:t>typed</w:t>
+            </w:r>
+          </w:p>
+        </w:tc>
+        <w:tc>
+          <w:tcPr>
+            <w:tcW w:type="dxa" w:w="1624"/>
+            <w:tcBorders>
+              <w:bottom w:val="single" w:sz="4" w:color="E5E5E5"/>
+              <w:top w:val="nil"/>
+              <w:left w:val="nil"/>
+              <w:right w:val="nil"/>
+            </w:tcBorders>
+          </w:tcPr>
+          <w:p>
+            <w:pPr>
+              <w:spacing w:before="0" w:after="40"/>
+            </w:pPr>
+            <w:r/>
+            <w:r>
+              <w:rPr>
+                <w:rFonts w:ascii="Inter Tight" w:hAnsi="Inter Tight" w:cs="Inter Tight" w:eastAsia="Inter Tight"/>
+                <w:color w:val="1A1A1A"/>
+                <w:sz w:val="17"/>
+              </w:rPr>
+              <w:t>store and production edit freely until the piece is on a plan; logistics remark only after; nothing once made</w:t>
+            </w:r>
+          </w:p>
+        </w:tc>
+        <w:tc>
+          <w:tcPr>
+            <w:tcW w:type="dxa" w:w="1624"/>
+            <w:tcBorders>
+              <w:bottom w:val="single" w:sz="4" w:color="E5E5E5"/>
+              <w:top w:val="nil"/>
+              <w:left w:val="nil"/>
+              <w:right w:val="nil"/>
+            </w:tcBorders>
+          </w:tcPr>
+          <w:p>
+            <w:pPr>
+              <w:spacing w:before="0" w:after="40"/>
+            </w:pPr>
+            <w:r/>
+            <w:r>
+              <w:rPr>
+                <w:rFonts w:ascii="Inter Tight" w:hAnsi="Inter Tight" w:cs="Inter Tight" w:eastAsia="Inter Tight"/>
+                <w:color w:val="1A1A1A"/>
+                <w:sz w:val="17"/>
+              </w:rPr>
+              <w:t>the factory never receives a changed sheet mid-production</w:t>
             </w:r>
           </w:p>
         </w:tc>
@@ -5568,7 +5937,7 @@
                 <w:color w:val="5C6066"/>
                 <w:sz w:val="15"/>
               </w:rPr>
-              <w:t>2.8</w:t>
+              <w:t>2.7</w:t>
             </w:r>
           </w:p>
         </w:tc>
@@ -5593,7 +5962,7 @@
                 <w:color w:val="1A1A1A"/>
                 <w:sz w:val="17"/>
               </w:rPr>
-              <w:t>Extra fabric · factory, production, Shravani</w:t>
+              <w:t>Move a ship-by · production</w:t>
             </w:r>
           </w:p>
         </w:tc>
@@ -5618,33 +5987,185 @@
                 <w:color w:val="1A1A1A"/>
                 <w:sz w:val="17"/>
               </w:rPr>
-              <w:t>1. The merchandiser clicks Ask for extra cloth on a piece: cloth, panel (front 0.8 m, both fronts 0.9, sleeve 0.8, both sleeves 0.9, collar 0.3, cuff 0.3), metres, reason (factory error or PP error), note.</w:t>
-            </w:r>
-          </w:p>
-          <w:p>
-            <w:pPr>
-              <w:spacing w:before="0" w:after="40"/>
-            </w:pPr>
+              <w:t>1. One piece: Factory delayed, move ship-by with a date and why. A whole floor: pick the factory, days and one reason.</w:t>
+            </w:r>
+          </w:p>
+        </w:tc>
+        <w:tc>
+          <w:tcPr>
+            <w:tcW w:type="dxa" w:w="1624"/>
+            <w:tcBorders>
+              <w:bottom w:val="single" w:sz="4" w:color="E5E5E5"/>
+              <w:top w:val="nil"/>
+              <w:left w:val="nil"/>
+              <w:right w:val="nil"/>
+            </w:tcBorders>
+          </w:tcPr>
+          <w:p>
+            <w:pPr>
+              <w:spacing w:before="0" w:after="40"/>
+            </w:pPr>
+            <w:r/>
             <w:r>
               <w:rPr>
                 <w:rFonts w:ascii="Inter Tight" w:hAnsi="Inter Tight" w:cs="Inter Tight" w:eastAsia="Inter Tight"/>
                 <w:color w:val="1A1A1A"/>
                 <w:sz w:val="17"/>
               </w:rPr>
-              <w:t>2. Production (Swati) sees each ask with the shelf before and after. If the cloth is on the shelf: Approve or Decline with a note; approval deducts the metres.</w:t>
-            </w:r>
-          </w:p>
-          <w:p>
-            <w:pPr>
-              <w:spacing w:before="0" w:after="40"/>
-            </w:pPr>
+              <w:t>typed</w:t>
+            </w:r>
+          </w:p>
+        </w:tc>
+        <w:tc>
+          <w:tcPr>
+            <w:tcW w:type="dxa" w:w="1624"/>
+            <w:tcBorders>
+              <w:bottom w:val="single" w:sz="4" w:color="E5E5E5"/>
+              <w:top w:val="nil"/>
+              <w:left w:val="nil"/>
+              <w:right w:val="nil"/>
+            </w:tcBorders>
+          </w:tcPr>
+          <w:p>
+            <w:pPr>
+              <w:spacing w:before="0" w:after="40"/>
+            </w:pPr>
+            <w:r/>
             <w:r>
               <w:rPr>
                 <w:rFonts w:ascii="Inter Tight" w:hAnsi="Inter Tight" w:cs="Inter Tight" w:eastAsia="Inter Tight"/>
                 <w:color w:val="1A1A1A"/>
                 <w:sz w:val="17"/>
               </w:rPr>
-              <w:t>3. If the cloth is bespoke, or the shelf does not cover it, even a small shortfall needs a PO with the mill. Production clicks Send to Shravani for a PO; the ask reads "with Shravani · PO". Shravani raises the PO with the mill (PO raised with the mill), and when the cloth is in (Cloth in · back to approval) the ask returns to production to approve as usual.</w:t>
+              <w:t>open pieces only</w:t>
+            </w:r>
+          </w:p>
+        </w:tc>
+        <w:tc>
+          <w:tcPr>
+            <w:tcW w:type="dxa" w:w="1624"/>
+            <w:tcBorders>
+              <w:bottom w:val="single" w:sz="4" w:color="E5E5E5"/>
+              <w:top w:val="nil"/>
+              <w:left w:val="nil"/>
+              <w:right w:val="nil"/>
+            </w:tcBorders>
+          </w:tcPr>
+          <w:p>
+            <w:pPr>
+              <w:spacing w:before="0" w:after="40"/>
+            </w:pPr>
+            <w:r/>
+            <w:r>
+              <w:rPr>
+                <w:rFonts w:ascii="Inter Tight" w:hAnsi="Inter Tight" w:cs="Inter Tight" w:eastAsia="Inter Tight"/>
+                <w:color w:val="1A1A1A"/>
+                <w:sz w:val="17"/>
+              </w:rPr>
+              <w:t>original date kept; the store reads "moved from…, tell the customer"; the portal marks "moved"</w:t>
+            </w:r>
+          </w:p>
+        </w:tc>
+      </w:tr>
+      <w:tr>
+        <w:tc>
+          <w:tcPr>
+            <w:tcW w:type="dxa" w:w="1624"/>
+            <w:tcBorders>
+              <w:bottom w:val="single" w:sz="4" w:color="E5E5E5"/>
+              <w:top w:val="nil"/>
+              <w:left w:val="nil"/>
+              <w:right w:val="nil"/>
+            </w:tcBorders>
+          </w:tcPr>
+          <w:p>
+            <w:pPr>
+              <w:spacing w:before="0" w:after="40"/>
+            </w:pPr>
+            <w:r/>
+            <w:r>
+              <w:rPr>
+                <w:rFonts w:ascii="JetBrains Mono" w:hAnsi="JetBrains Mono" w:cs="JetBrains Mono" w:eastAsia="JetBrains Mono"/>
+                <w:color w:val="5C6066"/>
+                <w:sz w:val="15"/>
+              </w:rPr>
+              <w:t>2.8</w:t>
+            </w:r>
+          </w:p>
+        </w:tc>
+        <w:tc>
+          <w:tcPr>
+            <w:tcW w:type="dxa" w:w="1624"/>
+            <w:tcBorders>
+              <w:bottom w:val="single" w:sz="4" w:color="E5E5E5"/>
+              <w:top w:val="nil"/>
+              <w:left w:val="nil"/>
+              <w:right w:val="nil"/>
+            </w:tcBorders>
+          </w:tcPr>
+          <w:p>
+            <w:pPr>
+              <w:spacing w:before="0" w:after="40"/>
+            </w:pPr>
+            <w:r/>
+            <w:r>
+              <w:rPr>
+                <w:rFonts w:ascii="Inter Tight" w:hAnsi="Inter Tight" w:cs="Inter Tight" w:eastAsia="Inter Tight"/>
+                <w:color w:val="1A1A1A"/>
+                <w:sz w:val="17"/>
+              </w:rPr>
+              <w:t>Extra fabric · factory, production, Shravani</w:t>
+            </w:r>
+          </w:p>
+        </w:tc>
+        <w:tc>
+          <w:tcPr>
+            <w:tcW w:type="dxa" w:w="1624"/>
+            <w:tcBorders>
+              <w:bottom w:val="single" w:sz="4" w:color="E5E5E5"/>
+              <w:top w:val="nil"/>
+              <w:left w:val="nil"/>
+              <w:right w:val="nil"/>
+            </w:tcBorders>
+          </w:tcPr>
+          <w:p>
+            <w:pPr>
+              <w:spacing w:before="0" w:after="40"/>
+            </w:pPr>
+            <w:r/>
+            <w:r>
+              <w:rPr>
+                <w:rFonts w:ascii="Inter Tight" w:hAnsi="Inter Tight" w:cs="Inter Tight" w:eastAsia="Inter Tight"/>
+                <w:color w:val="1A1A1A"/>
+                <w:sz w:val="17"/>
+              </w:rPr>
+              <w:t>1. The merchandiser clicks Ask for extra cloth on a piece: cloth, panel (front 0.8 m, both fronts 0.9, sleeve 0.8, both sleeves 0.9, collar 0.3, cuff 0.3), metres, reason (factory error or PP error), note.</w:t>
+            </w:r>
+          </w:p>
+          <w:p>
+            <w:pPr>
+              <w:spacing w:before="0" w:after="40"/>
+            </w:pPr>
+            <w:r>
+              <w:rPr>
+                <w:rFonts w:ascii="Inter Tight" w:hAnsi="Inter Tight" w:cs="Inter Tight" w:eastAsia="Inter Tight"/>
+                <w:color w:val="1A1A1A"/>
+                <w:sz w:val="17"/>
+              </w:rPr>
+              <w:t>2. Production (Swati) sees each ask with the shelf before and after. If the cloth is on the shelf: Approve or Decline with a note; approval deducts the metres.</w:t>
+            </w:r>
+          </w:p>
+          <w:p>
+            <w:pPr>
+              <w:spacing w:before="0" w:after="40"/>
+            </w:pPr>
+            <w:r>
+              <w:rPr>
+                <w:rFonts w:ascii="Inter Tight" w:hAnsi="Inter Tight" w:cs="Inter Tight" w:eastAsia="Inter Tight"/>
+                <w:color w:val="1A1A1A"/>
+                <w:sz w:val="17"/>
+              </w:rPr>
+              <w:t>3. Extra fabric is also asked for by the alteration and hemming unit. For bespoke cloth, an alteration ask, or a shortfall the shelf does not cover, production sends it to Shravani in one click. Shravani approves and the PO is generated; when the cloth is in, the ask returns to production to approve as usual.</w:t>
             </w:r>
           </w:p>
         </w:tc>
@@ -12072,7 +12593,7 @@
                 <w:color w:val="1A1A1A"/>
                 <w:sz w:val="17"/>
               </w:rPr>
-              <w:t>Approval from the shelf deducts the metres at once. Bespoke cloth, or a shortfall the shelf cannot cover, goes to Shravani for a PO with the mill and returns to production to approve when the cloth is in (proposed, not final). Extra fabric for the alteration and hemming unit (part replacement; collar or cuff sent to a store to attach) is to be logged too; its request, approval and stock steps are still to settle with Parag.</w:t>
+              <w:t>Approval from the shelf deducts the metres at once. Bespoke cloth, an alteration unit's ask, or a shortfall the shelf cannot cover goes to Shravani in one click from production; Shravani approves and the PO is generated; it returns to production to approve when the cloth is in. A tool for this in Swati's hands comes in a later phase.</w:t>
             </w:r>
           </w:p>
         </w:tc>
@@ -12125,6 +12646,162 @@
                 <w:sz w:val="17"/>
               </w:rPr>
               <w:t>Whether a fabric is washed is set on the requirement when design raises it; its shrinkage % is entered at receiving, once a cut has been washed. Only washed fabric shrinks: stock books the usable metres after washing (received × (1 − shrinkage)); the GRN keeps the metres received.</w:t>
+            </w:r>
+          </w:p>
+        </w:tc>
+      </w:tr>
+      <w:tr>
+        <w:tc>
+          <w:tcPr>
+            <w:tcW w:type="dxa" w:w="4873"/>
+            <w:tcBorders>
+              <w:bottom w:val="single" w:sz="4" w:color="E5E5E5"/>
+              <w:top w:val="nil"/>
+              <w:left w:val="nil"/>
+              <w:right w:val="nil"/>
+            </w:tcBorders>
+          </w:tcPr>
+          <w:p>
+            <w:pPr>
+              <w:spacing w:before="0" w:after="40"/>
+            </w:pPr>
+            <w:r/>
+            <w:r>
+              <w:rPr>
+                <w:rFonts w:ascii="JetBrains Mono" w:hAnsi="JetBrains Mono" w:cs="JetBrains Mono" w:eastAsia="JetBrains Mono"/>
+                <w:color w:val="5C6066"/>
+                <w:sz w:val="15"/>
+              </w:rPr>
+              <w:t>Pre-confirmed orders</w:t>
+            </w:r>
+          </w:p>
+        </w:tc>
+        <w:tc>
+          <w:tcPr>
+            <w:tcW w:type="dxa" w:w="4873"/>
+            <w:tcBorders>
+              <w:bottom w:val="single" w:sz="4" w:color="E5E5E5"/>
+              <w:top w:val="nil"/>
+              <w:left w:val="nil"/>
+              <w:right w:val="nil"/>
+            </w:tcBorders>
+          </w:tcPr>
+          <w:p>
+            <w:pPr>
+              <w:spacing w:before="0" w:after="40"/>
+            </w:pPr>
+            <w:r/>
+            <w:r>
+              <w:rPr>
+                <w:rFonts w:ascii="Inter Tight" w:hAnsi="Inter Tight" w:cs="Inter Tight" w:eastAsia="Inter Tight"/>
+                <w:color w:val="1A1A1A"/>
+                <w:sz w:val="17"/>
+              </w:rPr>
+              <w:t>An order not yet confirmed at the store (measurement not done, on hold, payment pending) is never planned to a factory; Allocate shows it only under the Pre-confirmed filter until someone confirms it.</w:t>
+            </w:r>
+          </w:p>
+        </w:tc>
+      </w:tr>
+      <w:tr>
+        <w:tc>
+          <w:tcPr>
+            <w:tcW w:type="dxa" w:w="4873"/>
+            <w:tcBorders>
+              <w:bottom w:val="single" w:sz="4" w:color="E5E5E5"/>
+              <w:top w:val="nil"/>
+              <w:left w:val="nil"/>
+              <w:right w:val="nil"/>
+            </w:tcBorders>
+          </w:tcPr>
+          <w:p>
+            <w:pPr>
+              <w:spacing w:before="0" w:after="40"/>
+            </w:pPr>
+            <w:r/>
+            <w:r>
+              <w:rPr>
+                <w:rFonts w:ascii="JetBrains Mono" w:hAnsi="JetBrains Mono" w:cs="JetBrains Mono" w:eastAsia="JetBrains Mono"/>
+                <w:color w:val="5C6066"/>
+                <w:sz w:val="15"/>
+              </w:rPr>
+              <w:t>Pre-production</w:t>
+            </w:r>
+          </w:p>
+        </w:tc>
+        <w:tc>
+          <w:tcPr>
+            <w:tcW w:type="dxa" w:w="4873"/>
+            <w:tcBorders>
+              <w:bottom w:val="single" w:sz="4" w:color="E5E5E5"/>
+              <w:top w:val="nil"/>
+              <w:left w:val="nil"/>
+              <w:right w:val="nil"/>
+            </w:tcBorders>
+          </w:tcPr>
+          <w:p>
+            <w:pPr>
+              <w:spacing w:before="0" w:after="40"/>
+            </w:pPr>
+            <w:r/>
+            <w:r>
+              <w:rPr>
+                <w:rFonts w:ascii="Inter Tight" w:hAnsi="Inter Tight" w:cs="Inter Tight" w:eastAsia="Inter Tight"/>
+                <w:color w:val="1A1A1A"/>
+                <w:sz w:val="17"/>
+              </w:rPr>
+              <w:t>After planning, every order passes CAD, cutting, fusing and compiling in that order; each step records who took it up, who finished it and when. Scan-out to the factory is refused until compiling is done.</w:t>
+            </w:r>
+          </w:p>
+        </w:tc>
+      </w:tr>
+      <w:tr>
+        <w:tc>
+          <w:tcPr>
+            <w:tcW w:type="dxa" w:w="4873"/>
+            <w:tcBorders>
+              <w:bottom w:val="single" w:sz="4" w:color="E5E5E5"/>
+              <w:top w:val="nil"/>
+              <w:left w:val="nil"/>
+              <w:right w:val="nil"/>
+            </w:tcBorders>
+          </w:tcPr>
+          <w:p>
+            <w:pPr>
+              <w:spacing w:before="0" w:after="40"/>
+            </w:pPr>
+            <w:r/>
+            <w:r>
+              <w:rPr>
+                <w:rFonts w:ascii="JetBrains Mono" w:hAnsi="JetBrains Mono" w:cs="JetBrains Mono" w:eastAsia="JetBrains Mono"/>
+                <w:color w:val="5C6066"/>
+                <w:sz w:val="15"/>
+              </w:rPr>
+              <w:t>Contrast fabric</w:t>
+            </w:r>
+          </w:p>
+        </w:tc>
+        <w:tc>
+          <w:tcPr>
+            <w:tcW w:type="dxa" w:w="4873"/>
+            <w:tcBorders>
+              <w:bottom w:val="single" w:sz="4" w:color="E5E5E5"/>
+              <w:top w:val="nil"/>
+              <w:left w:val="nil"/>
+              <w:right w:val="nil"/>
+            </w:tcBorders>
+          </w:tcPr>
+          <w:p>
+            <w:pPr>
+              <w:spacing w:before="0" w:after="40"/>
+            </w:pPr>
+            <w:r/>
+            <w:r>
+              <w:rPr>
+                <w:rFonts w:ascii="Inter Tight" w:hAnsi="Inter Tight" w:cs="Inter Tight" w:eastAsia="Inter Tight"/>
+                <w:color w:val="1A1A1A"/>
+                <w:sz w:val="17"/>
+              </w:rPr>
+              <w:t>Contrast fabric is inventory fabric used in small amounts on a piece. Compiling approval deducts it from physical stock; reserved stock is the main fabric held at punch, and saleable = physical − reserved − floor.</w:t>
             </w:r>
           </w:p>
         </w:tc>

</xml_diff>

<commit_message>
MTM: bespoke never in inventory, alteration cloth deducted on approval; urgent filters on floor and desks; CAD file upload; PRD updated
Co-Authored-By: Claude Opus 5.5 <noreply@anthropic.com>
</commit_message>
<xml_diff>
--- a/public/docs/bsc-plm-prd-mtm-v1.0.docx
+++ b/public/docs/bsc-plm-prd-mtm-v1.0.docx
@@ -5162,7 +5162,7 @@
                 <w:color w:val="1A1A1A"/>
                 <w:sz w:val="17"/>
               </w:rPr>
-              <w:t>2. Each desk shows Waiting for us, Taken up and Done. The team selects orders and clicks Take up, which puts the person's name on them, then Mark done with an optional remark. The next desk sees them.</w:t>
+              <w:t>2. Each desk shows Waiting for us, Taken up and Done. The team selects orders and clicks Take up, which puts the person's name on them, then Mark done with an optional remark. The next desk sees them. Urgent orders sit on top, and an Urgent filter shows only them.</w:t>
             </w:r>
           </w:p>
           <w:p>
@@ -5175,32 +5175,20 @@
                 <w:color w:val="1A1A1A"/>
                 <w:sz w:val="17"/>
               </w:rPr>
-              <w:t>3. Production's Pre-production tab counts orders at each desk (taken up or not started) and those ready to send, and shows every planned order with its four steps.</w:t>
-            </w:r>
-          </w:p>
-        </w:tc>
-        <w:tc>
-          <w:tcPr>
-            <w:tcW w:type="dxa" w:w="1624"/>
-            <w:tcBorders>
-              <w:bottom w:val="single" w:sz="4" w:color="E5E5E5"/>
-              <w:top w:val="nil"/>
-              <w:left w:val="nil"/>
-              <w:right w:val="nil"/>
-            </w:tcBorders>
-          </w:tcPr>
-          <w:p>
-            <w:pPr>
-              <w:spacing w:before="0" w:after="40"/>
-            </w:pPr>
-            <w:r/>
+              <w:t>3. The CAD desk uploads the CAD file it made on each order (Upload CAD file on the row); an order cannot be marked done at CAD without it, and the file stays on the order for cutting.</w:t>
+            </w:r>
+          </w:p>
+          <w:p>
+            <w:pPr>
+              <w:spacing w:before="0" w:after="40"/>
+            </w:pPr>
             <w:r>
               <w:rPr>
                 <w:rFonts w:ascii="Inter Tight" w:hAnsi="Inter Tight" w:cs="Inter Tight" w:eastAsia="Inter Tight"/>
                 <w:color w:val="1A1A1A"/>
                 <w:sz w:val="17"/>
               </w:rPr>
-              <w:t>the plan; the order sheet XML from Enigma; typed</w:t>
+              <w:t>4. Production's Pre-production tab counts orders at each desk (taken up or not started) and those ready to send, and shows every planned order with its four steps.</w:t>
             </w:r>
           </w:p>
         </w:tc>
@@ -5225,7 +5213,7 @@
                 <w:color w:val="1A1A1A"/>
                 <w:sz w:val="17"/>
               </w:rPr>
-              <w:t>desks run in order; an order leaves for the factory only once compiled</w:t>
+              <w:t>the plan; the order sheet XML from Enigma; typed</w:t>
             </w:r>
           </w:p>
         </w:tc>
@@ -5250,6 +5238,31 @@
                 <w:color w:val="1A1A1A"/>
                 <w:sz w:val="17"/>
               </w:rPr>
+              <w:t>desks run in order; CAD needs its file uploaded; an order leaves for the factory only once compiled</w:t>
+            </w:r>
+          </w:p>
+        </w:tc>
+        <w:tc>
+          <w:tcPr>
+            <w:tcW w:type="dxa" w:w="1624"/>
+            <w:tcBorders>
+              <w:bottom w:val="single" w:sz="4" w:color="E5E5E5"/>
+              <w:top w:val="nil"/>
+              <w:left w:val="nil"/>
+              <w:right w:val="nil"/>
+            </w:tcBorders>
+          </w:tcPr>
+          <w:p>
+            <w:pPr>
+              <w:spacing w:before="0" w:after="40"/>
+            </w:pPr>
+            <w:r/>
+            <w:r>
+              <w:rPr>
+                <w:rFonts w:ascii="Inter Tight" w:hAnsi="Inter Tight" w:cs="Inter Tight" w:eastAsia="Inter Tight"/>
+                <w:color w:val="1A1A1A"/>
+                <w:sz w:val="17"/>
+              </w:rPr>
               <w:t>who did each step and when is on the order</w:t>
             </w:r>
           </w:p>
@@ -5657,7 +5670,7 @@
                 <w:color w:val="1A1A1A"/>
                 <w:sz w:val="17"/>
               </w:rPr>
-              <w:t>2. Production's Factory floor tab shows the same floor per factory: order, customer, fabric and metres, tag, ship-by, stage, when the piece reached the factory (or when it was sent, while on its way), and days in factory, red past 5. Clicking a row opens the order sheet.</w:t>
+              <w:t>2. Production's Factory floor tab shows the same floor per factory: order, customer, fabric and metres, tag, ship-by, stage, when the piece reached the factory (or when it was sent, while on its way), and days in factory, red past 5. Urgent pieces sit on top, and an Urgent filter shows only them so the floor works them first. Clicking a row opens the order sheet.</w:t>
             </w:r>
           </w:p>
         </w:tc>
@@ -6165,32 +6178,20 @@
                 <w:color w:val="1A1A1A"/>
                 <w:sz w:val="17"/>
               </w:rPr>
-              <w:t>3. Extra fabric is also asked for by the alteration and hemming unit. For bespoke cloth, an alteration ask, or a shortfall the shelf does not cover, production sends it to Shravani in one click. Shravani approves and the PO is generated; when the cloth is in, the ask returns to production to approve as usual.</w:t>
-            </w:r>
-          </w:p>
-        </w:tc>
-        <w:tc>
-          <w:tcPr>
-            <w:tcW w:type="dxa" w:w="1624"/>
-            <w:tcBorders>
-              <w:bottom w:val="single" w:sz="4" w:color="E5E5E5"/>
-              <w:top w:val="nil"/>
-              <w:left w:val="nil"/>
-              <w:right w:val="nil"/>
-            </w:tcBorders>
-          </w:tcPr>
-          <w:p>
-            <w:pPr>
-              <w:spacing w:before="0" w:after="40"/>
-            </w:pPr>
-            <w:r/>
+              <w:t>3. Extra fabric is also asked for by the alteration and hemming unit. For bespoke cloth, an alteration ask, or a shortfall the shelf does not cover, production sends it to Shravani in one click. For an alteration on a fabric the shelf covers, Shravani's approval issues the cloth and deducts it from physical stock. Otherwise Shravani approves and the PO is generated; when the cloth is in, the ask returns to production to approve as usual.</w:t>
+            </w:r>
+          </w:p>
+          <w:p>
+            <w:pPr>
+              <w:spacing w:before="0" w:after="40"/>
+            </w:pPr>
             <w:r>
               <w:rPr>
                 <w:rFonts w:ascii="Inter Tight" w:hAnsi="Inter Tight" w:cs="Inter Tight" w:eastAsia="Inter Tight"/>
                 <w:color w:val="1A1A1A"/>
                 <w:sz w:val="17"/>
               </w:rPr>
-              <w:t>typed; PO number from the mill PO</w:t>
+              <w:t>4. Bespoke cloth is not kept in inventory: nothing is booked in when it arrives and nothing is deducted when it is approved.</w:t>
             </w:r>
           </w:p>
         </w:tc>
@@ -6215,7 +6216,32 @@
                 <w:color w:val="1A1A1A"/>
                 <w:sz w:val="17"/>
               </w:rPr>
-              <w:t>the order needs a fabric and a factory; later capped at the panel allowance; the bespoke routing is proposed, not final</w:t>
+              <w:t>typed; PO number from the mill PO</w:t>
+            </w:r>
+          </w:p>
+        </w:tc>
+        <w:tc>
+          <w:tcPr>
+            <w:tcW w:type="dxa" w:w="1624"/>
+            <w:tcBorders>
+              <w:bottom w:val="single" w:sz="4" w:color="E5E5E5"/>
+              <w:top w:val="nil"/>
+              <w:left w:val="nil"/>
+              <w:right w:val="nil"/>
+            </w:tcBorders>
+          </w:tcPr>
+          <w:p>
+            <w:pPr>
+              <w:spacing w:before="0" w:after="40"/>
+            </w:pPr>
+            <w:r/>
+            <w:r>
+              <w:rPr>
+                <w:rFonts w:ascii="Inter Tight" w:hAnsi="Inter Tight" w:cs="Inter Tight" w:eastAsia="Inter Tight"/>
+                <w:color w:val="1A1A1A"/>
+                <w:sz w:val="17"/>
+              </w:rPr>
+              <w:t>the order needs a fabric and a factory; later capped at the panel allowance</w:t>
             </w:r>
           </w:p>
         </w:tc>
@@ -12593,7 +12619,7 @@
                 <w:color w:val="1A1A1A"/>
                 <w:sz w:val="17"/>
               </w:rPr>
-              <w:t>Approval from the shelf deducts the metres at once. Bespoke cloth, an alteration unit's ask, or a shortfall the shelf cannot cover goes to Shravani in one click from production; Shravani approves and the PO is generated; it returns to production to approve when the cloth is in. A tool for this in Swati's hands comes in a later phase.</w:t>
+              <w:t>Approval from the shelf deducts the metres from physical stock at once, alteration cloth included. Bespoke cloth, an alteration unit's ask, or a shortfall the shelf cannot cover goes to Shravani in one click from production; an alteration the shelf covers is issued and deducted on her approval; otherwise Shravani approves, the PO is generated, and it returns to production to approve when the cloth is in. Bespoke is never in inventory: nothing is booked in or deducted for it. A tool for this in Swati's hands comes in a later phase.</w:t>
             </w:r>
           </w:p>
         </w:tc>

</xml_diff>

<commit_message>
CAD desk: view the order sheet XML (copy, download); PRD updated
Co-Authored-By: Claude Opus 5.5 <noreply@anthropic.com>
</commit_message>
<xml_diff>
--- a/public/docs/bsc-plm-prd-mtm-v1.0.docx
+++ b/public/docs/bsc-plm-prd-mtm-v1.0.docx
@@ -5175,7 +5175,7 @@
                 <w:color w:val="1A1A1A"/>
                 <w:sz w:val="17"/>
               </w:rPr>
-              <w:t>3. The CAD desk uploads the CAD file it made on each order (Upload CAD file on the row); an order cannot be marked done at CAD without it, and the file stays on the order for cutting.</w:t>
+              <w:t>3. The CAD desk sees each order's order sheet XML (View XML on the row, with copy and download); the XML is generated by the order software we connect to. It uploads the CAD file it made on each order (Upload CAD file on the row); an order cannot be marked done at CAD without it, and the file stays on the order for cutting.</w:t>
             </w:r>
           </w:p>
           <w:p>
@@ -5213,7 +5213,7 @@
                 <w:color w:val="1A1A1A"/>
                 <w:sz w:val="17"/>
               </w:rPr>
-              <w:t>the plan; the order sheet XML from Enigma; typed</w:t>
+              <w:t>the plan; the order sheet XML from the connected order software; the CAD file uploaded; typed</w:t>
             </w:r>
           </w:p>
         </w:tc>

</xml_diff>

<commit_message>
Pre-production team queues (ready, blocked, in progress, hand-offs) with block reasons; RetailOS pre-confirmed screen with days; store owners in RetailOS only; PRD updated
Co-Authored-By: Claude Opus 5.5 <noreply@anthropic.com>
</commit_message>
<xml_diff>
--- a/public/docs/bsc-plm-prd-mtm-v1.0.docx
+++ b/public/docs/bsc-plm-prd-mtm-v1.0.docx
@@ -193,7 +193,7 @@
           <w:color w:val="1A1A1A"/>
           <w:sz w:val="20"/>
         </w:rPr>
-        <w:t>Six roles in this edition, five of them with screens in BSC PLM (store managers stay in RetailOS), one login per team; colleagues in a team appear by name on what they wrote. Each role lands on the first screen it works in. The sidebar lists teams as pills; a team opens to its screens.</w:t>
+        <w:t>Six roles in this edition, five of them with screens in BSC PLM (store managers and owners stay in RetailOS), one login per team; colleagues in a team appear by name on what they wrote. Each role lands on the first screen it works in. The sidebar lists teams as pills; a team opens to its screens.</w:t>
       </w:r>
     </w:p>
     <w:tbl>
@@ -915,7 +915,7 @@
                 <w:color w:val="1A1A1A"/>
                 <w:sz w:val="17"/>
               </w:rPr>
-              <w:t>No screen in BSC PLM. Bills, customer profiles, order-sheet corrections, returns and credit notes and refund requests stay in RetailOS, which gains anything additional; the prototype shows these for demonstration only</w:t>
+              <w:t>No screen in BSC PLM, for store managers or store owners. Bills, customer profiles, order-sheet corrections, returns and credit notes and refund requests stay in RetailOS, and everything additional is built in RetailOS only; the prototype shows these for demonstration only</w:t>
             </w:r>
           </w:p>
         </w:tc>
@@ -2792,7 +2792,7 @@
           <w:color w:val="1A1A1A"/>
           <w:sz w:val="20"/>
         </w:rPr>
-        <w:t>The MTM side of the store page: customers, orders, what I can sell, returns and alterations. Anyone not from that store can read it but not act. Store managers will not have a screen in BSC PLM. They already work in RetailOS, and anything additional they need is added to RetailOS itself. The flows below are written down so RetailOS and BSC PLM agree on what passes between them; the store screens in the prototype are there only to demonstrate those flows end to end.</w:t>
+        <w:t>The MTM side of the store page: customers, orders, what I can sell, returns and alterations. Anyone not from that store can read it but not act. Store managers and store owners will not have a screen in BSC PLM. They already work in RetailOS, and everything additional for them is built in RetailOS only. The flows below are written down so RetailOS and BSC PLM agree on what passes between them; the store screens in the prototype are there only to demonstrate those flows end to end.</w:t>
       </w:r>
     </w:p>
     <w:tbl>
@@ -4476,20 +4476,33 @@
                 <w:color w:val="1A1A1A"/>
                 <w:sz w:val="17"/>
               </w:rPr>
-              <w:t>2. Allocate has two filters: Exclude pre-confirmed (the planning queue, the default) and Pre-confirmed (only these orders, each with Confirm).</w:t>
-            </w:r>
-          </w:p>
-          <w:p>
-            <w:pPr>
-              <w:spacing w:before="0" w:after="40"/>
-            </w:pPr>
-            <w:r>
-              <w:rPr>
-                <w:rFonts w:ascii="Inter Tight" w:hAnsi="Inter Tight" w:cs="Inter Tight" w:eastAsia="Inter Tight"/>
-                <w:color w:val="1A1A1A"/>
-                <w:sz w:val="17"/>
-              </w:rPr>
-              <w:t>3. Confirm order, with an optional remark, takes it into the planning queue.</w:t>
+              <w:t>2. Allocate has two filters: Exclude pre-confirmed (the planning queue, the default) and Pre-confirmed (only these orders, oldest first, with the days each has been pre-confirmed, and Confirm).</w:t>
+            </w:r>
+          </w:p>
+          <w:p>
+            <w:pPr>
+              <w:spacing w:before="0" w:after="40"/>
+            </w:pPr>
+            <w:r>
+              <w:rPr>
+                <w:rFonts w:ascii="Inter Tight" w:hAnsi="Inter Tight" w:cs="Inter Tight" w:eastAsia="Inter Tight"/>
+                <w:color w:val="1A1A1A"/>
+                <w:sz w:val="17"/>
+              </w:rPr>
+              <w:t>3. RetailOS gets a filtered screen of the store's pre-confirmed orders: order, customer, fabric, reason and note, and the days in pre-confirmed (red past 7), oldest first, with a filter by reason and Confirm on each. The prototype's store page shows it for demonstration.</w:t>
+            </w:r>
+          </w:p>
+          <w:p>
+            <w:pPr>
+              <w:spacing w:before="0" w:after="40"/>
+            </w:pPr>
+            <w:r>
+              <w:rPr>
+                <w:rFonts w:ascii="Inter Tight" w:hAnsi="Inter Tight" w:cs="Inter Tight" w:eastAsia="Inter Tight"/>
+                <w:color w:val="1A1A1A"/>
+                <w:sz w:val="17"/>
+              </w:rPr>
+              <w:t>4. Confirm order, with an optional remark, takes it into the planning queue.</w:t>
             </w:r>
           </w:p>
         </w:tc>
@@ -5162,7 +5175,7 @@
                 <w:color w:val="1A1A1A"/>
                 <w:sz w:val="17"/>
               </w:rPr>
-              <w:t>2. Each desk shows Waiting for us, Taken up and Done. The team selects orders and clicks Take up, which puts the person's name on them, then Mark done with an optional remark. The next desk sees them. Urgent orders sit on top, and an Urgent filter shows only them.</w:t>
+              <w:t>2. Each desk shows Waiting for us, Taken up, Blocked and Done. The team selects orders and clicks Take up, which puts the person's name on them, then Mark done with an optional remark. The next desk sees them. An order that cannot move (the XML missing a measurement, a short roll, interlining out) is marked blocked with a reason; it sits under Blocked until the team unblocks it. Urgent orders sit on top, and an Urgent filter shows only them.</w:t>
             </w:r>
           </w:p>
           <w:p>
@@ -5188,7 +5201,7 @@
                 <w:color w:val="1A1A1A"/>
                 <w:sz w:val="17"/>
               </w:rPr>
-              <w:t>4. Production's Pre-production tab counts orders at each desk (taken up or not started) and those ready to send, and shows every planned order with its four steps.</w:t>
+              <w:t>4. Production's Pre-production tab (Swati) shows each team's queue: orders ready for it, orders blocked (with the reason), work in progress, and completed hand-offs in the last 7 days, plus orders ready to send. Clicking a number lists those orders; the list shows every planned order with its four steps and any block.</w:t>
             </w:r>
           </w:p>
         </w:tc>
@@ -5238,7 +5251,7 @@
                 <w:color w:val="1A1A1A"/>
                 <w:sz w:val="17"/>
               </w:rPr>
-              <w:t>desks run in order; CAD needs its file uploaded; an order leaves for the factory only once compiled</w:t>
+              <w:t>desks run in order; a block needs a reason; CAD needs its file uploaded; an order leaves for the factory only once compiled</w:t>
             </w:r>
           </w:p>
         </w:tc>

</xml_diff>

<commit_message>
Desks: open an order (desks checklist, large fabric image, bin on rack map, CAD, order sheet); desks column; search, factory, plan filters; PRD updated
Co-Authored-By: Claude Opus 5.5 <noreply@anthropic.com>
</commit_message>
<xml_diff>
--- a/public/docs/bsc-plm-prd-mtm-v1.0.docx
+++ b/public/docs/bsc-plm-prd-mtm-v1.0.docx
@@ -5175,33 +5175,46 @@
                 <w:color w:val="1A1A1A"/>
                 <w:sz w:val="17"/>
               </w:rPr>
-              <w:t>2. Each desk shows Waiting for us, Taken up, Blocked and Done. The team selects orders and clicks Take up, which puts the person's name on them, then Mark done with an optional remark. The next desk sees them. An order that cannot move (the XML missing a measurement, a short roll, interlining out) is marked blocked with a reason; it sits under Blocked until the team unblocks it. Urgent orders sit on top, and an Urgent filter shows only them.</w:t>
-            </w:r>
-          </w:p>
-          <w:p>
-            <w:pPr>
-              <w:spacing w:before="0" w:after="40"/>
-            </w:pPr>
-            <w:r>
-              <w:rPr>
-                <w:rFonts w:ascii="Inter Tight" w:hAnsi="Inter Tight" w:cs="Inter Tight" w:eastAsia="Inter Tight"/>
-                <w:color w:val="1A1A1A"/>
-                <w:sz w:val="17"/>
-              </w:rPr>
-              <w:t>3. The CAD desk sees each order's order sheet XML (View XML on the row, with copy and download); the XML is generated by the order software we connect to. It uploads the CAD file it made on each order (Upload CAD file on the row); an order cannot be marked done at CAD without it, and the file stays on the order for cutting.</w:t>
-            </w:r>
-          </w:p>
-          <w:p>
-            <w:pPr>
-              <w:spacing w:before="0" w:after="40"/>
-            </w:pPr>
-            <w:r>
-              <w:rPr>
-                <w:rFonts w:ascii="Inter Tight" w:hAnsi="Inter Tight" w:cs="Inter Tight" w:eastAsia="Inter Tight"/>
-                <w:color w:val="1A1A1A"/>
-                <w:sz w:val="17"/>
-              </w:rPr>
-              <w:t>4. Production's Pre-production tab (Swati) shows each team's queue: orders ready for it, orders blocked (with the reason), work in progress, and completed hand-offs in the last 7 days, plus orders ready to send. Clicking a number lists those orders; the list shows every planned order with its four steps and any block.</w:t>
+              <w:t>2. Each desk shows Waiting for us, Taken up, Blocked and Done. The team selects orders and clicks Take up, which puts the person's name on them, then Mark done with an optional remark. The next desk sees them. An order that cannot move (the XML missing a measurement, a short roll, interlining out) is marked blocked with a reason; it sits under Blocked until the team unblocks it. Urgent orders sit on top. Filters: Urgent, search by order, customer or fabric, factory, and plan. Each row carries the desks checklist (CAD, Cutting, Fusing, Compiling: done, in progress or blocked, with who).</w:t>
+            </w:r>
+          </w:p>
+          <w:p>
+            <w:pPr>
+              <w:spacing w:before="0" w:after="40"/>
+            </w:pPr>
+            <w:r>
+              <w:rPr>
+                <w:rFonts w:ascii="Inter Tight" w:hAnsi="Inter Tight" w:cs="Inter Tight" w:eastAsia="Inter Tight"/>
+                <w:color w:val="1A1A1A"/>
+                <w:sz w:val="17"/>
+              </w:rPr>
+              <w:t>3. Clicking an order opens it on any desk: the desks checklist with who took each step up and finished it, and Take up, Mark done or Mark blocked for this desk; the fabric image from the fabric master, large, with the metres to cut and the bin and its place on the rack map (contrast fabric too, each with its image and bin); the CAD (the order sheet XML and the CAD file); and the order sheet (plan, factory, ship-by, styling, measurements, remarks). The cutting desk sees the fabric image largest.</w:t>
+            </w:r>
+          </w:p>
+          <w:p>
+            <w:pPr>
+              <w:spacing w:before="0" w:after="40"/>
+            </w:pPr>
+            <w:r>
+              <w:rPr>
+                <w:rFonts w:ascii="Inter Tight" w:hAnsi="Inter Tight" w:cs="Inter Tight" w:eastAsia="Inter Tight"/>
+                <w:color w:val="1A1A1A"/>
+                <w:sz w:val="17"/>
+              </w:rPr>
+              <w:t>4. The CAD desk sees each order's order sheet XML (View XML on the row, with copy and download); the XML is generated by the order software we connect to. It uploads the CAD file it made on each order (Upload CAD file on the row); an order cannot be marked done at CAD without it, and the file stays on the order for cutting.</w:t>
+            </w:r>
+          </w:p>
+          <w:p>
+            <w:pPr>
+              <w:spacing w:before="0" w:after="40"/>
+            </w:pPr>
+            <w:r>
+              <w:rPr>
+                <w:rFonts w:ascii="Inter Tight" w:hAnsi="Inter Tight" w:cs="Inter Tight" w:eastAsia="Inter Tight"/>
+                <w:color w:val="1A1A1A"/>
+                <w:sz w:val="17"/>
+              </w:rPr>
+              <w:t>5. Production's Pre-production tab (Swati) shows each team's queue: orders ready for it, orders blocked (with the reason), work in progress, and completed hand-offs in the last 7 days, plus orders ready to send. Clicking a number lists those orders; the list shows every planned order with its four steps and any block.</w:t>
             </w:r>
           </w:p>
         </w:tc>

</xml_diff>

<commit_message>
Fabric image and bin (location, photo) come from the backend: fields, desk view, PRD
Co-Authored-By: Claude Opus 5.5 <noreply@anthropic.com>
</commit_message>
<xml_diff>
--- a/public/docs/bsc-plm-prd-mtm-v1.0.docx
+++ b/public/docs/bsc-plm-prd-mtm-v1.0.docx
@@ -1360,7 +1360,7 @@
                 <w:color w:val="1A1A1A"/>
                 <w:sz w:val="17"/>
               </w:rPr>
-              <w:t>Fabric Name, Inventory Type, Category, Product Type, Fabric Code, On Hold; Vendor Information (Vendor Name, Vendor Code for fabric, Mill Country, Mill Description, Currency, Cost per Unit, TAT in hours, MOQ, Mills); the Dynamic Attributes for shirts (Panna, Big-Checked, Thread Count, Fabric Ply, Wrinkle Resistance, Stretch, Consumed_In, Construction, Composition family, Washed Fabric, Wash shrinkage %, Washcare Description, Weight Class, Weave Description, Pattern, Fabric Color, Contrast Fabric, Fabric Piping, Is_Cutroll, Is_uniform, Weave, Composition); fabric image</w:t>
+              <w:t>Fabric Name, Inventory Type, Category, Product Type, Fabric Code, On Hold; Vendor Information (Vendor Name, Vendor Code for fabric, Mill Country, Mill Description, Currency, Cost per Unit, TAT in hours, MOQ, Mills); the Dynamic Attributes for shirts (Panna, Big-Checked, Thread Count, Fabric Ply, Wrinkle Resistance, Stretch, Consumed_In, Construction, Composition family, Washed Fabric, Wash shrinkage %, Washcare Description, Weight Class, Weave Description, Pattern, Fabric Color, Contrast Fabric, Fabric Piping, Is_Cutroll, Is_uniform, Weave, Composition); fabric image (image URL, shown large on the pre-production desks)</w:t>
             </w:r>
           </w:p>
         </w:tc>
@@ -1487,7 +1487,7 @@
                 <w:color w:val="1A1A1A"/>
                 <w:sz w:val="17"/>
               </w:rPr>
-              <w:t>Warehouse, Threshold, Max Inventory, Is Auto Replenishment, bins; physical, reserved, saleable</w:t>
+              <w:t>Warehouse, Threshold, Max Inventory, Is Auto Replenishment, bins (bin code, metres in the bin, the bin's location on the rack and a bin photo); physical, reserved, saleable</w:t>
             </w:r>
           </w:p>
         </w:tc>
@@ -1562,7 +1562,7 @@
                 <w:color w:val="1A1A1A"/>
                 <w:sz w:val="17"/>
               </w:rPr>
-              <w:t>Fabric master, purchase orders, store "fabrics live today"</w:t>
+              <w:t>Fabric master, purchase orders, store "fabrics live today", the pre-production desks (where the roll is)</w:t>
             </w:r>
           </w:p>
         </w:tc>
@@ -5188,7 +5188,7 @@
                 <w:color w:val="1A1A1A"/>
                 <w:sz w:val="17"/>
               </w:rPr>
-              <w:t>3. Clicking an order opens it on any desk: the desks checklist with who took each step up and finished it, and Take up, Mark done or Mark blocked for this desk; the fabric image from the fabric master, large, with the metres to cut and the bin and its place on the rack map (contrast fabric too, each with its image and bin); the CAD (the order sheet XML and the CAD file); and the order sheet (plan, factory, ship-by, styling, measurements, remarks). The cutting desk sees the fabric image largest.</w:t>
+              <w:t>3. Clicking an order opens it on any desk: the desks checklist with who took each step up and finished it, and Take up, Mark done or Mark blocked for this desk; the fabric image from the backend (fabric master), large, with the metres to cut, and the bin from the backend: its code, its place on the rack map and the bin photo (contrast fabric too, each with its image and bin); the CAD (the order sheet XML and the CAD file); and the order sheet (plan, factory, ship-by, styling, measurements, remarks). The cutting desk sees the fabric image largest.</w:t>
             </w:r>
           </w:p>
           <w:p>
@@ -5239,7 +5239,7 @@
                 <w:color w:val="1A1A1A"/>
                 <w:sz w:val="17"/>
               </w:rPr>
-              <w:t>the plan; the order sheet XML from the connected order software; the CAD file uploaded; typed</w:t>
+              <w:t>the plan; the order sheet XML from the connected order software; the fabric image and the bin location and photo from the backend; the CAD file uploaded; typed</w:t>
             </w:r>
           </w:p>
         </w:tc>

</xml_diff>

<commit_message>
PRD: tightened about 18% with the same content
Co-Authored-By: Claude Opus 5.5 <noreply@anthropic.com>
</commit_message>
<xml_diff>
--- a/public/docs/bsc-plm-prd-mtm-v1.0.docx
+++ b/public/docs/bsc-plm-prd-mtm-v1.0.docx
@@ -108,7 +108,7 @@
           <w:color w:val="1A1A1A"/>
           <w:sz w:val="20"/>
         </w:rPr>
-        <w:t>This is the requirements document for the MTM edition of BSC PLM: the version of the tool that covers Bombay Shirt Company's made-to-measure business end to end and nothing else. It is what the MTM prototype shows, written down screen by screen so the delivery team can build from it. The workflows run in the order a shirt happens: the customer's order at the store, the day's production and the factory floor, then the cloth behind it, the fabric master, purchase orders, sourcing, the design loop and the swatch desk. The full prototype remains the reference for the ready-to-wear work; everything that is RTW-only is out of this document and comes in a later phase.</w:t>
+        <w:t>Requirements for the MTM edition of BSC PLM: Bombay Shirt Company's made-to-measure business end to end, as the MTM prototype shows it, screen by screen. Workflows run in the order a shirt happens: the order at the store, the day's production and the factory floor, then the cloth (fabric master, purchase orders, sourcing, the design loop, the swatch desk). RTW-only work is out and comes in a later phase; the full prototype stays its reference.</w:t>
       </w:r>
     </w:p>
     <w:p>
@@ -118,7 +118,7 @@
           <w:color w:val="1A1A1A"/>
           <w:sz w:val="20"/>
         </w:rPr>
-        <w:t>BSC PLM is built beside Enigma, not inside it. Enigma stays the system of record for fabrics, vendors, customer orders, purchase orders and stock. BSC PLM reads what it needs over Enigma's API and keeps its own records for everything Enigma does not hold: the design loop on a new fabric, the vendor's terms and hold, the swatch desk, production plans, scans, changed sheets, cases and conversation. Where BSC PLM shows a field Enigma owns, it shows it under Enigma's own name, so what is typed here is what goes there.</w:t>
+        <w:t>BSC PLM sits beside Enigma, not inside it. Enigma stays the system of record for fabrics, vendors, customer orders, purchase orders and stock. BSC PLM reads what it needs over Enigma's API and keeps its own records for what Enigma does not hold: the design loop, vendor terms and holds, the swatch desk, production plans, scans, changed sheets, cases and conversation. Fields Enigma owns appear under Enigma's own names, so what is typed here is what goes there.</w:t>
       </w:r>
     </w:p>
     <w:p>
@@ -137,7 +137,7 @@
           <w:color w:val="1A1A1A"/>
           <w:sz w:val="20"/>
         </w:rPr>
-        <w:t>The customer's order first: the store's MTM work (bills, fit profiles, trial and express, sheet corrections, returns, credit, refunds); MTM daily production (queue, plan, floor, changed sheets, extra fabric, ship-by moves), the factory merchandiser's MTM floor and the Factories screen. Then the cloth: the MTM fabric master as Enigma's fabric DB (fabric info, attributes, inventory, transactions, reservations); purchase orders, raised by Enigma or by hand, and the receiving line; the core weekly stock review; the sourcing desk and the vendor master; the MTM fabric requirement from ask to live online (five states); the swatch desk up to the handover to Yusuf; and the conversation and files on every record; and the cross-cutting bell and names rule.</w:t>
+        <w:t>The store's MTM work (bills, fit profiles, trial and express, sheet corrections, returns, credit, refunds); MTM daily production (queue, plan, pre-production desks, floor, changed sheets, extra fabric, ship-by moves), the factory merchandiser's floor and the Factories screen; the MTM fabric master as Enigma's fabric DB; purchase orders (auto or by hand) and the receiving line; the core weekly stock review; the sourcing desk and vendor master; the fabric requirement from ask to live online (five states); the swatch desk up to the handover to Yusuf; conversation and files on every record; the bell and names rule.</w:t>
       </w:r>
     </w:p>
     <w:p>
@@ -156,7 +156,7 @@
           <w:color w:val="1A1A1A"/>
           <w:sz w:val="20"/>
         </w:rPr>
-        <w:t>Dates are the record's own. Quantities are pieces unless the unit says metres. A state is where a record IS, never the next step. Every rule marked later is specified but not built in the prototype. Field names in italics are Enigma's.</w:t>
+        <w:t>Dates are the record's own. Quantities are pieces unless the unit says metres. A state is where a record is, never the next step. Rules marked later are specified but not built in the prototype. Field names in italics are Enigma's.</w:t>
       </w:r>
     </w:p>
     <w:p>
@@ -193,7 +193,7 @@
           <w:color w:val="1A1A1A"/>
           <w:sz w:val="20"/>
         </w:rPr>
-        <w:t>Six roles in this edition, five of them with screens in BSC PLM (store managers and owners stay in RetailOS), one login per team; colleagues in a team appear by name on what they wrote. Each role lands on the first screen it works in. The sidebar lists teams as pills; a team opens to its screens.</w:t>
+        <w:t>Six roles, five with screens in BSC PLM (store managers and owners stay in RetailOS). One login per team; colleagues appear by name on what they wrote. Each role lands on the first screen it works in; the sidebar lists teams as pills.</w:t>
       </w:r>
     </w:p>
     <w:tbl>
@@ -330,7 +330,7 @@
                 <w:color w:val="5C6066"/>
                 <w:sz w:val="13"/>
               </w:rPr>
-              <w:t>READS BUT DOES NOT EDIT</w:t>
+              <w:t>READS ONLY</w:t>
             </w:r>
           </w:p>
         </w:tc>
@@ -407,7 +407,7 @@
                 <w:color w:val="1A1A1A"/>
                 <w:sz w:val="17"/>
               </w:rPr>
-              <w:t>Every MTM fabric requirement; Push PO, More time or Reject on the vendor; the designs on a fabric and their push to Enigma; working, final and changed names; price per variant; go live online; pause and resume a fabric; promote to core; the fabric's Enigma fields</w:t>
+              <w:t>Every MTM fabric requirement; Push PO, More time or Reject on the vendor; designs and their push to Enigma; working, final and changed names; price per variant; go live online; pause and resume; promote to core; the fabric's Enigma fields</w:t>
             </w:r>
           </w:p>
         </w:tc>
@@ -457,7 +457,7 @@
                 <w:color w:val="1A1A1A"/>
                 <w:sz w:val="17"/>
               </w:rPr>
-              <w:t>Sourcing's desk, the swatch desk, purchase orders</w:t>
+              <w:t>Sourcing desk, swatch desk, purchase orders</w:t>
             </w:r>
           </w:p>
         </w:tc>
@@ -534,7 +534,7 @@
                 <w:color w:val="1A1A1A"/>
                 <w:sz w:val="17"/>
               </w:rPr>
-              <w:t>One vendor against every ask; extension asks; the mills (Enigma's vendor master, Add Vendor, Edit Vendor); purchase orders raised by hand; mill confirmation and remarks; the receiving line; the weekly core stock review; trims and packaging</w:t>
+              <w:t>A vendor on every ask; extension asks; the mills (Enigma's vendor master, Add and Edit Vendor); POs by hand; mill confirmation and remarks; the receiving line; the weekly core review; trims and packaging</w:t>
             </w:r>
           </w:p>
         </w:tc>
@@ -661,7 +661,7 @@
                 <w:color w:val="1A1A1A"/>
                 <w:sz w:val="17"/>
               </w:rPr>
-              <w:t>Confirm pre-confirmed orders, allocate pieces to factories, plans, the pre-production overview, the factory floor, changed sheets, extra fabric, ship-by moves; the Factories screen inputs</w:t>
+              <w:t>Confirm pre-confirmed orders; allocate to factories; plans; the pre-production overview; the factory floor; changed sheets; extra fabric; ship-by moves; Factories screen inputs</w:t>
             </w:r>
           </w:p>
         </w:tc>
@@ -763,7 +763,7 @@
                 <w:color w:val="1A1A1A"/>
                 <w:sz w:val="17"/>
               </w:rPr>
-              <w:t>Abhin M, Bhupendra, the floor at each unit</w:t>
+              <w:t>Abhin M, Bhupendra, each unit's floor</w:t>
             </w:r>
           </w:p>
         </w:tc>
@@ -838,7 +838,7 @@
                 <w:color w:val="1A1A1A"/>
                 <w:sz w:val="17"/>
               </w:rPr>
-              <w:t>The order sheet and job card</w:t>
+              <w:t>Order sheet and job card</w:t>
             </w:r>
           </w:p>
         </w:tc>
@@ -915,7 +915,7 @@
                 <w:color w:val="1A1A1A"/>
                 <w:sz w:val="17"/>
               </w:rPr>
-              <w:t>No screen in BSC PLM, for store managers or store owners. Bills, customer profiles, order-sheet corrections, returns and credit notes and refund requests stay in RetailOS, and everything additional is built in RetailOS only; the prototype shows these for demonstration only</w:t>
+              <w:t>No screen in BSC PLM, for managers or owners. Bills, profiles, sheet corrections, returns, credit notes and refund requests stay in RetailOS; everything additional is built in RetailOS only. The prototype shows them for demonstration</w:t>
             </w:r>
           </w:p>
         </w:tc>
@@ -1107,7 +1107,7 @@
           <w:color w:val="0A0A0A"/>
           <w:sz w:val="20"/>
         </w:rPr>
-        <w:t xml:space="preserve">Warehouse people in this edition. </w:t>
+        <w:t xml:space="preserve">Warehouse and unit teams. </w:t>
       </w:r>
       <w:r>
         <w:rPr>
@@ -1115,7 +1115,7 @@
           <w:color w:val="1A1A1A"/>
           <w:sz w:val="20"/>
         </w:rPr>
-        <w:t>Shravani and Yusuf do not have a portal here. Their work appears where it happens: Shravani books rolls on the purchase order's receiving line; Yusuf is the handover on the swatch desk. Both return as a role when the warehouse portal is added.</w:t>
+        <w:t>No portal for Shravani and Yusuf in this edition; their work appears where it happens. Shravani books rolls on the PO's receiving line and approves the mill PO for bespoke and alteration extra fabric; Yusuf is the swatch desk handover. The CAD, cutting, fusing and compiling teams each work from their own desk. The warehouse returns as a role with its portal.</w:t>
       </w:r>
     </w:p>
     <w:p>
@@ -1126,7 +1126,7 @@
           <w:color w:val="0A0A0A"/>
           <w:sz w:val="20"/>
         </w:rPr>
-        <w:t xml:space="preserve">Rules that follow from roles. </w:t>
+        <w:t xml:space="preserve">Role rules. </w:t>
       </w:r>
       <w:r>
         <w:rPr>
@@ -1134,7 +1134,7 @@
           <w:color w:val="1A1A1A"/>
           <w:sz w:val="20"/>
         </w:rPr>
-        <w:t>A button appears only for the role that owns the step; everyone else sees whose move it is. The factory merchandiser is scoped to one factory, the store manager to one store; a demo switch lifts both scopes for walkthroughs.</w:t>
+        <w:t>A button shows only for the role that owns the step; others see whose move it is. The factory merchandiser is scoped to one factory, the store to one store; a demo switch lifts both.</w:t>
       </w:r>
     </w:p>
     <w:p>
@@ -1171,7 +1171,7 @@
           <w:color w:val="1A1A1A"/>
           <w:sz w:val="20"/>
         </w:rPr>
-        <w:t>Enigma holds the transactions. BSC PLM reads them, shows them under Enigma's field names, and keeps its own records for the decisions. Write-back to Enigma is the last phase and only where access is granted.</w:t>
+        <w:t>Enigma holds the transactions; BSC PLM reads them under Enigma's field names and records the decisions. Write-back is the last phase, only where access is granted.</w:t>
       </w:r>
     </w:p>
     <w:tbl>
@@ -1233,7 +1233,7 @@
                 <w:color w:val="5C6066"/>
                 <w:sz w:val="13"/>
               </w:rPr>
-              <w:t>WHAT BSC PLM READS</w:t>
+              <w:t>BSC PLM READS</w:t>
             </w:r>
           </w:p>
         </w:tc>
@@ -1258,7 +1258,7 @@
                 <w:color w:val="5C6066"/>
                 <w:sz w:val="13"/>
               </w:rPr>
-              <w:t>WHAT BSC PLM WRITES (LAST PHASE, IF GRANTED)</w:t>
+              <w:t>BSC PLM WRITES (LAST PHASE, IF GRANTED)</w:t>
             </w:r>
           </w:p>
         </w:tc>
@@ -1283,7 +1283,7 @@
                 <w:color w:val="5C6066"/>
                 <w:sz w:val="13"/>
               </w:rPr>
-              <w:t>WHAT STAYS RECORDED ONLY</w:t>
+              <w:t>RECORDED ONLY</w:t>
             </w:r>
           </w:p>
         </w:tc>
@@ -1360,7 +1360,7 @@
                 <w:color w:val="1A1A1A"/>
                 <w:sz w:val="17"/>
               </w:rPr>
-              <w:t>Fabric Name, Inventory Type, Category, Product Type, Fabric Code, On Hold; Vendor Information (Vendor Name, Vendor Code for fabric, Mill Country, Mill Description, Currency, Cost per Unit, TAT in hours, MOQ, Mills); the Dynamic Attributes for shirts (Panna, Big-Checked, Thread Count, Fabric Ply, Wrinkle Resistance, Stretch, Consumed_In, Construction, Composition family, Washed Fabric, Wash shrinkage %, Washcare Description, Weight Class, Weave Description, Pattern, Fabric Color, Contrast Fabric, Fabric Piping, Is_Cutroll, Is_uniform, Weave, Composition); fabric image (image URL, shown large on the pre-production desks)</w:t>
+              <w:t>Fabric Name, Inventory Type, Category, Product Type, Fabric Code, On Hold; Vendor Information (Vendor Name, Vendor Code for fabric, Mill Country, Mill Description, Currency, Cost per Unit, TAT in hours, MOQ, Mills); Dynamic Attributes for shirts (Panna, Big-Checked, Thread Count, Fabric Ply, Wrinkle Resistance, Stretch, Consumed_In, Construction, Composition family, Washed Fabric, Wash shrinkage %, Washcare Description, Weight Class, Weave Description, Pattern, Fabric Color, Contrast Fabric, Fabric Piping, Is_Cutroll, Is_uniform, Weave, Composition); fabric image (URL, shown large on the pre-production desks)</w:t>
             </w:r>
           </w:p>
         </w:tc>
@@ -1385,7 +1385,7 @@
                 <w:color w:val="1A1A1A"/>
                 <w:sz w:val="17"/>
               </w:rPr>
-              <w:t>Field edits made on the fabric record; On-hold on pause, resume or supplier switch-off; the new fabric at Push PO</w:t>
+              <w:t>Fabric record edits; On Hold on pause, resume or supplier switch-off; the new fabric at Push PO</w:t>
             </w:r>
           </w:p>
         </w:tc>
@@ -1487,7 +1487,7 @@
                 <w:color w:val="1A1A1A"/>
                 <w:sz w:val="17"/>
               </w:rPr>
-              <w:t>Warehouse, Threshold, Max Inventory, Is Auto Replenishment, bins (bin code, metres in the bin, the bin's location on the rack and a bin photo); physical, reserved, saleable</w:t>
+              <w:t>Warehouse, Threshold, Max Inventory, Is Auto Replenishment, bins (code, metres, location on the rack, photo); physical, reserved, saleable</w:t>
             </w:r>
           </w:p>
         </w:tc>
@@ -1512,7 +1512,7 @@
                 <w:color w:val="1A1A1A"/>
                 <w:sz w:val="17"/>
               </w:rPr>
-              <w:t>Threshold and bin edits; stock adjustment with Adjustment Reason and Description</w:t>
+              <w:t>Threshold and bin edits; adjustment with Adjustment Reason and Description</w:t>
             </w:r>
           </w:p>
         </w:tc>
@@ -1562,7 +1562,7 @@
                 <w:color w:val="1A1A1A"/>
                 <w:sz w:val="17"/>
               </w:rPr>
-              <w:t>Fabric master, purchase orders, store "fabrics live today", the pre-production desks (where the roll is)</w:t>
+              <w:t>Fabric master, POs, store fabrics live today, pre-production desks (where the roll is)</w:t>
             </w:r>
           </w:p>
         </w:tc>
@@ -1689,7 +1689,7 @@
                 <w:color w:val="1A1A1A"/>
                 <w:sz w:val="17"/>
               </w:rPr>
-              <w:t>Inventory &amp; movements on the fabric record; rate of sale</w:t>
+              <w:t>Inventory &amp; movements; rate of sale</w:t>
             </w:r>
           </w:p>
         </w:tc>
@@ -1766,7 +1766,7 @@
                 <w:color w:val="1A1A1A"/>
                 <w:sz w:val="17"/>
               </w:rPr>
-              <w:t>Create the PO at Push PO or Raise PO; Update Receiving Status</w:t>
+              <w:t>Create at Push PO or Raise PO; Update Receiving Status</w:t>
             </w:r>
           </w:p>
         </w:tc>
@@ -1791,7 +1791,7 @@
                 <w:color w:val="1A1A1A"/>
                 <w:sz w:val="17"/>
               </w:rPr>
-              <w:t>The PO number comes back to the record</w:t>
+              <w:t>PO number back on the record</w:t>
             </w:r>
           </w:p>
         </w:tc>
@@ -1816,7 +1816,7 @@
                 <w:color w:val="1A1A1A"/>
                 <w:sz w:val="17"/>
               </w:rPr>
-              <w:t>Design loop, sourcing, purchase orders</w:t>
+              <w:t>Design loop, sourcing, POs</w:t>
             </w:r>
           </w:p>
         </w:tc>
@@ -1893,7 +1893,7 @@
                 <w:color w:val="1A1A1A"/>
                 <w:sz w:val="17"/>
               </w:rPr>
-              <w:t>Push to Enigma per design; re-push on a price change</w:t>
+              <w:t>Push per design; re-push on a price change</w:t>
             </w:r>
           </w:p>
         </w:tc>
@@ -2224,7 +2224,7 @@
                 <w:color w:val="5C6066"/>
                 <w:sz w:val="15"/>
               </w:rPr>
-              <w:t>Shopify</w:t>
+              <w:t>Connected order software</w:t>
             </w:r>
           </w:p>
         </w:tc>
@@ -2249,7 +2249,7 @@
                 <w:color w:val="1A1A1A"/>
                 <w:sz w:val="17"/>
               </w:rPr>
-              <w:t>Sales by product code, customer profile</w:t>
+              <w:t>The order sheet XML per order</w:t>
             </w:r>
           </w:p>
         </w:tc>
@@ -2299,7 +2299,7 @@
                 <w:color w:val="1A1A1A"/>
                 <w:sz w:val="17"/>
               </w:rPr>
-              <w:t>Listing, price, stock push</w:t>
+              <w:t>None</w:t>
             </w:r>
           </w:p>
         </w:tc>
@@ -2324,7 +2324,7 @@
                 <w:color w:val="1A1A1A"/>
                 <w:sz w:val="17"/>
               </w:rPr>
-              <w:t>Customer card, rate of sale</w:t>
+              <w:t>CAD desk</w:t>
             </w:r>
           </w:p>
         </w:tc>
@@ -2351,7 +2351,7 @@
                 <w:color w:val="5C6066"/>
                 <w:sz w:val="15"/>
               </w:rPr>
-              <w:t>Mill stock lists (email, WhatsApp)</w:t>
+              <w:t>Shopify</w:t>
             </w:r>
           </w:p>
         </w:tc>
@@ -2376,7 +2376,7 @@
                 <w:color w:val="1A1A1A"/>
                 <w:sz w:val="17"/>
               </w:rPr>
-              <w:t>Article, metres, price</w:t>
+              <w:t>Sales by product code, customer profile</w:t>
             </w:r>
           </w:p>
         </w:tc>
@@ -2426,7 +2426,7 @@
                 <w:color w:val="1A1A1A"/>
                 <w:sz w:val="17"/>
               </w:rPr>
-              <w:t>None</w:t>
+              <w:t>Listing, price, stock push</w:t>
             </w:r>
           </w:p>
         </w:tc>
@@ -2451,7 +2451,7 @@
                 <w:color w:val="1A1A1A"/>
                 <w:sz w:val="17"/>
               </w:rPr>
-              <w:t>Bespoke availability (store gate)</w:t>
+              <w:t>Customer card, rate of sale</w:t>
             </w:r>
           </w:p>
         </w:tc>
@@ -2478,7 +2478,7 @@
                 <w:color w:val="5C6066"/>
                 <w:sz w:val="15"/>
               </w:rPr>
-              <w:t>Sheets, imported once</w:t>
+              <w:t>Mill stock lists (email, WhatsApp)</w:t>
             </w:r>
           </w:p>
         </w:tc>
@@ -2503,7 +2503,7 @@
                 <w:color w:val="1A1A1A"/>
                 <w:sz w:val="17"/>
               </w:rPr>
-              <w:t>Fabric ordering, Merchandise Master, revised names, swatch tracker, Trims Working</w:t>
+              <w:t>Article, metres, price</w:t>
             </w:r>
           </w:p>
         </w:tc>
@@ -2553,7 +2553,7 @@
                 <w:color w:val="1A1A1A"/>
                 <w:sz w:val="17"/>
               </w:rPr>
-              <w:t>Kept read-only one month in parallel</w:t>
+              <w:t>None</w:t>
             </w:r>
           </w:p>
         </w:tc>
@@ -2578,7 +2578,7 @@
                 <w:color w:val="1A1A1A"/>
                 <w:sz w:val="17"/>
               </w:rPr>
-              <w:t>Seed and open items at go-live</w:t>
+              <w:t>Bespoke availability (store gate)</w:t>
             </w:r>
           </w:p>
         </w:tc>
@@ -2605,6 +2605,133 @@
                 <w:color w:val="5C6066"/>
                 <w:sz w:val="15"/>
               </w:rPr>
+              <w:t>Sheets, imported once</w:t>
+            </w:r>
+          </w:p>
+        </w:tc>
+        <w:tc>
+          <w:tcPr>
+            <w:tcW w:type="dxa" w:w="1949"/>
+            <w:tcBorders>
+              <w:bottom w:val="single" w:sz="4" w:color="E5E5E5"/>
+              <w:top w:val="nil"/>
+              <w:left w:val="nil"/>
+              <w:right w:val="nil"/>
+            </w:tcBorders>
+          </w:tcPr>
+          <w:p>
+            <w:pPr>
+              <w:spacing w:before="0" w:after="40"/>
+            </w:pPr>
+            <w:r/>
+            <w:r>
+              <w:rPr>
+                <w:rFonts w:ascii="Inter Tight" w:hAnsi="Inter Tight" w:cs="Inter Tight" w:eastAsia="Inter Tight"/>
+                <w:color w:val="1A1A1A"/>
+                <w:sz w:val="17"/>
+              </w:rPr>
+              <w:t>Fabric ordering, Merchandise Master, revised names, swatch tracker, Trims Working</w:t>
+            </w:r>
+          </w:p>
+        </w:tc>
+        <w:tc>
+          <w:tcPr>
+            <w:tcW w:type="dxa" w:w="1949"/>
+            <w:tcBorders>
+              <w:bottom w:val="single" w:sz="4" w:color="E5E5E5"/>
+              <w:top w:val="nil"/>
+              <w:left w:val="nil"/>
+              <w:right w:val="nil"/>
+            </w:tcBorders>
+          </w:tcPr>
+          <w:p>
+            <w:pPr>
+              <w:spacing w:before="0" w:after="40"/>
+            </w:pPr>
+            <w:r/>
+            <w:r>
+              <w:rPr>
+                <w:rFonts w:ascii="Inter Tight" w:hAnsi="Inter Tight" w:cs="Inter Tight" w:eastAsia="Inter Tight"/>
+                <w:color w:val="1A1A1A"/>
+                <w:sz w:val="17"/>
+              </w:rPr>
+              <w:t>None</w:t>
+            </w:r>
+          </w:p>
+        </w:tc>
+        <w:tc>
+          <w:tcPr>
+            <w:tcW w:type="dxa" w:w="1949"/>
+            <w:tcBorders>
+              <w:bottom w:val="single" w:sz="4" w:color="E5E5E5"/>
+              <w:top w:val="nil"/>
+              <w:left w:val="nil"/>
+              <w:right w:val="nil"/>
+            </w:tcBorders>
+          </w:tcPr>
+          <w:p>
+            <w:pPr>
+              <w:spacing w:before="0" w:after="40"/>
+            </w:pPr>
+            <w:r/>
+            <w:r>
+              <w:rPr>
+                <w:rFonts w:ascii="Inter Tight" w:hAnsi="Inter Tight" w:cs="Inter Tight" w:eastAsia="Inter Tight"/>
+                <w:color w:val="1A1A1A"/>
+                <w:sz w:val="17"/>
+              </w:rPr>
+              <w:t>Read-only one month in parallel</w:t>
+            </w:r>
+          </w:p>
+        </w:tc>
+        <w:tc>
+          <w:tcPr>
+            <w:tcW w:type="dxa" w:w="1949"/>
+            <w:tcBorders>
+              <w:bottom w:val="single" w:sz="4" w:color="E5E5E5"/>
+              <w:top w:val="nil"/>
+              <w:left w:val="nil"/>
+              <w:right w:val="nil"/>
+            </w:tcBorders>
+          </w:tcPr>
+          <w:p>
+            <w:pPr>
+              <w:spacing w:before="0" w:after="40"/>
+            </w:pPr>
+            <w:r/>
+            <w:r>
+              <w:rPr>
+                <w:rFonts w:ascii="Inter Tight" w:hAnsi="Inter Tight" w:cs="Inter Tight" w:eastAsia="Inter Tight"/>
+                <w:color w:val="1A1A1A"/>
+                <w:sz w:val="17"/>
+              </w:rPr>
+              <w:t>Seed and open items at go-live</w:t>
+            </w:r>
+          </w:p>
+        </w:tc>
+      </w:tr>
+      <w:tr>
+        <w:tc>
+          <w:tcPr>
+            <w:tcW w:type="dxa" w:w="1949"/>
+            <w:tcBorders>
+              <w:bottom w:val="single" w:sz="4" w:color="E5E5E5"/>
+              <w:top w:val="nil"/>
+              <w:left w:val="nil"/>
+              <w:right w:val="nil"/>
+            </w:tcBorders>
+          </w:tcPr>
+          <w:p>
+            <w:pPr>
+              <w:spacing w:before="0" w:after="40"/>
+            </w:pPr>
+            <w:r/>
+            <w:r>
+              <w:rPr>
+                <w:rFonts w:ascii="JetBrains Mono" w:hAnsi="JetBrains Mono" w:cs="JetBrains Mono" w:eastAsia="JetBrains Mono"/>
+                <w:color w:val="5C6066"/>
+                <w:sz w:val="15"/>
+              </w:rPr>
               <w:t>Typed in BSC PLM</w:t>
             </w:r>
           </w:p>
@@ -2630,7 +2757,7 @@
                 <w:color w:val="1A1A1A"/>
                 <w:sz w:val="17"/>
               </w:rPr>
-              <w:t>Requirements, vendor terms and holds, extension asks, designs, names, swatch dates, plans, scans, corrections, cases, comments, files</w:t>
+              <w:t>Requirements, vendor terms and holds, extensions, designs, names, swatch dates, plans, scans, desk steps, CAD files, corrections, cases, comments, files</w:t>
             </w:r>
           </w:p>
         </w:tc>
@@ -2720,7 +2847,7 @@
           <w:color w:val="0A0A0A"/>
           <w:sz w:val="20"/>
         </w:rPr>
-        <w:t xml:space="preserve">Computed by BSC PLM, never typed: </w:t>
+        <w:t xml:space="preserve">Computed, never typed: </w:t>
       </w:r>
       <w:r>
         <w:rPr>
@@ -2728,7 +2855,7 @@
           <w:color w:val="1A1A1A"/>
           <w:sz w:val="20"/>
         </w:rPr>
-        <w:t>saleable metres, weeks of cover, rate of sale, the reorder point and suggested PO, headroom per factory, store credit balance, the sheet version, every alert.</w:t>
+        <w:t>saleable metres, weeks of cover, rate of sale, reorder point and suggested PO, headroom per factory, store credit balance, sheet version, every alert.</w:t>
       </w:r>
     </w:p>
     <w:p>
@@ -2747,7 +2874,7 @@
           <w:color w:val="1A1A1A"/>
           <w:sz w:val="20"/>
         </w:rPr>
-        <w:t>Enigma's fabric read is one call of about 3.2 MB with no change filter, so it is polled nightly and on demand. Transaction reads need a code per call until a date range is confirmed. Shopify sales are read daily. Everything typed in BSC PLM is live.</w:t>
+        <w:t>The fabric read is one call of about 3.2 MB with no change filter: polled nightly and on demand. Transaction reads need a code per call until a date range is confirmed. Shopify sales daily. Everything typed here is live.</w:t>
       </w:r>
     </w:p>
     <w:p>
@@ -2792,7 +2919,7 @@
           <w:color w:val="1A1A1A"/>
           <w:sz w:val="20"/>
         </w:rPr>
-        <w:t>The MTM side of the store page: customers, orders, what I can sell, returns and alterations. Anyone not from that store can read it but not act. Store managers and store owners will not have a screen in BSC PLM. They already work in RetailOS, and everything additional for them is built in RetailOS only. The flows below are written down so RetailOS and BSC PLM agree on what passes between them; the store screens in the prototype are there only to demonstrate those flows end to end.</w:t>
+        <w:t>The MTM side of the store page: customers, orders, what I can sell, returns and alterations. Others can read it but not act. Store managers and owners have no screen in BSC PLM: they work in RetailOS, and everything additional for them is built there only. These flows fix what passes between RetailOS and BSC PLM; the prototype's store screens only demonstrate them.</w:t>
       </w:r>
     </w:p>
     <w:tbl>
@@ -3032,20 +3159,20 @@
                 <w:color w:val="1A1A1A"/>
                 <w:sz w:val="17"/>
               </w:rPr>
-              <w:t>1. Store → Customers: search by name or phone. The card shows home store, visits, spend, store credit with every note, measurements on file by fit profile, usual fabrics, past orders, open cases.</w:t>
-            </w:r>
-          </w:p>
-          <w:p>
-            <w:pPr>
-              <w:spacing w:before="0" w:after="40"/>
-            </w:pPr>
-            <w:r>
-              <w:rPr>
-                <w:rFonts w:ascii="Inter Tight" w:hAnsi="Inter Tight" w:cs="Inter Tight" w:eastAsia="Inter Tight"/>
-                <w:color w:val="1A1A1A"/>
-                <w:sz w:val="17"/>
-              </w:rPr>
-              <w:t>2. Punch MTM order, measurements pre-filled starts a bill with the last profile loaded.</w:t>
+              <w:t>1. Customers: search by name or phone. The card shows home store, visits, spend, store credit with notes, measurements by fit profile, usual fabrics, past orders, open cases.</w:t>
+            </w:r>
+          </w:p>
+          <w:p>
+            <w:pPr>
+              <w:spacing w:before="0" w:after="40"/>
+            </w:pPr>
+            <w:r>
+              <w:rPr>
+                <w:rFonts w:ascii="Inter Tight" w:hAnsi="Inter Tight" w:cs="Inter Tight" w:eastAsia="Inter Tight"/>
+                <w:color w:val="1A1A1A"/>
+                <w:sz w:val="17"/>
+              </w:rPr>
+              <w:t>2. Punch MTM order starts a bill with the last profile loaded.</w:t>
             </w:r>
           </w:p>
         </w:tc>
@@ -3070,7 +3197,7 @@
                 <w:color w:val="1A1A1A"/>
                 <w:sz w:val="17"/>
               </w:rPr>
-              <w:t>profile and spend from Shopify; orders, cases, credit from BSC PLM</w:t>
+              <w:t>Shopify profile and spend; orders, cases, credit from BSC PLM</w:t>
             </w:r>
           </w:p>
         </w:tc>
@@ -3120,7 +3247,7 @@
                 <w:color w:val="1A1A1A"/>
                 <w:sz w:val="17"/>
               </w:rPr>
-              <w:t>nothing is written until a bill is punched</w:t>
+              <w:t>nothing written until a bill is punched</w:t>
             </w:r>
           </w:p>
         </w:tc>
@@ -3210,33 +3337,33 @@
                 <w:color w:val="1A1A1A"/>
                 <w:sz w:val="17"/>
               </w:rPr>
-              <w:t>2. For each MTM piece: the fabric from "fabrics live today" (only fabrics open for selling, with the metres the store can still reserve), the design on it, the fit profile (a customer keeps several), who took the measurements, quantity. The order sheet opens pre-filled from the last order on that profile.</w:t>
-            </w:r>
-          </w:p>
-          <w:p>
-            <w:pPr>
-              <w:spacing w:before="0" w:after="40"/>
-            </w:pPr>
-            <w:r>
-              <w:rPr>
-                <w:rFonts w:ascii="Inter Tight" w:hAnsi="Inter Tight" w:cs="Inter Tight" w:eastAsia="Inter Tight"/>
-                <w:color w:val="1A1A1A"/>
-                <w:sz w:val="17"/>
-              </w:rPr>
-              <w:t>3. Above the pieces: Trial shirt first for a new customer (about 25 days) or Urgent (7 to 8 days, ₹600); a comment for the factory; a comment for shipping.</w:t>
-            </w:r>
-          </w:p>
-          <w:p>
-            <w:pPr>
-              <w:spacing w:before="0" w:after="40"/>
-            </w:pPr>
-            <w:r>
-              <w:rPr>
-                <w:rFonts w:ascii="Inter Tight" w:hAnsi="Inter Tight" w:cs="Inter Tight" w:eastAsia="Inter Tight"/>
-                <w:color w:val="1A1A1A"/>
-                <w:sz w:val="17"/>
-              </w:rPr>
-              <w:t>4. Apply store credit nets off up to the balance. Punch bill shows one bill number and one order number per piece with the promise date.</w:t>
+              <w:t>2. Per MTM piece: fabric from fabrics live today (open for selling, with metres the store can still reserve), design, fit profile (a customer keeps several), who measured, quantity. The sheet opens pre-filled from the last order on that profile.</w:t>
+            </w:r>
+          </w:p>
+          <w:p>
+            <w:pPr>
+              <w:spacing w:before="0" w:after="40"/>
+            </w:pPr>
+            <w:r>
+              <w:rPr>
+                <w:rFonts w:ascii="Inter Tight" w:hAnsi="Inter Tight" w:cs="Inter Tight" w:eastAsia="Inter Tight"/>
+                <w:color w:val="1A1A1A"/>
+                <w:sz w:val="17"/>
+              </w:rPr>
+              <w:t>3. Above the pieces: Trial shirt first for a new customer (about 25 days) or Urgent (7 to 8 days, ₹600); a comment for the factory; one for shipping.</w:t>
+            </w:r>
+          </w:p>
+          <w:p>
+            <w:pPr>
+              <w:spacing w:before="0" w:after="40"/>
+            </w:pPr>
+            <w:r>
+              <w:rPr>
+                <w:rFonts w:ascii="Inter Tight" w:hAnsi="Inter Tight" w:cs="Inter Tight" w:eastAsia="Inter Tight"/>
+                <w:color w:val="1A1A1A"/>
+                <w:sz w:val="17"/>
+              </w:rPr>
+              <w:t>4. Apply store credit nets off up to the balance. Punch bill gives one bill number and one order number per piece with its promise date.</w:t>
             </w:r>
           </w:p>
         </w:tc>
@@ -3261,7 +3388,7 @@
                 <w:color w:val="1A1A1A"/>
                 <w:sz w:val="17"/>
               </w:rPr>
-              <w:t>fabric list and metres from Enigma; credit from the ledger</w:t>
+              <w:t>fabric list and metres from Enigma; credit ledger</w:t>
             </w:r>
           </w:p>
         </w:tc>
@@ -3286,7 +3413,7 @@
                 <w:color w:val="1A1A1A"/>
                 <w:sz w:val="17"/>
               </w:rPr>
-              <w:t>only live fabrics can be picked; a sold-out bespoke fabric cannot be picked; credit capped at the balance</w:t>
+              <w:t>only live fabrics; no sold-out bespoke fabric; credit capped at the balance</w:t>
             </w:r>
           </w:p>
         </w:tc>
@@ -3311,7 +3438,7 @@
                 <w:color w:val="1A1A1A"/>
                 <w:sz w:val="17"/>
               </w:rPr>
-              <w:t>metres are reserved; the pieces join production's queue after the freeze window (workflow 2)</w:t>
+              <w:t>metres reserved; pieces join production's queue after the freeze window</w:t>
             </w:r>
           </w:p>
         </w:tc>
@@ -3388,20 +3515,20 @@
                 <w:color w:val="1A1A1A"/>
                 <w:sz w:val="17"/>
               </w:rPr>
-              <w:t>1. Store → Orders lists every piece punched here with its stage. One button per row: Handed to customer.</w:t>
-            </w:r>
-          </w:p>
-          <w:p>
-            <w:pPr>
-              <w:spacing w:before="0" w:after="40"/>
-            </w:pPr>
-            <w:r>
-              <w:rPr>
-                <w:rFonts w:ascii="Inter Tight" w:hAnsi="Inter Tight" w:cs="Inter Tight" w:eastAsia="Inter Tight"/>
-                <w:color w:val="1A1A1A"/>
-                <w:sz w:val="17"/>
-              </w:rPr>
-              <w:t>2. A ship-by moved by production reads "moved from 14 Oct, tell the customer" and lands in the bell.</w:t>
+              <w:t>1. Orders lists every piece punched here with its stage, and Handed to customer.</w:t>
+            </w:r>
+          </w:p>
+          <w:p>
+            <w:pPr>
+              <w:spacing w:before="0" w:after="40"/>
+            </w:pPr>
+            <w:r>
+              <w:rPr>
+                <w:rFonts w:ascii="Inter Tight" w:hAnsi="Inter Tight" w:cs="Inter Tight" w:eastAsia="Inter Tight"/>
+                <w:color w:val="1A1A1A"/>
+                <w:sz w:val="17"/>
+              </w:rPr>
+              <w:t>2. A ship-by moved by production reads “moved from 14 Oct, tell the customer” and lands in the bell.</w:t>
             </w:r>
           </w:p>
         </w:tc>
@@ -3476,7 +3603,7 @@
                 <w:color w:val="1A1A1A"/>
                 <w:sz w:val="17"/>
               </w:rPr>
-              <w:t>handing over closes the piece</w:t>
+              <w:t>handover closes the piece</w:t>
             </w:r>
           </w:p>
         </w:tc>
@@ -3553,33 +3680,33 @@
                 <w:color w:val="1A1A1A"/>
                 <w:sz w:val="17"/>
               </w:rPr>
-              <w:t>1. The sheet is Enigma's layout: measurements, pattern details, options. Every field that can be corrected is a dashed tile with a pencil on hover and a chip "click any field to correct it".</w:t>
-            </w:r>
-          </w:p>
-          <w:p>
-            <w:pPr>
-              <w:spacing w:before="0" w:after="40"/>
-            </w:pPr>
-            <w:r>
-              <w:rPr>
-                <w:rFonts w:ascii="Inter Tight" w:hAnsi="Inter Tight" w:cs="Inter Tight" w:eastAsia="Inter Tight"/>
-                <w:color w:val="1A1A1A"/>
-                <w:sz w:val="17"/>
-              </w:rPr>
-              <w:t>2. The associate clicks the field, types the correction and why, and saves. The sheet heading reads Order sheet · V1 · as punched, then V2 · changed once, V3 · changed 2 times; the change log shows the version each change produced.</w:t>
-            </w:r>
-          </w:p>
-          <w:p>
-            <w:pPr>
-              <w:spacing w:before="0" w:after="40"/>
-            </w:pPr>
-            <w:r>
-              <w:rPr>
-                <w:rFonts w:ascii="Inter Tight" w:hAnsi="Inter Tight" w:cs="Inter Tight" w:eastAsia="Inter Tight"/>
-                <w:color w:val="1A1A1A"/>
-                <w:sz w:val="17"/>
-              </w:rPr>
-              <w:t>3. Once production starts (the piece is on a plan) measurements and styling are locked and there are no free-form change remarks. Only a logistics remark can change.</w:t>
+              <w:t>1. The sheet is Enigma's layout. Every correctable field is a dashed tile: click, type the correction and why, save.</w:t>
+            </w:r>
+          </w:p>
+          <w:p>
+            <w:pPr>
+              <w:spacing w:before="0" w:after="40"/>
+            </w:pPr>
+            <w:r>
+              <w:rPr>
+                <w:rFonts w:ascii="Inter Tight" w:hAnsi="Inter Tight" w:cs="Inter Tight" w:eastAsia="Inter Tight"/>
+                <w:color w:val="1A1A1A"/>
+                <w:sz w:val="17"/>
+              </w:rPr>
+              <w:t>2. The heading reads V1 · as punched, then V2 · changed once, V3 · changed 2 times; the change log shows which version each change made.</w:t>
+            </w:r>
+          </w:p>
+          <w:p>
+            <w:pPr>
+              <w:spacing w:before="0" w:after="40"/>
+            </w:pPr>
+            <w:r>
+              <w:rPr>
+                <w:rFonts w:ascii="Inter Tight" w:hAnsi="Inter Tight" w:cs="Inter Tight" w:eastAsia="Inter Tight"/>
+                <w:color w:val="1A1A1A"/>
+                <w:sz w:val="17"/>
+              </w:rPr>
+              <w:t>3. Once the piece is on a plan, measurements and styling lock and free-form remarks stop; only a logistics remark can change.</w:t>
             </w:r>
           </w:p>
         </w:tc>
@@ -3654,7 +3781,7 @@
                 <w:color w:val="1A1A1A"/>
                 <w:sz w:val="17"/>
               </w:rPr>
-              <w:t>production sees a correction on Changed sheets as the next version; after production starts only a logistics remark changes on the order</w:t>
+              <w:t>production sees the next version on Changed sheets</w:t>
             </w:r>
           </w:p>
         </w:tc>
@@ -3731,7 +3858,7 @@
                 <w:color w:val="1A1A1A"/>
                 <w:sz w:val="17"/>
               </w:rPr>
-              <w:t>1. Return or alter on a delivered piece: the form shows whether it is inside the 30-day window (free alteration, credit note on return) or chargeable; reason, what the customer wants (Exchange, Credit note, Remake, Refund), remarks. Raise case gives a number and a 10-day promise.</w:t>
+              <w:t>1. Return or alter on a delivered piece shows whether it is inside 30 days (free alteration, credit note on return) or chargeable; reason, what the customer wants (Exchange, Credit note, Remake, Refund), remarks. Raise case gives a number and a 10-day promise.</w:t>
             </w:r>
           </w:p>
           <w:p>
@@ -3819,7 +3946,7 @@
                 <w:color w:val="1A1A1A"/>
                 <w:sz w:val="17"/>
               </w:rPr>
-              <w:t>credit note on take-back: CN-&lt;case&gt;, MRP, valid one year, offered on the next bill</w:t>
+              <w:t>take-back credit note: CN-&lt;case&gt;, MRP, valid one year, offered on the next bill</w:t>
             </w:r>
           </w:p>
         </w:tc>
@@ -3896,7 +4023,7 @@
                 <w:color w:val="1A1A1A"/>
                 <w:sz w:val="17"/>
               </w:rPr>
-              <w:t>1. Refund reads "requested, needs approval". The owner approves from the bell; finance clicks Moved with the reference.</w:t>
+              <w:t>1. Refund reads “requested, needs approval”. The owner approves from the bell; finance clicks Moved with the reference.</w:t>
             </w:r>
           </w:p>
         </w:tc>
@@ -3921,7 +4048,7 @@
                 <w:color w:val="1A1A1A"/>
                 <w:sz w:val="17"/>
               </w:rPr>
-              <w:t>amount from the MRP</w:t>
+              <w:t>amount from MRP</w:t>
             </w:r>
           </w:p>
         </w:tc>
@@ -3994,7 +4121,7 @@
           <w:color w:val="1A1A1A"/>
           <w:sz w:val="20"/>
         </w:rPr>
-        <w:t>Store: case past its promise; a fabric closed for selling; ship-by dates moved by production; a refund awaiting approval (owner).</w:t>
+        <w:t>Store: case past its promise; a fabric closed for selling; ship-by moved by production; refund awaiting approval (owner).</w:t>
       </w:r>
     </w:p>
     <w:p>
@@ -4039,7 +4166,7 @@
           <w:color w:val="1A1A1A"/>
           <w:sz w:val="20"/>
         </w:rPr>
-        <w:t>The production unit runs its day from one screen: Allocate, Plans, Factory floor, Changed sheets, Extra fabric. The system proposes the plan from each factory's spare capacity and a person confirms it. Every move of a piece is a scan. Daily output, aging and the capacity inputs sit on the Factories screen.</w:t>
+        <w:t>Production runs its day from one screen: Allocate, Plans, Pre-production, Factory floor, Changed sheets, Extra fabric. The system proposes each plan from the factories' spare capacity; a person confirms. Every move of a piece is a scan. Daily output, aging and capacity inputs sit on the Factories screen.</w:t>
       </w:r>
     </w:p>
     <w:p>
@@ -4058,7 +4185,7 @@
           <w:color w:val="1A1A1A"/>
           <w:sz w:val="20"/>
         </w:rPr>
-        <w:t>Order (punched at the store) → PP (waiting for a factory; frozen 2 hours for store-side changes) → PP · planned (on a plan) → pre-production at the unit: CAD → Cutting → Fusing → Compiling → In production (scanned out of the unit) → In factory (scanned in; aging after 5 days) → Out factory (QC passed) → RTS (back at the unit) → Fitting / shipping → Delivered. Cancelled can happen before cutting.</w:t>
+        <w:t>Order (punched) → PP (waiting for a factory; frozen 2 hours for store changes) → PP · planned (on a plan) → pre-production at the unit: CAD → Cutting → Fusing → Compiling → In production (scanned out) → In factory (aging after 5 days) → Out factory (QC passed) → RTS (back at the unit) → Fitting / shipping → Delivered. Cancelled is possible before cutting.</w:t>
       </w:r>
     </w:p>
     <w:tbl>
@@ -4298,20 +4425,20 @@
                 <w:color w:val="1A1A1A"/>
                 <w:sz w:val="17"/>
               </w:rPr>
-              <w:t>1. Every MTM piece joins Allocate once its freeze window (2 hours, a setting) has passed; pieces inside the freeze sit in a grey strip with the time they join.</w:t>
-            </w:r>
-          </w:p>
-          <w:p>
-            <w:pPr>
-              <w:spacing w:before="0" w:after="40"/>
-            </w:pPr>
-            <w:r>
-              <w:rPr>
-                <w:rFonts w:ascii="Inter Tight" w:hAnsi="Inter Tight" w:cs="Inter Tight" w:eastAsia="Inter Tight"/>
-                <w:color w:val="1A1A1A"/>
-                <w:sz w:val="17"/>
-              </w:rPr>
-              <w:t>2. Urgent first, then oldest; trial and express carry their shorter promise; bespoke shows "waiting for cloth" until its parcel is in.</w:t>
+              <w:t>1. A piece joins Allocate once its freeze (2 hours, a setting) has passed; pieces still frozen sit in a grey strip with the time they join.</w:t>
+            </w:r>
+          </w:p>
+          <w:p>
+            <w:pPr>
+              <w:spacing w:before="0" w:after="40"/>
+            </w:pPr>
+            <w:r>
+              <w:rPr>
+                <w:rFonts w:ascii="Inter Tight" w:hAnsi="Inter Tight" w:cs="Inter Tight" w:eastAsia="Inter Tight"/>
+                <w:color w:val="1A1A1A"/>
+                <w:sz w:val="17"/>
+              </w:rPr>
+              <w:t>2. Urgent first, then oldest; trial and express keep their shorter promise; bespoke shows “waiting for cloth” until its parcel is in.</w:t>
             </w:r>
           </w:p>
         </w:tc>
@@ -4463,46 +4590,46 @@
                 <w:color w:val="1A1A1A"/>
                 <w:sz w:val="17"/>
               </w:rPr>
-              <w:t>1. An order taken at the store but not yet confirmed (measurement not done, on hold, payment pending) is pre-confirmed. It shows the reason and a note.</w:t>
-            </w:r>
-          </w:p>
-          <w:p>
-            <w:pPr>
-              <w:spacing w:before="0" w:after="40"/>
-            </w:pPr>
-            <w:r>
-              <w:rPr>
-                <w:rFonts w:ascii="Inter Tight" w:hAnsi="Inter Tight" w:cs="Inter Tight" w:eastAsia="Inter Tight"/>
-                <w:color w:val="1A1A1A"/>
-                <w:sz w:val="17"/>
-              </w:rPr>
-              <w:t>2. Allocate has two filters: Exclude pre-confirmed (the planning queue, the default) and Pre-confirmed (only these orders, oldest first, with the days each has been pre-confirmed, and Confirm).</w:t>
-            </w:r>
-          </w:p>
-          <w:p>
-            <w:pPr>
-              <w:spacing w:before="0" w:after="40"/>
-            </w:pPr>
-            <w:r>
-              <w:rPr>
-                <w:rFonts w:ascii="Inter Tight" w:hAnsi="Inter Tight" w:cs="Inter Tight" w:eastAsia="Inter Tight"/>
-                <w:color w:val="1A1A1A"/>
-                <w:sz w:val="17"/>
-              </w:rPr>
-              <w:t>3. RetailOS gets a filtered screen of the store's pre-confirmed orders: order, customer, fabric, reason and note, and the days in pre-confirmed (red past 7), oldest first, with a filter by reason and Confirm on each. The prototype's store page shows it for demonstration.</w:t>
-            </w:r>
-          </w:p>
-          <w:p>
-            <w:pPr>
-              <w:spacing w:before="0" w:after="40"/>
-            </w:pPr>
-            <w:r>
-              <w:rPr>
-                <w:rFonts w:ascii="Inter Tight" w:hAnsi="Inter Tight" w:cs="Inter Tight" w:eastAsia="Inter Tight"/>
-                <w:color w:val="1A1A1A"/>
-                <w:sz w:val="17"/>
-              </w:rPr>
-              <w:t>4. Confirm order, with an optional remark, takes it into the planning queue.</w:t>
+              <w:t>1. An order taken but not confirmed (measurement not done, on hold, payment pending) is pre-confirmed, with its reason and a note.</w:t>
+            </w:r>
+          </w:p>
+          <w:p>
+            <w:pPr>
+              <w:spacing w:before="0" w:after="40"/>
+            </w:pPr>
+            <w:r>
+              <w:rPr>
+                <w:rFonts w:ascii="Inter Tight" w:hAnsi="Inter Tight" w:cs="Inter Tight" w:eastAsia="Inter Tight"/>
+                <w:color w:val="1A1A1A"/>
+                <w:sz w:val="17"/>
+              </w:rPr>
+              <w:t>2. Allocate filters: Exclude pre-confirmed (the queue, default) and Pre-confirmed (oldest first, days pre-confirmed, Confirm).</w:t>
+            </w:r>
+          </w:p>
+          <w:p>
+            <w:pPr>
+              <w:spacing w:before="0" w:after="40"/>
+            </w:pPr>
+            <w:r>
+              <w:rPr>
+                <w:rFonts w:ascii="Inter Tight" w:hAnsi="Inter Tight" w:cs="Inter Tight" w:eastAsia="Inter Tight"/>
+                <w:color w:val="1A1A1A"/>
+                <w:sz w:val="17"/>
+              </w:rPr>
+              <w:t>3. RetailOS gets the store's pre-confirmed list: order, customer, fabric, reason and note, days pre-confirmed (red past 7), oldest first, a reason filter and Confirm. The prototype store page demonstrates it.</w:t>
+            </w:r>
+          </w:p>
+          <w:p>
+            <w:pPr>
+              <w:spacing w:before="0" w:after="40"/>
+            </w:pPr>
+            <w:r>
+              <w:rPr>
+                <w:rFonts w:ascii="Inter Tight" w:hAnsi="Inter Tight" w:cs="Inter Tight" w:eastAsia="Inter Tight"/>
+                <w:color w:val="1A1A1A"/>
+                <w:sz w:val="17"/>
+              </w:rPr>
+              <w:t>4. Confirm order, with an optional remark, moves it into the queue.</w:t>
             </w:r>
           </w:p>
         </w:tc>
@@ -4552,7 +4679,7 @@
                 <w:color w:val="1A1A1A"/>
                 <w:sz w:val="17"/>
               </w:rPr>
-              <w:t>a pre-confirmed order cannot be planned to a factory</w:t>
+              <w:t>never planned to a factory until confirmed</w:t>
             </w:r>
           </w:p>
         </w:tc>
@@ -4577,7 +4704,7 @@
                 <w:color w:val="1A1A1A"/>
                 <w:sz w:val="17"/>
               </w:rPr>
-              <w:t>confirmed orders join the queue in punch order</w:t>
+              <w:t>confirmed orders join in punch order</w:t>
             </w:r>
           </w:p>
         </w:tc>
@@ -4654,20 +4781,20 @@
                 <w:color w:val="1A1A1A"/>
                 <w:sz w:val="17"/>
               </w:rPr>
-              <w:t>1. One card per MTM factory: feed target, pieces on the floor and their age, in transit, headroom today, load in days, the number proposed.</w:t>
-            </w:r>
-          </w:p>
-          <w:p>
-            <w:pPr>
-              <w:spacing w:before="0" w:after="40"/>
-            </w:pPr>
-            <w:r>
-              <w:rPr>
-                <w:rFonts w:ascii="Inter Tight" w:hAnsi="Inter Tight" w:cs="Inter Tight" w:eastAsia="Inter Tight"/>
-                <w:color w:val="1A1A1A"/>
-                <w:sz w:val="17"/>
-              </w:rPr>
-              <w:t>2. Corporate pieces to the corporate factory; urgent to the factory with an urgent reserve if room, else the nearest with room; the rest to the most headroom, oldest first.</w:t>
+              <w:t>1. One card per MTM factory: feed target, pieces on the floor and their age, in transit, headroom today, load in days, number proposed.</w:t>
+            </w:r>
+          </w:p>
+          <w:p>
+            <w:pPr>
+              <w:spacing w:before="0" w:after="40"/>
+            </w:pPr>
+            <w:r>
+              <w:rPr>
+                <w:rFonts w:ascii="Inter Tight" w:hAnsi="Inter Tight" w:cs="Inter Tight" w:eastAsia="Inter Tight"/>
+                <w:color w:val="1A1A1A"/>
+                <w:sz w:val="17"/>
+              </w:rPr>
+              <w:t>2. Corporate to the corporate factory; urgent to the factory with an urgent reserve if it has room, else the nearest with room; the rest to the most headroom, oldest first.</w:t>
             </w:r>
           </w:p>
         </w:tc>
@@ -4692,7 +4819,7 @@
                 <w:color w:val="1A1A1A"/>
                 <w:sz w:val="17"/>
               </w:rPr>
-              <w:t>Factories screen inputs; day logs</w:t>
+              <w:t>Factories inputs; day logs</w:t>
             </w:r>
           </w:p>
         </w:tc>
@@ -4819,20 +4946,20 @@
                 <w:color w:val="1A1A1A"/>
                 <w:sz w:val="17"/>
               </w:rPr>
-              <w:t>1. Tick pieces (all, oldest 20/30/50, or the card's proposal), pick the factory; the card shows headroom after this plan and "over by N" in red.</w:t>
-            </w:r>
-          </w:p>
-          <w:p>
-            <w:pPr>
-              <w:spacing w:before="0" w:after="40"/>
-            </w:pPr>
-            <w:r>
-              <w:rPr>
-                <w:rFonts w:ascii="Inter Tight" w:hAnsi="Inter Tight" w:cs="Inter Tight" w:eastAsia="Inter Tight"/>
-                <w:color w:val="1A1A1A"/>
-                <w:sz w:val="17"/>
-              </w:rPr>
-              <w:t>2. Submit N to &lt;factory&gt;; over headroom the button reads Send anyway and records the override.</w:t>
+              <w:t>1. Tick pieces (all, oldest 20/30/50, or the proposal) and pick the factory; the card shows headroom after the plan and “over by N” in red.</w:t>
+            </w:r>
+          </w:p>
+          <w:p>
+            <w:pPr>
+              <w:spacing w:before="0" w:after="40"/>
+            </w:pPr>
+            <w:r>
+              <w:rPr>
+                <w:rFonts w:ascii="Inter Tight" w:hAnsi="Inter Tight" w:cs="Inter Tight" w:eastAsia="Inter Tight"/>
+                <w:color w:val="1A1A1A"/>
+                <w:sz w:val="17"/>
+              </w:rPr>
+              <w:t>2. Submit N to &lt;factory&gt;; over headroom it reads Send anyway and records the override.</w:t>
             </w:r>
           </w:p>
         </w:tc>
@@ -4907,7 +5034,7 @@
                 <w:color w:val="1A1A1A"/>
                 <w:sz w:val="17"/>
               </w:rPr>
-              <w:t>a plan number; pieces read PP · planned; the cut list fills; the factory sees "on its way"</w:t>
+              <w:t>a plan number; pieces read PP · planned; the factory sees “on its way”</w:t>
             </w:r>
           </w:p>
         </w:tc>
@@ -4984,33 +5111,33 @@
                 <w:color w:val="1A1A1A"/>
                 <w:sz w:val="17"/>
               </w:rPr>
-              <w:t>1. Plans lists every plan: number, factory, created, pieces, where the pieces are (a pill per stage with a count), open or closed. Clicking a row opens the plan.</w:t>
-            </w:r>
-          </w:p>
-          <w:p>
-            <w:pPr>
-              <w:spacing w:before="0" w:after="40"/>
-            </w:pPr>
-            <w:r>
-              <w:rPr>
-                <w:rFonts w:ascii="Inter Tight" w:hAnsi="Inter Tight" w:cs="Inter Tight" w:eastAsia="Inter Tight"/>
-                <w:color w:val="1A1A1A"/>
-                <w:sz w:val="17"/>
-              </w:rPr>
-              <w:t>2. The plan shows its facts (factory, pieces, cloth in metres, fabrics, first ship-by, urgent count; sent over capacity and by whom), a left-to-right strip of where its pieces are (planned → in production → in factory → out factory → RTS → dispatched, a count in each), the whole-plan scans that apply right now, the cut list by fabric, and every piece: order, customer and store, fabric and metres, ship-by, stage, and the dates it was sent to the factory, reached it, was ready and came back at the unit.</w:t>
-            </w:r>
-          </w:p>
-          <w:p>
-            <w:pPr>
-              <w:spacing w:before="0" w:after="40"/>
-            </w:pPr>
-            <w:r>
-              <w:rPr>
-                <w:rFonts w:ascii="Inter Tight" w:hAnsi="Inter Tight" w:cs="Inter Tight" w:eastAsia="Inter Tight"/>
-                <w:color w:val="1A1A1A"/>
-                <w:sz w:val="17"/>
-              </w:rPr>
-              <w:t>3. Clicking a piece opens its order sheet with the full timeline.</w:t>
+              <w:t>1. Plans lists each plan: number, factory, created, pieces, a pill per stage with a count, open or closed.</w:t>
+            </w:r>
+          </w:p>
+          <w:p>
+            <w:pPr>
+              <w:spacing w:before="0" w:after="40"/>
+            </w:pPr>
+            <w:r>
+              <w:rPr>
+                <w:rFonts w:ascii="Inter Tight" w:hAnsi="Inter Tight" w:cs="Inter Tight" w:eastAsia="Inter Tight"/>
+                <w:color w:val="1A1A1A"/>
+                <w:sz w:val="17"/>
+              </w:rPr>
+              <w:t>2. A plan shows its facts (factory, pieces, metres, fabrics, first ship-by, urgent count, any over-capacity send and by whom), a strip of where its pieces are (planned → in production → in factory → out factory → RTS → dispatched), the scans that apply now, the cut list by fabric, and every piece with order, customer, store, fabric, metres, ship-by, stage and its scan dates.</w:t>
+            </w:r>
+          </w:p>
+          <w:p>
+            <w:pPr>
+              <w:spacing w:before="0" w:after="40"/>
+            </w:pPr>
+            <w:r>
+              <w:rPr>
+                <w:rFonts w:ascii="Inter Tight" w:hAnsi="Inter Tight" w:cs="Inter Tight" w:eastAsia="Inter Tight"/>
+                <w:color w:val="1A1A1A"/>
+                <w:sz w:val="17"/>
+              </w:rPr>
+              <w:t>3. A piece opens its order sheet with the full timeline.</w:t>
             </w:r>
           </w:p>
         </w:tc>
@@ -5085,7 +5212,7 @@
                 <w:color w:val="1A1A1A"/>
                 <w:sz w:val="17"/>
               </w:rPr>
-              <w:t>the dates are the scans; nothing is typed</w:t>
+              <w:t>dates are the scans; nothing typed</w:t>
             </w:r>
           </w:p>
         </w:tc>
@@ -5162,59 +5289,59 @@
                 <w:color w:val="1A1A1A"/>
                 <w:sz w:val="17"/>
               </w:rPr>
-              <w:t>1. Once a plan is submitted, every order on it passes four desks at the unit, each with its own screen: CAD (the order sheet XML from the connected order software becomes a CAD file and a print), Cutting (the cloth is cut to the CAD and the print attached), Fusing (collar, cuff and placket interlining), Compiling (the bundle is checked and approved).</w:t>
-            </w:r>
-          </w:p>
-          <w:p>
-            <w:pPr>
-              <w:spacing w:before="0" w:after="40"/>
-            </w:pPr>
-            <w:r>
-              <w:rPr>
-                <w:rFonts w:ascii="Inter Tight" w:hAnsi="Inter Tight" w:cs="Inter Tight" w:eastAsia="Inter Tight"/>
-                <w:color w:val="1A1A1A"/>
-                <w:sz w:val="17"/>
-              </w:rPr>
-              <w:t>2. Each desk shows Waiting for us, Taken up, Blocked and Done. The team selects orders and clicks Take up, which puts the person's name on them, then Mark done with an optional remark. The next desk sees them. An order that cannot move (the XML missing a measurement, a short roll, interlining out) is marked blocked with a reason; it sits under Blocked until the team unblocks it. Urgent orders sit on top. Filters: Urgent, search by order, customer or fabric, factory, and plan. Each row carries the desks checklist (CAD, Cutting, Fusing, Compiling: done, in progress or blocked, with who).</w:t>
-            </w:r>
-          </w:p>
-          <w:p>
-            <w:pPr>
-              <w:spacing w:before="0" w:after="40"/>
-            </w:pPr>
-            <w:r>
-              <w:rPr>
-                <w:rFonts w:ascii="Inter Tight" w:hAnsi="Inter Tight" w:cs="Inter Tight" w:eastAsia="Inter Tight"/>
-                <w:color w:val="1A1A1A"/>
-                <w:sz w:val="17"/>
-              </w:rPr>
-              <w:t>3. Clicking an order opens it on any desk: the desks checklist with who took each step up and finished it, and Take up, Mark done or Mark blocked for this desk; the fabric image from the backend (fabric master), large, with the metres to cut, and the bin from the backend: its code, its place on the rack map and the bin photo (contrast fabric too, each with its image and bin); the CAD (the order sheet XML and the CAD file); and the order sheet (plan, factory, ship-by, styling, measurements, remarks). The cutting desk sees the fabric image largest.</w:t>
-            </w:r>
-          </w:p>
-          <w:p>
-            <w:pPr>
-              <w:spacing w:before="0" w:after="40"/>
-            </w:pPr>
-            <w:r>
-              <w:rPr>
-                <w:rFonts w:ascii="Inter Tight" w:hAnsi="Inter Tight" w:cs="Inter Tight" w:eastAsia="Inter Tight"/>
-                <w:color w:val="1A1A1A"/>
-                <w:sz w:val="17"/>
-              </w:rPr>
-              <w:t>4. The CAD desk sees each order's order sheet XML (View XML on the row, with copy and download); the XML is generated by the order software we connect to. It uploads the CAD file it made on each order (Upload CAD file on the row); an order cannot be marked done at CAD without it, and the file stays on the order for cutting.</w:t>
-            </w:r>
-          </w:p>
-          <w:p>
-            <w:pPr>
-              <w:spacing w:before="0" w:after="40"/>
-            </w:pPr>
-            <w:r>
-              <w:rPr>
-                <w:rFonts w:ascii="Inter Tight" w:hAnsi="Inter Tight" w:cs="Inter Tight" w:eastAsia="Inter Tight"/>
-                <w:color w:val="1A1A1A"/>
-                <w:sz w:val="17"/>
-              </w:rPr>
-              <w:t>5. Production's Pre-production tab (Swati) shows each team's queue: orders ready for it, orders blocked (with the reason), work in progress, and completed hand-offs in the last 7 days, plus orders ready to send. Clicking a number lists those orders; the list shows every planned order with its four steps and any block.</w:t>
+              <w:t>1. After a plan is submitted every order passes four desks, each with its own screen: CAD (the order sheet XML becomes a CAD file and a print), Cutting (cloth cut to the CAD, print attached), Fusing (collar, cuff and placket interlining), Compiling (bundle checked and approved).</w:t>
+            </w:r>
+          </w:p>
+          <w:p>
+            <w:pPr>
+              <w:spacing w:before="0" w:after="40"/>
+            </w:pPr>
+            <w:r>
+              <w:rPr>
+                <w:rFonts w:ascii="Inter Tight" w:hAnsi="Inter Tight" w:cs="Inter Tight" w:eastAsia="Inter Tight"/>
+                <w:color w:val="1A1A1A"/>
+                <w:sz w:val="17"/>
+              </w:rPr>
+              <w:t>2. Tabs: Waiting for us, Taken up, Blocked, Done. Take up puts the person's name on the orders; Mark done, with an optional remark, hands them to the next desk. An order that cannot move (XML missing a measurement, short roll, interlining out) is marked blocked with a reason until unblocked. Urgent sits on top. Filters: Urgent; search by order, customer or fabric; factory; plan. Each row shows the desks checklist (done, in progress or blocked, with who).</w:t>
+            </w:r>
+          </w:p>
+          <w:p>
+            <w:pPr>
+              <w:spacing w:before="0" w:after="40"/>
+            </w:pPr>
+            <w:r>
+              <w:rPr>
+                <w:rFonts w:ascii="Inter Tight" w:hAnsi="Inter Tight" w:cs="Inter Tight" w:eastAsia="Inter Tight"/>
+                <w:color w:val="1A1A1A"/>
+                <w:sz w:val="17"/>
+              </w:rPr>
+              <w:t>3. Opening an order, on any desk, shows: the desks checklist with who took up and finished each step, plus Take up, Mark done or Mark blocked; the fabric image from the backend, large (largest on cutting), metres to cut, and the bin from the backend (code, place on the rack map, photo), contrast fabric likewise; the CAD (XML and file); the order sheet (plan, factory, ship-by, styling, measurements, remarks).</w:t>
+            </w:r>
+          </w:p>
+          <w:p>
+            <w:pPr>
+              <w:spacing w:before="0" w:after="40"/>
+            </w:pPr>
+            <w:r>
+              <w:rPr>
+                <w:rFonts w:ascii="Inter Tight" w:hAnsi="Inter Tight" w:cs="Inter Tight" w:eastAsia="Inter Tight"/>
+                <w:color w:val="1A1A1A"/>
+                <w:sz w:val="17"/>
+              </w:rPr>
+              <w:t>4. CAD sees each order's XML (View XML, copy, download), generated by the connected order software, and uploads the CAD file it made; CAD cannot be marked done without it, and the file stays on the order for cutting.</w:t>
+            </w:r>
+          </w:p>
+          <w:p>
+            <w:pPr>
+              <w:spacing w:before="0" w:after="40"/>
+            </w:pPr>
+            <w:r>
+              <w:rPr>
+                <w:rFonts w:ascii="Inter Tight" w:hAnsi="Inter Tight" w:cs="Inter Tight" w:eastAsia="Inter Tight"/>
+                <w:color w:val="1A1A1A"/>
+                <w:sz w:val="17"/>
+              </w:rPr>
+              <w:t>5. Production's Pre-production tab (Swati) shows each team's queue: ready for it, blocked (with reason), work in progress, hand-offs completed in 7 days, and orders ready to send. A number opens those orders with their four steps and any block.</w:t>
             </w:r>
           </w:p>
         </w:tc>
@@ -5239,7 +5366,7 @@
                 <w:color w:val="1A1A1A"/>
                 <w:sz w:val="17"/>
               </w:rPr>
-              <w:t>the plan; the order sheet XML from the connected order software; the fabric image and the bin location and photo from the backend; the CAD file uploaded; typed</w:t>
+              <w:t>the plan; XML from the connected order software; fabric image, bin location and photo from the backend; CAD file uploaded; typed</w:t>
             </w:r>
           </w:p>
         </w:tc>
@@ -5264,7 +5391,7 @@
                 <w:color w:val="1A1A1A"/>
                 <w:sz w:val="17"/>
               </w:rPr>
-              <w:t>desks run in order; a block needs a reason; CAD needs its file uploaded; an order leaves for the factory only once compiled</w:t>
+              <w:t>desks in order; a block needs a reason; CAD needs its file; leaves for the factory only once compiled</w:t>
             </w:r>
           </w:p>
         </w:tc>
@@ -5366,20 +5493,20 @@
                 <w:color w:val="1A1A1A"/>
                 <w:sz w:val="17"/>
               </w:rPr>
-              <w:t>1. A piece can carry contrast fabric: a little of another inventory fabric for a pocket, a collar band or a cuff lining. It is listed on the order with the fabric and metres; the compiling desk can add a line.</w:t>
-            </w:r>
-          </w:p>
-          <w:p>
-            <w:pPr>
-              <w:spacing w:before="0" w:after="40"/>
-            </w:pPr>
-            <w:r>
-              <w:rPr>
-                <w:rFonts w:ascii="Inter Tight" w:hAnsi="Inter Tight" w:cs="Inter Tight" w:eastAsia="Inter Tight"/>
-                <w:color w:val="1A1A1A"/>
-                <w:sz w:val="17"/>
-              </w:rPr>
-              <w:t>2. Approve &amp; mark compiled deducts the contrast metres from that fabric's physical stock, with a line in its transactions.</w:t>
+              <w:t>1. A piece can carry a little of another inventory fabric (pocket, collar band, cuff lining), listed on the order with fabric and metres; compiling can add a line.</w:t>
+            </w:r>
+          </w:p>
+          <w:p>
+            <w:pPr>
+              <w:spacing w:before="0" w:after="40"/>
+            </w:pPr>
+            <w:r>
+              <w:rPr>
+                <w:rFonts w:ascii="Inter Tight" w:hAnsi="Inter Tight" w:cs="Inter Tight" w:eastAsia="Inter Tight"/>
+                <w:color w:val="1A1A1A"/>
+                <w:sz w:val="17"/>
+              </w:rPr>
+              <w:t>2. Approve &amp; mark compiled deducts the contrast metres from that fabric's physical stock, with a transaction line.</w:t>
             </w:r>
           </w:p>
         </w:tc>
@@ -5429,7 +5556,7 @@
                 <w:color w:val="1A1A1A"/>
                 <w:sz w:val="17"/>
               </w:rPr>
-              <w:t>only inventory fabric; metres per line</w:t>
+              <w:t>inventory fabric only; metres per line</w:t>
             </w:r>
           </w:p>
         </w:tc>
@@ -5454,7 +5581,7 @@
                 <w:color w:val="1A1A1A"/>
                 <w:sz w:val="17"/>
               </w:rPr>
-              <w:t>physical stock falls by the contrast metres; saleable follows</w:t>
+              <w:t>physical falls by the contrast metres; saleable follows</w:t>
             </w:r>
           </w:p>
         </w:tc>
@@ -5531,7 +5658,7 @@
                 <w:color w:val="1A1A1A"/>
                 <w:sz w:val="17"/>
               </w:rPr>
-              <w:t>1. Each plan shows a cut list by fabric and the order sheets. Scan out sends the compiled orders to the factory.</w:t>
+              <w:t>1. Each plan has a cut list by fabric and the order sheets. Scan out sends compiled orders to the factory.</w:t>
             </w:r>
           </w:p>
         </w:tc>
@@ -5606,7 +5733,7 @@
                 <w:color w:val="1A1A1A"/>
                 <w:sz w:val="17"/>
               </w:rPr>
-              <w:t>In production; the main fabric's metres come off physical and reserved stock at the scan</w:t>
+              <w:t>In production; the main fabric's metres leave physical and reserved stock</w:t>
             </w:r>
           </w:p>
         </w:tc>
@@ -5683,20 +5810,20 @@
                 <w:color w:val="1A1A1A"/>
                 <w:sz w:val="17"/>
               </w:rPr>
-              <w:t>1. My factory: on their way, on the floor, ready. Received per piece or selection; Out of the factory when done; Log the day at day end with pieces out and a note.</w:t>
-            </w:r>
-          </w:p>
-          <w:p>
-            <w:pPr>
-              <w:spacing w:before="0" w:after="40"/>
-            </w:pPr>
-            <w:r>
-              <w:rPr>
-                <w:rFonts w:ascii="Inter Tight" w:hAnsi="Inter Tight" w:cs="Inter Tight" w:eastAsia="Inter Tight"/>
-                <w:color w:val="1A1A1A"/>
-                <w:sz w:val="17"/>
-              </w:rPr>
-              <w:t>2. Production's Factory floor tab shows the same floor per factory: order, customer, fabric and metres, tag, ship-by, stage, when the piece reached the factory (or when it was sent, while on its way), and days in factory, red past 5. Urgent pieces sit on top, and an Urgent filter shows only them so the floor works them first. Clicking a row opens the order sheet.</w:t>
+              <w:t>1. My factory: on their way, on the floor, ready. Received per piece or selection; Out of the factory when done; Log the day with pieces out and a note.</w:t>
+            </w:r>
+          </w:p>
+          <w:p>
+            <w:pPr>
+              <w:spacing w:before="0" w:after="40"/>
+            </w:pPr>
+            <w:r>
+              <w:rPr>
+                <w:rFonts w:ascii="Inter Tight" w:hAnsi="Inter Tight" w:cs="Inter Tight" w:eastAsia="Inter Tight"/>
+                <w:color w:val="1A1A1A"/>
+                <w:sz w:val="17"/>
+              </w:rPr>
+              <w:t>2. Production's Factory floor shows the same per factory: order, customer, fabric, metres, tag, ship-by, stage, reached (or sent) date, days in factory (red past 5). Urgent sits on top, with an Urgent filter so the floor works them first. A row opens the order sheet.</w:t>
             </w:r>
           </w:p>
         </w:tc>
@@ -5771,7 +5898,7 @@
                 <w:color w:val="1A1A1A"/>
                 <w:sz w:val="17"/>
               </w:rPr>
-              <w:t>the Factories screen shows the factory's count beside the scanned count, amber when they differ</w:t>
+              <w:t>Factories screen shows the factory's count beside the scanned, amber when they differ</w:t>
             </w:r>
           </w:p>
         </w:tc>
@@ -5848,33 +5975,33 @@
                 <w:color w:val="1A1A1A"/>
                 <w:sz w:val="17"/>
               </w:rPr>
-              <w:t>1. Once a piece is on a plan no measurement or styling change reaches the factory; remarks arriving at arbitrary points get missed and leave the factory accountable for a change it could not make.</w:t>
-            </w:r>
-          </w:p>
-          <w:p>
-            <w:pPr>
-              <w:spacing w:before="0" w:after="40"/>
-            </w:pPr>
-            <w:r>
-              <w:rPr>
-                <w:rFonts w:ascii="Inter Tight" w:hAnsi="Inter Tight" w:cs="Inter Tight" w:eastAsia="Inter Tight"/>
-                <w:color w:val="1A1A1A"/>
-                <w:sz w:val="17"/>
-              </w:rPr>
-              <w:t>2. A logistics remark shows on the order for the shipping team; nothing is re-issued to the factory.</w:t>
-            </w:r>
-          </w:p>
-          <w:p>
-            <w:pPr>
-              <w:spacing w:before="0" w:after="40"/>
-            </w:pPr>
-            <w:r>
-              <w:rPr>
-                <w:rFonts w:ascii="Inter Tight" w:hAnsi="Inter Tight" w:cs="Inter Tight" w:eastAsia="Inter Tight"/>
-                <w:color w:val="1A1A1A"/>
-                <w:sz w:val="17"/>
-              </w:rPr>
-              <w:t>3. Changes made before planning appear on Changed sheets; production clicks Acknowledged once it has acted on them.</w:t>
+              <w:t>1. Once on a plan, no measurement or styling change reaches the factory: stray remarks get missed and leave the factory blamed for a change it could not make.</w:t>
+            </w:r>
+          </w:p>
+          <w:p>
+            <w:pPr>
+              <w:spacing w:before="0" w:after="40"/>
+            </w:pPr>
+            <w:r>
+              <w:rPr>
+                <w:rFonts w:ascii="Inter Tight" w:hAnsi="Inter Tight" w:cs="Inter Tight" w:eastAsia="Inter Tight"/>
+                <w:color w:val="1A1A1A"/>
+                <w:sz w:val="17"/>
+              </w:rPr>
+              <w:t>2. A logistics remark shows on the order for shipping; nothing is re-issued to the factory.</w:t>
+            </w:r>
+          </w:p>
+          <w:p>
+            <w:pPr>
+              <w:spacing w:before="0" w:after="40"/>
+            </w:pPr>
+            <w:r>
+              <w:rPr>
+                <w:rFonts w:ascii="Inter Tight" w:hAnsi="Inter Tight" w:cs="Inter Tight" w:eastAsia="Inter Tight"/>
+                <w:color w:val="1A1A1A"/>
+                <w:sz w:val="17"/>
+              </w:rPr>
+              <w:t>3. Changes made before planning appear on Changed sheets; production clicks Acknowledged once it has acted.</w:t>
             </w:r>
           </w:p>
         </w:tc>
@@ -5924,7 +6051,7 @@
                 <w:color w:val="1A1A1A"/>
                 <w:sz w:val="17"/>
               </w:rPr>
-              <w:t>store and production edit freely until the piece is on a plan; logistics remark only after; nothing once made</w:t>
+              <w:t>free edits until on a plan; logistics remark only after; nothing once made</w:t>
             </w:r>
           </w:p>
         </w:tc>
@@ -5949,7 +6076,7 @@
                 <w:color w:val="1A1A1A"/>
                 <w:sz w:val="17"/>
               </w:rPr>
-              <w:t>the factory never receives a changed sheet mid-production</w:t>
+              <w:t>the factory never gets a changed sheet mid-production</w:t>
             </w:r>
           </w:p>
         </w:tc>
@@ -6026,7 +6153,7 @@
                 <w:color w:val="1A1A1A"/>
                 <w:sz w:val="17"/>
               </w:rPr>
-              <w:t>1. One piece: Factory delayed, move ship-by with a date and why. A whole floor: pick the factory, days and one reason.</w:t>
+              <w:t>1. One piece: Factory delayed, move ship-by with a date and why. A whole floor: factory, days, one reason.</w:t>
             </w:r>
           </w:p>
         </w:tc>
@@ -6101,7 +6228,7 @@
                 <w:color w:val="1A1A1A"/>
                 <w:sz w:val="17"/>
               </w:rPr>
-              <w:t>original date kept; the store reads "moved from…, tell the customer"; the portal marks "moved"</w:t>
+              <w:t>original date kept; the store reads “moved from…, tell the customer”; the portal marks “moved”</w:t>
             </w:r>
           </w:p>
         </w:tc>
@@ -6153,7 +6280,7 @@
                 <w:color w:val="1A1A1A"/>
                 <w:sz w:val="17"/>
               </w:rPr>
-              <w:t>Extra fabric · factory, production, Shravani</w:t>
+              <w:t>Extra fabric · factory, alteration unit, production, Shravani</w:t>
             </w:r>
           </w:p>
         </w:tc>
@@ -6178,46 +6305,46 @@
                 <w:color w:val="1A1A1A"/>
                 <w:sz w:val="17"/>
               </w:rPr>
-              <w:t>1. The merchandiser clicks Ask for extra cloth on a piece: cloth, panel (front 0.8 m, both fronts 0.9, sleeve 0.8, both sleeves 0.9, collar 0.3, cuff 0.3), metres, reason (factory error or PP error), note.</w:t>
-            </w:r>
-          </w:p>
-          <w:p>
-            <w:pPr>
-              <w:spacing w:before="0" w:after="40"/>
-            </w:pPr>
-            <w:r>
-              <w:rPr>
-                <w:rFonts w:ascii="Inter Tight" w:hAnsi="Inter Tight" w:cs="Inter Tight" w:eastAsia="Inter Tight"/>
-                <w:color w:val="1A1A1A"/>
-                <w:sz w:val="17"/>
-              </w:rPr>
-              <w:t>2. Production (Swati) sees each ask with the shelf before and after, filtered by kind: Normal orders, Bespoke orders, Alteration / hemming. If the cloth is on the shelf: Approve or Decline with a note; approval deducts the metres.</w:t>
-            </w:r>
-          </w:p>
-          <w:p>
-            <w:pPr>
-              <w:spacing w:before="0" w:after="40"/>
-            </w:pPr>
-            <w:r>
-              <w:rPr>
-                <w:rFonts w:ascii="Inter Tight" w:hAnsi="Inter Tight" w:cs="Inter Tight" w:eastAsia="Inter Tight"/>
-                <w:color w:val="1A1A1A"/>
-                <w:sz w:val="17"/>
-              </w:rPr>
-              <w:t>3. Extra fabric is also asked for by the alteration and hemming unit. For bespoke cloth, an alteration ask, or a shortfall the shelf does not cover, production sends it to Shravani in one click. For an alteration on a fabric the shelf covers, Shravani's approval issues the cloth and deducts it from physical stock. Otherwise Shravani approves and the PO is generated; when the cloth is in, the ask returns to production to approve as usual.</w:t>
-            </w:r>
-          </w:p>
-          <w:p>
-            <w:pPr>
-              <w:spacing w:before="0" w:after="40"/>
-            </w:pPr>
-            <w:r>
-              <w:rPr>
-                <w:rFonts w:ascii="Inter Tight" w:hAnsi="Inter Tight" w:cs="Inter Tight" w:eastAsia="Inter Tight"/>
-                <w:color w:val="1A1A1A"/>
-                <w:sz w:val="17"/>
-              </w:rPr>
-              <w:t>4. Bespoke cloth is not kept in inventory: nothing is booked in when it arrives and nothing is deducted when it is approved.</w:t>
+              <w:t>1. The merchandiser clicks Ask for extra cloth: cloth, panel (front 0.8 m, both fronts 0.9, sleeve 0.8, both sleeves 0.9, collar 0.3, cuff 0.3), metres, reason (factory or PP error), note. The alteration and hemming unit asks too (part replacement, CCP collars and cuffs for stores).</w:t>
+            </w:r>
+          </w:p>
+          <w:p>
+            <w:pPr>
+              <w:spacing w:before="0" w:after="40"/>
+            </w:pPr>
+            <w:r>
+              <w:rPr>
+                <w:rFonts w:ascii="Inter Tight" w:hAnsi="Inter Tight" w:cs="Inter Tight" w:eastAsia="Inter Tight"/>
+                <w:color w:val="1A1A1A"/>
+                <w:sz w:val="17"/>
+              </w:rPr>
+              <w:t>2. Swati sees each ask with the shelf before and after, filtered: Normal orders, Bespoke orders, Alteration / hemming. Cloth on the shelf: Approve or Decline with a note; approval deducts the metres.</w:t>
+            </w:r>
+          </w:p>
+          <w:p>
+            <w:pPr>
+              <w:spacing w:before="0" w:after="40"/>
+            </w:pPr>
+            <w:r>
+              <w:rPr>
+                <w:rFonts w:ascii="Inter Tight" w:hAnsi="Inter Tight" w:cs="Inter Tight" w:eastAsia="Inter Tight"/>
+                <w:color w:val="1A1A1A"/>
+                <w:sz w:val="17"/>
+              </w:rPr>
+              <w:t>3. Bespoke, alteration, or a shortfall the shelf cannot cover goes to Shravani in one click. An alteration the shelf covers is issued and deducted from physical stock on her approval; otherwise she approves, the PO is generated, and when the cloth is in the ask returns to Swati to approve.</w:t>
+            </w:r>
+          </w:p>
+          <w:p>
+            <w:pPr>
+              <w:spacing w:before="0" w:after="40"/>
+            </w:pPr>
+            <w:r>
+              <w:rPr>
+                <w:rFonts w:ascii="Inter Tight" w:hAnsi="Inter Tight" w:cs="Inter Tight" w:eastAsia="Inter Tight"/>
+                <w:color w:val="1A1A1A"/>
+                <w:sz w:val="17"/>
+              </w:rPr>
+              <w:t>4. Bespoke is never inventory: nothing booked in on arrival, nothing deducted on approval.</w:t>
             </w:r>
           </w:p>
         </w:tc>
@@ -6267,7 +6394,7 @@
                 <w:color w:val="1A1A1A"/>
                 <w:sz w:val="17"/>
               </w:rPr>
-              <w:t>the order needs a fabric and a factory; later capped at the panel allowance</w:t>
+              <w:t>needs a fabric and a factory; later capped at the panel allowance</w:t>
             </w:r>
           </w:p>
         </w:tc>
@@ -6292,7 +6419,7 @@
                 <w:color w:val="1A1A1A"/>
                 <w:sz w:val="17"/>
               </w:rPr>
-              <w:t>approval deducts the metres at once; factory errors count on the vendor, PP errors on the consumption rule</w:t>
+              <w:t>approval deducts at once; factory errors count on the vendor, PP errors on the consumption rule</w:t>
             </w:r>
           </w:p>
         </w:tc>
@@ -6369,7 +6496,7 @@
                 <w:color w:val="1A1A1A"/>
                 <w:sz w:val="17"/>
               </w:rPr>
-              <w:t>1. Pieces scanned RTS at the unit, packed and shipped; the store hands over (1.3).</w:t>
+              <w:t>1. RTS at the unit, packed, shipped; the store hands over (1.3).</w:t>
             </w:r>
           </w:p>
         </w:tc>
@@ -6451,25 +6578,6 @@
       </w:tr>
     </w:tbl>
     <w:p/>
-    <w:p>
-      <w:r>
-        <w:rPr>
-          <w:rFonts w:ascii="Inter Tight" w:hAnsi="Inter Tight" w:cs="Inter Tight" w:eastAsia="Inter Tight"/>
-          <w:b/>
-          <w:color w:val="0A0A0A"/>
-          <w:sz w:val="20"/>
-        </w:rPr>
-        <w:t xml:space="preserve">Alteration and hemming unit. </w:t>
-      </w:r>
-      <w:r>
-        <w:rPr>
-          <w:rFonts w:ascii="Inter Tight" w:hAnsi="Inter Tight" w:cs="Inter Tight" w:eastAsia="Inter Tight"/>
-          <w:color w:val="1A1A1A"/>
-          <w:sz w:val="20"/>
-        </w:rPr>
-        <w:t>Extra fabric for the alteration and hemming unit is to be logged in the same way, for example cloth for a part replacement, or collars and cuffs sent to a store to attach (CCP alterations). The unit is a requester of cloth, not only a destination for orders. The exact request, approval and stock steps are still to be agreed with Parag before this is built.</w:t>
-      </w:r>
-    </w:p>
     <w:p>
       <w:r>
         <w:rPr>
@@ -6486,7 +6594,7 @@
           <w:color w:val="1A1A1A"/>
           <w:sz w:val="20"/>
         </w:rPr>
-        <w:t>Capacity &amp; planning inputs per factory (tailors, nominal and measured output, feed target, distance, corporate, urgent reserve, grade), Daily output (the WhatsApp table, live, keyed beside scanned), Aging (pieces past ship-by by factory, stage and days), On-time performance.</w:t>
+        <w:t>Capacity and planning inputs per factory (tailors, nominal and measured output, feed target, distance, corporate, urgent reserve, grade), Daily output (the WhatsApp table, keyed beside scanned), Aging (past ship-by by factory, stage, days), On-time performance.</w:t>
       </w:r>
     </w:p>
     <w:p>
@@ -6505,7 +6613,7 @@
           <w:color w:val="1A1A1A"/>
           <w:sz w:val="20"/>
         </w:rPr>
-        <w:t>Production: pieces past ship-by; changed sheets pending; extra-fabric asks to decide. Factory: unread changes; pieces to receive; a ship-by moved.</w:t>
+        <w:t>Production: past ship-by; changed sheets pending; extra fabric to decide. Factory: unread changes; pieces to receive; a ship-by moved.</w:t>
       </w:r>
     </w:p>
     <w:p>
@@ -6550,7 +6658,7 @@
           <w:color w:val="1A1A1A"/>
           <w:sz w:val="20"/>
         </w:rPr>
-        <w:t>One list and one record. The list is Enigma's fabric inventory with its columns; the record is Enigma's fabric DB with its screens, shown as tabs so nothing is folded away.</w:t>
+        <w:t>One list and one record: the list is Enigma's fabric inventory with its columns; the record is Enigma's fabric DB, its screens shown as tabs.</w:t>
       </w:r>
     </w:p>
     <w:tbl>
@@ -6790,33 +6898,33 @@
                 <w:color w:val="1A1A1A"/>
                 <w:sz w:val="17"/>
               </w:rPr>
-              <w:t>1. MTM fabric master → What sells → Fabric inventory lists every MTM fabric with Enigma's columns: code, name, category, inventory type, saleable, physical, reserved, threshold, status chip.</w:t>
-            </w:r>
-          </w:p>
-          <w:p>
-            <w:pPr>
-              <w:spacing w:before="0" w:after="40"/>
-            </w:pPr>
-            <w:r>
-              <w:rPr>
-                <w:rFonts w:ascii="Inter Tight" w:hAnsi="Inter Tight" w:cs="Inter Tight" w:eastAsia="Inter Tight"/>
-                <w:color w:val="1A1A1A"/>
-                <w:sz w:val="17"/>
-              </w:rPr>
-              <w:t>2. A strip of swatch books filters the list; Core / Non-core narrows it; On the shelf shows what is sellable now; warehouse select; export.</w:t>
-            </w:r>
-          </w:p>
-          <w:p>
-            <w:pPr>
-              <w:spacing w:before="0" w:after="40"/>
-            </w:pPr>
-            <w:r>
-              <w:rPr>
-                <w:rFonts w:ascii="Inter Tight" w:hAnsi="Inter Tight" w:cs="Inter Tight" w:eastAsia="Inter Tight"/>
-                <w:color w:val="1A1A1A"/>
-                <w:sz w:val="17"/>
-              </w:rPr>
-              <w:t>3. The sell-status cell carries one action for the state it is in: Pause selling…, Resume, Switch back on, Switch off · supplier.</w:t>
+              <w:t>1. What sells → Fabric inventory lists every MTM fabric: code, name, category, inventory type, saleable, physical, reserved, threshold, status.</w:t>
+            </w:r>
+          </w:p>
+          <w:p>
+            <w:pPr>
+              <w:spacing w:before="0" w:after="40"/>
+            </w:pPr>
+            <w:r>
+              <w:rPr>
+                <w:rFonts w:ascii="Inter Tight" w:hAnsi="Inter Tight" w:cs="Inter Tight" w:eastAsia="Inter Tight"/>
+                <w:color w:val="1A1A1A"/>
+                <w:sz w:val="17"/>
+              </w:rPr>
+              <w:t>2. Filters: swatch book strip, Core / Non-core, On the shelf, warehouse; export.</w:t>
+            </w:r>
+          </w:p>
+          <w:p>
+            <w:pPr>
+              <w:spacing w:before="0" w:after="40"/>
+            </w:pPr>
+            <w:r>
+              <w:rPr>
+                <w:rFonts w:ascii="Inter Tight" w:hAnsi="Inter Tight" w:cs="Inter Tight" w:eastAsia="Inter Tight"/>
+                <w:color w:val="1A1A1A"/>
+                <w:sz w:val="17"/>
+              </w:rPr>
+              <w:t>3. The sell-status cell carries one action for its state: Pause selling…, Resume, Switch back on, Switch off · supplier.</w:t>
             </w:r>
           </w:p>
         </w:tc>
@@ -6866,7 +6974,7 @@
                 <w:color w:val="1A1A1A"/>
                 <w:sz w:val="17"/>
               </w:rPr>
-              <w:t>only one action per state</w:t>
+              <w:t>one action per state</w:t>
             </w:r>
           </w:p>
         </w:tc>
@@ -6891,7 +6999,7 @@
                 <w:color w:val="1A1A1A"/>
                 <w:sz w:val="17"/>
               </w:rPr>
-              <w:t>pause and switch-off set Enigma's On Hold</w:t>
+              <w:t>pause and switch-off set On Hold</w:t>
             </w:r>
           </w:p>
         </w:tc>
@@ -6968,59 +7076,59 @@
                 <w:color w:val="1A1A1A"/>
                 <w:sz w:val="17"/>
               </w:rPr>
-              <w:t>1. A fabric opens as its own page (#/fabric/&lt;id&gt;) with a facts strip, on the shelf, reserved, on order, saleable, threshold, cost per metre, weekly sales, status, and five tabs.</w:t>
-            </w:r>
-          </w:p>
-          <w:p>
-            <w:pPr>
-              <w:spacing w:before="0" w:after="40"/>
-            </w:pPr>
-            <w:r>
-              <w:rPr>
-                <w:rFonts w:ascii="Inter Tight" w:hAnsi="Inter Tight" w:cs="Inter Tight" w:eastAsia="Inter Tight"/>
-                <w:color w:val="1A1A1A"/>
-                <w:sz w:val="17"/>
-              </w:rPr>
-              <w:t>2. Overview: where it stands (bucket, promote or demote, supply block for core, family, vendor, book), sales over 12 weeks, in stores.</w:t>
-            </w:r>
-          </w:p>
-          <w:p>
-            <w:pPr>
-              <w:spacing w:before="0" w:after="40"/>
-            </w:pPr>
-            <w:r>
-              <w:rPr>
-                <w:rFonts w:ascii="Inter Tight" w:hAnsi="Inter Tight" w:cs="Inter Tight" w:eastAsia="Inter Tight"/>
-                <w:color w:val="1A1A1A"/>
-                <w:sz w:val="17"/>
-              </w:rPr>
-              <w:t>3. Purchase orders: how this fabric is reordered (Enigma raises it, or a person) with the reorder point and whether it is under it; every PO on the fabric with its source pill and its receiving line.</w:t>
-            </w:r>
-          </w:p>
-          <w:p>
-            <w:pPr>
-              <w:spacing w:before="0" w:after="40"/>
-            </w:pPr>
-            <w:r>
-              <w:rPr>
-                <w:rFonts w:ascii="Inter Tight" w:hAnsi="Inter Tight" w:cs="Inter Tight" w:eastAsia="Inter Tight"/>
-                <w:color w:val="1A1A1A"/>
-                <w:sz w:val="17"/>
-              </w:rPr>
-              <w:t>4. Fabric info · Enigma: Edit Fabric Info and Vendor Information, then the Dynamic attributes for shirts, each editable.</w:t>
-            </w:r>
-          </w:p>
-          <w:p>
-            <w:pPr>
-              <w:spacing w:before="0" w:after="40"/>
-            </w:pPr>
-            <w:r>
-              <w:rPr>
-                <w:rFonts w:ascii="Inter Tight" w:hAnsi="Inter Tight" w:cs="Inter Tight" w:eastAsia="Inter Tight"/>
-                <w:color w:val="1A1A1A"/>
-                <w:sz w:val="17"/>
-              </w:rPr>
-              <w:t>5. Inventory &amp; movements: Edit Inventory (Warehouse, Threshold, Max Inventory, Is Auto Replenishment, bins), Adjust stock with reason and description, the Fabric transactions log and the Fabric reservations log.</w:t>
+              <w:t>1. A fabric opens as its own page (#/fabric/&lt;id&gt;): a facts strip (on the shelf, reserved, on order, saleable, threshold, cost per metre, weekly sales, status) and five tabs.</w:t>
+            </w:r>
+          </w:p>
+          <w:p>
+            <w:pPr>
+              <w:spacing w:before="0" w:after="40"/>
+            </w:pPr>
+            <w:r>
+              <w:rPr>
+                <w:rFonts w:ascii="Inter Tight" w:hAnsi="Inter Tight" w:cs="Inter Tight" w:eastAsia="Inter Tight"/>
+                <w:color w:val="1A1A1A"/>
+                <w:sz w:val="17"/>
+              </w:rPr>
+              <w:t>2. Overview: bucket, promote or demote, core supply block, family, vendor, book; 12 weeks of sales; in stores.</w:t>
+            </w:r>
+          </w:p>
+          <w:p>
+            <w:pPr>
+              <w:spacing w:before="0" w:after="40"/>
+            </w:pPr>
+            <w:r>
+              <w:rPr>
+                <w:rFonts w:ascii="Inter Tight" w:hAnsi="Inter Tight" w:cs="Inter Tight" w:eastAsia="Inter Tight"/>
+                <w:color w:val="1A1A1A"/>
+                <w:sz w:val="17"/>
+              </w:rPr>
+              <w:t>3. Purchase orders: how it is reordered (Enigma or a person), the reorder point and whether it is under; every PO with its source pill and receiving line.</w:t>
+            </w:r>
+          </w:p>
+          <w:p>
+            <w:pPr>
+              <w:spacing w:before="0" w:after="40"/>
+            </w:pPr>
+            <w:r>
+              <w:rPr>
+                <w:rFonts w:ascii="Inter Tight" w:hAnsi="Inter Tight" w:cs="Inter Tight" w:eastAsia="Inter Tight"/>
+                <w:color w:val="1A1A1A"/>
+                <w:sz w:val="17"/>
+              </w:rPr>
+              <w:t>4. Fabric info · Enigma: Edit Fabric Info, Vendor Information, Dynamic attributes for shirts, each editable.</w:t>
+            </w:r>
+          </w:p>
+          <w:p>
+            <w:pPr>
+              <w:spacing w:before="0" w:after="40"/>
+            </w:pPr>
+            <w:r>
+              <w:rPr>
+                <w:rFonts w:ascii="Inter Tight" w:hAnsi="Inter Tight" w:cs="Inter Tight" w:eastAsia="Inter Tight"/>
+                <w:color w:val="1A1A1A"/>
+                <w:sz w:val="17"/>
+              </w:rPr>
+              <w:t>5. Inventory &amp; movements: Edit Inventory (Warehouse, Threshold, Max Inventory, Is Auto Replenishment, bins with code, metres, rack location and photo), Adjust stock with reason and description, the transactions and reservations logs.</w:t>
             </w:r>
           </w:p>
           <w:p>
@@ -7046,7 +7154,7 @@
                 <w:color w:val="1A1A1A"/>
                 <w:sz w:val="17"/>
               </w:rPr>
-              <w:t>7. Rename this fabric keeps the old name in the history; the code never changes.</w:t>
+              <w:t>7. Rename keeps the old name in history; the code never changes.</w:t>
             </w:r>
           </w:p>
         </w:tc>
@@ -7121,7 +7229,7 @@
                 <w:color w:val="1A1A1A"/>
                 <w:sz w:val="17"/>
               </w:rPr>
-              <w:t>every edit is what goes to Enigma; the same record opens as a drawer with the same tabs from the inventory list</w:t>
+              <w:t>every edit is what goes to Enigma; the same record opens as a drawer from the list</w:t>
             </w:r>
           </w:p>
         </w:tc>
@@ -7170,7 +7278,7 @@
           <w:color w:val="1A1A1A"/>
           <w:sz w:val="20"/>
         </w:rPr>
-        <w:t>Two ways a PO gets raised, said plainly on the screen. Enigma · auto: its batch run orders a domestic core fabric the moment saleable stock falls under the threshold. By hand: a person pushes it, sourcing for international core, which Enigma never orders; design for a new fabric (workflow 6).</w:t>
+        <w:t>A PO is raised one of two ways, said plainly on screen. Enigma · auto: its batch run orders a domestic core fabric once saleable falls under the threshold. By hand: sourcing for international core (Enigma never orders it); design for a new fabric (workflow 6).</w:t>
       </w:r>
     </w:p>
     <w:tbl>
@@ -7410,46 +7518,46 @@
                 <w:color w:val="1A1A1A"/>
                 <w:sz w:val="17"/>
               </w:rPr>
-              <w:t>1. MTM fabric master → Purchase orders &amp; supply → Purchase orders lists every open PO with a pill on each: Enigma · auto, by hand · design, by hand · sourcing.</w:t>
-            </w:r>
-          </w:p>
-          <w:p>
-            <w:pPr>
-              <w:spacing w:before="0" w:after="40"/>
-            </w:pPr>
-            <w:r>
-              <w:rPr>
-                <w:rFonts w:ascii="Inter Tight" w:hAnsi="Inter Tight" w:cs="Inter Tight" w:eastAsia="Inter Tight"/>
-                <w:color w:val="1A1A1A"/>
-                <w:sz w:val="17"/>
-              </w:rPr>
-              <w:t>2. Filters: All open, Enigma raised · auto, Raised by hand, Needs a PO by hand, Mill not confirmed, Confirmed.</w:t>
-            </w:r>
-          </w:p>
-          <w:p>
-            <w:pPr>
-              <w:spacing w:before="0" w:after="40"/>
-            </w:pPr>
-            <w:r>
-              <w:rPr>
-                <w:rFonts w:ascii="Inter Tight" w:hAnsi="Inter Tight" w:cs="Inter Tight" w:eastAsia="Inter Tight"/>
-                <w:color w:val="1A1A1A"/>
-                <w:sz w:val="17"/>
-              </w:rPr>
-              <w:t>3. "Needs a PO by hand" lists international core under its reorder point with nothing on order, each with Raise PO · N m; a click raises it.</w:t>
-            </w:r>
-          </w:p>
-          <w:p>
-            <w:pPr>
-              <w:spacing w:before="0" w:after="40"/>
-            </w:pPr>
-            <w:r>
-              <w:rPr>
-                <w:rFonts w:ascii="Inter Tight" w:hAnsi="Inter Tight" w:cs="Inter Tight" w:eastAsia="Inter Tight"/>
-                <w:color w:val="1A1A1A"/>
-                <w:sz w:val="17"/>
-              </w:rPr>
-              <w:t>4. When the mill replies the sourcer clicks Mill confirmed… and types the date and remark; later Update date / remark.</w:t>
+              <w:t>1. Purchase orders &amp; supply → Purchase orders lists every open PO with a pill: Enigma · auto, by hand · design, by hand · sourcing.</w:t>
+            </w:r>
+          </w:p>
+          <w:p>
+            <w:pPr>
+              <w:spacing w:before="0" w:after="40"/>
+            </w:pPr>
+            <w:r>
+              <w:rPr>
+                <w:rFonts w:ascii="Inter Tight" w:hAnsi="Inter Tight" w:cs="Inter Tight" w:eastAsia="Inter Tight"/>
+                <w:color w:val="1A1A1A"/>
+                <w:sz w:val="17"/>
+              </w:rPr>
+              <w:t>2. Filters: All open, Enigma · auto, By hand, Needs a PO by hand, Mill not confirmed, Confirmed.</w:t>
+            </w:r>
+          </w:p>
+          <w:p>
+            <w:pPr>
+              <w:spacing w:before="0" w:after="40"/>
+            </w:pPr>
+            <w:r>
+              <w:rPr>
+                <w:rFonts w:ascii="Inter Tight" w:hAnsi="Inter Tight" w:cs="Inter Tight" w:eastAsia="Inter Tight"/>
+                <w:color w:val="1A1A1A"/>
+                <w:sz w:val="17"/>
+              </w:rPr>
+              <w:t>3. Needs a PO by hand lists international core under its reorder point with nothing on order, each with Raise PO · N m.</w:t>
+            </w:r>
+          </w:p>
+          <w:p>
+            <w:pPr>
+              <w:spacing w:before="0" w:after="40"/>
+            </w:pPr>
+            <w:r>
+              <w:rPr>
+                <w:rFonts w:ascii="Inter Tight" w:hAnsi="Inter Tight" w:cs="Inter Tight" w:eastAsia="Inter Tight"/>
+                <w:color w:val="1A1A1A"/>
+                <w:sz w:val="17"/>
+              </w:rPr>
+              <w:t>4. When the mill replies: Mill confirmed… with date and remark; later Update date / remark.</w:t>
             </w:r>
           </w:p>
         </w:tc>
@@ -7524,7 +7632,7 @@
                 <w:color w:val="1A1A1A"/>
                 <w:sz w:val="17"/>
               </w:rPr>
-              <w:t>an auto-PO the mill has not confirmed is a chase after 2 days; the receiving line (6.5) books the rolls</w:t>
+              <w:t>an unconfirmed auto-PO is a chase after 2 days; the receiving line (6.5) books rolls</w:t>
             </w:r>
           </w:p>
         </w:tc>
@@ -7601,7 +7709,7 @@
                 <w:color w:val="1A1A1A"/>
                 <w:sz w:val="17"/>
               </w:rPr>
-              <w:t>1. One plain table: fabric, mill, saleable, reorder state (above / under, PO if any, Raise PO for international), what the mill last said and when, a Review button that opens an inline status (In stock, Delayed, Run out), a back-on date and a note, and the selling cell.</w:t>
+              <w:t>1. One table: fabric, mill, saleable, reorder state (above or under, PO if any, Raise PO for international), the mill's last word and when, Review (In stock, Delayed, Run out, back-on date, note), and the selling cell.</w:t>
             </w:r>
           </w:p>
           <w:p>
@@ -7664,7 +7772,7 @@
                 <w:color w:val="1A1A1A"/>
                 <w:sz w:val="17"/>
               </w:rPr>
-              <w:t>"review due" when never asked or 7 or more days ago</w:t>
+              <w:t>review due if never asked or 7+ days ago</w:t>
             </w:r>
           </w:p>
         </w:tc>
@@ -7689,7 +7797,7 @@
                 <w:color w:val="1A1A1A"/>
                 <w:sz w:val="17"/>
               </w:rPr>
-              <w:t>delayed or run out goes to design, who switch the fabric off; back in stock, they switch it on</w:t>
+              <w:t>delayed or run out goes to design to switch off; back in stock, they switch on</w:t>
             </w:r>
           </w:p>
         </w:tc>
@@ -7766,7 +7874,7 @@
                 <w:color w:val="1A1A1A"/>
                 <w:sz w:val="17"/>
               </w:rPr>
-              <w:t>1. The trims master with stock, threshold, incoming and cost.</w:t>
+              <w:t>1. The trims master: stock, threshold, incoming, cost.</w:t>
             </w:r>
           </w:p>
         </w:tc>
@@ -7864,7 +7972,7 @@
           <w:color w:val="1A1A1A"/>
           <w:sz w:val="20"/>
         </w:rPr>
-        <w:t>Saleable = physical − reserved − floor. Rate = shirts a week over 8 weeks. Metres a week = rate × 2.15. Lead-time demand = metres a week × lead days ÷ 7. Reorder point = the larger of lead-time demand and the vendor's MOQ. Under it when saleable + on order ≤ the point. PO = the MOQ. Never for bespoke. Promotion to core lifts the floor to 40 m if under 20.</w:t>
+        <w:t>Saleable = physical − reserved − floor. Rate = shirts a week over 8 weeks. Metres a week = rate × 2.15. Lead-time demand = metres a week × lead days ÷ 7. Reorder point = the larger of lead-time demand and the vendor's MOQ; under it when saleable + on order ≤ the point. PO = the MOQ. Never for bespoke. Promotion to core lifts the floor to 40 m if under 20.</w:t>
       </w:r>
     </w:p>
     <w:p>
@@ -7909,7 +8017,7 @@
           <w:color w:val="1A1A1A"/>
           <w:sz w:val="20"/>
         </w:rPr>
-        <w:t>Sourcing sees only what is theirs to do: add a vendor to a new ask, or answer an extension ask. Two tabs, never overlapping: Your move (state 1 and extension asks) and Waiting on design (state 2). Records from state 3 onwards are not on the desk; they are on Purchase orders.</w:t>
+        <w:t>Sourcing sees only its own moves: add a vendor to a new ask, or answer an extension. Two tabs that never overlap: Your move (state 1 and extensions) and Waiting on design (state 2). From state 3 a record is on Purchase orders instead.</w:t>
       </w:r>
     </w:p>
     <w:tbl>
@@ -8149,20 +8257,20 @@
                 <w:color w:val="1A1A1A"/>
                 <w:sz w:val="17"/>
               </w:rPr>
-              <w:t>1. Each row is one ask: what design asked for (name, why, book, month, attachments), then The vendor (empty, or the extension asked).</w:t>
-            </w:r>
-          </w:p>
-          <w:p>
-            <w:pPr>
-              <w:spacing w:before="0" w:after="40"/>
-            </w:pPr>
-            <w:r>
-              <w:rPr>
-                <w:rFonts w:ascii="Inter Tight" w:hAnsi="Inter Tight" w:cs="Inter Tight" w:eastAsia="Inter Tight"/>
-                <w:color w:val="1A1A1A"/>
-                <w:sz w:val="17"/>
-              </w:rPr>
-              <w:t>2. Add vendor as 6.2, or Extend / Drop vendor as 6.4.</w:t>
+              <w:t>1. Each row is one ask: what design asked for (name, why, book, month, attachments) and the vendor (empty, or the extension asked).</w:t>
+            </w:r>
+          </w:p>
+          <w:p>
+            <w:pPr>
+              <w:spacing w:before="0" w:after="40"/>
+            </w:pPr>
+            <w:r>
+              <w:rPr>
+                <w:rFonts w:ascii="Inter Tight" w:hAnsi="Inter Tight" w:cs="Inter Tight" w:eastAsia="Inter Tight"/>
+                <w:color w:val="1A1A1A"/>
+                <w:sz w:val="17"/>
+              </w:rPr>
+              <w:t>2. Add vendor (6.2), or Extend / Drop vendor (6.4).</w:t>
             </w:r>
           </w:p>
         </w:tc>
@@ -8237,7 +8345,7 @@
                 <w:color w:val="1A1A1A"/>
                 <w:sz w:val="17"/>
               </w:rPr>
-              <w:t>the row moves to Waiting on design</w:t>
+              <w:t>moves to Waiting on design</w:t>
             </w:r>
           </w:p>
         </w:tc>
@@ -8314,7 +8422,7 @@
                 <w:color w:val="1A1A1A"/>
                 <w:sz w:val="17"/>
               </w:rPr>
-              <w:t>1. Rows in state 2 with the vendor card as design sees it. Nothing to do; the desk shows how long design has had it.</w:t>
+              <w:t>1. State 2 rows with the vendor card as design sees it and how long design has had it.</w:t>
             </w:r>
           </w:p>
         </w:tc>
@@ -8466,33 +8574,33 @@
                 <w:color w:val="1A1A1A"/>
                 <w:sz w:val="17"/>
               </w:rPr>
-              <w:t>1. On Fabric vendors → Find a fabric the sourcer types a cloth, code, article, composition, book or mill. Filters: mill, where from, bucket, swatch book; sort by name, cheapest, fastest, least cover.</w:t>
-            </w:r>
-          </w:p>
-          <w:p>
-            <w:pPr>
-              <w:spacing w:before="0" w:after="40"/>
-            </w:pPr>
-            <w:r>
-              <w:rPr>
-                <w:rFonts w:ascii="Inter Tight" w:hAnsi="Inter Tight" w:cs="Inter Tight" w:eastAsia="Inter Tight"/>
-                <w:color w:val="1A1A1A"/>
-                <w:sz w:val="17"/>
-              </w:rPr>
-              <w:t>2. Each row: fabric and code, composition with panna, vendor, TAT · MOQ, cost per unit in the mill's currency, a yes/no on whether it can be bought today (hover for why not), and how many other mills do this cloth, with a compare panel.</w:t>
-            </w:r>
-          </w:p>
-          <w:p>
-            <w:pPr>
-              <w:spacing w:before="0" w:after="40"/>
-            </w:pPr>
-            <w:r>
-              <w:rPr>
-                <w:rFonts w:ascii="Inter Tight" w:hAnsi="Inter Tight" w:cs="Inter Tight" w:eastAsia="Inter Tight"/>
-                <w:color w:val="1A1A1A"/>
-                <w:sz w:val="17"/>
-              </w:rPr>
-              <w:t>3. Clicking a row opens the fabric's page (workflow 3).</w:t>
+              <w:t>1. Fabric vendors → Find a fabric: search cloth, code, article, composition, book or mill; filter by mill, origin, bucket, book; sort by name, cheapest, fastest, least cover.</w:t>
+            </w:r>
+          </w:p>
+          <w:p>
+            <w:pPr>
+              <w:spacing w:before="0" w:after="40"/>
+            </w:pPr>
+            <w:r>
+              <w:rPr>
+                <w:rFonts w:ascii="Inter Tight" w:hAnsi="Inter Tight" w:cs="Inter Tight" w:eastAsia="Inter Tight"/>
+                <w:color w:val="1A1A1A"/>
+                <w:sz w:val="17"/>
+              </w:rPr>
+              <w:t>2. Each row: fabric and code, composition and panna, vendor, TAT · MOQ, cost in the mill's currency, buyable today yes or no (hover for why), and how many other mills do it, with a compare panel.</w:t>
+            </w:r>
+          </w:p>
+          <w:p>
+            <w:pPr>
+              <w:spacing w:before="0" w:after="40"/>
+            </w:pPr>
+            <w:r>
+              <w:rPr>
+                <w:rFonts w:ascii="Inter Tight" w:hAnsi="Inter Tight" w:cs="Inter Tight" w:eastAsia="Inter Tight"/>
+                <w:color w:val="1A1A1A"/>
+                <w:sz w:val="17"/>
+              </w:rPr>
+              <w:t>3. A row opens the fabric page.</w:t>
             </w:r>
           </w:p>
         </w:tc>
@@ -8644,33 +8752,33 @@
                 <w:color w:val="1A1A1A"/>
                 <w:sz w:val="17"/>
               </w:rPr>
-              <w:t>1. Fabric vendors → The mills is Enigma's vendor list: Code, Name, Vendor Type, Address, Office Phone, Office Email, Categories, Active, with TAT · MOQ and the fabric count.</w:t>
-            </w:r>
-          </w:p>
-          <w:p>
-            <w:pPr>
-              <w:spacing w:before="0" w:after="40"/>
-            </w:pPr>
-            <w:r>
-              <w:rPr>
-                <w:rFonts w:ascii="Inter Tight" w:hAnsi="Inter Tight" w:cs="Inter Tight" w:eastAsia="Inter Tight"/>
-                <w:color w:val="1A1A1A"/>
-                <w:sz w:val="17"/>
-              </w:rPr>
-              <w:t>2. + Add Vendor opens the same form as Enigma's Add Vendor, plus the Vendor Information block (Mill Country, Mill Description, Currency, TAT in hours, MOQ). Saving opens the new mill.</w:t>
-            </w:r>
-          </w:p>
-          <w:p>
-            <w:pPr>
-              <w:spacing w:before="0" w:after="40"/>
-            </w:pPr>
-            <w:r>
-              <w:rPr>
-                <w:rFonts w:ascii="Inter Tight" w:hAnsi="Inter Tight" w:cs="Inter Tight" w:eastAsia="Inter Tight"/>
-                <w:color w:val="1A1A1A"/>
-                <w:sz w:val="17"/>
-              </w:rPr>
-              <w:t>3. A mill's record opens on "Vendor · as in Enigma" with Edit Vendor; then its fabrics, performance, blocks, files and conversation.</w:t>
+              <w:t>1. The mills is Enigma's vendor list: Code, Name, Vendor Type, Address, Office Phone, Office Email, Categories, Active, plus TAT · MOQ and fabric count.</w:t>
+            </w:r>
+          </w:p>
+          <w:p>
+            <w:pPr>
+              <w:spacing w:before="0" w:after="40"/>
+            </w:pPr>
+            <w:r>
+              <w:rPr>
+                <w:rFonts w:ascii="Inter Tight" w:hAnsi="Inter Tight" w:cs="Inter Tight" w:eastAsia="Inter Tight"/>
+                <w:color w:val="1A1A1A"/>
+                <w:sz w:val="17"/>
+              </w:rPr>
+              <w:t>2. + Add Vendor is Enigma's form plus Vendor Information (Mill Country, Mill Description, Currency, TAT in hours, MOQ); saving opens the mill.</w:t>
+            </w:r>
+          </w:p>
+          <w:p>
+            <w:pPr>
+              <w:spacing w:before="0" w:after="40"/>
+            </w:pPr>
+            <w:r>
+              <w:rPr>
+                <w:rFonts w:ascii="Inter Tight" w:hAnsi="Inter Tight" w:cs="Inter Tight" w:eastAsia="Inter Tight"/>
+                <w:color w:val="1A1A1A"/>
+                <w:sz w:val="17"/>
+              </w:rPr>
+              <w:t>3. A mill opens on Vendor · as in Enigma with Edit Vendor, then its fabrics, performance, blocks, files and conversation.</w:t>
             </w:r>
           </w:p>
         </w:tc>
@@ -8745,7 +8853,7 @@
                 <w:color w:val="1A1A1A"/>
                 <w:sz w:val="17"/>
               </w:rPr>
-              <w:t>what is saved here goes to Enigma at write-back</w:t>
+              <w:t>goes to Enigma at write-back</w:t>
             </w:r>
           </w:p>
         </w:tc>
@@ -8794,7 +8902,7 @@
           <w:color w:val="1A1A1A"/>
           <w:sz w:val="20"/>
         </w:rPr>
-        <w:t>One new made-to-measure fabric, shade or construction variant runs on one record. The record is always in exactly one of five states, and the list shows that state in one column: 1 Requirement requested (sourcing has to add a vendor) · 2 Vendor added (design has to punch the PO) · 3 PO punched (the cloth is on its way) · 4 Fabric in (design configures Enigma; design codes can be added at any stage) · 5 Live online. The record opens on four sections in that order; there is no section for "PO punched" because it is a state, not work.</w:t>
+        <w:t>A new fabric, shade or construction variant runs on one record, always in one of five states, shown in one column: 1 Requirement requested (sourcing adds a vendor) · 2 Vendor added (design punches the PO) · 3 PO punched (cloth on its way) · 4 Fabric in (design configures Enigma; design codes can be added at any stage) · 5 Live online. The record opens on four sections in that order; PO punched is a state, not work, so it has no section.</w:t>
       </w:r>
     </w:p>
     <w:p>
@@ -8813,7 +8921,7 @@
           <w:color w:val="1A1A1A"/>
           <w:sz w:val="20"/>
         </w:rPr>
-        <w:t>Design sees a gap in a swatch book, a customer ask, or a variant worth making. Done when the fabric is live online with its designs in Enigma. Stores follow the swatch desk and are not a gate for going live online.</w:t>
+        <w:t>A gap in a swatch book, a customer ask, or a variant worth making. Done when live online with its designs in Enigma. Stores follow the swatch desk and do not gate going live online.</w:t>
       </w:r>
     </w:p>
     <w:tbl>
@@ -9053,33 +9161,33 @@
                 <w:color w:val="1A1A1A"/>
                 <w:sz w:val="17"/>
               </w:rPr>
-              <w:t>1. On Requirements the designer clicks + New requirement. They choose a new fabric or shade, or a variant of an existing fabric (picked from the master).</w:t>
-            </w:r>
-          </w:p>
-          <w:p>
-            <w:pPr>
-              <w:spacing w:before="0" w:after="40"/>
-            </w:pPr>
-            <w:r>
-              <w:rPr>
-                <w:rFonts w:ascii="Inter Tight" w:hAnsi="Inter Tight" w:cs="Inter Tight" w:eastAsia="Inter Tight"/>
-                <w:color w:val="1A1A1A"/>
-                <w:sz w:val="17"/>
-              </w:rPr>
-              <w:t>2. They type a working name, why BSC needs it, the swatch book it belongs in, the month wanted, and attach a sketch, swatch photo or pattern file. Samples are an optional checklist on the record: Sample &amp; PAT file handed to a factory, PP sample approved, Shipment sample approved, Approval posted to every department. Each row is ticked with one click and an optional remark; sending a sample back needs the remark. Remarks land in the record's conversation under their step. They also mark whether the fabric will be washed; the shrinkage is only known once the cloth arrives.</w:t>
-            </w:r>
-          </w:p>
-          <w:p>
-            <w:pPr>
-              <w:spacing w:before="0" w:after="40"/>
-            </w:pPr>
-            <w:r>
-              <w:rPr>
-                <w:rFonts w:ascii="Inter Tight" w:hAnsi="Inter Tight" w:cs="Inter Tight" w:eastAsia="Inter Tight"/>
-                <w:color w:val="1A1A1A"/>
-                <w:sz w:val="17"/>
-              </w:rPr>
-              <w:t>3. They click Raise. The record is in state 1 · Requirement requested.</w:t>
+              <w:t>1. + New requirement: a new fabric or shade, or a variant of an existing one (picked from the master).</w:t>
+            </w:r>
+          </w:p>
+          <w:p>
+            <w:pPr>
+              <w:spacing w:before="0" w:after="40"/>
+            </w:pPr>
+            <w:r>
+              <w:rPr>
+                <w:rFonts w:ascii="Inter Tight" w:hAnsi="Inter Tight" w:cs="Inter Tight" w:eastAsia="Inter Tight"/>
+                <w:color w:val="1A1A1A"/>
+                <w:sz w:val="17"/>
+              </w:rPr>
+              <w:t>2. Working name, why BSC needs it, swatch book, month wanted, a sketch, swatch photo or pattern file, and whether it will be washed (shrinkage is known only once the cloth arrives). Samples are an optional checklist: Sample &amp; PAT file to a factory, PP sample approved, Shipment sample approved, Approval posted to every department; one click each with an optional remark, a remark required to send a sample back; remarks land in the conversation under their step.</w:t>
+            </w:r>
+          </w:p>
+          <w:p>
+            <w:pPr>
+              <w:spacing w:before="0" w:after="40"/>
+            </w:pPr>
+            <w:r>
+              <w:rPr>
+                <w:rFonts w:ascii="Inter Tight" w:hAnsi="Inter Tight" w:cs="Inter Tight" w:eastAsia="Inter Tight"/>
+                <w:color w:val="1A1A1A"/>
+                <w:sz w:val="17"/>
+              </w:rPr>
+              <w:t>3. Raise: state 1 · Requirement requested.</w:t>
             </w:r>
           </w:p>
         </w:tc>
@@ -9104,7 +9212,7 @@
                 <w:color w:val="1A1A1A"/>
                 <w:sz w:val="17"/>
               </w:rPr>
-              <w:t>typed; base fabric from Enigma's fabric master</w:t>
+              <w:t>typed; base fabric from the master</w:t>
             </w:r>
           </w:p>
         </w:tc>
@@ -9129,7 +9237,7 @@
                 <w:color w:val="1A1A1A"/>
                 <w:sz w:val="17"/>
               </w:rPr>
-              <w:t>name and why required; a variant's base must be an inventory fabric over 20 m, not bespoke, not paused or on hold</w:t>
+              <w:t>name and why required; a variant's base must be inventory over 20 m, not bespoke, not paused or on hold</w:t>
             </w:r>
           </w:p>
         </w:tc>
@@ -9154,7 +9262,7 @@
                 <w:color w:val="1A1A1A"/>
                 <w:sz w:val="17"/>
               </w:rPr>
-              <w:t>the ask appears on sourcing's desk under Your move</w:t>
+              <w:t>the ask lands on sourcing's Your move</w:t>
             </w:r>
           </w:p>
         </w:tc>
@@ -9231,33 +9339,20 @@
                 <w:color w:val="1A1A1A"/>
                 <w:sz w:val="17"/>
               </w:rPr>
-              <w:t>1. On Fabric sourcing → Your move the sourcer opens the ask and clicks Add vendor.</w:t>
-            </w:r>
-          </w:p>
-          <w:p>
-            <w:pPr>
-              <w:spacing w:before="0" w:after="40"/>
-            </w:pPr>
-            <w:r>
-              <w:rPr>
-                <w:rFonts w:ascii="Inter Tight" w:hAnsi="Inter Tight" w:cs="Inter Tight" w:eastAsia="Inter Tight"/>
-                <w:color w:val="1A1A1A"/>
-                <w:sz w:val="17"/>
-              </w:rPr>
-              <w:t>2. They pick the mill, type the mill's article, cloth name, price per metre, MOQ, lead days, hold-until (defaults to today plus the mill's usual hold), composition, panna, book and a note.</w:t>
-            </w:r>
-          </w:p>
-          <w:p>
-            <w:pPr>
-              <w:spacing w:before="0" w:after="40"/>
-            </w:pPr>
-            <w:r>
-              <w:rPr>
-                <w:rFonts w:ascii="Inter Tight" w:hAnsi="Inter Tight" w:cs="Inter Tight" w:eastAsia="Inter Tight"/>
-                <w:color w:val="1A1A1A"/>
-                <w:sz w:val="17"/>
-              </w:rPr>
-              <w:t>3. They click Save vendor. The record moves to state 2 · Vendor added and leaves sourcing's list for Waiting on design.</w:t>
+              <w:t>1. On Your move, Add vendor: mill, article, cloth name, price per metre, MOQ, lead days, hold-until (today plus the mill's usual hold), composition, panna, book, note.</w:t>
+            </w:r>
+          </w:p>
+          <w:p>
+            <w:pPr>
+              <w:spacing w:before="0" w:after="40"/>
+            </w:pPr>
+            <w:r>
+              <w:rPr>
+                <w:rFonts w:ascii="Inter Tight" w:hAnsi="Inter Tight" w:cs="Inter Tight" w:eastAsia="Inter Tight"/>
+                <w:color w:val="1A1A1A"/>
+                <w:sz w:val="17"/>
+              </w:rPr>
+              <w:t>2. Save vendor: state 2 · Vendor added; the row moves to Waiting on design.</w:t>
             </w:r>
           </w:p>
         </w:tc>
@@ -9307,7 +9402,7 @@
                 <w:color w:val="1A1A1A"/>
                 <w:sz w:val="17"/>
               </w:rPr>
-              <w:t>mill, price and cloth name required; one live vendor per ask, a second replaces the first and the first is kept as replaced</w:t>
+              <w:t>mill, price and cloth name required; one live vendor per ask, a second replaces the first, which is kept as replaced</w:t>
             </w:r>
           </w:p>
         </w:tc>
@@ -9409,33 +9504,33 @@
                 <w:color w:val="1A1A1A"/>
                 <w:sz w:val="17"/>
               </w:rPr>
-              <w:t>1. The vendor card shows the terms (price, MOQ, lead, hold-until, article, composition, panna) and the first buy.</w:t>
-            </w:r>
-          </w:p>
-          <w:p>
-            <w:pPr>
-              <w:spacing w:before="0" w:after="40"/>
-            </w:pPr>
-            <w:r>
-              <w:rPr>
-                <w:rFonts w:ascii="Inter Tight" w:hAnsi="Inter Tight" w:cs="Inter Tight" w:eastAsia="Inter Tight"/>
-                <w:color w:val="1A1A1A"/>
-                <w:sz w:val="17"/>
-              </w:rPr>
-              <w:t>2. The designer types the metres (defaulted to the MOQ); the amount follows the metres as they type.</w:t>
-            </w:r>
-          </w:p>
-          <w:p>
-            <w:pPr>
-              <w:spacing w:before="0" w:after="40"/>
-            </w:pPr>
-            <w:r>
-              <w:rPr>
-                <w:rFonts w:ascii="Inter Tight" w:hAnsi="Inter Tight" w:cs="Inter Tight" w:eastAsia="Inter Tight"/>
-                <w:color w:val="1A1A1A"/>
-                <w:sz w:val="17"/>
-              </w:rPr>
-              <w:t>3. They click Push PO, More time, or Reject with a reason. There is no sample gate on this card.</w:t>
+              <w:t>1. The card shows terms (price, MOQ, lead, hold-until, article, composition, panna) and the first buy.</w:t>
+            </w:r>
+          </w:p>
+          <w:p>
+            <w:pPr>
+              <w:spacing w:before="0" w:after="40"/>
+            </w:pPr>
+            <w:r>
+              <w:rPr>
+                <w:rFonts w:ascii="Inter Tight" w:hAnsi="Inter Tight" w:cs="Inter Tight" w:eastAsia="Inter Tight"/>
+                <w:color w:val="1A1A1A"/>
+                <w:sz w:val="17"/>
+              </w:rPr>
+              <w:t>2. Metres default to the MOQ; the amount follows as typed.</w:t>
+            </w:r>
+          </w:p>
+          <w:p>
+            <w:pPr>
+              <w:spacing w:before="0" w:after="40"/>
+            </w:pPr>
+            <w:r>
+              <w:rPr>
+                <w:rFonts w:ascii="Inter Tight" w:hAnsi="Inter Tight" w:cs="Inter Tight" w:eastAsia="Inter Tight"/>
+                <w:color w:val="1A1A1A"/>
+                <w:sz w:val="17"/>
+              </w:rPr>
+              <w:t>3. Push PO, More time, or Reject with a reason. No sample gate here.</w:t>
             </w:r>
           </w:p>
         </w:tc>
@@ -9460,7 +9555,7 @@
                 <w:color w:val="1A1A1A"/>
                 <w:sz w:val="17"/>
               </w:rPr>
-              <w:t>metres typed; price from the vendor card</w:t>
+              <w:t>metres typed; price from the card</w:t>
             </w:r>
           </w:p>
         </w:tc>
@@ -9485,7 +9580,7 @@
                 <w:color w:val="1A1A1A"/>
                 <w:sz w:val="17"/>
               </w:rPr>
-              <w:t>Push PO is refused on a lapsed hold until sourcing extends it; Reject needs a reason</w:t>
+              <w:t>Push PO refused on a lapsed hold until extended; Reject needs a reason</w:t>
             </w:r>
           </w:p>
         </w:tc>
@@ -9510,7 +9605,7 @@
                 <w:color w:val="1A1A1A"/>
                 <w:sz w:val="17"/>
               </w:rPr>
-              <w:t>Push PO: the fabric PO is punched (Enigma's number, or a stand-in FPO number until write-back), the fabric is added to the master in the non-core bucket, on hold, and the record moves to state 3 · PO punched. More time: an extension ask goes to sourcing and the record shows "extension asked". Reject: back to state 1</w:t>
+              <w:t>Push PO: the PO is punched (Enigma's number, or a stand-in FPO until write-back), the fabric joins the master as non-core, on hold; state 3 · PO punched. More time: an extension ask goes to sourcing. Reject: back to state 1</w:t>
             </w:r>
           </w:p>
         </w:tc>
@@ -9562,7 +9657,7 @@
                 <w:color w:val="1A1A1A"/>
                 <w:sz w:val="17"/>
               </w:rPr>
-              <w:t>Extend, send back or drop · sourcing</w:t>
+              <w:t>Extend or drop · sourcing</w:t>
             </w:r>
           </w:p>
         </w:tc>
@@ -9587,7 +9682,7 @@
                 <w:color w:val="1A1A1A"/>
                 <w:sz w:val="17"/>
               </w:rPr>
-              <w:t>1. An extension ask appears under Your move. The sourcer types the new hold date and clicks Extend, or Drop vendor if the mill will not hold.</w:t>
+              <w:t>1. An extension appears on Your move: type the new hold date and Extend, or Drop vendor if the mill will not hold.</w:t>
             </w:r>
           </w:p>
         </w:tc>
@@ -9637,7 +9732,7 @@
                 <w:color w:val="1A1A1A"/>
                 <w:sz w:val="17"/>
               </w:rPr>
-              <w:t>extend must be later than the old date (later)</w:t>
+              <w:t>new date must be later (later)</w:t>
             </w:r>
           </w:p>
         </w:tc>
@@ -9714,7 +9809,7 @@
                 <w:color w:val="1A1A1A"/>
                 <w:sz w:val="17"/>
               </w:rPr>
-              <w:t>The purchase order and its receiving line · sourcing, warehouse</w:t>
+              <w:t>The PO and its receiving line · sourcing, warehouse</w:t>
             </w:r>
           </w:p>
         </w:tc>
@@ -9739,59 +9834,59 @@
                 <w:color w:val="1A1A1A"/>
                 <w:sz w:val="17"/>
               </w:rPr>
-              <w:t>1. The PO shows inside section 2 of the record under "The purchase order": number, metres, amount, raised on, mill confirmation.</w:t>
-            </w:r>
-          </w:p>
-          <w:p>
-            <w:pPr>
-              <w:spacing w:before="0" w:after="40"/>
-            </w:pPr>
-            <w:r>
-              <w:rPr>
-                <w:rFonts w:ascii="Inter Tight" w:hAnsi="Inter Tight" w:cs="Inter Tight" w:eastAsia="Inter Tight"/>
-                <w:color w:val="1A1A1A"/>
-                <w:sz w:val="17"/>
-              </w:rPr>
-              <w:t>2. Enigma's receiving line sits under it: Receiving Status, Ordered Quantity, Total Received Quantity, Pending Quantity, a Received Qty box, Close, and Update Receiving Status.</w:t>
-            </w:r>
-          </w:p>
-          <w:p>
-            <w:pPr>
-              <w:spacing w:before="0" w:after="40"/>
-            </w:pPr>
-            <w:r>
-              <w:rPr>
-                <w:rFonts w:ascii="Inter Tight" w:hAnsi="Inter Tight" w:cs="Inter Tight" w:eastAsia="Inter Tight"/>
-                <w:color w:val="1A1A1A"/>
-                <w:sz w:val="17"/>
-              </w:rPr>
-              <w:t>3. Rolls land in parts. Each update books the metres and raises a GRN; ticking Close with metres pending cancels the balance.</w:t>
-            </w:r>
-          </w:p>
-          <w:p>
-            <w:pPr>
-              <w:spacing w:before="0" w:after="40"/>
-            </w:pPr>
-            <w:r>
-              <w:rPr>
-                <w:rFonts w:ascii="Inter Tight" w:hAnsi="Inter Tight" w:cs="Inter Tight" w:eastAsia="Inter Tight"/>
-                <w:color w:val="1A1A1A"/>
-                <w:sz w:val="17"/>
-              </w:rPr>
-              <w:t>4. Washed fabric: when the cloth arrives a cut is washed and the receiver enters the shrinkage % on the receiving line. The GRN records the metres received, and the shelf books the usable metres (100 m received at 5% shrinkage books 95 m). The difference is a WASH line in the fabric's transactions.</w:t>
-            </w:r>
-          </w:p>
-          <w:p>
-            <w:pPr>
-              <w:spacing w:before="0" w:after="40"/>
-            </w:pPr>
-            <w:r>
-              <w:rPr>
-                <w:rFonts w:ascii="Inter Tight" w:hAnsi="Inter Tight" w:cs="Inter Tight" w:eastAsia="Inter Tight"/>
-                <w:color w:val="1A1A1A"/>
-                <w:sz w:val="17"/>
-              </w:rPr>
-              <w:t>5. The same line is on Purchase orders (workflow 4).</w:t>
+              <w:t>1. Section 2 shows the PO: number, metres, amount, raised on, mill confirmation.</w:t>
+            </w:r>
+          </w:p>
+          <w:p>
+            <w:pPr>
+              <w:spacing w:before="0" w:after="40"/>
+            </w:pPr>
+            <w:r>
+              <w:rPr>
+                <w:rFonts w:ascii="Inter Tight" w:hAnsi="Inter Tight" w:cs="Inter Tight" w:eastAsia="Inter Tight"/>
+                <w:color w:val="1A1A1A"/>
+                <w:sz w:val="17"/>
+              </w:rPr>
+              <w:t>2. Enigma's receiving line below it: Receiving Status, Ordered, Total Received, Pending, a Received Qty box, Close, Update Receiving Status.</w:t>
+            </w:r>
+          </w:p>
+          <w:p>
+            <w:pPr>
+              <w:spacing w:before="0" w:after="40"/>
+            </w:pPr>
+            <w:r>
+              <w:rPr>
+                <w:rFonts w:ascii="Inter Tight" w:hAnsi="Inter Tight" w:cs="Inter Tight" w:eastAsia="Inter Tight"/>
+                <w:color w:val="1A1A1A"/>
+                <w:sz w:val="17"/>
+              </w:rPr>
+              <w:t>3. Rolls land in parts; each update books metres and raises a GRN; Close with metres pending cancels the balance.</w:t>
+            </w:r>
+          </w:p>
+          <w:p>
+            <w:pPr>
+              <w:spacing w:before="0" w:after="40"/>
+            </w:pPr>
+            <w:r>
+              <w:rPr>
+                <w:rFonts w:ascii="Inter Tight" w:hAnsi="Inter Tight" w:cs="Inter Tight" w:eastAsia="Inter Tight"/>
+                <w:color w:val="1A1A1A"/>
+                <w:sz w:val="17"/>
+              </w:rPr>
+              <w:t>4. Washed fabric: a cut is washed on arrival and the receiver enters the shrinkage %. The GRN keeps metres received; the shelf books usable metres (100 m at 5% books 95 m); the difference is a WASH transaction.</w:t>
+            </w:r>
+          </w:p>
+          <w:p>
+            <w:pPr>
+              <w:spacing w:before="0" w:after="40"/>
+            </w:pPr>
+            <w:r>
+              <w:rPr>
+                <w:rFonts w:ascii="Inter Tight" w:hAnsi="Inter Tight" w:cs="Inter Tight" w:eastAsia="Inter Tight"/>
+                <w:color w:val="1A1A1A"/>
+                <w:sz w:val="17"/>
+              </w:rPr>
+              <w:t>5. The same line is on Purchase orders.</w:t>
             </w:r>
           </w:p>
         </w:tc>
@@ -9816,7 +9911,7 @@
                 <w:color w:val="1A1A1A"/>
                 <w:sz w:val="17"/>
               </w:rPr>
-              <w:t>PO from 6.3; metres counted; washed from the requirement; shrinkage % entered at receiving</w:t>
+              <w:t>PO from 6.3; metres counted; washed from the requirement; shrinkage at receiving</w:t>
             </w:r>
           </w:p>
         </w:tc>
@@ -9841,7 +9936,7 @@
                 <w:color w:val="1A1A1A"/>
                 <w:sz w:val="17"/>
               </w:rPr>
-              <w:t>metres received never above pending; shrinkage applies only to fabric marked washed on the requirement, and is required before metres are booked</w:t>
+              <w:t>received never above pending; shrinkage only for fabric marked washed, required before booking</w:t>
             </w:r>
           </w:p>
         </w:tc>
@@ -9866,7 +9961,7 @@
                 <w:color w:val="1A1A1A"/>
                 <w:sz w:val="17"/>
               </w:rPr>
-              <w:t>the shelf goes up by the usable metres and incoming down by what arrived; when the line is received or closed the record moves to state 4 · Fabric in</w:t>
+              <w:t>shelf up by usable metres, incoming down by what arrived; received or closed moves to state 4 · Fabric in</w:t>
             </w:r>
           </w:p>
         </w:tc>
@@ -9943,59 +10038,59 @@
                 <w:color w:val="1A1A1A"/>
                 <w:sz w:val="17"/>
               </w:rPr>
-              <w:t>1. Design codes can be added at any stage, not only once the cloth is in. In Designs &amp; stickers, a section of its own on the record, the designer clicks + Add a design and fills Enigma's Product Info: SKU, Product Type, Weight, Region, Stock Mode, Primary Fabric (this cloth), Status, Sales Channel, Media.</w:t>
-            </w:r>
-          </w:p>
-          <w:p>
-            <w:pPr>
-              <w:spacing w:before="0" w:after="40"/>
-            </w:pPr>
-            <w:r>
-              <w:rPr>
-                <w:rFonts w:ascii="Inter Tight" w:hAnsi="Inter Tight" w:cs="Inter Tight" w:eastAsia="Inter Tight"/>
-                <w:color w:val="1A1A1A"/>
-                <w:sz w:val="17"/>
-              </w:rPr>
-              <w:t>2. They type a variant option name (Size, Fit, anything) and its values as free text; the table beneath takes a price, a discounted price and a SKU per value (defaulted to code-value).</w:t>
-            </w:r>
-          </w:p>
-          <w:p>
-            <w:pPr>
-              <w:spacing w:before="0" w:after="40"/>
-            </w:pPr>
-            <w:r>
-              <w:rPr>
-                <w:rFonts w:ascii="Inter Tight" w:hAnsi="Inter Tight" w:cs="Inter Tight" w:eastAsia="Inter Tight"/>
-                <w:color w:val="1A1A1A"/>
-                <w:sz w:val="17"/>
-              </w:rPr>
-              <w:t>3. They write what the customer reads: description and buzzwords.</w:t>
-            </w:r>
-          </w:p>
-          <w:p>
-            <w:pPr>
-              <w:spacing w:before="0" w:after="40"/>
-            </w:pPr>
-            <w:r>
-              <w:rPr>
-                <w:rFonts w:ascii="Inter Tight" w:hAnsi="Inter Tight" w:cs="Inter Tight" w:eastAsia="Inter Tight"/>
-                <w:color w:val="1A1A1A"/>
-                <w:sz w:val="17"/>
-              </w:rPr>
-              <w:t>4. Save mints a product code (BOM-SHI-FM/CS-nnnn). Push to Enigma on the row sends it; the row then reads "in Enigma · synced &lt;date&gt;".</w:t>
-            </w:r>
-          </w:p>
-          <w:p>
-            <w:pPr>
-              <w:spacing w:before="0" w:after="40"/>
-            </w:pPr>
-            <w:r>
-              <w:rPr>
-                <w:rFonts w:ascii="Inter Tight" w:hAnsi="Inter Tight" w:cs="Inter Tight" w:eastAsia="Inter Tight"/>
-                <w:color w:val="1A1A1A"/>
-                <w:sz w:val="17"/>
-              </w:rPr>
-              <w:t>5. The stickers sit under the designs: one label per design with the fabric code, design name and product code, swatch book and MRP, printed as a 3 × 7 sheet or one page per design. One sticker per design; there is no per-store copy count. The add form stays closed until + Add a design is clicked.</w:t>
+              <w:t>1. Design codes can be added at any stage. In Designs &amp; stickers, its own section, + Add a design (the form stays closed until clicked) fills Enigma's Product Info: SKU, Product Type, Weight, Region, Stock Mode, Primary Fabric (this cloth), Status, Sales Channel, Media.</w:t>
+            </w:r>
+          </w:p>
+          <w:p>
+            <w:pPr>
+              <w:spacing w:before="0" w:after="40"/>
+            </w:pPr>
+            <w:r>
+              <w:rPr>
+                <w:rFonts w:ascii="Inter Tight" w:hAnsi="Inter Tight" w:cs="Inter Tight" w:eastAsia="Inter Tight"/>
+                <w:color w:val="1A1A1A"/>
+                <w:sz w:val="17"/>
+              </w:rPr>
+              <w:t>2. A variant option (Size, Fit, anything) with free-text values; per value a price, discounted price and SKU (default code-value).</w:t>
+            </w:r>
+          </w:p>
+          <w:p>
+            <w:pPr>
+              <w:spacing w:before="0" w:after="40"/>
+            </w:pPr>
+            <w:r>
+              <w:rPr>
+                <w:rFonts w:ascii="Inter Tight" w:hAnsi="Inter Tight" w:cs="Inter Tight" w:eastAsia="Inter Tight"/>
+                <w:color w:val="1A1A1A"/>
+                <w:sz w:val="17"/>
+              </w:rPr>
+              <w:t>3. Description and buzzwords for the customer.</w:t>
+            </w:r>
+          </w:p>
+          <w:p>
+            <w:pPr>
+              <w:spacing w:before="0" w:after="40"/>
+            </w:pPr>
+            <w:r>
+              <w:rPr>
+                <w:rFonts w:ascii="Inter Tight" w:hAnsi="Inter Tight" w:cs="Inter Tight" w:eastAsia="Inter Tight"/>
+                <w:color w:val="1A1A1A"/>
+                <w:sz w:val="17"/>
+              </w:rPr>
+              <w:t>4. Save mints a product code (BOM-SHI-FM/CS-nnnn); Push to Enigma sends it and the row reads “in Enigma · synced &lt;date&gt;”.</w:t>
+            </w:r>
+          </w:p>
+          <w:p>
+            <w:pPr>
+              <w:spacing w:before="0" w:after="40"/>
+            </w:pPr>
+            <w:r>
+              <w:rPr>
+                <w:rFonts w:ascii="Inter Tight" w:hAnsi="Inter Tight" w:cs="Inter Tight" w:eastAsia="Inter Tight"/>
+                <w:color w:val="1A1A1A"/>
+                <w:sz w:val="17"/>
+              </w:rPr>
+              <w:t>5. Stickers sit under the designs: one per design (fabric code, design name, product code, swatch book, MRP), printed 3 × 7 or one page per design; no per-store copy count.</w:t>
             </w:r>
           </w:p>
         </w:tc>
@@ -10045,7 +10140,7 @@
                 <w:color w:val="1A1A1A"/>
                 <w:sz w:val="17"/>
               </w:rPr>
-              <w:t>a design needs a name and at least one variant with a price; price lives on the variant only, there is no separate money block</w:t>
+              <w:t>a design needs a name and one variant with a price; price only on variants</w:t>
             </w:r>
           </w:p>
         </w:tc>
@@ -10070,7 +10165,7 @@
                 <w:color w:val="1A1A1A"/>
                 <w:sz w:val="17"/>
               </w:rPr>
-              <w:t>the design is listed on Design → Designs (every product code on every fabric, searchable, Not in Enigma / In Enigma) and in Search; the store's bill form offers it; a price change on a design already in Enigma re-pushes it and stamps the sync date</w:t>
+              <w:t>listed on Design → Designs (every product code, searchable, in Enigma or not) and in Search; offered on the store's bill form; a price change re-pushes and stamps the sync date</w:t>
             </w:r>
           </w:p>
         </w:tc>
@@ -10147,7 +10242,7 @@
                 <w:color w:val="1A1A1A"/>
                 <w:sz w:val="17"/>
               </w:rPr>
-              <w:t>1. The designer sets the fabric up in Enigma (template, base and buffer consumption) and clicks Configured in Enigma on the record with those values. Big-Checked and composition family are fabric attributes and are edited on the fabric record (workflow 3), not here.</w:t>
+              <w:t>1. Set the fabric up in Enigma (template, base and buffer consumption) and click Configured in Enigma with those values. Big-Checked and composition family are fabric attributes, edited on the fabric record.</w:t>
             </w:r>
           </w:p>
         </w:tc>
@@ -10222,7 +10317,7 @@
                 <w:color w:val="1A1A1A"/>
                 <w:sz w:val="17"/>
               </w:rPr>
-              <w:t>consumption on the order sheet reads base + buffer; a Big-Checked fabric adds matching</w:t>
+              <w:t>the sheet's consumption reads base + buffer; Big-Checked adds matching</w:t>
             </w:r>
           </w:p>
         </w:tc>
@@ -10299,20 +10394,20 @@
                 <w:color w:val="1A1A1A"/>
                 <w:sz w:val="17"/>
               </w:rPr>
-              <w:t>1. The name block shows the working name, the final name and the history of every earlier name with who, when and why. The final name can be set or changed at any time.</w:t>
-            </w:r>
-          </w:p>
-          <w:p>
-            <w:pPr>
-              <w:spacing w:before="0" w:after="40"/>
-            </w:pPr>
-            <w:r>
-              <w:rPr>
-                <w:rFonts w:ascii="Inter Tight" w:hAnsi="Inter Tight" w:cs="Inter Tight" w:eastAsia="Inter Tight"/>
-                <w:color w:val="1A1A1A"/>
-                <w:sz w:val="17"/>
-              </w:rPr>
-              <w:t>2. Price is per variant on each design (6.6).</w:t>
+              <w:t>1. Working name, final name (settable any time) and every earlier name with who, when and why.</w:t>
+            </w:r>
+          </w:p>
+          <w:p>
+            <w:pPr>
+              <w:spacing w:before="0" w:after="40"/>
+            </w:pPr>
+            <w:r>
+              <w:rPr>
+                <w:rFonts w:ascii="Inter Tight" w:hAnsi="Inter Tight" w:cs="Inter Tight" w:eastAsia="Inter Tight"/>
+                <w:color w:val="1A1A1A"/>
+                <w:sz w:val="17"/>
+              </w:rPr>
+              <w:t>2. Price is per variant (6.6).</w:t>
             </w:r>
           </w:p>
         </w:tc>
@@ -10387,7 +10482,7 @@
                 <w:color w:val="1A1A1A"/>
                 <w:sz w:val="17"/>
               </w:rPr>
-              <w:t>website, sticker and Enigma read the final name; a change after a sticker was printed flags "out of date · reprint" on the swatch desk</w:t>
+              <w:t>website, sticker and Enigma read the final name; a change after a sticker flags “out of date · reprint”</w:t>
             </w:r>
           </w:p>
         </w:tc>
@@ -10464,33 +10559,7 @@
                 <w:color w:val="1A1A1A"/>
                 <w:sz w:val="17"/>
               </w:rPr>
-              <w:t>1. Section 4 · Live online lists the online gates: photos, video, post-production, product page, and Go live online.</w:t>
-            </w:r>
-          </w:p>
-          <w:p>
-            <w:pPr>
-              <w:spacing w:before="0" w:after="40"/>
-            </w:pPr>
-            <w:r>
-              <w:rPr>
-                <w:rFonts w:ascii="Inter Tight" w:hAnsi="Inter Tight" w:cs="Inter Tight" w:eastAsia="Inter Tight"/>
-                <w:color w:val="1A1A1A"/>
-                <w:sz w:val="17"/>
-              </w:rPr>
-              <w:t>2. The designer works them in any order and clicks Go live online. Stores are not a gate here.</w:t>
-            </w:r>
-          </w:p>
-          <w:p>
-            <w:pPr>
-              <w:spacing w:before="0" w:after="40"/>
-            </w:pPr>
-            <w:r>
-              <w:rPr>
-                <w:rFonts w:ascii="Inter Tight" w:hAnsi="Inter Tight" w:cs="Inter Tight" w:eastAsia="Inter Tight"/>
-                <w:color w:val="1A1A1A"/>
-                <w:sz w:val="17"/>
-              </w:rPr>
-              <w:t>3. Story and live in stores are hidden in this edition; stores follow the swatch desk.</w:t>
+              <w:t>1. Section 4 lists the online gates (photos, video, post-production, product page) and Go live online, in any order. Stores are not a gate; story and live in stores are hidden in this edition.</w:t>
             </w:r>
           </w:p>
         </w:tc>
@@ -10540,7 +10609,7 @@
                 <w:color w:val="1A1A1A"/>
                 <w:sz w:val="17"/>
               </w:rPr>
-              <w:t>go live blocked until composition and a description are on the record; every other gate is advisory and the skips are kept</w:t>
+              <w:t>blocked until composition and a description are on the record; other gates advisory, skips kept</w:t>
             </w:r>
           </w:p>
         </w:tc>
@@ -10565,7 +10634,7 @@
                 <w:color w:val="1A1A1A"/>
                 <w:sz w:val="17"/>
               </w:rPr>
-              <w:t>state 5 · Live online; the fabric comes off hold for the website</w:t>
+              <w:t>state 5 · Live online; off hold for the website</w:t>
             </w:r>
           </w:p>
         </w:tc>
@@ -10588,7 +10657,7 @@
           <w:color w:val="1A1A1A"/>
           <w:sz w:val="20"/>
         </w:rPr>
-        <w:t>New shade of a known fabric: no sampling. Re-source from another mill: a new ask. Paused before live: hidden from the website and the order form; the record stays until design closes it. Core replenishment and bespoke are never requirements (workflow 4).</w:t>
+        <w:t>New shade of a known fabric: no sampling. Re-source from another mill: a new ask. Paused before live: hidden from website and order form; the record stays until design closes it. Core replenishment and bespoke are never requirements.</w:t>
       </w:r>
     </w:p>
     <w:p>
@@ -10607,7 +10676,7 @@
           <w:color w:val="1A1A1A"/>
           <w:sz w:val="20"/>
         </w:rPr>
-        <w:t>Design: a vendor added and waiting for Push PO (urgent at 5 days of hold left); fabric in with no design yet; a design not pushed to Enigma. Sourcing: a requirement with no vendor; an extension asked.</w:t>
+        <w:t>Design: vendor added awaiting Push PO (urgent at 5 days of hold left); fabric in with no design; a design not pushed. Sourcing: a requirement with no vendor; an extension asked.</w:t>
       </w:r>
     </w:p>
     <w:p>
@@ -10652,7 +10721,7 @@
           <w:color w:val="1A1A1A"/>
           <w:sz w:val="20"/>
         </w:rPr>
-        <w:t>In this edition the desk runs from cloth in to the handover to Yusuf. Cut, sticker, dispatch, photos and stores told are the next phase, with the warehouse portal.</w:t>
+        <w:t>Here the desk runs from cloth in to the handover to Yusuf; cut, sticker, dispatch, photos and stores told follow with the warehouse portal.</w:t>
       </w:r>
     </w:p>
     <w:tbl>
@@ -10892,20 +10961,20 @@
                 <w:color w:val="1A1A1A"/>
                 <w:sz w:val="17"/>
               </w:rPr>
-              <w:t>1. Swatch desk lists every new fabric whose PO has received metres. Each row has one button: Handed to Yusuf (tick Priority-1 if urgent).</w:t>
-            </w:r>
-          </w:p>
-          <w:p>
-            <w:pPr>
-              <w:spacing w:before="0" w:after="40"/>
-            </w:pPr>
-            <w:r>
-              <w:rPr>
-                <w:rFonts w:ascii="Inter Tight" w:hAnsi="Inter Tight" w:cs="Inter Tight" w:eastAsia="Inter Tight"/>
-                <w:color w:val="1A1A1A"/>
-                <w:sz w:val="17"/>
-              </w:rPr>
-              <w:t>2. The row keeps the dates and who did it; files and conversation sit on the row.</w:t>
+              <w:t>1. Every new fabric with received metres, each with Handed to Yusuf (tick Priority-1 if urgent).</w:t>
+            </w:r>
+          </w:p>
+          <w:p>
+            <w:pPr>
+              <w:spacing w:before="0" w:after="40"/>
+            </w:pPr>
+            <w:r>
+              <w:rPr>
+                <w:rFonts w:ascii="Inter Tight" w:hAnsi="Inter Tight" w:cs="Inter Tight" w:eastAsia="Inter Tight"/>
+                <w:color w:val="1A1A1A"/>
+                <w:sz w:val="17"/>
+              </w:rPr>
+              <w:t>2. The row keeps dates, who, files and conversation.</w:t>
             </w:r>
           </w:p>
         </w:tc>
@@ -10980,7 +11049,7 @@
                 <w:color w:val="1A1A1A"/>
                 <w:sz w:val="17"/>
               </w:rPr>
-              <w:t>design sees "with Yusuf" on the record; Priority-1 reminds until done</w:t>
+              <w:t>design sees “with Yusuf”; Priority-1 reminds until done</w:t>
             </w:r>
           </w:p>
         </w:tc>
@@ -10995,7 +11064,7 @@
           <w:color w:val="0A0A0A"/>
           <w:sz w:val="20"/>
         </w:rPr>
-        <w:t xml:space="preserve">Phase two on this desk. </w:t>
+        <w:t xml:space="preserve">Phase two. </w:t>
       </w:r>
       <w:r>
         <w:rPr>
@@ -11003,7 +11072,7 @@
           <w:color w:val="1A1A1A"/>
           <w:sz w:val="20"/>
         </w:rPr>
-        <w:t>Yusuf cuts the swatches for every store, prints the sticker (fabric code, design name with article, book, price from the record), dispatches one parcel per store, takes the photos; design marks stores told; a name or price change after the sticker flags a reprint.</w:t>
+        <w:t>Yusuf cuts swatches for every store, prints the sticker (fabric code, design name with article, book, price), dispatches one parcel per store and takes photos; design marks stores told; a name or price change after printing flags a reprint.</w:t>
       </w:r>
     </w:p>
     <w:p>
@@ -11048,7 +11117,7 @@
           <w:color w:val="1A1A1A"/>
           <w:sz w:val="20"/>
         </w:rPr>
-        <w:t>Nothing is emailed and nothing lives in a WhatsApp group: the record is the thread. Every record in this edition, a customer order, a customer, a fabric, a requirement, a mill, a return case, carries a conversation and a set of files at the bottom of its page or drawer. Anyone who can open the record can read and write there. A mention puts a line on the mentioned person's bell, and it stays until that person marks it dealt with.</w:t>
+        <w:t>Nothing is emailed or kept in WhatsApp: the record is the thread. Every record (order, customer, fabric, requirement, mill, return case) has a conversation and files at its foot, open to anyone who can open the record. A mention puts a line on that person's bell until they mark it dealt with.</w:t>
       </w:r>
     </w:p>
     <w:tbl>
@@ -11263,7 +11332,7 @@
                 <w:color w:val="1A1A1A"/>
                 <w:sz w:val="17"/>
               </w:rPr>
-              <w:t>Post on a record · anyone who can open it</w:t>
+              <w:t>Post · anyone who can open the record</w:t>
             </w:r>
           </w:p>
         </w:tc>
@@ -11288,33 +11357,33 @@
                 <w:color w:val="1A1A1A"/>
                 <w:sz w:val="17"/>
               </w:rPr>
-              <w:t>1. At the foot of the record, Conversation · N shows every comment in order with who, role, when and the step it is about.</w:t>
-            </w:r>
-          </w:p>
-          <w:p>
-            <w:pPr>
-              <w:spacing w:before="0" w:after="40"/>
-            </w:pPr>
-            <w:r>
-              <w:rPr>
-                <w:rFonts w:ascii="Inter Tight" w:hAnsi="Inter Tight" w:cs="Inter Tight" w:eastAsia="Inter Tight"/>
-                <w:color w:val="1A1A1A"/>
-                <w:sz w:val="17"/>
-              </w:rPr>
-              <w:t>2. The writer picks the step (per record: a requirement has General, Fabric, PP sample, Shipment sample, Approval, Enigma; a customer order has General, Change from store, Fabric, Alteration; a customer has General, Fit, Preferences, Complaint; the swatch desk has Cut &amp; packed, Dispatch, Marketing · go live, General), types the comment, optionally attaches files, and clicks Post.</w:t>
-            </w:r>
-          </w:p>
-          <w:p>
-            <w:pPr>
-              <w:spacing w:before="0" w:after="40"/>
-            </w:pPr>
-            <w:r>
-              <w:rPr>
-                <w:rFonts w:ascii="Inter Tight" w:hAnsi="Inter Tight" w:cs="Inter Tight" w:eastAsia="Inter Tight"/>
-                <w:color w:val="1A1A1A"/>
-                <w:sz w:val="17"/>
-              </w:rPr>
-              <w:t>3. Comments can be filtered by step.</w:t>
+              <w:t>1. Conversation · N lists comments in order with who, role, when and step.</w:t>
+            </w:r>
+          </w:p>
+          <w:p>
+            <w:pPr>
+              <w:spacing w:before="0" w:after="40"/>
+            </w:pPr>
+            <w:r>
+              <w:rPr>
+                <w:rFonts w:ascii="Inter Tight" w:hAnsi="Inter Tight" w:cs="Inter Tight" w:eastAsia="Inter Tight"/>
+                <w:color w:val="1A1A1A"/>
+                <w:sz w:val="17"/>
+              </w:rPr>
+              <w:t>2. Pick the step (a requirement: General, Fabric, PP sample, Shipment sample, Approval, Enigma; an order: General, Change from store, Fabric, Alteration; a customer: General, Fit, Preferences, Complaint; the swatch desk: Cut &amp; packed, Dispatch, Marketing · go live, General), type, attach files if any, Post.</w:t>
+            </w:r>
+          </w:p>
+          <w:p>
+            <w:pPr>
+              <w:spacing w:before="0" w:after="40"/>
+            </w:pPr>
+            <w:r>
+              <w:rPr>
+                <w:rFonts w:ascii="Inter Tight" w:hAnsi="Inter Tight" w:cs="Inter Tight" w:eastAsia="Inter Tight"/>
+                <w:color w:val="1A1A1A"/>
+                <w:sz w:val="17"/>
+              </w:rPr>
+              <w:t>3. Filter by step.</w:t>
             </w:r>
           </w:p>
         </w:tc>
@@ -11364,7 +11433,7 @@
                 <w:color w:val="1A1A1A"/>
                 <w:sz w:val="17"/>
               </w:rPr>
-              <w:t>a comment needs text</w:t>
+              <w:t>text required</w:t>
             </w:r>
           </w:p>
         </w:tc>
@@ -11389,7 +11458,7 @@
                 <w:color w:val="1A1A1A"/>
                 <w:sz w:val="17"/>
               </w:rPr>
-              <w:t>the comment is on the record for everyone; the toast says who will see it</w:t>
+              <w:t>on the record for everyone; the toast says who will see it</w:t>
             </w:r>
           </w:p>
         </w:tc>
@@ -11441,7 +11510,7 @@
                 <w:color w:val="1A1A1A"/>
                 <w:sz w:val="17"/>
               </w:rPr>
-              <w:t>Mention a person or a team · writer</w:t>
+              <w:t>Mention · writer</w:t>
             </w:r>
           </w:p>
         </w:tc>
@@ -11466,20 +11535,20 @@
                 <w:color w:val="1A1A1A"/>
                 <w:sz w:val="17"/>
               </w:rPr>
-              <w:t>1. Typing @ and a name or a team (@kunal, @sourcing, @design) mentions them. The mention is resolved against the people and roles list.</w:t>
-            </w:r>
-          </w:p>
-          <w:p>
-            <w:pPr>
-              <w:spacing w:before="0" w:after="40"/>
-            </w:pPr>
-            <w:r>
-              <w:rPr>
-                <w:rFonts w:ascii="Inter Tight" w:hAnsi="Inter Tight" w:cs="Inter Tight" w:eastAsia="Inter Tight"/>
-                <w:color w:val="1A1A1A"/>
-                <w:sz w:val="17"/>
-              </w:rPr>
-              <w:t>2. A store writing on a customer order mentions whoever holds the piece by default: production for an MTM piece in PP or at a factory.</w:t>
+              <w:t>1. @ and a name or team (@kunal, @sourcing, @design), resolved against the people and roles list.</w:t>
+            </w:r>
+          </w:p>
+          <w:p>
+            <w:pPr>
+              <w:spacing w:before="0" w:after="40"/>
+            </w:pPr>
+            <w:r>
+              <w:rPr>
+                <w:rFonts w:ascii="Inter Tight" w:hAnsi="Inter Tight" w:cs="Inter Tight" w:eastAsia="Inter Tight"/>
+                <w:color w:val="1A1A1A"/>
+                <w:sz w:val="17"/>
+              </w:rPr>
+              <w:t>2. A store writing on an order mentions whoever holds the piece by default: production for MTM in PP or at a factory.</w:t>
             </w:r>
           </w:p>
         </w:tc>
@@ -11529,7 +11598,7 @@
                 <w:color w:val="1A1A1A"/>
                 <w:sz w:val="17"/>
               </w:rPr>
-              <w:t>unknown names are plain text</w:t>
+              <w:t>unknown names stay plain text</w:t>
             </w:r>
           </w:p>
         </w:tc>
@@ -11554,7 +11623,7 @@
                 <w:color w:val="1A1A1A"/>
                 <w:sz w:val="17"/>
               </w:rPr>
-              <w:t>each person mentioned, and everyone in a mentioned team, gets a line under Messages on their bell</w:t>
+              <w:t>each person, or every member of a team, gets a line under Messages</w:t>
             </w:r>
           </w:p>
         </w:tc>
@@ -11606,7 +11675,7 @@
                 <w:color w:val="1A1A1A"/>
                 <w:sz w:val="17"/>
               </w:rPr>
-              <w:t>Read and deal with a mention · the person mentioned</w:t>
+              <w:t>Deal with a mention · the person mentioned</w:t>
             </w:r>
           </w:p>
         </w:tc>
@@ -11631,33 +11700,33 @@
                 <w:color w:val="1A1A1A"/>
                 <w:sz w:val="17"/>
               </w:rPr>
-              <w:t>1. Waiting on you → Messages lists every mention, newest first, grouped by day, with the record it is on (name and code), the step, the text, and who wrote it. Filters: all, this week, earlier.</w:t>
-            </w:r>
-          </w:p>
-          <w:p>
-            <w:pPr>
-              <w:spacing w:before="0" w:after="40"/>
-            </w:pPr>
-            <w:r>
-              <w:rPr>
-                <w:rFonts w:ascii="Inter Tight" w:hAnsi="Inter Tight" w:cs="Inter Tight" w:eastAsia="Inter Tight"/>
-                <w:color w:val="1A1A1A"/>
-                <w:sz w:val="17"/>
-              </w:rPr>
-              <w:t>2. Clicking the text opens the record at the conversation.</w:t>
-            </w:r>
-          </w:p>
-          <w:p>
-            <w:pPr>
-              <w:spacing w:before="0" w:after="40"/>
-            </w:pPr>
-            <w:r>
-              <w:rPr>
-                <w:rFonts w:ascii="Inter Tight" w:hAnsi="Inter Tight" w:cs="Inter Tight" w:eastAsia="Inter Tight"/>
-                <w:color w:val="1A1A1A"/>
-                <w:sz w:val="17"/>
-              </w:rPr>
-              <w:t>3. Mark resolved says it was dealt with; the comment stays on the record with who resolved it and when. Resolve all clears the list. A resolved mention can be put back.</w:t>
+              <w:t>1. Waiting on you → Messages: newest first, by day, with the record (name, code), step, text and writer. Filters: all, this week, earlier.</w:t>
+            </w:r>
+          </w:p>
+          <w:p>
+            <w:pPr>
+              <w:spacing w:before="0" w:after="40"/>
+            </w:pPr>
+            <w:r>
+              <w:rPr>
+                <w:rFonts w:ascii="Inter Tight" w:hAnsi="Inter Tight" w:cs="Inter Tight" w:eastAsia="Inter Tight"/>
+                <w:color w:val="1A1A1A"/>
+                <w:sz w:val="17"/>
+              </w:rPr>
+              <w:t>2. The text opens the record at the conversation.</w:t>
+            </w:r>
+          </w:p>
+          <w:p>
+            <w:pPr>
+              <w:spacing w:before="0" w:after="40"/>
+            </w:pPr>
+            <w:r>
+              <w:rPr>
+                <w:rFonts w:ascii="Inter Tight" w:hAnsi="Inter Tight" w:cs="Inter Tight" w:eastAsia="Inter Tight"/>
+                <w:color w:val="1A1A1A"/>
+                <w:sz w:val="17"/>
+              </w:rPr>
+              <w:t>3. Mark resolved keeps the comment with who resolved it and when; Resolve all clears the list; a resolved mention can be put back.</w:t>
             </w:r>
           </w:p>
         </w:tc>
@@ -11707,7 +11776,7 @@
                 <w:color w:val="1A1A1A"/>
                 <w:sz w:val="17"/>
               </w:rPr>
-              <w:t>a mention is done when it is dealt with, not when it is read</w:t>
+              <w:t>done when dealt with, not when read</w:t>
             </w:r>
           </w:p>
         </w:tc>
@@ -11732,7 +11801,7 @@
                 <w:color w:val="1A1A1A"/>
                 <w:sz w:val="17"/>
               </w:rPr>
-              <w:t>the bell count drops; the writer sees who resolved it on the record</w:t>
+              <w:t>the bell count drops; the writer sees who resolved it</w:t>
             </w:r>
           </w:p>
         </w:tc>
@@ -11784,7 +11853,7 @@
                 <w:color w:val="1A1A1A"/>
                 <w:sz w:val="17"/>
               </w:rPr>
-              <w:t>Files on a record · anyone who can open it</w:t>
+              <w:t>Files · anyone who can open the record</w:t>
             </w:r>
           </w:p>
         </w:tc>
@@ -11809,20 +11878,20 @@
                 <w:color w:val="1A1A1A"/>
                 <w:sz w:val="17"/>
               </w:rPr>
-              <w:t>1. Files · N lists every attachment with a label per record kind. A requirement takes PAT file, CAD / pattern, tech pack, sketch or reference image, sample photo, green slip, approval note, fabric swatch image. A fabric takes swatch image, test report, mill stock sheet, vendor quote, block confirmation, datasheet. A customer order takes order sheet, alteration note, photo, measurement sheet. A customer takes a photo in the fit sample, reference image, measurement sheet, old bill. A mill takes agreement, rate card, capacity sheet, audit report. A return takes photo, invoice, alteration note. The swatch desk takes photos of the cut swatches, dispatch photo, sticker page, marketing lines, reference.</w:t>
-            </w:r>
-          </w:p>
-          <w:p>
-            <w:pPr>
-              <w:spacing w:before="0" w:after="40"/>
-            </w:pPr>
-            <w:r>
-              <w:rPr>
-                <w:rFonts w:ascii="Inter Tight" w:hAnsi="Inter Tight" w:cs="Inter Tight" w:eastAsia="Inter Tight"/>
-                <w:color w:val="1A1A1A"/>
-                <w:sz w:val="17"/>
-              </w:rPr>
-              <w:t>2. Upload, pick the label, optionally the step; images preview inline. A file attached to a comment carries the label Attachment.</w:t>
+              <w:t>1. Files · N with a label per record kind. Requirement: PAT file, CAD / pattern, tech pack, sketch or reference, sample photo, green slip, approval note, swatch image. Fabric: swatch image, test report, mill stock sheet, vendor quote, block confirmation, datasheet. Order: order sheet, alteration note, photo, measurement sheet. Customer: fit sample photo, reference image, measurement sheet, old bill. Mill: agreement, rate card, capacity sheet, audit report. Return: photo, invoice, alteration note. Swatch desk: cut swatch photos, dispatch photo, sticker page, marketing lines, reference.</w:t>
+            </w:r>
+          </w:p>
+          <w:p>
+            <w:pPr>
+              <w:spacing w:before="0" w:after="40"/>
+            </w:pPr>
+            <w:r>
+              <w:rPr>
+                <w:rFonts w:ascii="Inter Tight" w:hAnsi="Inter Tight" w:cs="Inter Tight" w:eastAsia="Inter Tight"/>
+                <w:color w:val="1A1A1A"/>
+                <w:sz w:val="17"/>
+              </w:rPr>
+              <w:t>2. Upload, pick the label and optionally the step; images preview inline; a file on a comment is labelled Attachment.</w:t>
             </w:r>
           </w:p>
         </w:tc>
@@ -11897,7 +11966,7 @@
                 <w:color w:val="1A1A1A"/>
                 <w:sz w:val="17"/>
               </w:rPr>
-              <w:t>the file stays with the record; the sticker and the website read the swatch image and the marketing lines from here</w:t>
+              <w:t>stays with the record; sticker and website read the swatch image and marketing lines here</w:t>
             </w:r>
           </w:p>
         </w:tc>
@@ -11949,7 +12018,7 @@
                 <w:color w:val="1A1A1A"/>
                 <w:sz w:val="17"/>
               </w:rPr>
-              <w:t>Posts the system writes · system</w:t>
+              <w:t>System posts · system</w:t>
             </w:r>
           </w:p>
         </w:tc>
@@ -11974,7 +12043,7 @@
                 <w:color w:val="1A1A1A"/>
                 <w:sz w:val="17"/>
               </w:rPr>
-              <w:t>1. Some actions write a comment themselves so the record tells its own story: posting an approval writes it once under Approval for every role to read; a rename, a pause, a ship-by move and a refund approval each leave a line with who and why.</w:t>
+              <w:t>1. Some actions write their own line so the record tells its story: an approval is posted once under Approval for every role; a rename, pause, ship-by move or refund approval leaves who and why.</w:t>
             </w:r>
           </w:p>
         </w:tc>
@@ -12049,7 +12118,7 @@
                 <w:color w:val="1A1A1A"/>
                 <w:sz w:val="17"/>
               </w:rPr>
-              <w:t>the audit and the conversation are the same thread</w:t>
+              <w:t>audit and conversation are one thread</w:t>
             </w:r>
           </w:p>
         </w:tc>
@@ -12072,7 +12141,7 @@
           <w:color w:val="1A1A1A"/>
           <w:sz w:val="20"/>
         </w:rPr>
-        <w:t>One thread per record, in order, never deleted. Everyone who can open the record can read all of it; there is no private comment. A mention goes to a person or to a team; a team mention lands on every member's bell. Resolving is per person and is kept on the comment. Nothing is sent by email or WhatsApp; the record is the only copy.</w:t>
+        <w:t>One thread per record, in order, never deleted, no private comments. A team mention reaches every member. Resolving is per person and kept on the comment. Nothing goes by email or WhatsApp.</w:t>
       </w:r>
     </w:p>
     <w:p>
@@ -12091,7 +12160,7 @@
           <w:color w:val="1A1A1A"/>
           <w:sz w:val="20"/>
         </w:rPr>
-        <w:t>Messages on the bell: every unresolved mention of me or my team. The count on the bell is things to do plus unresolved mentions.</w:t>
+        <w:t>Messages on the bell: every unresolved mention of me or my team. The bell counts things to do plus unresolved mentions.</w:t>
       </w:r>
     </w:p>
     <w:p>
@@ -12229,7 +12298,7 @@
                 <w:color w:val="1A1A1A"/>
                 <w:sz w:val="17"/>
               </w:rPr>
-              <w:t>Name and why required. A variant's base fabric must be inventory, over 20 m, not bespoke, not paused or on hold. A requirement is in exactly one of five states; the state is derived, never typed.</w:t>
+              <w:t>Name and why required. A variant's base must be inventory, over 20 m, not bespoke, not paused or on hold. One of five states, derived, never typed.</w:t>
             </w:r>
           </w:p>
         </w:tc>
@@ -12281,7 +12350,7 @@
                 <w:color w:val="1A1A1A"/>
                 <w:sz w:val="17"/>
               </w:rPr>
-              <w:t>One live vendor per ask; a second replaces the first and is kept as replaced. Push PO refused on a lapsed hold until sourcing extends it. Reject needs a reason. Extend must be later than the old date (later). The PO amount follows the typed metres at the vendor's price.</w:t>
+              <w:t>One live vendor per ask; a second replaces the first, kept as replaced. Push PO refused on a lapsed hold until extended. Reject needs a reason. Extend must be later (later). PO amount = typed metres × the vendor's price.</w:t>
             </w:r>
           </w:p>
         </w:tc>
@@ -12333,7 +12402,7 @@
                 <w:color w:val="1A1A1A"/>
                 <w:sz w:val="17"/>
               </w:rPr>
-              <w:t>A PO raised by Enigma carries source auto; by a person, manual with who. Received metres never exceed pending; Close with metres pending cancels the balance and is marked closed short. Every receiving update raises a GRN. "Needs a PO by hand" is only international core under its reorder point with nothing on order.</w:t>
+              <w:t>Enigma-raised is source auto; person-raised is manual with who. Received never exceeds pending; Close with metres pending cancels the balance as closed short. Every receiving update raises a GRN. Needs a PO by hand is only international core under its point with nothing on order.</w:t>
             </w:r>
           </w:p>
         </w:tc>
@@ -12385,7 +12454,7 @@
                 <w:color w:val="1A1A1A"/>
                 <w:sz w:val="17"/>
               </w:rPr>
-              <w:t>A design needs a name and one variant with a price. Price is per variant; no design-level price. A price change on a design in Enigma re-pushes it. The product code is minted once.</w:t>
+              <w:t>A name and one priced variant. Price per variant only. A price change on a design in Enigma re-pushes it. The product code is minted once.</w:t>
             </w:r>
           </w:p>
         </w:tc>
@@ -12437,7 +12506,7 @@
                 <w:color w:val="1A1A1A"/>
                 <w:sz w:val="17"/>
               </w:rPr>
-              <w:t>A rename appends the old name to the history with who, when and why; the code never changes.</w:t>
+              <w:t>A rename appends the old name with who, when and why; the code never changes.</w:t>
             </w:r>
           </w:p>
         </w:tc>
@@ -12489,7 +12558,7 @@
                 <w:color w:val="1A1A1A"/>
                 <w:sz w:val="17"/>
               </w:rPr>
-              <w:t>Edits to Enigma's fields are saved under Enigma's names. A stock adjustment is signed metres with a reason and a description. Threshold on the inventory block is the reorder floor. One sell action per state.</w:t>
+              <w:t>Edits saved under Enigma's field names. An adjustment is signed metres with a reason and description. Threshold is the reorder floor. One sell action per state.</w:t>
             </w:r>
           </w:p>
         </w:tc>
@@ -12541,7 +12610,7 @@
                 <w:color w:val="1A1A1A"/>
                 <w:sz w:val="17"/>
               </w:rPr>
-              <w:t>Blocked until composition and a description are on the record; every other gate is advisory and the skips are kept. Stores are not a gate.</w:t>
+              <w:t>Blocked until composition and a description are on the record; other gates advisory, skips kept. Stores are not a gate.</w:t>
             </w:r>
           </w:p>
         </w:tc>
@@ -12645,7 +12714,7 @@
                 <w:color w:val="1A1A1A"/>
                 <w:sz w:val="17"/>
               </w:rPr>
-              <w:t>Approval from the shelf deducts the metres from physical stock at once, alteration cloth included. Bespoke cloth, an alteration unit's ask, or a shortfall the shelf cannot cover goes to Shravani in one click from production; an alteration the shelf covers is issued and deducted on her approval; otherwise Shravani approves, the PO is generated, and it returns to production to approve when the cloth is in. Bespoke is never in inventory: nothing is booked in or deducted for it. A tool for this in Swati's hands comes in a later phase.</w:t>
+              <w:t>Approval from the shelf deducts from physical stock at once, alteration cloth included. Bespoke, an alteration ask, or a shortfall goes to Shravani in one click; an alteration the shelf covers is issued and deducted on her approval; otherwise she approves, the PO is generated, and it returns to production when the cloth is in. Bespoke is never inventory: nothing booked in or deducted. A fuller tool for Swati comes later.</w:t>
             </w:r>
           </w:p>
         </w:tc>
@@ -12697,7 +12766,7 @@
                 <w:color w:val="1A1A1A"/>
                 <w:sz w:val="17"/>
               </w:rPr>
-              <w:t>Whether a fabric is washed is set on the requirement when design raises it; its shrinkage % is entered at receiving, once a cut has been washed. Only washed fabric shrinks: stock books the usable metres after washing (received × (1 − shrinkage)); the GRN keeps the metres received.</w:t>
+              <w:t>Washed is set on the requirement; shrinkage % is entered at receiving once a cut is washed. Only washed fabric shrinks: stock books received × (1 − shrinkage); the GRN keeps metres received.</w:t>
             </w:r>
           </w:p>
         </w:tc>
@@ -12749,7 +12818,7 @@
                 <w:color w:val="1A1A1A"/>
                 <w:sz w:val="17"/>
               </w:rPr>
-              <w:t>An order not yet confirmed at the store (measurement not done, on hold, payment pending) is never planned to a factory; Allocate shows it only under the Pre-confirmed filter until someone confirms it.</w:t>
+              <w:t>Never planned to a factory; shown only under the Pre-confirmed filter until confirmed.</w:t>
             </w:r>
           </w:p>
         </w:tc>
@@ -12801,7 +12870,7 @@
                 <w:color w:val="1A1A1A"/>
                 <w:sz w:val="17"/>
               </w:rPr>
-              <w:t>After planning, every order passes CAD, cutting, fusing and compiling in that order; each step records who took it up, who finished it and when. Scan-out to the factory is refused until compiling is done.</w:t>
+              <w:t>Every planned order passes CAD, cutting, fusing and compiling in order, each step recording who took it up, who finished and when. A block needs a reason. CAD needs its file. Scan-out is refused until compiled.</w:t>
             </w:r>
           </w:p>
         </w:tc>
@@ -12853,7 +12922,7 @@
                 <w:color w:val="1A1A1A"/>
                 <w:sz w:val="17"/>
               </w:rPr>
-              <w:t>Contrast fabric is inventory fabric used in small amounts on a piece. Compiling approval deducts it from physical stock; reserved stock is the main fabric held at punch, and saleable = physical − reserved − floor.</w:t>
+              <w:t>Inventory fabric in small amounts; compiling approval deducts it from physical stock. Reserved is the main fabric held at punch; saleable = physical − reserved − floor.</w:t>
             </w:r>
           </w:p>
         </w:tc>
@@ -12905,7 +12974,7 @@
                 <w:color w:val="1A1A1A"/>
                 <w:sz w:val="17"/>
               </w:rPr>
-              <w:t>A piece joins the queue after the freeze window. A plan over headroom is refused unless forced, and forcing is recorded with the name. Urgent sets ship-by to punch + 2 days. Scan-out deducts metres from stock and reserved. A bespoke piece is never planned before its parcel is in. A ship-by move needs a reason.</w:t>
+              <w:t>A piece joins the queue after the freeze. Over headroom is refused unless forced, and forcing is recorded with the name. Urgent sets ship-by to punch + 2 days. Scan-out deducts from stock and reserved. Bespoke is never planned before its parcel. A ship-by move needs a reason.</w:t>
             </w:r>
           </w:p>
         </w:tc>
@@ -12957,7 +13026,7 @@
                 <w:color w:val="1A1A1A"/>
                 <w:sz w:val="17"/>
               </w:rPr>
-              <w:t>Before production starts (order or PP) the store and production can correct the sheet; each correction is the next version (V2, V3). Once the piece is on a plan, measurements and styling are locked and there are no free-form change remarks; only a logistics remark can change.</w:t>
+              <w:t>Before production (order or PP) store and production can correct the sheet, each correction the next version (V2, V3). On a plan, measurements and styling lock and free-form remarks stop; only a logistics remark can change.</w:t>
             </w:r>
           </w:p>
         </w:tc>
@@ -13009,7 +13078,7 @@
                 <w:color w:val="1A1A1A"/>
                 <w:sz w:val="17"/>
               </w:rPr>
-              <w:t>Only live fabrics can be punched; a sold-out bespoke fabric cannot. Credit never above the balance; credits expire after a year. A case is raised only on a piece delivered from this store; within 30 days free alteration and credit note, after that chargeable. A full refund needs approval before finance moves it.</w:t>
+              <w:t>Only live fabrics can be punched; no sold-out bespoke. Credit never above the balance; credits expire after a year. Cases only on pieces delivered from this store; within 30 days free alteration and credit note, after that chargeable. A full refund needs approval before finance moves it.</w:t>
             </w:r>
           </w:p>
         </w:tc>
@@ -13113,7 +13182,7 @@
                 <w:color w:val="1A1A1A"/>
                 <w:sz w:val="17"/>
               </w:rPr>
-              <w:t>A button appears only for the owning role. Store and factory roles are scoped to one store or factory. Owner sees and may do everything.</w:t>
+              <w:t>Buttons only for the owning role. Store and factory roles are scoped to one store or factory. Owner sees and may do everything.</w:t>
             </w:r>
           </w:p>
         </w:tc>
@@ -13165,7 +13234,7 @@
                 <w:color w:val="1A1A1A"/>
                 <w:sz w:val="17"/>
               </w:rPr>
-              <w:t>One thread per record, never deleted, readable by everyone who can open the record. A mention goes to a person or a team and stays on the bell until that person resolves it; resolving is kept on the comment. Files carry a label from the record kind's list; 25 MB per file. Nothing is emailed.</w:t>
+              <w:t>One thread per record, never deleted, readable by everyone who can open it. A mention stays on the bell until resolved; resolving is kept. Files carry a label per record kind; 25 MB each. Nothing is emailed.</w:t>
             </w:r>
           </w:p>
         </w:tc>
@@ -13307,7 +13376,7 @@
                 <w:color w:val="1A1A1A"/>
                 <w:sz w:val="17"/>
               </w:rPr>
-              <w:t>A separate application beside Enigma. Reads over Enigma's API; its own database for every record it keeps; write-back behind per-module flags in the last phase. No build inside Enigma's codebase. One codebase builds both editions; the MTM edition is a build flag that hides the RTW screens and the warehouse portal.</w:t>
+              <w:t>A separate application beside Enigma: reads over its API, its own database for its records, write-back behind per-module flags in the last phase, nothing built in Enigma's codebase. One codebase builds both editions; MTM is a build flag hiding RTW screens and the warehouse portal.</w:t>
             </w:r>
           </w:p>
         </w:tc>
@@ -13359,7 +13428,7 @@
                 <w:color w:val="1A1A1A"/>
                 <w:sz w:val="17"/>
               </w:rPr>
-              <w:t>Fabric master (one 3.2 MB call, no change filter), with the fabric image: nightly plus on demand. Inventory per warehouse, with each bin's code, location on the rack and photo. Transaction and reservation logs per code until a date range is confirmed. Fabric POs with their receiving lines. Orders and order sheets. Vendors. Designs and variants.</w:t>
+              <w:t>Fabric master (one 3.2 MB call, no change filter) with the fabric image: nightly and on demand. Inventory per warehouse with each bin's code, rack location and photo. Transaction and reservation logs per code until a date range is confirmed. Fabric POs with receiving lines. Orders and order sheets. Vendors. Designs and variants.</w:t>
             </w:r>
           </w:p>
         </w:tc>
@@ -13411,7 +13480,7 @@
                 <w:color w:val="1A1A1A"/>
                 <w:sz w:val="17"/>
               </w:rPr>
-              <w:t>Fabric info, attribute and inventory edits; On-hold on pause, resume or supplier switch-off; fabric PO at Push PO and Raise PO; Update Receiving Status; Add and Edit Vendor; design push with variants; order-sheet corrections. Until then each is keyed in Enigma and the number recorded in BSC PLM.</w:t>
+              <w:t>Fabric info, attribute and inventory edits; On Hold on pause, resume or switch-off; the fabric PO at Push PO and Raise PO; Update Receiving Status; Add and Edit Vendor; design push with variants; order-sheet corrections. Until then each is keyed in Enigma and the number recorded here.</w:t>
             </w:r>
           </w:p>
         </w:tc>
@@ -13463,7 +13532,7 @@
                 <w:color w:val="1A1A1A"/>
                 <w:sz w:val="17"/>
               </w:rPr>
-              <w:t>Shopify sales by product code daily and the customer profile. Mill lists pasted. Sheets imported once at go-live, idempotent, every skipped row logged.</w:t>
+              <w:t>Shopify sales by product code daily, and the customer profile. The order sheet XML from the connected order software. Mill lists pasted. Sheets imported once at go-live, idempotent, every skipped row logged.</w:t>
             </w:r>
           </w:p>
         </w:tc>
@@ -13567,7 +13636,7 @@
                 <w:color w:val="1A1A1A"/>
                 <w:sz w:val="17"/>
               </w:rPr>
-              <w:t>Server-side records with optimistic versioning; a stale write is refused with the current state shown; Enigma's reservation is the arbiter when two stores punch the last metres.</w:t>
+              <w:t>Server-side records with optimistic versioning; a stale write is refused and the current state shown; Enigma's reservation decides when two stores punch the last metres.</w:t>
             </w:r>
           </w:p>
         </w:tc>
@@ -13619,7 +13688,7 @@
                 <w:color w:val="1A1A1A"/>
                 <w:sz w:val="17"/>
               </w:rPr>
-              <w:t>Every write appends who, when and what. Order sheets keep versions. Nothing is hard-deleted. A record's history is exportable.</w:t>
+              <w:t>Every write appends who, when and what. Order sheets keep versions. Nothing hard-deleted. History exportable.</w:t>
             </w:r>
           </w:p>
         </w:tc>
@@ -13671,7 +13740,7 @@
                 <w:color w:val="1A1A1A"/>
                 <w:sz w:val="17"/>
               </w:rPr>
-              <w:t>Lists filtered server-side for the fabric master (about 8,600 rows) and orders (about 40 a day). The bell recomputed under a second on every write.</w:t>
+              <w:t>Server-side filtering for the fabric master (about 8,600 rows) and orders (about 40 a day). The bell recomputed under a second on every write.</w:t>
             </w:r>
           </w:p>
         </w:tc>
@@ -13723,7 +13792,7 @@
                 <w:color w:val="1A1A1A"/>
                 <w:sz w:val="17"/>
               </w:rPr>
-              <w:t>Stores work 10:00 to 22:00 IST seven days; maintenance outside those hours.</w:t>
+              <w:t>Stores work 10:00 to 22:00 IST, seven days; maintenance outside those hours.</w:t>
             </w:r>
           </w:p>
         </w:tc>
@@ -13775,7 +13844,7 @@
                 <w:color w:val="1A1A1A"/>
                 <w:sz w:val="17"/>
               </w:rPr>
-              <w:t>Desktop first. A narrow layout with large buttons for the store's returns bench and the swatch desk.</w:t>
+              <w:t>Desktop first; a narrow layout with large buttons for the returns bench and the swatch desk.</w:t>
             </w:r>
           </w:p>
         </w:tc>
@@ -13879,7 +13948,7 @@
                 <w:color w:val="1A1A1A"/>
                 <w:sz w:val="17"/>
               </w:rPr>
-              <w:t>Development, staging reading Enigma read-only against production data, production. Enigma has no sandbox, so writes are flagged per module per environment.</w:t>
+              <w:t>Development; staging reading Enigma read-only against production data; production. Enigma has no sandbox, so writes are flagged per module per environment.</w:t>
             </w:r>
           </w:p>
         </w:tc>
@@ -13931,7 +14000,7 @@
                 <w:color w:val="1A1A1A"/>
                 <w:sz w:val="17"/>
               </w:rPr>
-              <w:t>Daily, retained 90 days. English; dates as 12 Sep 26; rupees with Indian grouping; inches for measurements; metres for cloth.</w:t>
+              <w:t>Daily, kept 90 days. English; dates as 12 Sep 26; rupees with Indian grouping; inches for measurements, metres for cloth.</w:t>
             </w:r>
           </w:p>
         </w:tc>
@@ -13983,7 +14052,7 @@
                 <w:color w:val="1A1A1A"/>
                 <w:sz w:val="17"/>
               </w:rPr>
-              <w:t>For every phase the sheet it replaces stays available read-only for one month; a weekly comparison with the owning team before it is switched off.</w:t>
+              <w:t>Each phase keeps the sheet it replaces read-only for one month, with a weekly comparison with the owning team before switch-off.</w:t>
             </w:r>
           </w:p>
         </w:tc>

</xml_diff>

<commit_message>
PRD: CAD, cutting, fusing and compiling teams as roles; Parag in production
Co-Authored-By: Claude Opus 5.5 <noreply@anthropic.com>
</commit_message>
<xml_diff>
--- a/public/docs/bsc-plm-prd-mtm-v1.0.docx
+++ b/public/docs/bsc-plm-prd-mtm-v1.0.docx
@@ -193,7 +193,7 @@
           <w:color w:val="1A1A1A"/>
           <w:sz w:val="20"/>
         </w:rPr>
-        <w:t>Six roles, five with screens in BSC PLM (store managers and owners stay in RetailOS). One login per team; colleagues appear by name on what they wrote. Each role lands on the first screen it works in; the sidebar lists teams as pills.</w:t>
+        <w:t>Ten roles, nine with screens in BSC PLM (store managers and owners stay in RetailOS). One login per team; colleagues appear by name on what they wrote. Each role lands on the first screen it works in; the sidebar lists teams as pills.</w:t>
       </w:r>
     </w:p>
     <w:tbl>
@@ -636,7 +636,7 @@
                 <w:color w:val="1A1A1A"/>
                 <w:sz w:val="17"/>
               </w:rPr>
-              <w:t>Vishnu, Swati</w:t>
+              <w:t>Vishnu, Swati, Parag</w:t>
             </w:r>
           </w:p>
         </w:tc>
@@ -712,6 +712,514 @@
                 <w:sz w:val="17"/>
               </w:rPr>
               <w:t>Store orders</w:t>
+            </w:r>
+          </w:p>
+        </w:tc>
+      </w:tr>
+      <w:tr>
+        <w:tc>
+          <w:tcPr>
+            <w:tcW w:type="dxa" w:w="1949"/>
+            <w:tcBorders>
+              <w:bottom w:val="single" w:sz="4" w:color="E5E5E5"/>
+              <w:top w:val="nil"/>
+              <w:left w:val="nil"/>
+              <w:right w:val="nil"/>
+            </w:tcBorders>
+          </w:tcPr>
+          <w:p>
+            <w:pPr>
+              <w:spacing w:before="0" w:after="40"/>
+            </w:pPr>
+            <w:r/>
+            <w:r>
+              <w:rPr>
+                <w:rFonts w:ascii="JetBrains Mono" w:hAnsi="JetBrains Mono" w:cs="JetBrains Mono" w:eastAsia="JetBrains Mono"/>
+                <w:color w:val="5C6066"/>
+                <w:sz w:val="15"/>
+              </w:rPr>
+              <w:t>CAD team</w:t>
+            </w:r>
+          </w:p>
+        </w:tc>
+        <w:tc>
+          <w:tcPr>
+            <w:tcW w:type="dxa" w:w="1949"/>
+            <w:tcBorders>
+              <w:bottom w:val="single" w:sz="4" w:color="E5E5E5"/>
+              <w:top w:val="nil"/>
+              <w:left w:val="nil"/>
+              <w:right w:val="nil"/>
+            </w:tcBorders>
+          </w:tcPr>
+          <w:p>
+            <w:pPr>
+              <w:spacing w:before="0" w:after="40"/>
+            </w:pPr>
+            <w:r/>
+            <w:r>
+              <w:rPr>
+                <w:rFonts w:ascii="Inter Tight" w:hAnsi="Inter Tight" w:cs="Inter Tight" w:eastAsia="Inter Tight"/>
+                <w:color w:val="1A1A1A"/>
+                <w:sz w:val="17"/>
+              </w:rPr>
+              <w:t>CAD team at the production unit</w:t>
+            </w:r>
+          </w:p>
+        </w:tc>
+        <w:tc>
+          <w:tcPr>
+            <w:tcW w:type="dxa" w:w="1949"/>
+            <w:tcBorders>
+              <w:bottom w:val="single" w:sz="4" w:color="E5E5E5"/>
+              <w:top w:val="nil"/>
+              <w:left w:val="nil"/>
+              <w:right w:val="nil"/>
+            </w:tcBorders>
+          </w:tcPr>
+          <w:p>
+            <w:pPr>
+              <w:spacing w:before="0" w:after="40"/>
+            </w:pPr>
+            <w:r/>
+            <w:r>
+              <w:rPr>
+                <w:rFonts w:ascii="Inter Tight" w:hAnsi="Inter Tight" w:cs="Inter Tight" w:eastAsia="Inter Tight"/>
+                <w:color w:val="1A1A1A"/>
+                <w:sz w:val="17"/>
+              </w:rPr>
+              <w:t>The CAD desk: take orders up, view the order sheet XML, upload the CAD file, mark done or blocked with a reason</w:t>
+            </w:r>
+          </w:p>
+        </w:tc>
+        <w:tc>
+          <w:tcPr>
+            <w:tcW w:type="dxa" w:w="1949"/>
+            <w:tcBorders>
+              <w:bottom w:val="single" w:sz="4" w:color="E5E5E5"/>
+              <w:top w:val="nil"/>
+              <w:left w:val="nil"/>
+              <w:right w:val="nil"/>
+            </w:tcBorders>
+          </w:tcPr>
+          <w:p>
+            <w:pPr>
+              <w:spacing w:before="0" w:after="40"/>
+            </w:pPr>
+            <w:r/>
+            <w:r>
+              <w:rPr>
+                <w:rFonts w:ascii="Inter Tight" w:hAnsi="Inter Tight" w:cs="Inter Tight" w:eastAsia="Inter Tight"/>
+                <w:color w:val="1A1A1A"/>
+                <w:sz w:val="17"/>
+              </w:rPr>
+              <w:t>CAD desk</w:t>
+            </w:r>
+          </w:p>
+        </w:tc>
+        <w:tc>
+          <w:tcPr>
+            <w:tcW w:type="dxa" w:w="1949"/>
+            <w:tcBorders>
+              <w:bottom w:val="single" w:sz="4" w:color="E5E5E5"/>
+              <w:top w:val="nil"/>
+              <w:left w:val="nil"/>
+              <w:right w:val="nil"/>
+            </w:tcBorders>
+          </w:tcPr>
+          <w:p>
+            <w:pPr>
+              <w:spacing w:before="0" w:after="40"/>
+            </w:pPr>
+            <w:r/>
+            <w:r>
+              <w:rPr>
+                <w:rFonts w:ascii="Inter Tight" w:hAnsi="Inter Tight" w:cs="Inter Tight" w:eastAsia="Inter Tight"/>
+                <w:color w:val="1A1A1A"/>
+                <w:sz w:val="17"/>
+              </w:rPr>
+              <w:t>The order sheet, fabric and bin</w:t>
+            </w:r>
+          </w:p>
+        </w:tc>
+      </w:tr>
+      <w:tr>
+        <w:tc>
+          <w:tcPr>
+            <w:tcW w:type="dxa" w:w="1949"/>
+            <w:tcBorders>
+              <w:bottom w:val="single" w:sz="4" w:color="E5E5E5"/>
+              <w:top w:val="nil"/>
+              <w:left w:val="nil"/>
+              <w:right w:val="nil"/>
+            </w:tcBorders>
+          </w:tcPr>
+          <w:p>
+            <w:pPr>
+              <w:spacing w:before="0" w:after="40"/>
+            </w:pPr>
+            <w:r/>
+            <w:r>
+              <w:rPr>
+                <w:rFonts w:ascii="JetBrains Mono" w:hAnsi="JetBrains Mono" w:cs="JetBrains Mono" w:eastAsia="JetBrains Mono"/>
+                <w:color w:val="5C6066"/>
+                <w:sz w:val="15"/>
+              </w:rPr>
+              <w:t>Cutting team</w:t>
+            </w:r>
+          </w:p>
+        </w:tc>
+        <w:tc>
+          <w:tcPr>
+            <w:tcW w:type="dxa" w:w="1949"/>
+            <w:tcBorders>
+              <w:bottom w:val="single" w:sz="4" w:color="E5E5E5"/>
+              <w:top w:val="nil"/>
+              <w:left w:val="nil"/>
+              <w:right w:val="nil"/>
+            </w:tcBorders>
+          </w:tcPr>
+          <w:p>
+            <w:pPr>
+              <w:spacing w:before="0" w:after="40"/>
+            </w:pPr>
+            <w:r/>
+            <w:r>
+              <w:rPr>
+                <w:rFonts w:ascii="Inter Tight" w:hAnsi="Inter Tight" w:cs="Inter Tight" w:eastAsia="Inter Tight"/>
+                <w:color w:val="1A1A1A"/>
+                <w:sz w:val="17"/>
+              </w:rPr>
+              <w:t>Cutting team at the production unit</w:t>
+            </w:r>
+          </w:p>
+        </w:tc>
+        <w:tc>
+          <w:tcPr>
+            <w:tcW w:type="dxa" w:w="1949"/>
+            <w:tcBorders>
+              <w:bottom w:val="single" w:sz="4" w:color="E5E5E5"/>
+              <w:top w:val="nil"/>
+              <w:left w:val="nil"/>
+              <w:right w:val="nil"/>
+            </w:tcBorders>
+          </w:tcPr>
+          <w:p>
+            <w:pPr>
+              <w:spacing w:before="0" w:after="40"/>
+            </w:pPr>
+            <w:r/>
+            <w:r>
+              <w:rPr>
+                <w:rFonts w:ascii="Inter Tight" w:hAnsi="Inter Tight" w:cs="Inter Tight" w:eastAsia="Inter Tight"/>
+                <w:color w:val="1A1A1A"/>
+                <w:sz w:val="17"/>
+              </w:rPr>
+              <w:t>The cutting desk: take orders up, cut to the CAD using the fabric image and bin, attach the print, mark done or blocked</w:t>
+            </w:r>
+          </w:p>
+        </w:tc>
+        <w:tc>
+          <w:tcPr>
+            <w:tcW w:type="dxa" w:w="1949"/>
+            <w:tcBorders>
+              <w:bottom w:val="single" w:sz="4" w:color="E5E5E5"/>
+              <w:top w:val="nil"/>
+              <w:left w:val="nil"/>
+              <w:right w:val="nil"/>
+            </w:tcBorders>
+          </w:tcPr>
+          <w:p>
+            <w:pPr>
+              <w:spacing w:before="0" w:after="40"/>
+            </w:pPr>
+            <w:r/>
+            <w:r>
+              <w:rPr>
+                <w:rFonts w:ascii="Inter Tight" w:hAnsi="Inter Tight" w:cs="Inter Tight" w:eastAsia="Inter Tight"/>
+                <w:color w:val="1A1A1A"/>
+                <w:sz w:val="17"/>
+              </w:rPr>
+              <w:t>Cutting desk</w:t>
+            </w:r>
+          </w:p>
+        </w:tc>
+        <w:tc>
+          <w:tcPr>
+            <w:tcW w:type="dxa" w:w="1949"/>
+            <w:tcBorders>
+              <w:bottom w:val="single" w:sz="4" w:color="E5E5E5"/>
+              <w:top w:val="nil"/>
+              <w:left w:val="nil"/>
+              <w:right w:val="nil"/>
+            </w:tcBorders>
+          </w:tcPr>
+          <w:p>
+            <w:pPr>
+              <w:spacing w:before="0" w:after="40"/>
+            </w:pPr>
+            <w:r/>
+            <w:r>
+              <w:rPr>
+                <w:rFonts w:ascii="Inter Tight" w:hAnsi="Inter Tight" w:cs="Inter Tight" w:eastAsia="Inter Tight"/>
+                <w:color w:val="1A1A1A"/>
+                <w:sz w:val="17"/>
+              </w:rPr>
+              <w:t>The order sheet, CAD file</w:t>
+            </w:r>
+          </w:p>
+        </w:tc>
+      </w:tr>
+      <w:tr>
+        <w:tc>
+          <w:tcPr>
+            <w:tcW w:type="dxa" w:w="1949"/>
+            <w:tcBorders>
+              <w:bottom w:val="single" w:sz="4" w:color="E5E5E5"/>
+              <w:top w:val="nil"/>
+              <w:left w:val="nil"/>
+              <w:right w:val="nil"/>
+            </w:tcBorders>
+          </w:tcPr>
+          <w:p>
+            <w:pPr>
+              <w:spacing w:before="0" w:after="40"/>
+            </w:pPr>
+            <w:r/>
+            <w:r>
+              <w:rPr>
+                <w:rFonts w:ascii="JetBrains Mono" w:hAnsi="JetBrains Mono" w:cs="JetBrains Mono" w:eastAsia="JetBrains Mono"/>
+                <w:color w:val="5C6066"/>
+                <w:sz w:val="15"/>
+              </w:rPr>
+              <w:t>Fusing team</w:t>
+            </w:r>
+          </w:p>
+        </w:tc>
+        <w:tc>
+          <w:tcPr>
+            <w:tcW w:type="dxa" w:w="1949"/>
+            <w:tcBorders>
+              <w:bottom w:val="single" w:sz="4" w:color="E5E5E5"/>
+              <w:top w:val="nil"/>
+              <w:left w:val="nil"/>
+              <w:right w:val="nil"/>
+            </w:tcBorders>
+          </w:tcPr>
+          <w:p>
+            <w:pPr>
+              <w:spacing w:before="0" w:after="40"/>
+            </w:pPr>
+            <w:r/>
+            <w:r>
+              <w:rPr>
+                <w:rFonts w:ascii="Inter Tight" w:hAnsi="Inter Tight" w:cs="Inter Tight" w:eastAsia="Inter Tight"/>
+                <w:color w:val="1A1A1A"/>
+                <w:sz w:val="17"/>
+              </w:rPr>
+              <w:t>Fusing team at the production unit</w:t>
+            </w:r>
+          </w:p>
+        </w:tc>
+        <w:tc>
+          <w:tcPr>
+            <w:tcW w:type="dxa" w:w="1949"/>
+            <w:tcBorders>
+              <w:bottom w:val="single" w:sz="4" w:color="E5E5E5"/>
+              <w:top w:val="nil"/>
+              <w:left w:val="nil"/>
+              <w:right w:val="nil"/>
+            </w:tcBorders>
+          </w:tcPr>
+          <w:p>
+            <w:pPr>
+              <w:spacing w:before="0" w:after="40"/>
+            </w:pPr>
+            <w:r/>
+            <w:r>
+              <w:rPr>
+                <w:rFonts w:ascii="Inter Tight" w:hAnsi="Inter Tight" w:cs="Inter Tight" w:eastAsia="Inter Tight"/>
+                <w:color w:val="1A1A1A"/>
+                <w:sz w:val="17"/>
+              </w:rPr>
+              <w:t>The fusing desk: take orders up, fuse collar, cuff and placket interlining, mark done or blocked</w:t>
+            </w:r>
+          </w:p>
+        </w:tc>
+        <w:tc>
+          <w:tcPr>
+            <w:tcW w:type="dxa" w:w="1949"/>
+            <w:tcBorders>
+              <w:bottom w:val="single" w:sz="4" w:color="E5E5E5"/>
+              <w:top w:val="nil"/>
+              <w:left w:val="nil"/>
+              <w:right w:val="nil"/>
+            </w:tcBorders>
+          </w:tcPr>
+          <w:p>
+            <w:pPr>
+              <w:spacing w:before="0" w:after="40"/>
+            </w:pPr>
+            <w:r/>
+            <w:r>
+              <w:rPr>
+                <w:rFonts w:ascii="Inter Tight" w:hAnsi="Inter Tight" w:cs="Inter Tight" w:eastAsia="Inter Tight"/>
+                <w:color w:val="1A1A1A"/>
+                <w:sz w:val="17"/>
+              </w:rPr>
+              <w:t>Fusing desk</w:t>
+            </w:r>
+          </w:p>
+        </w:tc>
+        <w:tc>
+          <w:tcPr>
+            <w:tcW w:type="dxa" w:w="1949"/>
+            <w:tcBorders>
+              <w:bottom w:val="single" w:sz="4" w:color="E5E5E5"/>
+              <w:top w:val="nil"/>
+              <w:left w:val="nil"/>
+              <w:right w:val="nil"/>
+            </w:tcBorders>
+          </w:tcPr>
+          <w:p>
+            <w:pPr>
+              <w:spacing w:before="0" w:after="40"/>
+            </w:pPr>
+            <w:r/>
+            <w:r>
+              <w:rPr>
+                <w:rFonts w:ascii="Inter Tight" w:hAnsi="Inter Tight" w:cs="Inter Tight" w:eastAsia="Inter Tight"/>
+                <w:color w:val="1A1A1A"/>
+                <w:sz w:val="17"/>
+              </w:rPr>
+              <w:t>The order sheet, CAD file</w:t>
+            </w:r>
+          </w:p>
+        </w:tc>
+      </w:tr>
+      <w:tr>
+        <w:tc>
+          <w:tcPr>
+            <w:tcW w:type="dxa" w:w="1949"/>
+            <w:tcBorders>
+              <w:bottom w:val="single" w:sz="4" w:color="E5E5E5"/>
+              <w:top w:val="nil"/>
+              <w:left w:val="nil"/>
+              <w:right w:val="nil"/>
+            </w:tcBorders>
+          </w:tcPr>
+          <w:p>
+            <w:pPr>
+              <w:spacing w:before="0" w:after="40"/>
+            </w:pPr>
+            <w:r/>
+            <w:r>
+              <w:rPr>
+                <w:rFonts w:ascii="JetBrains Mono" w:hAnsi="JetBrains Mono" w:cs="JetBrains Mono" w:eastAsia="JetBrains Mono"/>
+                <w:color w:val="5C6066"/>
+                <w:sz w:val="15"/>
+              </w:rPr>
+              <w:t>Compiling team</w:t>
+            </w:r>
+          </w:p>
+        </w:tc>
+        <w:tc>
+          <w:tcPr>
+            <w:tcW w:type="dxa" w:w="1949"/>
+            <w:tcBorders>
+              <w:bottom w:val="single" w:sz="4" w:color="E5E5E5"/>
+              <w:top w:val="nil"/>
+              <w:left w:val="nil"/>
+              <w:right w:val="nil"/>
+            </w:tcBorders>
+          </w:tcPr>
+          <w:p>
+            <w:pPr>
+              <w:spacing w:before="0" w:after="40"/>
+            </w:pPr>
+            <w:r/>
+            <w:r>
+              <w:rPr>
+                <w:rFonts w:ascii="Inter Tight" w:hAnsi="Inter Tight" w:cs="Inter Tight" w:eastAsia="Inter Tight"/>
+                <w:color w:val="1A1A1A"/>
+                <w:sz w:val="17"/>
+              </w:rPr>
+              <w:t>Compiling team at the production unit</w:t>
+            </w:r>
+          </w:p>
+        </w:tc>
+        <w:tc>
+          <w:tcPr>
+            <w:tcW w:type="dxa" w:w="1949"/>
+            <w:tcBorders>
+              <w:bottom w:val="single" w:sz="4" w:color="E5E5E5"/>
+              <w:top w:val="nil"/>
+              <w:left w:val="nil"/>
+              <w:right w:val="nil"/>
+            </w:tcBorders>
+          </w:tcPr>
+          <w:p>
+            <w:pPr>
+              <w:spacing w:before="0" w:after="40"/>
+            </w:pPr>
+            <w:r/>
+            <w:r>
+              <w:rPr>
+                <w:rFonts w:ascii="Inter Tight" w:hAnsi="Inter Tight" w:cs="Inter Tight" w:eastAsia="Inter Tight"/>
+                <w:color w:val="1A1A1A"/>
+                <w:sz w:val="17"/>
+              </w:rPr>
+              <w:t>The compiling desk: check the bundle, add contrast fabric, Approve &amp; mark compiled (deducts the contrast), mark blocked</w:t>
+            </w:r>
+          </w:p>
+        </w:tc>
+        <w:tc>
+          <w:tcPr>
+            <w:tcW w:type="dxa" w:w="1949"/>
+            <w:tcBorders>
+              <w:bottom w:val="single" w:sz="4" w:color="E5E5E5"/>
+              <w:top w:val="nil"/>
+              <w:left w:val="nil"/>
+              <w:right w:val="nil"/>
+            </w:tcBorders>
+          </w:tcPr>
+          <w:p>
+            <w:pPr>
+              <w:spacing w:before="0" w:after="40"/>
+            </w:pPr>
+            <w:r/>
+            <w:r>
+              <w:rPr>
+                <w:rFonts w:ascii="Inter Tight" w:hAnsi="Inter Tight" w:cs="Inter Tight" w:eastAsia="Inter Tight"/>
+                <w:color w:val="1A1A1A"/>
+                <w:sz w:val="17"/>
+              </w:rPr>
+              <w:t>Compiling desk</w:t>
+            </w:r>
+          </w:p>
+        </w:tc>
+        <w:tc>
+          <w:tcPr>
+            <w:tcW w:type="dxa" w:w="1949"/>
+            <w:tcBorders>
+              <w:bottom w:val="single" w:sz="4" w:color="E5E5E5"/>
+              <w:top w:val="nil"/>
+              <w:left w:val="nil"/>
+              <w:right w:val="nil"/>
+            </w:tcBorders>
+          </w:tcPr>
+          <w:p>
+            <w:pPr>
+              <w:spacing w:before="0" w:after="40"/>
+            </w:pPr>
+            <w:r/>
+            <w:r>
+              <w:rPr>
+                <w:rFonts w:ascii="Inter Tight" w:hAnsi="Inter Tight" w:cs="Inter Tight" w:eastAsia="Inter Tight"/>
+                <w:color w:val="1A1A1A"/>
+                <w:sz w:val="17"/>
+              </w:rPr>
+              <w:t>The order sheet, CAD file</w:t>
             </w:r>
           </w:p>
         </w:tc>
@@ -1115,7 +1623,7 @@
           <w:color w:val="1A1A1A"/>
           <w:sz w:val="20"/>
         </w:rPr>
-        <w:t>No portal for Shravani and Yusuf in this edition; their work appears where it happens. Shravani books rolls on the PO's receiving line and approves the mill PO for bespoke and alteration extra fabric; Yusuf is the swatch desk handover. The CAD, cutting, fusing and compiling teams each work from their own desk. The warehouse returns as a role with its portal.</w:t>
+        <w:t>No portal for Shravani and Yusuf in this edition; their work appears where it happens. Shravani books rolls on the PO's receiving line and approves the mill PO for bespoke and alteration extra fabric; Yusuf is the swatch desk handover. The warehouse returns as a role with its portal.</w:t>
       </w:r>
     </w:p>
     <w:p>

</xml_diff>

<commit_message>
Extra fabric: alteration asks approved from stock; Shravani only for bespoke or a shortfall; PRD updated
Co-Authored-By: Claude Opus 5.5 <noreply@anthropic.com>
</commit_message>
<xml_diff>
--- a/public/docs/bsc-plm-prd-mtm-v1.0.docx
+++ b/public/docs/bsc-plm-prd-mtm-v1.0.docx
@@ -1623,7 +1623,7 @@
           <w:color w:val="1A1A1A"/>
           <w:sz w:val="20"/>
         </w:rPr>
-        <w:t>No portal for Shravani and Yusuf in this edition; their work appears where it happens. Shravani books rolls on the PO's receiving line and approves the mill PO for bespoke and alteration extra fabric; Yusuf is the swatch desk handover. The warehouse returns as a role with its portal.</w:t>
+        <w:t>No portal for Shravani and Yusuf in this edition; their work appears where it happens. Shravani books rolls on the PO's receiving line and approves the mill PO for bespoke extra fabric and shortfalls; Yusuf is the swatch desk handover. The warehouse returns as a role with its portal.</w:t>
       </w:r>
     </w:p>
     <w:p>
@@ -6839,7 +6839,7 @@
                 <w:color w:val="1A1A1A"/>
                 <w:sz w:val="17"/>
               </w:rPr>
-              <w:t>3. Bespoke, alteration, or a shortfall the shelf cannot cover goes to Shravani in one click. An alteration the shelf covers is issued and deducted from physical stock on her approval; otherwise she approves, the PO is generated, and when the cloth is in the ask returns to Swati to approve.</w:t>
+              <w:t>3. Alteration and hemming asks are approved by Swati from the shelf like any other and deducted from physical stock. Only bespoke cloth, or a shortfall the shelf cannot cover, goes to Shravani in one click: she approves, the PO is generated, and when the cloth is in the ask returns to Swati to approve.</w:t>
             </w:r>
           </w:p>
           <w:p>
@@ -13222,7 +13222,7 @@
                 <w:color w:val="1A1A1A"/>
                 <w:sz w:val="17"/>
               </w:rPr>
-              <w:t>Approval from the shelf deducts from physical stock at once, alteration cloth included. Bespoke, an alteration ask, or a shortfall goes to Shravani in one click; an alteration the shelf covers is issued and deducted on her approval; otherwise she approves, the PO is generated, and it returns to production when the cloth is in. Bespoke is never inventory: nothing booked in or deducted. A fuller tool for Swati comes later.</w:t>
+              <w:t>Approval from the shelf deducts from physical stock at once, alteration and hemming cloth included. Only bespoke, or a shortfall, goes to Shravani in one click; she approves, the PO is generated, and it returns to production when the cloth is in. Bespoke is never inventory: nothing booked in or deducted. A fuller tool for Swati comes later.</w:t>
             </w:r>
           </w:p>
         </w:tc>

</xml_diff>

<commit_message>
Alteration asks split Normal (approve here) / Bespoke (to Shravani); PRD updated
Co-Authored-By: Claude Opus 5.5 <noreply@anthropic.com>
</commit_message>
<xml_diff>
--- a/public/docs/bsc-plm-prd-mtm-v1.0.docx
+++ b/public/docs/bsc-plm-prd-mtm-v1.0.docx
@@ -6826,20 +6826,20 @@
                 <w:color w:val="1A1A1A"/>
                 <w:sz w:val="17"/>
               </w:rPr>
-              <w:t>2. Swati sees each ask with the shelf before and after, filtered: Normal orders, Bespoke orders, Alteration / hemming. Cloth on the shelf: Approve or Decline with a note; approval deducts the metres.</w:t>
-            </w:r>
-          </w:p>
-          <w:p>
-            <w:pPr>
-              <w:spacing w:before="0" w:after="40"/>
-            </w:pPr>
-            <w:r>
-              <w:rPr>
-                <w:rFonts w:ascii="Inter Tight" w:hAnsi="Inter Tight" w:cs="Inter Tight" w:eastAsia="Inter Tight"/>
-                <w:color w:val="1A1A1A"/>
-                <w:sz w:val="17"/>
-              </w:rPr>
-              <w:t>3. Alteration and hemming asks are approved by Swati from the shelf like any other and deducted from physical stock. Only bespoke cloth (an alteration on a bespoke shirt included), or a shortfall the shelf cannot cover, goes to Shravani in one click: she approves, the PO is generated, and when the cloth is in the ask returns to Swati to approve.</w:t>
+              <w:t>2. Swati sees each ask with the shelf before and after, filtered: Normal orders, Bespoke orders, Alteration / hemming (with Normal and Bespoke inside it). Cloth on the shelf: Approve or Decline with a note; approval deducts the metres.</w:t>
+            </w:r>
+          </w:p>
+          <w:p>
+            <w:pPr>
+              <w:spacing w:before="0" w:after="40"/>
+            </w:pPr>
+            <w:r>
+              <w:rPr>
+                <w:rFonts w:ascii="Inter Tight" w:hAnsi="Inter Tight" w:cs="Inter Tight" w:eastAsia="Inter Tight"/>
+                <w:color w:val="1A1A1A"/>
+                <w:sz w:val="17"/>
+              </w:rPr>
+              <w:t>3. Alteration / hemming splits into two: Normal (approved by Swati directly, deducted from physical stock) and Bespoke (one click to Shravani). Bespoke cloth, or a shortfall on a normal order, goes to Shravani in one click: she approves, the PO is generated, and when the cloth is in the ask returns to Swati to approve.</w:t>
             </w:r>
           </w:p>
           <w:p>

</xml_diff>